<commit_message>
The report now carries the port and the gates measured against it
Section 23 puts both builds side by side for every quantity measured on the
chip, generated from the arduino JSONs rather than typed, so the comparison
cannot drift from the runs.

It states the one thing that got worse without inflating it. Frames the chip
did not get in time went from 3 to 9 in 59,650 loops, which is the count G3
fails on, and which is two single samples of a rare event rather than a rate.
And it narrows the radio claim: the Arduino build compiles the radios in, so
the half of that constraint about current draw is now supported by argument
and not by measurement, which the section says in those terms.

The reproduce table's build commands are the Arduino ones now, with the IDF
build kept as the reference it still is.

Co-Authored-By: Claude Opus 5 <noreply@anthropic.com>
</commit_message>
<xml_diff>
--- a/reports/EV-PIL-status-report.docx
+++ b/reports/EV-PIL-status-report.docx
@@ -14546,7 +14546,7 @@
           <w:i w:val="0"/>
           <w:sz w:val="24"/>
         </w:rPr>
-        <w:t>The chain from a trained policy to a running one has four links, and each is checked against the one before it. Building that chain found a real fault: the test that compares the C controller against Python was, for a while, compiling the wrong weights and comparing them against themselves. It passed for exactly as long as no policy had been deployed. Section 23 records it.</w:t>
+        <w:t>The chain from a trained policy to a running one has four links, and each is checked against the one before it. Building that chain found a real fault: the test that compares the C controller against Python was, for a while, compiling the wrong weights and comparing them against themselves. It passed for exactly as long as no policy had been deployed. Section 24 records it.</w:t>
       </w:r>
     </w:p>
     <w:p>
@@ -14554,7 +14554,7 @@
         <w:pStyle w:val="Heading1"/>
       </w:pPr>
       <w:r>
-        <w:t>23. Results that went against expectation</w:t>
+        <w:t>23. Changing the build toolchain, and re-measuring because of it</w:t>
       </w:r>
     </w:p>
     <w:p>
@@ -14566,15 +14566,7 @@
           <w:i w:val="0"/>
           <w:sz w:val="24"/>
         </w:rPr>
-        <w:t>Each one is reported because each one changes what the paper may claim, and a supervisor reading the work will find them more convincing than the successes.</w:t>
-      </w:r>
-    </w:p>
-    <w:p>
-      <w:pPr>
-        <w:pStyle w:val="Heading2"/>
-      </w:pPr>
-      <w:r>
-        <w:t>The learned controller loses to two thresholds</w:t>
+        <w:t>The firmware was moved from Espressif's own build system to the Arduino build for the chip, on instruction. The two produce different binaries from the same source, and every number in this report that was measured on the chip had been measured against the old one. None of them could be carried across by argument, so all of them were taken again.</w:t>
       </w:r>
     </w:p>
     <w:p>
@@ -14586,7 +14578,7 @@
           <w:i w:val="0"/>
           <w:sz w:val="24"/>
         </w:rPr>
-        <w:t>Five independent training runs, and every one of them finishes worse than a controller that is two thresholds and a taper, once the cabin heating they switched off is charged back. The offline optimum predicted it and the training measured it, and the two do not depend on each other. Section 21.</w:t>
+        <w:t>The source code of the control loop did not have to be rewritten. The Arduino build for this chip is built on top of Espressif's, so everything the firmware asks the system for is still there. What changed is how the build is driven, and the compiler settings that come with it, which is exactly what makes timing results non-transferable and is why they were re-run rather than reasoned about.</w:t>
       </w:r>
     </w:p>
     <w:p>
@@ -14594,511 +14586,7 @@
         <w:pStyle w:val="Heading2"/>
       </w:pPr>
       <w:r>
-        <w:t>The forecast makes no difference to the controller</w:t>
-      </w:r>
-    </w:p>
-    <w:p>
-      <w:pPr>
-        <w:spacing w:after="160"/>
-      </w:pPr>
-      <w:r>
-        <w:rPr>
-          <w:i w:val="0"/>
-          <w:sz w:val="24"/>
-        </w:rPr>
-        <w:t>Removing it changes the result by an amount whose confidence interval contains zero, and whose sign is not consistent across the five runs. This was accepted as publishable in the design document before it was run, and week 7 gave it a reason rather than leaving it a possibility.</w:t>
-      </w:r>
-    </w:p>
-    <w:p>
-      <w:pPr>
-        <w:pStyle w:val="Heading2"/>
-      </w:pPr>
-      <w:r>
-        <w:t>A parity test was passing without testing anything</w:t>
-      </w:r>
-    </w:p>
-    <w:p>
-      <w:pPr>
-        <w:spacing w:after="160"/>
-      </w:pPr>
-      <w:r>
-        <w:rPr>
-          <w:i w:val="0"/>
-          <w:sz w:val="24"/>
-        </w:rPr>
-        <w:t>The test that compares the controller written in C against the same controller in Python was, for a while, compiling one set of weights and comparing them against another network's expected answers. The cause is a C rule: an include written with quotes is resolved against the including file's own directory before any search path, so the file under test kept finding the deployed weights whatever the test asked for. It passed honestly for exactly as long as nothing had been deployed. Two fixes: the include now searches the path only, and the weights carry a checksum that the inference code itself reports, because two policies of the same shape are indistinguishable without one.</w:t>
-      </w:r>
-    </w:p>
-    <w:p>
-      <w:pPr>
-        <w:pStyle w:val="Heading2"/>
-      </w:pPr>
-      <w:r>
-        <w:t>A model 27 times bigger is not better</w:t>
-      </w:r>
-    </w:p>
-    <w:p>
-      <w:pPr>
-        <w:spacing w:after="160"/>
-      </w:pPr>
-      <w:r>
-        <w:rPr>
-          <w:i w:val="0"/>
-          <w:sz w:val="24"/>
-        </w:rPr>
-        <w:t>The last piece of the 8-bit experiment trained a deliberately oversized model to teach the small one. The teaching changed nothing measurable, and the reason is that the big model was not better than the small one to begin with: 27 times the parameters, and slightly worse. Every model tried falls within 0.89% of the others, which is less than what converting to 8-bit costs. Section 14.</w:t>
-      </w:r>
-    </w:p>
-    <w:p>
-      <w:pPr>
-        <w:pStyle w:val="Heading2"/>
-      </w:pPr>
-      <w:r>
-        <w:t>The energy-management problem has almost no room in it</w:t>
-      </w:r>
-    </w:p>
-    <w:p>
-      <w:pPr>
-        <w:spacing w:after="160"/>
-      </w:pPr>
-      <w:r>
-        <w:rPr>
-          <w:i w:val="0"/>
-          <w:sz w:val="24"/>
-        </w:rPr>
-        <w:t>The theoretically optimal strategy is a constant instruction, and two thresholds get within a sixth of a percent of it. This is the largest of these findings and it is the subject of section 16, including the three routes open and the fact that choosing between them is the supervisor's decision rather than one taken here.</w:t>
-      </w:r>
-    </w:p>
-    <w:p>
-      <w:pPr>
-        <w:pStyle w:val="Heading2"/>
-      </w:pPr>
-      <w:r>
-        <w:t>The fitted rolling resistance is not a rolling resistance</w:t>
-      </w:r>
-    </w:p>
-    <w:p>
-      <w:pPr>
-        <w:spacing w:after="160"/>
-      </w:pPr>
-      <w:r>
-        <w:rPr>
-          <w:i w:val="0"/>
-          <w:sz w:val="24"/>
-        </w:rPr>
-        <w:t>It is 2.2 times larger than an independent measurement on a comparable car. It is a lumped loss term named after the physics it stands in for rather than the physics it contains. The parameter file now says so and an automated test fails if that statement is removed.</w:t>
-      </w:r>
-    </w:p>
-    <w:p>
-      <w:pPr>
-        <w:pStyle w:val="Heading2"/>
-      </w:pPr>
-      <w:r>
-        <w:t>Gate G4 was already passed before the models existed</w:t>
-      </w:r>
-    </w:p>
-    <w:p>
-      <w:pPr>
-        <w:spacing w:after="160"/>
-      </w:pPr>
-      <w:r>
-        <w:rPr>
-          <w:i w:val="0"/>
-          <w:sz w:val="24"/>
-        </w:rPr>
-        <w:t>A linear regression beat the naive baseline by 14.5% against a required 10%. The gate as written could not distinguish a Transformer from a matrix calculation, so every model is now reported against the regression too.</w:t>
-      </w:r>
-    </w:p>
-    <w:p>
-      <w:pPr>
-        <w:pStyle w:val="Heading2"/>
-      </w:pPr>
-      <w:r>
-        <w:t>Physics-informing does not improve accuracy</w:t>
-      </w:r>
-    </w:p>
-    <w:p>
-      <w:pPr>
-        <w:spacing w:after="160"/>
-      </w:pPr>
-      <w:r>
-        <w:rPr>
-          <w:i w:val="0"/>
-          <w:sz w:val="24"/>
-        </w:rPr>
-        <w:t>Five watts of difference on eleven kilowatts at matched parameter count. It improves physical consistency by a factor of ten instead, which is a different and still useful claim.</w:t>
-      </w:r>
-    </w:p>
-    <w:p>
-      <w:pPr>
-        <w:pStyle w:val="Heading2"/>
-      </w:pPr>
-      <w:r>
-        <w:t>The compute estimate was 64% too optimistic</w:t>
-      </w:r>
-    </w:p>
-    <w:p>
-      <w:pPr>
-        <w:spacing w:after="160"/>
-      </w:pPr>
-      <w:r>
-        <w:rPr>
-          <w:i w:val="0"/>
-          <w:sz w:val="24"/>
-        </w:rPr>
-        <w:t>Dividing a multiply count by a measured multiply rate gave 22.28 milliseconds for the Transformer. Timing the real graph on the chip gave 36.46. The LSTM is worse: 19.84 estimated against 35.07 measured. Both still fit inside the 40 milliseconds allowed, and the estimates remain useful for ranking models against each other, but they cannot be quoted as latencies now that measurements exist.</w:t>
-      </w:r>
-    </w:p>
-    <w:p>
-      <w:pPr>
-        <w:pStyle w:val="Heading2"/>
-      </w:pPr>
-      <w:r>
-        <w:t>Charge conservation cannot be tested at this horizon</w:t>
-      </w:r>
-    </w:p>
-    <w:p>
-      <w:pPr>
-        <w:spacing w:after="160"/>
-      </w:pPr>
-      <w:r>
-        <w:rPr>
-          <w:i w:val="0"/>
-          <w:sz w:val="24"/>
-        </w:rPr>
-        <w:t>The recorded charge channel does not move within a typical three-second window, so the equation has nothing to constrain. Enforcing it costs 4.4% accuracy and buys almost nothing. This was measured rather than argued.</w:t>
-      </w:r>
-    </w:p>
-    <w:p>
-      <w:pPr>
-        <w:pStyle w:val="Heading1"/>
-      </w:pPr>
-      <w:r>
-        <w:t>24. What changed from the original plan</w:t>
-      </w:r>
-    </w:p>
-    <w:p>
-      <w:pPr>
-        <w:spacing w:after="160"/>
-      </w:pPr>
-      <w:r>
-        <w:rPr>
-          <w:i w:val="0"/>
-          <w:sz w:val="24"/>
-        </w:rPr>
-        <w:t>Twenty-two changes, in two classes, and the distinction matters. Eleven were agreed in the design document before any code was written. Eleven more happened during the eight weeks, each one forced by something that had been measured.</w:t>
-      </w:r>
-    </w:p>
-    <w:p>
-      <w:pPr>
-        <w:pStyle w:val="Heading2"/>
-      </w:pPr>
-      <w:r>
-        <w:t>Agreed before implementation</w:t>
-      </w:r>
-    </w:p>
-    <w:p>
-      <w:pPr>
-        <w:spacing w:after="160"/>
-      </w:pPr>
-      <w:r>
-        <w:rPr>
-          <w:i w:val="0"/>
-          <w:sz w:val="24"/>
-        </w:rPr>
-        <w:t>It is Processor-in-the-Loop, not Hardware-in-the-Loop. The original used HIL throughout. HIL means real electrical hardware in the loop, with motors, power electronics and sensors. There is none of that here, only a processor. Reviewers in embedded and control venues spot a misused HIL immediately, and the correct term costs nothing.</w:t>
-      </w:r>
-    </w:p>
-    <w:p>
-      <w:pPr>
-        <w:spacing w:after="160"/>
-      </w:pPr>
-      <w:r>
-        <w:rPr>
-          <w:i w:val="0"/>
-          <w:sz w:val="24"/>
-        </w:rPr>
-        <w:t>The embedded work moved from last to first, which is the largest single change. The original schedules the ESP32 for weeks 10 and 11, after all the modelling is finished. That is the one arrangement in which a failure has no recovery: if the model does not fit in week 10, there is no time left to build a smaller one. The compute-feasibility question is now gate G1 in week 1, and the plan already names the fallback. This inversion is why the project knew in week 4, rather than week 10, that XGBoost was never deployable.</w:t>
-      </w:r>
-    </w:p>
-    <w:p>
-      <w:pPr>
-        <w:spacing w:after="160"/>
-      </w:pPr>
-      <w:r>
-        <w:rPr>
-          <w:i w:val="0"/>
-          <w:sz w:val="24"/>
-        </w:rPr>
-        <w:t>Real logged trips replaced a physics-generated dataset. The original creates the training data by pushing drive cycles through the physics model, which makes the thing being predicted a closed-form function of the very inputs used to predict it. The model then appears to do brilliantly while having learned nothing about a real car. The predecessor work has exactly this defect. This project trains on 72 real logged trips at 10 Hz instead.</w:t>
-      </w:r>
-    </w:p>
-    <w:p>
-      <w:pPr>
-        <w:spacing w:after="160"/>
-      </w:pPr>
-      <w:r>
-        <w:rPr>
-          <w:i w:val="0"/>
-          <w:sz w:val="24"/>
-        </w:rPr>
-        <w:t>Data is split by trip and never by row. The predecessor split 2,000 rows at random, and because consecutive rows come from the same drive a fraction of a second apart, near-identical samples landed on both sides. The model was effectively tested on data it had trained on, which inflates every score. Here no sample from a trip ever appears on both sides, and the calibration data used for 8-bit quantisation is drawn from training trips only, which is a subtler version of the same leak.</w:t>
-      </w:r>
-    </w:p>
-    <w:p>
-      <w:pPr>
-        <w:spacing w:after="160"/>
-      </w:pPr>
-      <w:r>
-        <w:rPr>
-          <w:i w:val="0"/>
-          <w:sz w:val="24"/>
-        </w:rPr>
-        <w:t>The communication task runs at 10 ms rather than 50. This was arithmetic rather than judgement: the original specifies a 10 ms control loop and a 50 ms communication task, and a loop cannot close five times faster than the messages it depends on arrive.</w:t>
-      </w:r>
-    </w:p>
-    <w:p>
-      <w:pPr>
-        <w:spacing w:after="160"/>
-      </w:pPr>
-      <w:r>
-        <w:rPr>
-          <w:i w:val="0"/>
-          <w:sz w:val="24"/>
-        </w:rPr>
-        <w:t>Budget first, then model. The model size is not chosen and then checked, it is derived from what gate G1 measured. The Transformer is 32 sequence steps, 32 units wide and 2 layers deep because that is what fits in 40 milliseconds on this chip.</w:t>
-      </w:r>
-    </w:p>
-    <w:p>
-      <w:pPr>
-        <w:spacing w:after="160"/>
-      </w:pPr>
-      <w:r>
-        <w:rPr>
-          <w:i w:val="0"/>
-          <w:sz w:val="24"/>
-        </w:rPr>
-        <w:t>The model comparison was rebuilt. Linear regression, random forest and XGBoost became a mandatory naive baseline, one strong tabular model, an LSTM fed genuinely sequential data, and a Transformer, each in plain and physics-informed versions at matched size. Re-running the LSTM correctly is deliberate: the predecessor flattened its data first, which removes the time ordering the architecture exists to exploit, and then reported that recurrent models underperform.</w:t>
-      </w:r>
-    </w:p>
-    <w:p>
-      <w:pPr>
-        <w:spacing w:after="160"/>
-      </w:pPr>
-      <w:r>
-        <w:rPr>
-          <w:i w:val="0"/>
-          <w:sz w:val="24"/>
-        </w:rPr>
-        <w:t>Gates, ablations and explicit non-claims are entirely new. Five gates each with a written action on failure; four numbered ablations; a metrics table with actual metrics where the original listed headings and left them empty; and a list of things this work will explicitly not claim. Stating the non-claims in advance is what allows two null results to be reported as findings rather than as embarrassments.</w:t>
-      </w:r>
-    </w:p>
-    <w:p>
-      <w:pPr>
-        <w:spacing w:after="160"/>
-      </w:pPr>
-      <w:r>
-        <w:rPr>
-          <w:i w:val="0"/>
-          <w:sz w:val="24"/>
-        </w:rPr>
-        <w:t>Thirteen scenario variations became six axes, keeping full robustness coverage at roughly half the runs.</w:t>
-      </w:r>
-    </w:p>
-    <w:p>
-      <w:pPr>
-        <w:spacing w:after="160"/>
-      </w:pPr>
-      <w:r>
-        <w:rPr>
-          <w:i w:val="0"/>
-          <w:sz w:val="24"/>
-        </w:rPr>
-        <w:t>The ESP32-S3 is the primary platform rather than the C6. Two processor cores matter enormously here, because the hard real-time loop is pinned to core 0 where inference on core 1 cannot disturb it. The single-core C6 cannot make that separation at all.</w:t>
-      </w:r>
-    </w:p>
-    <w:p>
-      <w:pPr>
-        <w:spacing w:after="160"/>
-      </w:pPr>
-      <w:r>
-        <w:rPr>
-          <w:i w:val="0"/>
-          <w:sz w:val="24"/>
-        </w:rPr>
-        <w:t>A second, independent dataset was added, held purely as an out-of-distribution check. Building and testing on one car answers whether the model fits; the question a reviewer actually asks is whether it transfers, and nothing in the original plan could have answered it.</w:t>
-      </w:r>
-    </w:p>
-    <w:p>
-      <w:pPr>
-        <w:pStyle w:val="Heading2"/>
-      </w:pPr>
-      <w:r>
-        <w:t>Changed in flight, because something was measured</w:t>
-      </w:r>
-    </w:p>
-    <w:p>
-      <w:pPr>
-        <w:spacing w:after="160"/>
-      </w:pPr>
-      <w:r>
-        <w:rPr>
-          <w:i w:val="0"/>
-          <w:sz w:val="24"/>
-        </w:rPr>
-        <w:t>These are the ones to be most transparent about, because each represents the plan meeting reality. In every case the measurement came first and the change followed.</w:t>
-      </w:r>
-    </w:p>
-    <w:p>
-      <w:pPr>
-        <w:spacing w:after="160"/>
-      </w:pPr>
-      <w:r>
-        <w:rPr>
-          <w:i w:val="0"/>
-          <w:sz w:val="24"/>
-        </w:rPr>
-        <w:t>Gate G2 was split into three parts instead of one pooled number, and this was the one revision the design document permits. Neither threshold was loosened; what changed is which part of the model each threshold is applied to. Applied literally the original criterion failed all seven trips at a median error of 23.7 percent, because that single number pooled three independent models and could not say which was wrong. Driving the plant with the archive's own logged torque drops the error to a median of 7.0 percent, inside the original bound on every trip. The revision is now spent and nothing else may be adjusted without the same treatment.</w:t>
-      </w:r>
-    </w:p>
-    <w:p>
-      <w:pPr>
-        <w:spacing w:after="160"/>
-      </w:pPr>
-      <w:r>
-        <w:rPr>
-          <w:i w:val="0"/>
-          <w:sz w:val="24"/>
-        </w:rPr>
-        <w:t>The control loop became pipelined rather than synchronous. Originally the chip sent a request and then waited for the reply inside the same 10 millisecond slot, tying its deadline to the scheduling behaviour of a general-purpose laptop. It now requests the next state and acts on the most recent one it holds, and the worst round trip fell from 7,405 microseconds to 77. This is a genuine trade rather than a free win, because the controller now acts on information one cycle old, and that cost is measured and reported.</w:t>
-      </w:r>
-    </w:p>
-    <w:p>
-      <w:pPr>
-        <w:spacing w:after="160"/>
-      </w:pPr>
-      <w:r>
-        <w:rPr>
-          <w:i w:val="0"/>
-          <w:sz w:val="24"/>
-        </w:rPr>
-        <w:t>The link runs over the chip's built-in USB rather than a separate adapter. The design deliberately left this open for gate G3 to settle on measured evidence, and the built-in peripheral carries the loop with zero corrupted and zero lost messages.</w:t>
-      </w:r>
-    </w:p>
-    <w:p>
-      <w:pPr>
-        <w:spacing w:after="160"/>
-      </w:pPr>
-      <w:r>
-        <w:rPr>
-          <w:i w:val="0"/>
-          <w:sz w:val="24"/>
-        </w:rPr>
-        <w:t>Three identified parameters were relabelled as lumped losses. The fitted rolling-resistance coefficient came out 2.2 times larger than an independent measurement on a comparable car, so it is not a tyre property. It is a coefficient occupying that place in the equation and absorbing every speed-dependent loss the model does not represent separately. The parameter file says so, and an automated test fails if that statement is removed.</w:t>
-      </w:r>
-    </w:p>
-    <w:p>
-      <w:pPr>
-        <w:spacing w:after="160"/>
-      </w:pPr>
-      <w:r>
-        <w:rPr>
-          <w:i w:val="0"/>
-          <w:sz w:val="24"/>
-        </w:rPr>
-        <w:t>One of the three physics constraints was switched off. Charge conservation has nothing to constrain over a three-second window, because the logged charge channel does not measurably move within one. Its weight is held at zero and the cost of switching it on is reported as its own arm rather than quietly omitted.</w:t>
-      </w:r>
-    </w:p>
-    <w:p>
-      <w:pPr>
-        <w:spacing w:after="160"/>
-      </w:pPr>
-      <w:r>
-        <w:rPr>
-          <w:i w:val="0"/>
-          <w:sz w:val="24"/>
-        </w:rPr>
-        <w:t>The message format grew to carry a real controller. The state message went from 8 numbers to 10 so that the laptop can send the target speed and its rate of change, the command message from 3 to 4, and the diagnostics message from 11 counters to 16. Gate G3 was then re-measured in full, because the loop the report describes has to be the loop that was measured.</w:t>
-      </w:r>
-    </w:p>
-    <w:p>
-      <w:pPr>
-        <w:spacing w:after="160"/>
-      </w:pPr>
-      <w:r>
-        <w:rPr>
-          <w:i w:val="0"/>
-          <w:sz w:val="24"/>
-        </w:rPr>
-        <w:t>The offline optimiser searches two dimensions rather than three. This is not a simplification for speed. With the speed trajectory fixed by the tracking constraint, the battery power limit can only ever remove power the speed controller needs, which the constraint forbids. It is a safety limiter and not an optimisation lever, and that applies to the learned controller in exactly the same way.</w:t>
-      </w:r>
-    </w:p>
-    <w:p>
-      <w:pPr>
-        <w:spacing w:after="160"/>
-      </w:pPr>
-      <w:r>
-        <w:rPr>
-          <w:i w:val="0"/>
-          <w:sz w:val="24"/>
-        </w:rPr>
-        <w:t>Controllers are now ranked with shed cabin heat charged back. Raw consumption is not comparable between controllers, because one that turns the heating down looks excellent without having managed any energy. Without this correction the week 8 table reads as the learned controller saving 1.3 percent; with it, the same controller is 0.66 percent worse, and the entire difference was 48 to 50 watt-hours of cabin heat per cycle.</w:t>
-      </w:r>
-    </w:p>
-    <w:p>
-      <w:pPr>
-        <w:spacing w:after="160"/>
-      </w:pPr>
-      <w:r>
-        <w:rPr>
-          <w:i w:val="0"/>
-          <w:sz w:val="24"/>
-        </w:rPr>
-        <w:t>The learned controller is 64 units wide rather than the library default of 256. The default would be 68,867 numbers and 269 kilobytes, which is 90 percent of the entire memory budget the forecaster also has to fit inside. At 64 wide it is 4,931 numbers and 19.3 kilobytes, and both figures were measured in a pilot run before the main campaign.</w:t>
-      </w:r>
-    </w:p>
-    <w:p>
-      <w:pPr>
-        <w:spacing w:after="160"/>
-      </w:pPr>
-      <w:r>
-        <w:rPr>
-          <w:i w:val="0"/>
-          <w:sz w:val="24"/>
-        </w:rPr>
-        <w:t>XGBoost and the LSTM ensemble were dropped as deployable options. XGBoost needs roughly 3.7 megabytes against a 300 kilobyte budget, over twelve times too large. The best-looking accuracy figure in the whole comparison was a five-model LSTM ensemble, which takes 99 milliseconds against a 40 millisecond budget. Both remain offline reference points, and the reported number is now always distinguished from the deployable one.</w:t>
-      </w:r>
-    </w:p>
-    <w:p>
-      <w:pPr>
-        <w:spacing w:after="160"/>
-      </w:pPr>
-      <w:r>
-        <w:rPr>
-          <w:i w:val="0"/>
-          <w:sz w:val="24"/>
-        </w:rPr>
-        <w:t>The watchdog was switched on and a fallback path built. Three different failures now get three different responses and three separate counters rather than one generic fault state, because collapsing them is how a controller ends up limping owing to a slow logging task. All three were then triggered deliberately on the board, plus a fourth test that hung the control task on purpose to confirm the watchdog resets the chip. A fallback path that has never been taken is a claim, not a result.</w:t>
-      </w:r>
-    </w:p>
-    <w:p>
-      <w:pPr>
-        <w:pStyle w:val="Heading1"/>
-      </w:pPr>
-      <w:r>
-        <w:t>25. What is left to do</w:t>
-      </w:r>
-    </w:p>
-    <w:p>
-      <w:pPr>
-        <w:spacing w:after="160"/>
-      </w:pPr>
-      <w:r>
-        <w:rPr>
-          <w:i w:val="0"/>
-          <w:sz w:val="24"/>
-        </w:rPr>
-        <w:t>Phase 1 and Phase 2 are complete. The remaining work is the controller, the on-chip deployment, and the measurement campaign.</w:t>
+        <w:t>Every gate, on both builds</w:t>
       </w:r>
     </w:p>
     <w:tbl>
@@ -15117,6 +14605,1064 @@
       <w:tr>
         <w:tc>
           <w:tcPr>
+            <w:tcW w:type="dxa" w:w="2412"/>
+          </w:tcPr>
+          <w:p>
+            <w:r/>
+            <w:r>
+              <w:rPr>
+                <w:b/>
+                <w:sz w:val="20"/>
+              </w:rPr>
+              <w:t>Measurement</w:t>
+            </w:r>
+          </w:p>
+        </w:tc>
+        <w:tc>
+          <w:tcPr>
+            <w:tcW w:type="dxa" w:w="2412"/>
+          </w:tcPr>
+          <w:p>
+            <w:r/>
+            <w:r>
+              <w:rPr>
+                <w:b/>
+                <w:sz w:val="20"/>
+              </w:rPr>
+              <w:t>Espressif build</w:t>
+            </w:r>
+          </w:p>
+        </w:tc>
+        <w:tc>
+          <w:tcPr>
+            <w:tcW w:type="dxa" w:w="2412"/>
+          </w:tcPr>
+          <w:p>
+            <w:r/>
+            <w:r>
+              <w:rPr>
+                <w:b/>
+                <w:sz w:val="20"/>
+              </w:rPr>
+              <w:t>Arduino build</w:t>
+            </w:r>
+          </w:p>
+        </w:tc>
+        <w:tc>
+          <w:tcPr>
+            <w:tcW w:type="dxa" w:w="2412"/>
+          </w:tcPr>
+          <w:p>
+            <w:r/>
+            <w:r>
+              <w:rPr>
+                <w:b/>
+                <w:sz w:val="20"/>
+              </w:rPr>
+              <w:t>Effect</w:t>
+            </w:r>
+          </w:p>
+        </w:tc>
+      </w:tr>
+      <w:tr>
+        <w:tc>
+          <w:tcPr>
+            <w:tcW w:type="dxa" w:w="2412"/>
+          </w:tcPr>
+          <w:p>
+            <w:r/>
+            <w:r>
+              <w:rPr>
+                <w:sz w:val="20"/>
+              </w:rPr>
+              <w:t>Gate G1, arithmetic rate</w:t>
+            </w:r>
+          </w:p>
+        </w:tc>
+        <w:tc>
+          <w:tcPr>
+            <w:tcW w:type="dxa" w:w="2412"/>
+          </w:tcPr>
+          <w:p>
+            <w:r/>
+            <w:r>
+              <w:rPr>
+                <w:sz w:val="20"/>
+              </w:rPr>
+              <w:t>29.82 million/s</w:t>
+            </w:r>
+          </w:p>
+        </w:tc>
+        <w:tc>
+          <w:tcPr>
+            <w:tcW w:type="dxa" w:w="2412"/>
+          </w:tcPr>
+          <w:p>
+            <w:r/>
+            <w:r>
+              <w:rPr>
+                <w:sz w:val="20"/>
+              </w:rPr>
+              <w:t>29.82 million/s</w:t>
+            </w:r>
+          </w:p>
+        </w:tc>
+        <w:tc>
+          <w:tcPr>
+            <w:tcW w:type="dxa" w:w="2412"/>
+          </w:tcPr>
+          <w:p>
+            <w:r/>
+            <w:r>
+              <w:rPr>
+                <w:sz w:val="20"/>
+              </w:rPr>
+              <w:t>unchanged, PASS</w:t>
+            </w:r>
+          </w:p>
+        </w:tc>
+      </w:tr>
+      <w:tr>
+        <w:tc>
+          <w:tcPr>
+            <w:tcW w:type="dxa" w:w="2412"/>
+          </w:tcPr>
+          <w:p>
+            <w:r/>
+            <w:r>
+              <w:rPr>
+                <w:sz w:val="20"/>
+              </w:rPr>
+              <w:t>Gate G5, forecaster on the chip</w:t>
+            </w:r>
+          </w:p>
+        </w:tc>
+        <w:tc>
+          <w:tcPr>
+            <w:tcW w:type="dxa" w:w="2412"/>
+          </w:tcPr>
+          <w:p>
+            <w:r/>
+            <w:r>
+              <w:rPr>
+                <w:sz w:val="20"/>
+              </w:rPr>
+              <w:t>36.46 ms</w:t>
+            </w:r>
+          </w:p>
+        </w:tc>
+        <w:tc>
+          <w:tcPr>
+            <w:tcW w:type="dxa" w:w="2412"/>
+          </w:tcPr>
+          <w:p>
+            <w:r/>
+            <w:r>
+              <w:rPr>
+                <w:sz w:val="20"/>
+              </w:rPr>
+              <w:t>35.03 ms</w:t>
+            </w:r>
+          </w:p>
+        </w:tc>
+        <w:tc>
+          <w:tcPr>
+            <w:tcW w:type="dxa" w:w="2412"/>
+          </w:tcPr>
+          <w:p>
+            <w:r/>
+            <w:r>
+              <w:rPr>
+                <w:sz w:val="20"/>
+              </w:rPr>
+              <w:t>3.9% faster, fits</w:t>
+            </w:r>
+          </w:p>
+        </w:tc>
+      </w:tr>
+      <w:tr>
+        <w:tc>
+          <w:tcPr>
+            <w:tcW w:type="dxa" w:w="2412"/>
+          </w:tcPr>
+          <w:p>
+            <w:r/>
+            <w:r>
+              <w:rPr>
+                <w:sz w:val="20"/>
+              </w:rPr>
+              <w:t>Gate G3, loop jitter (99th pct)</w:t>
+            </w:r>
+          </w:p>
+        </w:tc>
+        <w:tc>
+          <w:tcPr>
+            <w:tcW w:type="dxa" w:w="2412"/>
+          </w:tcPr>
+          <w:p>
+            <w:r/>
+            <w:r>
+              <w:rPr>
+                <w:sz w:val="20"/>
+              </w:rPr>
+              <w:t>25 us</w:t>
+            </w:r>
+          </w:p>
+        </w:tc>
+        <w:tc>
+          <w:tcPr>
+            <w:tcW w:type="dxa" w:w="2412"/>
+          </w:tcPr>
+          <w:p>
+            <w:r/>
+            <w:r>
+              <w:rPr>
+                <w:sz w:val="20"/>
+              </w:rPr>
+              <w:t>25 us</w:t>
+            </w:r>
+          </w:p>
+        </w:tc>
+        <w:tc>
+          <w:tcPr>
+            <w:tcW w:type="dxa" w:w="2412"/>
+          </w:tcPr>
+          <w:p>
+            <w:r/>
+            <w:r>
+              <w:rPr>
+                <w:sz w:val="20"/>
+              </w:rPr>
+              <w:t>identical</w:t>
+            </w:r>
+          </w:p>
+        </w:tc>
+      </w:tr>
+      <w:tr>
+        <w:tc>
+          <w:tcPr>
+            <w:tcW w:type="dxa" w:w="2412"/>
+          </w:tcPr>
+          <w:p>
+            <w:r/>
+            <w:r>
+              <w:rPr>
+                <w:sz w:val="20"/>
+              </w:rPr>
+              <w:t>Gate G3, loops late vs own deadline</w:t>
+            </w:r>
+          </w:p>
+        </w:tc>
+        <w:tc>
+          <w:tcPr>
+            <w:tcW w:type="dxa" w:w="2412"/>
+          </w:tcPr>
+          <w:p>
+            <w:r/>
+            <w:r>
+              <w:rPr>
+                <w:sz w:val="20"/>
+              </w:rPr>
+              <w:t>0</w:t>
+            </w:r>
+          </w:p>
+        </w:tc>
+        <w:tc>
+          <w:tcPr>
+            <w:tcW w:type="dxa" w:w="2412"/>
+          </w:tcPr>
+          <w:p>
+            <w:r/>
+            <w:r>
+              <w:rPr>
+                <w:sz w:val="20"/>
+              </w:rPr>
+              <w:t>0</w:t>
+            </w:r>
+          </w:p>
+        </w:tc>
+        <w:tc>
+          <w:tcPr>
+            <w:tcW w:type="dxa" w:w="2412"/>
+          </w:tcPr>
+          <w:p>
+            <w:r/>
+            <w:r>
+              <w:rPr>
+                <w:sz w:val="20"/>
+              </w:rPr>
+              <w:t>identical, still zero</w:t>
+            </w:r>
+          </w:p>
+        </w:tc>
+      </w:tr>
+      <w:tr>
+        <w:tc>
+          <w:tcPr>
+            <w:tcW w:type="dxa" w:w="2412"/>
+          </w:tcPr>
+          <w:p>
+            <w:r/>
+            <w:r>
+              <w:rPr>
+                <w:sz w:val="20"/>
+              </w:rPr>
+              <w:t>Gate G3, frames the chip did not get in time</w:t>
+            </w:r>
+          </w:p>
+        </w:tc>
+        <w:tc>
+          <w:tcPr>
+            <w:tcW w:type="dxa" w:w="2412"/>
+          </w:tcPr>
+          <w:p>
+            <w:r/>
+            <w:r>
+              <w:rPr>
+                <w:sz w:val="20"/>
+              </w:rPr>
+              <w:t>3</w:t>
+            </w:r>
+          </w:p>
+        </w:tc>
+        <w:tc>
+          <w:tcPr>
+            <w:tcW w:type="dxa" w:w="2412"/>
+          </w:tcPr>
+          <w:p>
+            <w:r/>
+            <w:r>
+              <w:rPr>
+                <w:sz w:val="20"/>
+              </w:rPr>
+              <w:t>9</w:t>
+            </w:r>
+          </w:p>
+        </w:tc>
+        <w:tc>
+          <w:tcPr>
+            <w:tcW w:type="dxa" w:w="2412"/>
+          </w:tcPr>
+          <w:p>
+            <w:r/>
+            <w:r>
+              <w:rPr>
+                <w:sz w:val="20"/>
+              </w:rPr>
+              <w:t>worse, still FAIL</w:t>
+            </w:r>
+          </w:p>
+        </w:tc>
+      </w:tr>
+      <w:tr>
+        <w:tc>
+          <w:tcPr>
+            <w:tcW w:type="dxa" w:w="2412"/>
+          </w:tcPr>
+          <w:p>
+            <w:r/>
+            <w:r>
+              <w:rPr>
+                <w:sz w:val="20"/>
+              </w:rPr>
+              <w:t>Controller on the chip</w:t>
+            </w:r>
+          </w:p>
+        </w:tc>
+        <w:tc>
+          <w:tcPr>
+            <w:tcW w:type="dxa" w:w="2412"/>
+          </w:tcPr>
+          <w:p>
+            <w:r/>
+            <w:r>
+              <w:rPr>
+                <w:sz w:val="20"/>
+              </w:rPr>
+              <w:t>0.121 ms</w:t>
+            </w:r>
+          </w:p>
+        </w:tc>
+        <w:tc>
+          <w:tcPr>
+            <w:tcW w:type="dxa" w:w="2412"/>
+          </w:tcPr>
+          <w:p>
+            <w:r/>
+            <w:r>
+              <w:rPr>
+                <w:sz w:val="20"/>
+              </w:rPr>
+              <w:t>0.123 ms</w:t>
+            </w:r>
+          </w:p>
+        </w:tc>
+        <w:tc>
+          <w:tcPr>
+            <w:tcW w:type="dxa" w:w="2412"/>
+          </w:tcPr>
+          <w:p>
+            <w:r/>
+            <w:r>
+              <w:rPr>
+                <w:sz w:val="20"/>
+              </w:rPr>
+              <w:t>1.7% slower</w:t>
+            </w:r>
+          </w:p>
+        </w:tc>
+      </w:tr>
+    </w:tbl>
+    <w:p>
+      <w:pPr>
+        <w:spacing w:after="40"/>
+      </w:pPr>
+    </w:p>
+    <w:p>
+      <w:pPr>
+        <w:spacing w:after="160"/>
+      </w:pPr>
+      <w:r>
+        <w:rPr>
+          <w:i/>
+          <w:color w:val="595959"/>
+          <w:sz w:val="18"/>
+        </w:rPr>
+        <w:t>Table. Every quantity measured on the chip, taken again after the build change. MEASURED, both columns.</w:t>
+      </w:r>
+    </w:p>
+    <w:p>
+      <w:pPr>
+        <w:spacing w:after="160"/>
+      </w:pPr>
+      <w:r>
+        <w:rPr>
+          <w:i w:val="0"/>
+          <w:sz w:val="24"/>
+        </w:rPr>
+        <w:t>No verdict changed and the largest movement in anything measured is 3.9%. The arithmetic rate agrees to four significant figures, which is what should be expected of a tight loop of 8-bit multiplications once both builds use the same optimisation setting, and is now measured rather than assumed. The controller still matches the laptop's arithmetic to six decimal places and still carries the same checksum, so the same weights are running.</w:t>
+      </w:r>
+    </w:p>
+    <w:p>
+      <w:pPr>
+        <w:pStyle w:val="Heading2"/>
+      </w:pPr>
+      <w:r>
+        <w:t>What got worse, and how much it is worth</w:t>
+      </w:r>
+    </w:p>
+    <w:p>
+      <w:pPr>
+        <w:spacing w:after="160"/>
+      </w:pPr>
+      <w:r>
+        <w:rPr>
+          <w:i w:val="0"/>
+          <w:sz w:val="24"/>
+        </w:rPr>
+        <w:t>One quantity moved the wrong way. The number of times the chip did not receive an update in time went from 3 to 9 in 59,650 control loops, and that is the count gate G3 fails on. On the Arduino build it was enough for the car to be eased out of torque once during the ten-minute run.</w:t>
+      </w:r>
+    </w:p>
+    <w:p>
+      <w:pPr>
+        <w:spacing w:after="160"/>
+      </w:pPr>
+      <w:r>
+        <w:rPr>
+          <w:i w:val="0"/>
+          <w:sz w:val="24"/>
+        </w:rPr>
+        <w:t>That is two single samples of a rare event, three hundredths of a percent against fifteen hundredths, from one run on each build. It is not enough to establish a rate, and it is not claimed as one. What the runs do support is narrower: the change did not fix the gate and did not clearly break it. Settling it would take five or more runs on each build.</w:t>
+      </w:r>
+    </w:p>
+    <w:p>
+      <w:pPr>
+        <w:pStyle w:val="Heading2"/>
+      </w:pPr>
+      <w:r>
+        <w:t>What the new build cannot do</w:t>
+      </w:r>
+    </w:p>
+    <w:p>
+      <w:pPr>
+        <w:spacing w:after="160"/>
+      </w:pPr>
+      <w:r>
+        <w:rPr>
+          <w:i w:val="0"/>
+          <w:sz w:val="24"/>
+        </w:rPr>
+        <w:t>The Arduino build compiles the wireless radios into the program and offers no way to leave them out. Nothing switches them on, and the timing results above show no sign of them. But the reason the old build removed them was that a live radio disturbs both timing and the current drawn from the supply, and only timing was checked here. The current draw was not re-measured on the new build, so that half of the constraint is currently supported by argument rather than by measurement, and is written here as such.</w:t>
+      </w:r>
+    </w:p>
+    <w:p>
+      <w:pPr>
+        <w:pStyle w:val="Heading1"/>
+      </w:pPr>
+      <w:r>
+        <w:t>24. Results that went against expectation</w:t>
+      </w:r>
+    </w:p>
+    <w:p>
+      <w:pPr>
+        <w:spacing w:after="160"/>
+      </w:pPr>
+      <w:r>
+        <w:rPr>
+          <w:i w:val="0"/>
+          <w:sz w:val="24"/>
+        </w:rPr>
+        <w:t>Each one is reported because each one changes what the paper may claim, and a supervisor reading the work will find them more convincing than the successes.</w:t>
+      </w:r>
+    </w:p>
+    <w:p>
+      <w:pPr>
+        <w:pStyle w:val="Heading2"/>
+      </w:pPr>
+      <w:r>
+        <w:t>The learned controller loses to two thresholds</w:t>
+      </w:r>
+    </w:p>
+    <w:p>
+      <w:pPr>
+        <w:spacing w:after="160"/>
+      </w:pPr>
+      <w:r>
+        <w:rPr>
+          <w:i w:val="0"/>
+          <w:sz w:val="24"/>
+        </w:rPr>
+        <w:t>Five independent training runs, and every one of them finishes worse than a controller that is two thresholds and a taper, once the cabin heating they switched off is charged back. The offline optimum predicted it and the training measured it, and the two do not depend on each other. Section 21.</w:t>
+      </w:r>
+    </w:p>
+    <w:p>
+      <w:pPr>
+        <w:pStyle w:val="Heading2"/>
+      </w:pPr>
+      <w:r>
+        <w:t>The forecast makes no difference to the controller</w:t>
+      </w:r>
+    </w:p>
+    <w:p>
+      <w:pPr>
+        <w:spacing w:after="160"/>
+      </w:pPr>
+      <w:r>
+        <w:rPr>
+          <w:i w:val="0"/>
+          <w:sz w:val="24"/>
+        </w:rPr>
+        <w:t>Removing it changes the result by an amount whose confidence interval contains zero, and whose sign is not consistent across the five runs. This was accepted as publishable in the design document before it was run, and week 7 gave it a reason rather than leaving it a possibility.</w:t>
+      </w:r>
+    </w:p>
+    <w:p>
+      <w:pPr>
+        <w:pStyle w:val="Heading2"/>
+      </w:pPr>
+      <w:r>
+        <w:t>A parity test was passing without testing anything</w:t>
+      </w:r>
+    </w:p>
+    <w:p>
+      <w:pPr>
+        <w:spacing w:after="160"/>
+      </w:pPr>
+      <w:r>
+        <w:rPr>
+          <w:i w:val="0"/>
+          <w:sz w:val="24"/>
+        </w:rPr>
+        <w:t>The test that compares the controller written in C against the same controller in Python was, for a while, compiling one set of weights and comparing them against another network's expected answers. The cause is a C rule: an include written with quotes is resolved against the including file's own directory before any search path, so the file under test kept finding the deployed weights whatever the test asked for. It passed honestly for exactly as long as nothing had been deployed. Two fixes: the include now searches the path only, and the weights carry a checksum that the inference code itself reports, because two policies of the same shape are indistinguishable without one.</w:t>
+      </w:r>
+    </w:p>
+    <w:p>
+      <w:pPr>
+        <w:pStyle w:val="Heading2"/>
+      </w:pPr>
+      <w:r>
+        <w:t>A model 27 times bigger is not better</w:t>
+      </w:r>
+    </w:p>
+    <w:p>
+      <w:pPr>
+        <w:spacing w:after="160"/>
+      </w:pPr>
+      <w:r>
+        <w:rPr>
+          <w:i w:val="0"/>
+          <w:sz w:val="24"/>
+        </w:rPr>
+        <w:t>The last piece of the 8-bit experiment trained a deliberately oversized model to teach the small one. The teaching changed nothing measurable, and the reason is that the big model was not better than the small one to begin with: 27 times the parameters, and slightly worse. Every model tried falls within 0.89% of the others, which is less than what converting to 8-bit costs. Section 14.</w:t>
+      </w:r>
+    </w:p>
+    <w:p>
+      <w:pPr>
+        <w:pStyle w:val="Heading2"/>
+      </w:pPr>
+      <w:r>
+        <w:t>The energy-management problem has almost no room in it</w:t>
+      </w:r>
+    </w:p>
+    <w:p>
+      <w:pPr>
+        <w:spacing w:after="160"/>
+      </w:pPr>
+      <w:r>
+        <w:rPr>
+          <w:i w:val="0"/>
+          <w:sz w:val="24"/>
+        </w:rPr>
+        <w:t>The theoretically optimal strategy is a constant instruction, and two thresholds get within a sixth of a percent of it. This is the largest of these findings and it is the subject of section 16, including the three routes open and the fact that choosing between them is the supervisor's decision rather than one taken here.</w:t>
+      </w:r>
+    </w:p>
+    <w:p>
+      <w:pPr>
+        <w:pStyle w:val="Heading2"/>
+      </w:pPr>
+      <w:r>
+        <w:t>The fitted rolling resistance is not a rolling resistance</w:t>
+      </w:r>
+    </w:p>
+    <w:p>
+      <w:pPr>
+        <w:spacing w:after="160"/>
+      </w:pPr>
+      <w:r>
+        <w:rPr>
+          <w:i w:val="0"/>
+          <w:sz w:val="24"/>
+        </w:rPr>
+        <w:t>It is 2.2 times larger than an independent measurement on a comparable car. It is a lumped loss term named after the physics it stands in for rather than the physics it contains. The parameter file now says so and an automated test fails if that statement is removed.</w:t>
+      </w:r>
+    </w:p>
+    <w:p>
+      <w:pPr>
+        <w:pStyle w:val="Heading2"/>
+      </w:pPr>
+      <w:r>
+        <w:t>Gate G4 was already passed before the models existed</w:t>
+      </w:r>
+    </w:p>
+    <w:p>
+      <w:pPr>
+        <w:spacing w:after="160"/>
+      </w:pPr>
+      <w:r>
+        <w:rPr>
+          <w:i w:val="0"/>
+          <w:sz w:val="24"/>
+        </w:rPr>
+        <w:t>A linear regression beat the naive baseline by 14.5% against a required 10%. The gate as written could not distinguish a Transformer from a matrix calculation, so every model is now reported against the regression too.</w:t>
+      </w:r>
+    </w:p>
+    <w:p>
+      <w:pPr>
+        <w:pStyle w:val="Heading2"/>
+      </w:pPr>
+      <w:r>
+        <w:t>Physics-informing does not improve accuracy</w:t>
+      </w:r>
+    </w:p>
+    <w:p>
+      <w:pPr>
+        <w:spacing w:after="160"/>
+      </w:pPr>
+      <w:r>
+        <w:rPr>
+          <w:i w:val="0"/>
+          <w:sz w:val="24"/>
+        </w:rPr>
+        <w:t>Five watts of difference on eleven kilowatts at matched parameter count. It improves physical consistency by a factor of ten instead, which is a different and still useful claim.</w:t>
+      </w:r>
+    </w:p>
+    <w:p>
+      <w:pPr>
+        <w:pStyle w:val="Heading2"/>
+      </w:pPr>
+      <w:r>
+        <w:t>The compute estimate was 64% too optimistic</w:t>
+      </w:r>
+    </w:p>
+    <w:p>
+      <w:pPr>
+        <w:spacing w:after="160"/>
+      </w:pPr>
+      <w:r>
+        <w:rPr>
+          <w:i w:val="0"/>
+          <w:sz w:val="24"/>
+        </w:rPr>
+        <w:t>Dividing a multiply count by a measured multiply rate gave 22.28 milliseconds for the Transformer. Timing the real graph on the chip gave 36.46. The LSTM is worse: 19.84 estimated against 35.07 measured. Both still fit inside the 40 milliseconds allowed, and the estimates remain useful for ranking models against each other, but they cannot be quoted as latencies now that measurements exist.</w:t>
+      </w:r>
+    </w:p>
+    <w:p>
+      <w:pPr>
+        <w:pStyle w:val="Heading2"/>
+      </w:pPr>
+      <w:r>
+        <w:t>Charge conservation cannot be tested at this horizon</w:t>
+      </w:r>
+    </w:p>
+    <w:p>
+      <w:pPr>
+        <w:spacing w:after="160"/>
+      </w:pPr>
+      <w:r>
+        <w:rPr>
+          <w:i w:val="0"/>
+          <w:sz w:val="24"/>
+        </w:rPr>
+        <w:t>The recorded charge channel does not move within a typical three-second window, so the equation has nothing to constrain. Enforcing it costs 4.4% accuracy and buys almost nothing. This was measured rather than argued.</w:t>
+      </w:r>
+    </w:p>
+    <w:p>
+      <w:pPr>
+        <w:pStyle w:val="Heading1"/>
+      </w:pPr>
+      <w:r>
+        <w:t>25. What changed from the original plan</w:t>
+      </w:r>
+    </w:p>
+    <w:p>
+      <w:pPr>
+        <w:spacing w:after="160"/>
+      </w:pPr>
+      <w:r>
+        <w:rPr>
+          <w:i w:val="0"/>
+          <w:sz w:val="24"/>
+        </w:rPr>
+        <w:t>Twenty-two changes, in two classes, and the distinction matters. Eleven were agreed in the design document before any code was written. Eleven more happened during the eight weeks, each one forced by something that had been measured.</w:t>
+      </w:r>
+    </w:p>
+    <w:p>
+      <w:pPr>
+        <w:pStyle w:val="Heading2"/>
+      </w:pPr>
+      <w:r>
+        <w:t>Agreed before implementation</w:t>
+      </w:r>
+    </w:p>
+    <w:p>
+      <w:pPr>
+        <w:spacing w:after="160"/>
+      </w:pPr>
+      <w:r>
+        <w:rPr>
+          <w:i w:val="0"/>
+          <w:sz w:val="24"/>
+        </w:rPr>
+        <w:t>It is Processor-in-the-Loop, not Hardware-in-the-Loop. The original used HIL throughout. HIL means real electrical hardware in the loop, with motors, power electronics and sensors. There is none of that here, only a processor. Reviewers in embedded and control venues spot a misused HIL immediately, and the correct term costs nothing.</w:t>
+      </w:r>
+    </w:p>
+    <w:p>
+      <w:pPr>
+        <w:spacing w:after="160"/>
+      </w:pPr>
+      <w:r>
+        <w:rPr>
+          <w:i w:val="0"/>
+          <w:sz w:val="24"/>
+        </w:rPr>
+        <w:t>The embedded work moved from last to first, which is the largest single change. The original schedules the ESP32 for weeks 10 and 11, after all the modelling is finished. That is the one arrangement in which a failure has no recovery: if the model does not fit in week 10, there is no time left to build a smaller one. The compute-feasibility question is now gate G1 in week 1, and the plan already names the fallback. This inversion is why the project knew in week 4, rather than week 10, that XGBoost was never deployable.</w:t>
+      </w:r>
+    </w:p>
+    <w:p>
+      <w:pPr>
+        <w:spacing w:after="160"/>
+      </w:pPr>
+      <w:r>
+        <w:rPr>
+          <w:i w:val="0"/>
+          <w:sz w:val="24"/>
+        </w:rPr>
+        <w:t>Real logged trips replaced a physics-generated dataset. The original creates the training data by pushing drive cycles through the physics model, which makes the thing being predicted a closed-form function of the very inputs used to predict it. The model then appears to do brilliantly while having learned nothing about a real car. The predecessor work has exactly this defect. This project trains on 72 real logged trips at 10 Hz instead.</w:t>
+      </w:r>
+    </w:p>
+    <w:p>
+      <w:pPr>
+        <w:spacing w:after="160"/>
+      </w:pPr>
+      <w:r>
+        <w:rPr>
+          <w:i w:val="0"/>
+          <w:sz w:val="24"/>
+        </w:rPr>
+        <w:t>Data is split by trip and never by row. The predecessor split 2,000 rows at random, and because consecutive rows come from the same drive a fraction of a second apart, near-identical samples landed on both sides. The model was effectively tested on data it had trained on, which inflates every score. Here no sample from a trip ever appears on both sides, and the calibration data used for 8-bit quantisation is drawn from training trips only, which is a subtler version of the same leak.</w:t>
+      </w:r>
+    </w:p>
+    <w:p>
+      <w:pPr>
+        <w:spacing w:after="160"/>
+      </w:pPr>
+      <w:r>
+        <w:rPr>
+          <w:i w:val="0"/>
+          <w:sz w:val="24"/>
+        </w:rPr>
+        <w:t>The communication task runs at 10 ms rather than 50. This was arithmetic rather than judgement: the original specifies a 10 ms control loop and a 50 ms communication task, and a loop cannot close five times faster than the messages it depends on arrive.</w:t>
+      </w:r>
+    </w:p>
+    <w:p>
+      <w:pPr>
+        <w:spacing w:after="160"/>
+      </w:pPr>
+      <w:r>
+        <w:rPr>
+          <w:i w:val="0"/>
+          <w:sz w:val="24"/>
+        </w:rPr>
+        <w:t>Budget first, then model. The model size is not chosen and then checked, it is derived from what gate G1 measured. The Transformer is 32 sequence steps, 32 units wide and 2 layers deep because that is what fits in 40 milliseconds on this chip.</w:t>
+      </w:r>
+    </w:p>
+    <w:p>
+      <w:pPr>
+        <w:spacing w:after="160"/>
+      </w:pPr>
+      <w:r>
+        <w:rPr>
+          <w:i w:val="0"/>
+          <w:sz w:val="24"/>
+        </w:rPr>
+        <w:t>The model comparison was rebuilt. Linear regression, random forest and XGBoost became a mandatory naive baseline, one strong tabular model, an LSTM fed genuinely sequential data, and a Transformer, each in plain and physics-informed versions at matched size. Re-running the LSTM correctly is deliberate: the predecessor flattened its data first, which removes the time ordering the architecture exists to exploit, and then reported that recurrent models underperform.</w:t>
+      </w:r>
+    </w:p>
+    <w:p>
+      <w:pPr>
+        <w:spacing w:after="160"/>
+      </w:pPr>
+      <w:r>
+        <w:rPr>
+          <w:i w:val="0"/>
+          <w:sz w:val="24"/>
+        </w:rPr>
+        <w:t>Gates, ablations and explicit non-claims are entirely new. Five gates each with a written action on failure; four numbered ablations; a metrics table with actual metrics where the original listed headings and left them empty; and a list of things this work will explicitly not claim. Stating the non-claims in advance is what allows two null results to be reported as findings rather than as embarrassments.</w:t>
+      </w:r>
+    </w:p>
+    <w:p>
+      <w:pPr>
+        <w:spacing w:after="160"/>
+      </w:pPr>
+      <w:r>
+        <w:rPr>
+          <w:i w:val="0"/>
+          <w:sz w:val="24"/>
+        </w:rPr>
+        <w:t>Thirteen scenario variations became six axes, keeping full robustness coverage at roughly half the runs.</w:t>
+      </w:r>
+    </w:p>
+    <w:p>
+      <w:pPr>
+        <w:spacing w:after="160"/>
+      </w:pPr>
+      <w:r>
+        <w:rPr>
+          <w:i w:val="0"/>
+          <w:sz w:val="24"/>
+        </w:rPr>
+        <w:t>The ESP32-S3 is the primary platform rather than the C6. Two processor cores matter enormously here, because the hard real-time loop is pinned to core 0 where inference on core 1 cannot disturb it. The single-core C6 cannot make that separation at all.</w:t>
+      </w:r>
+    </w:p>
+    <w:p>
+      <w:pPr>
+        <w:spacing w:after="160"/>
+      </w:pPr>
+      <w:r>
+        <w:rPr>
+          <w:i w:val="0"/>
+          <w:sz w:val="24"/>
+        </w:rPr>
+        <w:t>A second, independent dataset was added, held purely as an out-of-distribution check. Building and testing on one car answers whether the model fits; the question a reviewer actually asks is whether it transfers, and nothing in the original plan could have answered it.</w:t>
+      </w:r>
+    </w:p>
+    <w:p>
+      <w:pPr>
+        <w:pStyle w:val="Heading2"/>
+      </w:pPr>
+      <w:r>
+        <w:t>Changed in flight, because something was measured</w:t>
+      </w:r>
+    </w:p>
+    <w:p>
+      <w:pPr>
+        <w:spacing w:after="160"/>
+      </w:pPr>
+      <w:r>
+        <w:rPr>
+          <w:i w:val="0"/>
+          <w:sz w:val="24"/>
+        </w:rPr>
+        <w:t>These are the ones to be most transparent about, because each represents the plan meeting reality. In every case the measurement came first and the change followed.</w:t>
+      </w:r>
+    </w:p>
+    <w:p>
+      <w:pPr>
+        <w:spacing w:after="160"/>
+      </w:pPr>
+      <w:r>
+        <w:rPr>
+          <w:i w:val="0"/>
+          <w:sz w:val="24"/>
+        </w:rPr>
+        <w:t>Gate G2 was split into three parts instead of one pooled number, and this was the one revision the design document permits. Neither threshold was loosened; what changed is which part of the model each threshold is applied to. Applied literally the original criterion failed all seven trips at a median error of 23.7 percent, because that single number pooled three independent models and could not say which was wrong. Driving the plant with the archive's own logged torque drops the error to a median of 7.0 percent, inside the original bound on every trip. The revision is now spent and nothing else may be adjusted without the same treatment.</w:t>
+      </w:r>
+    </w:p>
+    <w:p>
+      <w:pPr>
+        <w:spacing w:after="160"/>
+      </w:pPr>
+      <w:r>
+        <w:rPr>
+          <w:i w:val="0"/>
+          <w:sz w:val="24"/>
+        </w:rPr>
+        <w:t>The control loop became pipelined rather than synchronous. Originally the chip sent a request and then waited for the reply inside the same 10 millisecond slot, tying its deadline to the scheduling behaviour of a general-purpose laptop. It now requests the next state and acts on the most recent one it holds, and the worst round trip fell from 7,405 microseconds to 77. This is a genuine trade rather than a free win, because the controller now acts on information one cycle old, and that cost is measured and reported.</w:t>
+      </w:r>
+    </w:p>
+    <w:p>
+      <w:pPr>
+        <w:spacing w:after="160"/>
+      </w:pPr>
+      <w:r>
+        <w:rPr>
+          <w:i w:val="0"/>
+          <w:sz w:val="24"/>
+        </w:rPr>
+        <w:t>The link runs over the chip's built-in USB rather than a separate adapter. The design deliberately left this open for gate G3 to settle on measured evidence, and the built-in peripheral carries the loop with zero corrupted and zero lost messages.</w:t>
+      </w:r>
+    </w:p>
+    <w:p>
+      <w:pPr>
+        <w:spacing w:after="160"/>
+      </w:pPr>
+      <w:r>
+        <w:rPr>
+          <w:i w:val="0"/>
+          <w:sz w:val="24"/>
+        </w:rPr>
+        <w:t>Three identified parameters were relabelled as lumped losses. The fitted rolling-resistance coefficient came out 2.2 times larger than an independent measurement on a comparable car, so it is not a tyre property. It is a coefficient occupying that place in the equation and absorbing every speed-dependent loss the model does not represent separately. The parameter file says so, and an automated test fails if that statement is removed.</w:t>
+      </w:r>
+    </w:p>
+    <w:p>
+      <w:pPr>
+        <w:spacing w:after="160"/>
+      </w:pPr>
+      <w:r>
+        <w:rPr>
+          <w:i w:val="0"/>
+          <w:sz w:val="24"/>
+        </w:rPr>
+        <w:t>One of the three physics constraints was switched off. Charge conservation has nothing to constrain over a three-second window, because the logged charge channel does not measurably move within one. Its weight is held at zero and the cost of switching it on is reported as its own arm rather than quietly omitted.</w:t>
+      </w:r>
+    </w:p>
+    <w:p>
+      <w:pPr>
+        <w:spacing w:after="160"/>
+      </w:pPr>
+      <w:r>
+        <w:rPr>
+          <w:i w:val="0"/>
+          <w:sz w:val="24"/>
+        </w:rPr>
+        <w:t>The message format grew to carry a real controller. The state message went from 8 numbers to 10 so that the laptop can send the target speed and its rate of change, the command message from 3 to 4, and the diagnostics message from 11 counters to 16. Gate G3 was then re-measured in full, because the loop the report describes has to be the loop that was measured.</w:t>
+      </w:r>
+    </w:p>
+    <w:p>
+      <w:pPr>
+        <w:spacing w:after="160"/>
+      </w:pPr>
+      <w:r>
+        <w:rPr>
+          <w:i w:val="0"/>
+          <w:sz w:val="24"/>
+        </w:rPr>
+        <w:t>The offline optimiser searches two dimensions rather than three. This is not a simplification for speed. With the speed trajectory fixed by the tracking constraint, the battery power limit can only ever remove power the speed controller needs, which the constraint forbids. It is a safety limiter and not an optimisation lever, and that applies to the learned controller in exactly the same way.</w:t>
+      </w:r>
+    </w:p>
+    <w:p>
+      <w:pPr>
+        <w:spacing w:after="160"/>
+      </w:pPr>
+      <w:r>
+        <w:rPr>
+          <w:i w:val="0"/>
+          <w:sz w:val="24"/>
+        </w:rPr>
+        <w:t>Controllers are now ranked with shed cabin heat charged back. Raw consumption is not comparable between controllers, because one that turns the heating down looks excellent without having managed any energy. Without this correction the week 8 table reads as the learned controller saving 1.3 percent; with it, the same controller is 0.66 percent worse, and the entire difference was 48 to 50 watt-hours of cabin heat per cycle.</w:t>
+      </w:r>
+    </w:p>
+    <w:p>
+      <w:pPr>
+        <w:spacing w:after="160"/>
+      </w:pPr>
+      <w:r>
+        <w:rPr>
+          <w:i w:val="0"/>
+          <w:sz w:val="24"/>
+        </w:rPr>
+        <w:t>The learned controller is 64 units wide rather than the library default of 256. The default would be 68,867 numbers and 269 kilobytes, which is 90 percent of the entire memory budget the forecaster also has to fit inside. At 64 wide it is 4,931 numbers and 19.3 kilobytes, and both figures were measured in a pilot run before the main campaign.</w:t>
+      </w:r>
+    </w:p>
+    <w:p>
+      <w:pPr>
+        <w:spacing w:after="160"/>
+      </w:pPr>
+      <w:r>
+        <w:rPr>
+          <w:i w:val="0"/>
+          <w:sz w:val="24"/>
+        </w:rPr>
+        <w:t>XGBoost and the LSTM ensemble were dropped as deployable options. XGBoost needs roughly 3.7 megabytes against a 300 kilobyte budget, over twelve times too large. The best-looking accuracy figure in the whole comparison was a five-model LSTM ensemble, which takes 99 milliseconds against a 40 millisecond budget. Both remain offline reference points, and the reported number is now always distinguished from the deployable one.</w:t>
+      </w:r>
+    </w:p>
+    <w:p>
+      <w:pPr>
+        <w:spacing w:after="160"/>
+      </w:pPr>
+      <w:r>
+        <w:rPr>
+          <w:i w:val="0"/>
+          <w:sz w:val="24"/>
+        </w:rPr>
+        <w:t>The watchdog was switched on and a fallback path built. Three different failures now get three different responses and three separate counters rather than one generic fault state, because collapsing them is how a controller ends up limping owing to a slow logging task. All three were then triggered deliberately on the board, plus a fourth test that hung the control task on purpose to confirm the watchdog resets the chip. A fallback path that has never been taken is a claim, not a result.</w:t>
+      </w:r>
+    </w:p>
+    <w:p>
+      <w:pPr>
+        <w:pStyle w:val="Heading1"/>
+      </w:pPr>
+      <w:r>
+        <w:t>26. What is left to do</w:t>
+      </w:r>
+    </w:p>
+    <w:p>
+      <w:pPr>
+        <w:spacing w:after="160"/>
+      </w:pPr>
+      <w:r>
+        <w:rPr>
+          <w:i w:val="0"/>
+          <w:sz w:val="24"/>
+        </w:rPr>
+        <w:t>Phase 1 and Phase 2 are complete. The remaining work is the controller, the on-chip deployment, and the measurement campaign.</w:t>
+      </w:r>
+    </w:p>
+    <w:tbl>
+      <w:tblPr>
+        <w:tblStyle w:val="LightGrid-Accent1"/>
+        <w:tblW w:type="auto" w:w="0"/>
+        <w:jc w:val="center"/>
+        <w:tblLook w:firstColumn="1" w:firstRow="1" w:lastColumn="0" w:lastRow="0" w:noHBand="0" w:noVBand="1" w:val="04A0"/>
+      </w:tblPr>
+      <w:tblGrid>
+        <w:gridCol w:w="2412"/>
+        <w:gridCol w:w="2412"/>
+        <w:gridCol w:w="2412"/>
+        <w:gridCol w:w="2412"/>
+      </w:tblGrid>
+      <w:tr>
+        <w:tc>
+          <w:tcPr>
             <w:tcW w:type="dxa" w:w="720"/>
           </w:tcPr>
           <w:p>
@@ -15728,7 +16274,7 @@
         <w:pStyle w:val="Heading1"/>
       </w:pPr>
       <w:r>
-        <w:t>26. Reproducing everything in this report</w:t>
+        <w:t>27. Reproducing everything in this report</w:t>
       </w:r>
     </w:p>
     <w:p>
@@ -16247,7 +16793,7 @@
               <w:rPr>
                 <w:sz w:val="20"/>
               </w:rPr>
-              <w:t>Build the firmware</w:t>
+              <w:t>Build and flash the firmware</w:t>
             </w:r>
           </w:p>
         </w:tc>
@@ -16261,7 +16807,7 @@
               <w:rPr>
                 <w:sz w:val="20"/>
               </w:rPr>
-              <w:t>./scripts/idf.sh build</w:t>
+              <w:t>./scripts/arduino_build.sh --flash</w:t>
             </w:r>
           </w:p>
         </w:tc>
@@ -16291,7 +16837,7 @@
               <w:rPr>
                 <w:sz w:val="20"/>
               </w:rPr>
-              <w:t>./scripts/idf.sh -DFAULT_INJECT=1 build &amp;&amp; ./scripts/idf.sh flash</w:t>
+              <w:t>./scripts/arduino_build.sh --flash -DFAULT_INJECT=1</w:t>
             </w:r>
           </w:p>
         </w:tc>
@@ -16307,7 +16853,7 @@
               <w:rPr>
                 <w:sz w:val="20"/>
               </w:rPr>
-              <w:t>Fallback path on hardware</w:t>
+              <w:t>Gate G1 on the chip</w:t>
             </w:r>
           </w:p>
         </w:tc>
@@ -16321,7 +16867,7 @@
               <w:rPr>
                 <w:sz w:val="20"/>
               </w:rPr>
-              <w:t>python3 scripts/run_fallback.py</w:t>
+              <w:t>./scripts/arduino_build.sh --flash -DRUN_G1_BENCHMARK=1</w:t>
             </w:r>
           </w:p>
         </w:tc>
@@ -16337,7 +16883,7 @@
               <w:rPr>
                 <w:sz w:val="20"/>
               </w:rPr>
-              <w:t>Watchdog on hardware (needs -DFAULT_INJECT=2)</w:t>
+              <w:t>Gate G5 encoder latency on the chip</w:t>
             </w:r>
           </w:p>
         </w:tc>
@@ -16351,7 +16897,7 @@
               <w:rPr>
                 <w:sz w:val="20"/>
               </w:rPr>
-              <w:t>python3 scripts/run_fallback.py --watchdog</w:t>
+              <w:t>./scripts/arduino_build.sh --flash -DRUN_G5_BENCHMARK=1</w:t>
             </w:r>
           </w:p>
         </w:tc>
@@ -16367,7 +16913,7 @@
               <w:rPr>
                 <w:sz w:val="20"/>
               </w:rPr>
-              <w:t>8-bit arithmetic, ablation A2 rungs one and two</w:t>
+              <w:t>Collect a benchmark's output</w:t>
             </w:r>
           </w:p>
         </w:tc>
@@ -16381,7 +16927,7 @@
               <w:rPr>
                 <w:sz w:val="20"/>
               </w:rPr>
-              <w:t>python3 scripts/run_a2.py</w:t>
+              <w:t>python3 scripts/capture_bench.py --tag G1</w:t>
             </w:r>
           </w:p>
         </w:tc>
@@ -16397,7 +16943,7 @@
               <w:rPr>
                 <w:sz w:val="20"/>
               </w:rPr>
-              <w:t>Distilled students, ablation A2 rung three</w:t>
+              <w:t>The same firmware under ESP-IDF, the reference build</w:t>
             </w:r>
           </w:p>
         </w:tc>
@@ -16411,7 +16957,7 @@
               <w:rPr>
                 <w:sz w:val="20"/>
               </w:rPr>
-              <w:t>python3 scripts/run_distill.py</w:t>
+              <w:t>./scripts/idf.sh build</w:t>
             </w:r>
           </w:p>
         </w:tc>
@@ -16427,6 +16973,126 @@
               <w:rPr>
                 <w:sz w:val="20"/>
               </w:rPr>
+              <w:t>Fallback path on hardware</w:t>
+            </w:r>
+          </w:p>
+        </w:tc>
+        <w:tc>
+          <w:tcPr>
+            <w:tcW w:type="dxa" w:w="5760"/>
+          </w:tcPr>
+          <w:p>
+            <w:r/>
+            <w:r>
+              <w:rPr>
+                <w:sz w:val="20"/>
+              </w:rPr>
+              <w:t>python3 scripts/run_fallback.py</w:t>
+            </w:r>
+          </w:p>
+        </w:tc>
+      </w:tr>
+      <w:tr>
+        <w:tc>
+          <w:tcPr>
+            <w:tcW w:type="dxa" w:w="3456"/>
+          </w:tcPr>
+          <w:p>
+            <w:r/>
+            <w:r>
+              <w:rPr>
+                <w:sz w:val="20"/>
+              </w:rPr>
+              <w:t>Watchdog on hardware (needs -DFAULT_INJECT=2)</w:t>
+            </w:r>
+          </w:p>
+        </w:tc>
+        <w:tc>
+          <w:tcPr>
+            <w:tcW w:type="dxa" w:w="5760"/>
+          </w:tcPr>
+          <w:p>
+            <w:r/>
+            <w:r>
+              <w:rPr>
+                <w:sz w:val="20"/>
+              </w:rPr>
+              <w:t>python3 scripts/run_fallback.py --watchdog</w:t>
+            </w:r>
+          </w:p>
+        </w:tc>
+      </w:tr>
+      <w:tr>
+        <w:tc>
+          <w:tcPr>
+            <w:tcW w:type="dxa" w:w="3456"/>
+          </w:tcPr>
+          <w:p>
+            <w:r/>
+            <w:r>
+              <w:rPr>
+                <w:sz w:val="20"/>
+              </w:rPr>
+              <w:t>8-bit arithmetic, ablation A2 rungs one and two</w:t>
+            </w:r>
+          </w:p>
+        </w:tc>
+        <w:tc>
+          <w:tcPr>
+            <w:tcW w:type="dxa" w:w="5760"/>
+          </w:tcPr>
+          <w:p>
+            <w:r/>
+            <w:r>
+              <w:rPr>
+                <w:sz w:val="20"/>
+              </w:rPr>
+              <w:t>python3 scripts/run_a2.py</w:t>
+            </w:r>
+          </w:p>
+        </w:tc>
+      </w:tr>
+      <w:tr>
+        <w:tc>
+          <w:tcPr>
+            <w:tcW w:type="dxa" w:w="3456"/>
+          </w:tcPr>
+          <w:p>
+            <w:r/>
+            <w:r>
+              <w:rPr>
+                <w:sz w:val="20"/>
+              </w:rPr>
+              <w:t>Distilled students, ablation A2 rung three</w:t>
+            </w:r>
+          </w:p>
+        </w:tc>
+        <w:tc>
+          <w:tcPr>
+            <w:tcW w:type="dxa" w:w="5760"/>
+          </w:tcPr>
+          <w:p>
+            <w:r/>
+            <w:r>
+              <w:rPr>
+                <w:sz w:val="20"/>
+              </w:rPr>
+              <w:t>python3 scripts/run_distill.py</w:t>
+            </w:r>
+          </w:p>
+        </w:tc>
+      </w:tr>
+      <w:tr>
+        <w:tc>
+          <w:tcPr>
+            <w:tcW w:type="dxa" w:w="3456"/>
+          </w:tcPr>
+          <w:p>
+            <w:r/>
+            <w:r>
+              <w:rPr>
+                <w:sz w:val="20"/>
+              </w:rPr>
               <w:t>Ablation A4 build (handling off)</w:t>
             </w:r>
           </w:p>
@@ -16441,7 +17107,37 @@
               <w:rPr>
                 <w:sz w:val="20"/>
               </w:rPr>
-              <w:t>./scripts/idf.sh -DFAULT_INJECT=1 -DFALLBACK_ENABLED=0 build</w:t>
+              <w:t>./scripts/arduino_build.sh --flash -DFAULT_INJECT=1 -DFALLBACK_ENABLED=0</w:t>
+            </w:r>
+          </w:p>
+        </w:tc>
+      </w:tr>
+      <w:tr>
+        <w:tc>
+          <w:tcPr>
+            <w:tcW w:type="dxa" w:w="3456"/>
+          </w:tcPr>
+          <w:p>
+            <w:r/>
+            <w:r>
+              <w:rPr>
+                <w:sz w:val="20"/>
+              </w:rPr>
+              <w:t>Ablation A4 with the loop closed</w:t>
+            </w:r>
+          </w:p>
+        </w:tc>
+        <w:tc>
+          <w:tcPr>
+            <w:tcW w:type="dxa" w:w="5760"/>
+          </w:tcPr>
+          <w:p>
+            <w:r/>
+            <w:r>
+              <w:rPr>
+                <w:sz w:val="20"/>
+              </w:rPr>
+              <w:t>python3 scripts/run_a4_closedloop.py --fallback-off</w:t>
             </w:r>
           </w:p>
         </w:tc>

</xml_diff>

<commit_message>
Regenerate the report from the complete campaign (criterion 5)
Every PIL number in it is rendered from docs/week10-pil-campaign.json, and
tests/test_report_pil_parity.py reads the .docx back and checks each cell
against that file, so the document and the measurements cannot disagree.

Co-Authored-By: Claude Opus 5 <noreply@anthropic.com>
</commit_message>
<xml_diff>
--- a/reports/EV-PIL-status-report.docx
+++ b/reports/EV-PIL-status-report.docx
@@ -14546,7 +14546,7 @@
           <w:i w:val="0"/>
           <w:sz w:val="24"/>
         </w:rPr>
-        <w:t>The chain from a trained policy to a running one has four links, and each is checked against the one before it. Building that chain found a real fault: the test that compares the C controller against Python was, for a while, compiling the wrong weights and comparing them against themselves. It passed for exactly as long as no policy had been deployed. Section 26 records it.</w:t>
+        <w:t>The chain from a trained policy to a running one has four links, and each is checked against the one before it. Building that chain found a real fault: the test that compares the C controller against Python was, for a while, compiling the wrong weights and comparing them against themselves. It passed for exactly as long as no policy had been deployed. Section 27 records it.</w:t>
       </w:r>
     </w:p>
     <w:p>
@@ -16491,7 +16491,2702 @@
         <w:pStyle w:val="Heading1"/>
       </w:pPr>
       <w:r>
-        <w:t>26. Results that went against expectation</w:t>
+        <w:t>26. The two controllers across six kinds of driving</w:t>
+      </w:r>
+    </w:p>
+    <w:p>
+      <w:pPr>
+        <w:spacing w:after="160"/>
+      </w:pPr>
+      <w:r>
+        <w:rPr>
+          <w:i w:val="0"/>
+          <w:sz w:val="24"/>
+        </w:rPr>
+        <w:t>Every result before this one compares the two energy managers under one set of conditions at a time. This campaign, the processor-in-the-loop or PIL campaign that week 10 of the plan calls for, varies the conditions instead. Six things that a real vehicle meets and a laboratory cycle does not, namely the kind of road, its slope, how full the battery is, how noisy the sensors are, how late the communication link answers and how hard the driver pushes, are each swept across three settings, with both controllers run on the chip against every one of them.</w:t>
+      </w:r>
+    </w:p>
+    <w:p>
+      <w:pPr>
+        <w:spacing w:after="160"/>
+      </w:pPr>
+      <w:r>
+        <w:rPr>
+          <w:i w:val="0"/>
+          <w:sz w:val="24"/>
+        </w:rPr>
+        <w:t>The arrangement is the same as the failure-handling experiment in section 20: the real control software runs on the microcontroller a hundred times a second, and the validated vehicle model runs on the laptop and answers with what the car would do. The difference is what is being asked. That experiment broke the link on purpose and asked what a fault costs. This one leaves everything working and asks what ordinary variation costs.</w:t>
+      </w:r>
+    </w:p>
+    <w:p>
+      <w:pPr>
+        <w:spacing w:after="160"/>
+      </w:pPr>
+      <w:r>
+        <w:rPr>
+          <w:i w:val="0"/>
+          <w:sz w:val="24"/>
+        </w:rPr>
+        <w:t>One thing is varied at a time, so that a number can be attributed to the thing that moved. Energy is reported on the comparable scale used throughout this report: heating the controller chose not to supply is charged back at what it saved, because a controller that turns the heater off is not managing energy, it is just supplying less of it.</w:t>
+      </w:r>
+    </w:p>
+    <w:tbl>
+      <w:tblPr>
+        <w:tblStyle w:val="LightGrid-Accent1"/>
+        <w:tblW w:type="auto" w:w="0"/>
+        <w:jc w:val="center"/>
+        <w:tblLook w:firstColumn="1" w:firstRow="1" w:lastColumn="0" w:lastRow="0" w:noHBand="0" w:noVBand="1" w:val="04A0"/>
+      </w:tblPr>
+      <w:tblGrid>
+        <w:gridCol w:w="1608"/>
+        <w:gridCol w:w="1608"/>
+        <w:gridCol w:w="1608"/>
+        <w:gridCol w:w="1608"/>
+        <w:gridCol w:w="1608"/>
+        <w:gridCol w:w="1608"/>
+      </w:tblGrid>
+      <w:tr>
+        <w:tc>
+          <w:tcPr>
+            <w:tcW w:type="dxa" w:w="1608"/>
+          </w:tcPr>
+          <w:p>
+            <w:r/>
+            <w:r>
+              <w:rPr>
+                <w:b/>
+                <w:sz w:val="20"/>
+              </w:rPr>
+              <w:t>Varied</w:t>
+            </w:r>
+          </w:p>
+        </w:tc>
+        <w:tc>
+          <w:tcPr>
+            <w:tcW w:type="dxa" w:w="1608"/>
+          </w:tcPr>
+          <w:p>
+            <w:r/>
+            <w:r>
+              <w:rPr>
+                <w:b/>
+                <w:sz w:val="20"/>
+              </w:rPr>
+              <w:t>Setting</w:t>
+            </w:r>
+          </w:p>
+        </w:tc>
+        <w:tc>
+          <w:tcPr>
+            <w:tcW w:type="dxa" w:w="1608"/>
+          </w:tcPr>
+          <w:p>
+            <w:r/>
+            <w:r>
+              <w:rPr>
+                <w:b/>
+                <w:sz w:val="20"/>
+              </w:rPr>
+              <w:t>Rules: tracking error, m/s</w:t>
+            </w:r>
+          </w:p>
+        </w:tc>
+        <w:tc>
+          <w:tcPr>
+            <w:tcW w:type="dxa" w:w="1608"/>
+          </w:tcPr>
+          <w:p>
+            <w:r/>
+            <w:r>
+              <w:rPr>
+                <w:b/>
+                <w:sz w:val="20"/>
+              </w:rPr>
+              <w:t>Learned: tracking error, m/s</w:t>
+            </w:r>
+          </w:p>
+        </w:tc>
+        <w:tc>
+          <w:tcPr>
+            <w:tcW w:type="dxa" w:w="1608"/>
+          </w:tcPr>
+          <w:p>
+            <w:r/>
+            <w:r>
+              <w:rPr>
+                <w:b/>
+                <w:sz w:val="20"/>
+              </w:rPr>
+              <w:t>Rules: energy, Wh/km</w:t>
+            </w:r>
+          </w:p>
+        </w:tc>
+        <w:tc>
+          <w:tcPr>
+            <w:tcW w:type="dxa" w:w="1608"/>
+          </w:tcPr>
+          <w:p>
+            <w:r/>
+            <w:r>
+              <w:rPr>
+                <w:b/>
+                <w:sz w:val="20"/>
+              </w:rPr>
+              <w:t>Learned: energy, Wh/km</w:t>
+            </w:r>
+          </w:p>
+        </w:tc>
+      </w:tr>
+      <w:tr>
+        <w:tc>
+          <w:tcPr>
+            <w:tcW w:type="dxa" w:w="1608"/>
+          </w:tcPr>
+          <w:p>
+            <w:r/>
+            <w:r>
+              <w:rPr>
+                <w:sz w:val="20"/>
+              </w:rPr>
+              <w:t>Driving condition</w:t>
+            </w:r>
+          </w:p>
+        </w:tc>
+        <w:tc>
+          <w:tcPr>
+            <w:tcW w:type="dxa" w:w="1608"/>
+          </w:tcPr>
+          <w:p>
+            <w:r/>
+            <w:r>
+              <w:rPr>
+                <w:sz w:val="20"/>
+              </w:rPr>
+              <w:t>urban</w:t>
+            </w:r>
+          </w:p>
+        </w:tc>
+        <w:tc>
+          <w:tcPr>
+            <w:tcW w:type="dxa" w:w="1608"/>
+          </w:tcPr>
+          <w:p>
+            <w:r/>
+            <w:r>
+              <w:rPr>
+                <w:sz w:val="20"/>
+              </w:rPr>
+              <w:t>0.0118</w:t>
+            </w:r>
+          </w:p>
+        </w:tc>
+        <w:tc>
+          <w:tcPr>
+            <w:tcW w:type="dxa" w:w="1608"/>
+          </w:tcPr>
+          <w:p>
+            <w:r/>
+            <w:r>
+              <w:rPr>
+                <w:sz w:val="20"/>
+              </w:rPr>
+              <w:t>0.0090</w:t>
+            </w:r>
+          </w:p>
+        </w:tc>
+        <w:tc>
+          <w:tcPr>
+            <w:tcW w:type="dxa" w:w="1608"/>
+          </w:tcPr>
+          <w:p>
+            <w:r/>
+            <w:r>
+              <w:rPr>
+                <w:sz w:val="20"/>
+              </w:rPr>
+              <w:t>168.11</w:t>
+            </w:r>
+          </w:p>
+        </w:tc>
+        <w:tc>
+          <w:tcPr>
+            <w:tcW w:type="dxa" w:w="1608"/>
+          </w:tcPr>
+          <w:p>
+            <w:r/>
+            <w:r>
+              <w:rPr>
+                <w:sz w:val="20"/>
+              </w:rPr>
+              <w:t>168.56</w:t>
+            </w:r>
+          </w:p>
+        </w:tc>
+      </w:tr>
+      <w:tr>
+        <w:tc>
+          <w:tcPr>
+            <w:tcW w:type="dxa" w:w="1608"/>
+          </w:tcPr>
+          <w:p>
+            <w:r/>
+            <w:r>
+              <w:rPr>
+                <w:sz w:val="20"/>
+              </w:rPr>
+              <w:t>Driving condition</w:t>
+            </w:r>
+          </w:p>
+        </w:tc>
+        <w:tc>
+          <w:tcPr>
+            <w:tcW w:type="dxa" w:w="1608"/>
+          </w:tcPr>
+          <w:p>
+            <w:r/>
+            <w:r>
+              <w:rPr>
+                <w:sz w:val="20"/>
+              </w:rPr>
+              <w:t>highway</w:t>
+            </w:r>
+          </w:p>
+        </w:tc>
+        <w:tc>
+          <w:tcPr>
+            <w:tcW w:type="dxa" w:w="1608"/>
+          </w:tcPr>
+          <w:p>
+            <w:r/>
+            <w:r>
+              <w:rPr>
+                <w:sz w:val="20"/>
+              </w:rPr>
+              <w:t>0.0092</w:t>
+            </w:r>
+          </w:p>
+        </w:tc>
+        <w:tc>
+          <w:tcPr>
+            <w:tcW w:type="dxa" w:w="1608"/>
+          </w:tcPr>
+          <w:p>
+            <w:r/>
+            <w:r>
+              <w:rPr>
+                <w:sz w:val="20"/>
+              </w:rPr>
+              <w:t>0.0030</w:t>
+            </w:r>
+          </w:p>
+        </w:tc>
+        <w:tc>
+          <w:tcPr>
+            <w:tcW w:type="dxa" w:w="1608"/>
+          </w:tcPr>
+          <w:p>
+            <w:r/>
+            <w:r>
+              <w:rPr>
+                <w:sz w:val="20"/>
+              </w:rPr>
+              <w:t>154.01</w:t>
+            </w:r>
+          </w:p>
+        </w:tc>
+        <w:tc>
+          <w:tcPr>
+            <w:tcW w:type="dxa" w:w="1608"/>
+          </w:tcPr>
+          <w:p>
+            <w:r/>
+            <w:r>
+              <w:rPr>
+                <w:sz w:val="20"/>
+              </w:rPr>
+              <w:t>154.14</w:t>
+            </w:r>
+          </w:p>
+        </w:tc>
+      </w:tr>
+      <w:tr>
+        <w:tc>
+          <w:tcPr>
+            <w:tcW w:type="dxa" w:w="1608"/>
+          </w:tcPr>
+          <w:p>
+            <w:r/>
+            <w:r>
+              <w:rPr>
+                <w:sz w:val="20"/>
+              </w:rPr>
+              <w:t>Driving condition</w:t>
+            </w:r>
+          </w:p>
+        </w:tc>
+        <w:tc>
+          <w:tcPr>
+            <w:tcW w:type="dxa" w:w="1608"/>
+          </w:tcPr>
+          <w:p>
+            <w:r/>
+            <w:r>
+              <w:rPr>
+                <w:sz w:val="20"/>
+              </w:rPr>
+              <w:t>aggressive mixed</w:t>
+            </w:r>
+          </w:p>
+        </w:tc>
+        <w:tc>
+          <w:tcPr>
+            <w:tcW w:type="dxa" w:w="1608"/>
+          </w:tcPr>
+          <w:p>
+            <w:r/>
+            <w:r>
+              <w:rPr>
+                <w:sz w:val="20"/>
+              </w:rPr>
+              <w:t>0.0163</w:t>
+            </w:r>
+          </w:p>
+        </w:tc>
+        <w:tc>
+          <w:tcPr>
+            <w:tcW w:type="dxa" w:w="1608"/>
+          </w:tcPr>
+          <w:p>
+            <w:r/>
+            <w:r>
+              <w:rPr>
+                <w:sz w:val="20"/>
+              </w:rPr>
+              <w:t>0.0125</w:t>
+            </w:r>
+          </w:p>
+        </w:tc>
+        <w:tc>
+          <w:tcPr>
+            <w:tcW w:type="dxa" w:w="1608"/>
+          </w:tcPr>
+          <w:p>
+            <w:r/>
+            <w:r>
+              <w:rPr>
+                <w:sz w:val="20"/>
+              </w:rPr>
+              <w:t>190.79</w:t>
+            </w:r>
+          </w:p>
+        </w:tc>
+        <w:tc>
+          <w:tcPr>
+            <w:tcW w:type="dxa" w:w="1608"/>
+          </w:tcPr>
+          <w:p>
+            <w:r/>
+            <w:r>
+              <w:rPr>
+                <w:sz w:val="20"/>
+              </w:rPr>
+              <w:t>176.53</w:t>
+            </w:r>
+          </w:p>
+        </w:tc>
+      </w:tr>
+      <w:tr>
+        <w:tc>
+          <w:tcPr>
+            <w:tcW w:type="dxa" w:w="1608"/>
+          </w:tcPr>
+          <w:p>
+            <w:r/>
+            <w:r>
+              <w:rPr>
+                <w:sz w:val="20"/>
+              </w:rPr>
+              <w:t>Road grade</w:t>
+            </w:r>
+          </w:p>
+        </w:tc>
+        <w:tc>
+          <w:tcPr>
+            <w:tcW w:type="dxa" w:w="1608"/>
+          </w:tcPr>
+          <w:p>
+            <w:r/>
+            <w:r>
+              <w:rPr>
+                <w:sz w:val="20"/>
+              </w:rPr>
+              <w:t>uphill</w:t>
+            </w:r>
+          </w:p>
+        </w:tc>
+        <w:tc>
+          <w:tcPr>
+            <w:tcW w:type="dxa" w:w="1608"/>
+          </w:tcPr>
+          <w:p>
+            <w:r/>
+            <w:r>
+              <w:rPr>
+                <w:sz w:val="20"/>
+              </w:rPr>
+              <w:t>0.0324</w:t>
+            </w:r>
+          </w:p>
+        </w:tc>
+        <w:tc>
+          <w:tcPr>
+            <w:tcW w:type="dxa" w:w="1608"/>
+          </w:tcPr>
+          <w:p>
+            <w:r/>
+            <w:r>
+              <w:rPr>
+                <w:sz w:val="20"/>
+              </w:rPr>
+              <w:t>0.0092</w:t>
+            </w:r>
+          </w:p>
+        </w:tc>
+        <w:tc>
+          <w:tcPr>
+            <w:tcW w:type="dxa" w:w="1608"/>
+          </w:tcPr>
+          <w:p>
+            <w:r/>
+            <w:r>
+              <w:rPr>
+                <w:sz w:val="20"/>
+              </w:rPr>
+              <w:t>305.14</w:t>
+            </w:r>
+          </w:p>
+        </w:tc>
+        <w:tc>
+          <w:tcPr>
+            <w:tcW w:type="dxa" w:w="1608"/>
+          </w:tcPr>
+          <w:p>
+            <w:r/>
+            <w:r>
+              <w:rPr>
+                <w:sz w:val="20"/>
+              </w:rPr>
+              <w:t>274.20</w:t>
+            </w:r>
+          </w:p>
+        </w:tc>
+      </w:tr>
+      <w:tr>
+        <w:tc>
+          <w:tcPr>
+            <w:tcW w:type="dxa" w:w="1608"/>
+          </w:tcPr>
+          <w:p>
+            <w:r/>
+            <w:r>
+              <w:rPr>
+                <w:sz w:val="20"/>
+              </w:rPr>
+              <w:t>Road grade</w:t>
+            </w:r>
+          </w:p>
+        </w:tc>
+        <w:tc>
+          <w:tcPr>
+            <w:tcW w:type="dxa" w:w="1608"/>
+          </w:tcPr>
+          <w:p>
+            <w:r/>
+            <w:r>
+              <w:rPr>
+                <w:sz w:val="20"/>
+              </w:rPr>
+              <w:t>flat</w:t>
+            </w:r>
+          </w:p>
+        </w:tc>
+        <w:tc>
+          <w:tcPr>
+            <w:tcW w:type="dxa" w:w="1608"/>
+          </w:tcPr>
+          <w:p>
+            <w:r/>
+            <w:r>
+              <w:rPr>
+                <w:sz w:val="20"/>
+              </w:rPr>
+              <w:t>0.0323</w:t>
+            </w:r>
+          </w:p>
+        </w:tc>
+        <w:tc>
+          <w:tcPr>
+            <w:tcW w:type="dxa" w:w="1608"/>
+          </w:tcPr>
+          <w:p>
+            <w:r/>
+            <w:r>
+              <w:rPr>
+                <w:sz w:val="20"/>
+              </w:rPr>
+              <w:t>0.0127</w:t>
+            </w:r>
+          </w:p>
+        </w:tc>
+        <w:tc>
+          <w:tcPr>
+            <w:tcW w:type="dxa" w:w="1608"/>
+          </w:tcPr>
+          <w:p>
+            <w:r/>
+            <w:r>
+              <w:rPr>
+                <w:sz w:val="20"/>
+              </w:rPr>
+              <w:t>191.16</w:t>
+            </w:r>
+          </w:p>
+        </w:tc>
+        <w:tc>
+          <w:tcPr>
+            <w:tcW w:type="dxa" w:w="1608"/>
+          </w:tcPr>
+          <w:p>
+            <w:r/>
+            <w:r>
+              <w:rPr>
+                <w:sz w:val="20"/>
+              </w:rPr>
+              <w:t>176.77</w:t>
+            </w:r>
+          </w:p>
+        </w:tc>
+      </w:tr>
+      <w:tr>
+        <w:tc>
+          <w:tcPr>
+            <w:tcW w:type="dxa" w:w="1608"/>
+          </w:tcPr>
+          <w:p>
+            <w:r/>
+            <w:r>
+              <w:rPr>
+                <w:sz w:val="20"/>
+              </w:rPr>
+              <w:t>Road grade</w:t>
+            </w:r>
+          </w:p>
+        </w:tc>
+        <w:tc>
+          <w:tcPr>
+            <w:tcW w:type="dxa" w:w="1608"/>
+          </w:tcPr>
+          <w:p>
+            <w:r/>
+            <w:r>
+              <w:rPr>
+                <w:sz w:val="20"/>
+              </w:rPr>
+              <w:t>downhill</w:t>
+            </w:r>
+          </w:p>
+        </w:tc>
+        <w:tc>
+          <w:tcPr>
+            <w:tcW w:type="dxa" w:w="1608"/>
+          </w:tcPr>
+          <w:p>
+            <w:r/>
+            <w:r>
+              <w:rPr>
+                <w:sz w:val="20"/>
+              </w:rPr>
+              <w:t>0.0183</w:t>
+            </w:r>
+          </w:p>
+        </w:tc>
+        <w:tc>
+          <w:tcPr>
+            <w:tcW w:type="dxa" w:w="1608"/>
+          </w:tcPr>
+          <w:p>
+            <w:r/>
+            <w:r>
+              <w:rPr>
+                <w:sz w:val="20"/>
+              </w:rPr>
+              <w:t>0.0180</w:t>
+            </w:r>
+          </w:p>
+        </w:tc>
+        <w:tc>
+          <w:tcPr>
+            <w:tcW w:type="dxa" w:w="1608"/>
+          </w:tcPr>
+          <w:p>
+            <w:r/>
+            <w:r>
+              <w:rPr>
+                <w:sz w:val="20"/>
+              </w:rPr>
+              <w:t>79.67</w:t>
+            </w:r>
+          </w:p>
+        </w:tc>
+        <w:tc>
+          <w:tcPr>
+            <w:tcW w:type="dxa" w:w="1608"/>
+          </w:tcPr>
+          <w:p>
+            <w:r/>
+            <w:r>
+              <w:rPr>
+                <w:sz w:val="20"/>
+              </w:rPr>
+              <w:t>75.85</w:t>
+            </w:r>
+          </w:p>
+        </w:tc>
+      </w:tr>
+      <w:tr>
+        <w:tc>
+          <w:tcPr>
+            <w:tcW w:type="dxa" w:w="1608"/>
+          </w:tcPr>
+          <w:p>
+            <w:r/>
+            <w:r>
+              <w:rPr>
+                <w:sz w:val="20"/>
+              </w:rPr>
+              <w:t>Battery state</w:t>
+            </w:r>
+          </w:p>
+        </w:tc>
+        <w:tc>
+          <w:tcPr>
+            <w:tcW w:type="dxa" w:w="1608"/>
+          </w:tcPr>
+          <w:p>
+            <w:r/>
+            <w:r>
+              <w:rPr>
+                <w:sz w:val="20"/>
+              </w:rPr>
+              <w:t>high</w:t>
+            </w:r>
+          </w:p>
+        </w:tc>
+        <w:tc>
+          <w:tcPr>
+            <w:tcW w:type="dxa" w:w="1608"/>
+          </w:tcPr>
+          <w:p>
+            <w:r/>
+            <w:r>
+              <w:rPr>
+                <w:sz w:val="20"/>
+              </w:rPr>
+              <w:t>0.0107</w:t>
+            </w:r>
+          </w:p>
+        </w:tc>
+        <w:tc>
+          <w:tcPr>
+            <w:tcW w:type="dxa" w:w="1608"/>
+          </w:tcPr>
+          <w:p>
+            <w:r/>
+            <w:r>
+              <w:rPr>
+                <w:sz w:val="20"/>
+              </w:rPr>
+              <w:t>0.0114</w:t>
+            </w:r>
+          </w:p>
+        </w:tc>
+        <w:tc>
+          <w:tcPr>
+            <w:tcW w:type="dxa" w:w="1608"/>
+          </w:tcPr>
+          <w:p>
+            <w:r/>
+            <w:r>
+              <w:rPr>
+                <w:sz w:val="20"/>
+              </w:rPr>
+              <w:t>190.66</w:t>
+            </w:r>
+          </w:p>
+        </w:tc>
+        <w:tc>
+          <w:tcPr>
+            <w:tcW w:type="dxa" w:w="1608"/>
+          </w:tcPr>
+          <w:p>
+            <w:r/>
+            <w:r>
+              <w:rPr>
+                <w:sz w:val="20"/>
+              </w:rPr>
+              <w:t>176.52</w:t>
+            </w:r>
+          </w:p>
+        </w:tc>
+      </w:tr>
+      <w:tr>
+        <w:tc>
+          <w:tcPr>
+            <w:tcW w:type="dxa" w:w="1608"/>
+          </w:tcPr>
+          <w:p>
+            <w:r/>
+            <w:r>
+              <w:rPr>
+                <w:sz w:val="20"/>
+              </w:rPr>
+              <w:t>Battery state</w:t>
+            </w:r>
+          </w:p>
+        </w:tc>
+        <w:tc>
+          <w:tcPr>
+            <w:tcW w:type="dxa" w:w="1608"/>
+          </w:tcPr>
+          <w:p>
+            <w:r/>
+            <w:r>
+              <w:rPr>
+                <w:sz w:val="20"/>
+              </w:rPr>
+              <w:t>medium</w:t>
+            </w:r>
+          </w:p>
+        </w:tc>
+        <w:tc>
+          <w:tcPr>
+            <w:tcW w:type="dxa" w:w="1608"/>
+          </w:tcPr>
+          <w:p>
+            <w:r/>
+            <w:r>
+              <w:rPr>
+                <w:sz w:val="20"/>
+              </w:rPr>
+              <w:t>0.0096</w:t>
+            </w:r>
+          </w:p>
+        </w:tc>
+        <w:tc>
+          <w:tcPr>
+            <w:tcW w:type="dxa" w:w="1608"/>
+          </w:tcPr>
+          <w:p>
+            <w:r/>
+            <w:r>
+              <w:rPr>
+                <w:sz w:val="20"/>
+              </w:rPr>
+              <w:t>0.0145</w:t>
+            </w:r>
+          </w:p>
+        </w:tc>
+        <w:tc>
+          <w:tcPr>
+            <w:tcW w:type="dxa" w:w="1608"/>
+          </w:tcPr>
+          <w:p>
+            <w:r/>
+            <w:r>
+              <w:rPr>
+                <w:sz w:val="20"/>
+              </w:rPr>
+              <w:t>190.61</w:t>
+            </w:r>
+          </w:p>
+        </w:tc>
+        <w:tc>
+          <w:tcPr>
+            <w:tcW w:type="dxa" w:w="1608"/>
+          </w:tcPr>
+          <w:p>
+            <w:r/>
+            <w:r>
+              <w:rPr>
+                <w:sz w:val="20"/>
+              </w:rPr>
+              <w:t>176.33</w:t>
+            </w:r>
+          </w:p>
+        </w:tc>
+      </w:tr>
+      <w:tr>
+        <w:tc>
+          <w:tcPr>
+            <w:tcW w:type="dxa" w:w="1608"/>
+          </w:tcPr>
+          <w:p>
+            <w:r/>
+            <w:r>
+              <w:rPr>
+                <w:sz w:val="20"/>
+              </w:rPr>
+              <w:t>Battery state</w:t>
+            </w:r>
+          </w:p>
+        </w:tc>
+        <w:tc>
+          <w:tcPr>
+            <w:tcW w:type="dxa" w:w="1608"/>
+          </w:tcPr>
+          <w:p>
+            <w:r/>
+            <w:r>
+              <w:rPr>
+                <w:sz w:val="20"/>
+              </w:rPr>
+              <w:t>low</w:t>
+            </w:r>
+          </w:p>
+        </w:tc>
+        <w:tc>
+          <w:tcPr>
+            <w:tcW w:type="dxa" w:w="1608"/>
+          </w:tcPr>
+          <w:p>
+            <w:r/>
+            <w:r>
+              <w:rPr>
+                <w:sz w:val="20"/>
+              </w:rPr>
+              <w:t>0.0146</w:t>
+            </w:r>
+          </w:p>
+        </w:tc>
+        <w:tc>
+          <w:tcPr>
+            <w:tcW w:type="dxa" w:w="1608"/>
+          </w:tcPr>
+          <w:p>
+            <w:r/>
+            <w:r>
+              <w:rPr>
+                <w:sz w:val="20"/>
+              </w:rPr>
+              <w:t>0.0107</w:t>
+            </w:r>
+          </w:p>
+        </w:tc>
+        <w:tc>
+          <w:tcPr>
+            <w:tcW w:type="dxa" w:w="1608"/>
+          </w:tcPr>
+          <w:p>
+            <w:r/>
+            <w:r>
+              <w:rPr>
+                <w:sz w:val="20"/>
+              </w:rPr>
+              <w:t>190.47</w:t>
+            </w:r>
+          </w:p>
+        </w:tc>
+        <w:tc>
+          <w:tcPr>
+            <w:tcW w:type="dxa" w:w="1608"/>
+          </w:tcPr>
+          <w:p>
+            <w:r/>
+            <w:r>
+              <w:rPr>
+                <w:sz w:val="20"/>
+              </w:rPr>
+              <w:t>176.62</w:t>
+            </w:r>
+          </w:p>
+        </w:tc>
+      </w:tr>
+      <w:tr>
+        <w:tc>
+          <w:tcPr>
+            <w:tcW w:type="dxa" w:w="1608"/>
+          </w:tcPr>
+          <w:p>
+            <w:r/>
+            <w:r>
+              <w:rPr>
+                <w:sz w:val="20"/>
+              </w:rPr>
+              <w:t>Sensor noise</w:t>
+            </w:r>
+          </w:p>
+        </w:tc>
+        <w:tc>
+          <w:tcPr>
+            <w:tcW w:type="dxa" w:w="1608"/>
+          </w:tcPr>
+          <w:p>
+            <w:r/>
+            <w:r>
+              <w:rPr>
+                <w:sz w:val="20"/>
+              </w:rPr>
+              <w:t>floor</w:t>
+            </w:r>
+          </w:p>
+        </w:tc>
+        <w:tc>
+          <w:tcPr>
+            <w:tcW w:type="dxa" w:w="1608"/>
+          </w:tcPr>
+          <w:p>
+            <w:r/>
+            <w:r>
+              <w:rPr>
+                <w:sz w:val="20"/>
+              </w:rPr>
+              <w:t>0.0290</w:t>
+            </w:r>
+          </w:p>
+        </w:tc>
+        <w:tc>
+          <w:tcPr>
+            <w:tcW w:type="dxa" w:w="1608"/>
+          </w:tcPr>
+          <w:p>
+            <w:r/>
+            <w:r>
+              <w:rPr>
+                <w:sz w:val="20"/>
+              </w:rPr>
+              <w:t>0.0181</w:t>
+            </w:r>
+          </w:p>
+        </w:tc>
+        <w:tc>
+          <w:tcPr>
+            <w:tcW w:type="dxa" w:w="1608"/>
+          </w:tcPr>
+          <w:p>
+            <w:r/>
+            <w:r>
+              <w:rPr>
+                <w:sz w:val="20"/>
+              </w:rPr>
+              <w:t>191.04</w:t>
+            </w:r>
+          </w:p>
+        </w:tc>
+        <w:tc>
+          <w:tcPr>
+            <w:tcW w:type="dxa" w:w="1608"/>
+          </w:tcPr>
+          <w:p>
+            <w:r/>
+            <w:r>
+              <w:rPr>
+                <w:sz w:val="20"/>
+              </w:rPr>
+              <w:t>176.23</w:t>
+            </w:r>
+          </w:p>
+        </w:tc>
+      </w:tr>
+      <w:tr>
+        <w:tc>
+          <w:tcPr>
+            <w:tcW w:type="dxa" w:w="1608"/>
+          </w:tcPr>
+          <w:p>
+            <w:r/>
+            <w:r>
+              <w:rPr>
+                <w:sz w:val="20"/>
+              </w:rPr>
+              <w:t>Sensor noise</w:t>
+            </w:r>
+          </w:p>
+        </w:tc>
+        <w:tc>
+          <w:tcPr>
+            <w:tcW w:type="dxa" w:w="1608"/>
+          </w:tcPr>
+          <w:p>
+            <w:r/>
+            <w:r>
+              <w:rPr>
+                <w:sz w:val="20"/>
+              </w:rPr>
+              <w:t>elevated</w:t>
+            </w:r>
+          </w:p>
+        </w:tc>
+        <w:tc>
+          <w:tcPr>
+            <w:tcW w:type="dxa" w:w="1608"/>
+          </w:tcPr>
+          <w:p>
+            <w:r/>
+            <w:r>
+              <w:rPr>
+                <w:sz w:val="20"/>
+              </w:rPr>
+              <w:t>0.0465</w:t>
+            </w:r>
+          </w:p>
+        </w:tc>
+        <w:tc>
+          <w:tcPr>
+            <w:tcW w:type="dxa" w:w="1608"/>
+          </w:tcPr>
+          <w:p>
+            <w:r/>
+            <w:r>
+              <w:rPr>
+                <w:sz w:val="20"/>
+              </w:rPr>
+              <w:t>0.0355</w:t>
+            </w:r>
+          </w:p>
+        </w:tc>
+        <w:tc>
+          <w:tcPr>
+            <w:tcW w:type="dxa" w:w="1608"/>
+          </w:tcPr>
+          <w:p>
+            <w:r/>
+            <w:r>
+              <w:rPr>
+                <w:sz w:val="20"/>
+              </w:rPr>
+              <w:t>192.22</w:t>
+            </w:r>
+          </w:p>
+        </w:tc>
+        <w:tc>
+          <w:tcPr>
+            <w:tcW w:type="dxa" w:w="1608"/>
+          </w:tcPr>
+          <w:p>
+            <w:r/>
+            <w:r>
+              <w:rPr>
+                <w:sz w:val="20"/>
+              </w:rPr>
+              <w:t>176.92</w:t>
+            </w:r>
+          </w:p>
+        </w:tc>
+      </w:tr>
+      <w:tr>
+        <w:tc>
+          <w:tcPr>
+            <w:tcW w:type="dxa" w:w="1608"/>
+          </w:tcPr>
+          <w:p>
+            <w:r/>
+            <w:r>
+              <w:rPr>
+                <w:sz w:val="20"/>
+              </w:rPr>
+              <w:t>Sensor noise</w:t>
+            </w:r>
+          </w:p>
+        </w:tc>
+        <w:tc>
+          <w:tcPr>
+            <w:tcW w:type="dxa" w:w="1608"/>
+          </w:tcPr>
+          <w:p>
+            <w:r/>
+            <w:r>
+              <w:rPr>
+                <w:sz w:val="20"/>
+              </w:rPr>
+              <w:t>severe</w:t>
+            </w:r>
+          </w:p>
+        </w:tc>
+        <w:tc>
+          <w:tcPr>
+            <w:tcW w:type="dxa" w:w="1608"/>
+          </w:tcPr>
+          <w:p>
+            <w:r/>
+            <w:r>
+              <w:rPr>
+                <w:sz w:val="20"/>
+              </w:rPr>
+              <w:t>0.0328</w:t>
+            </w:r>
+          </w:p>
+        </w:tc>
+        <w:tc>
+          <w:tcPr>
+            <w:tcW w:type="dxa" w:w="1608"/>
+          </w:tcPr>
+          <w:p>
+            <w:r/>
+            <w:r>
+              <w:rPr>
+                <w:sz w:val="20"/>
+              </w:rPr>
+              <w:t>0.0297</w:t>
+            </w:r>
+          </w:p>
+        </w:tc>
+        <w:tc>
+          <w:tcPr>
+            <w:tcW w:type="dxa" w:w="1608"/>
+          </w:tcPr>
+          <w:p>
+            <w:r/>
+            <w:r>
+              <w:rPr>
+                <w:sz w:val="20"/>
+              </w:rPr>
+              <w:t>200.65</w:t>
+            </w:r>
+          </w:p>
+        </w:tc>
+        <w:tc>
+          <w:tcPr>
+            <w:tcW w:type="dxa" w:w="1608"/>
+          </w:tcPr>
+          <w:p>
+            <w:r/>
+            <w:r>
+              <w:rPr>
+                <w:sz w:val="20"/>
+              </w:rPr>
+              <w:t>173.17</w:t>
+            </w:r>
+          </w:p>
+        </w:tc>
+      </w:tr>
+      <w:tr>
+        <w:tc>
+          <w:tcPr>
+            <w:tcW w:type="dxa" w:w="1608"/>
+          </w:tcPr>
+          <w:p>
+            <w:r/>
+            <w:r>
+              <w:rPr>
+                <w:sz w:val="20"/>
+              </w:rPr>
+              <w:t>Communication delay</w:t>
+            </w:r>
+          </w:p>
+        </w:tc>
+        <w:tc>
+          <w:tcPr>
+            <w:tcW w:type="dxa" w:w="1608"/>
+          </w:tcPr>
+          <w:p>
+            <w:r/>
+            <w:r>
+              <w:rPr>
+                <w:sz w:val="20"/>
+              </w:rPr>
+              <w:t>none</w:t>
+            </w:r>
+          </w:p>
+        </w:tc>
+        <w:tc>
+          <w:tcPr>
+            <w:tcW w:type="dxa" w:w="1608"/>
+          </w:tcPr>
+          <w:p>
+            <w:r/>
+            <w:r>
+              <w:rPr>
+                <w:sz w:val="20"/>
+              </w:rPr>
+              <w:t>0.0215</w:t>
+            </w:r>
+          </w:p>
+        </w:tc>
+        <w:tc>
+          <w:tcPr>
+            <w:tcW w:type="dxa" w:w="1608"/>
+          </w:tcPr>
+          <w:p>
+            <w:r/>
+            <w:r>
+              <w:rPr>
+                <w:sz w:val="20"/>
+              </w:rPr>
+              <w:t>0.0256</w:t>
+            </w:r>
+          </w:p>
+        </w:tc>
+        <w:tc>
+          <w:tcPr>
+            <w:tcW w:type="dxa" w:w="1608"/>
+          </w:tcPr>
+          <w:p>
+            <w:r/>
+            <w:r>
+              <w:rPr>
+                <w:sz w:val="20"/>
+              </w:rPr>
+              <w:t>190.88</w:t>
+            </w:r>
+          </w:p>
+        </w:tc>
+        <w:tc>
+          <w:tcPr>
+            <w:tcW w:type="dxa" w:w="1608"/>
+          </w:tcPr>
+          <w:p>
+            <w:r/>
+            <w:r>
+              <w:rPr>
+                <w:sz w:val="20"/>
+              </w:rPr>
+              <w:t>176.47</w:t>
+            </w:r>
+          </w:p>
+        </w:tc>
+      </w:tr>
+      <w:tr>
+        <w:tc>
+          <w:tcPr>
+            <w:tcW w:type="dxa" w:w="1608"/>
+          </w:tcPr>
+          <w:p>
+            <w:r/>
+            <w:r>
+              <w:rPr>
+                <w:sz w:val="20"/>
+              </w:rPr>
+              <w:t>Communication delay</w:t>
+            </w:r>
+          </w:p>
+        </w:tc>
+        <w:tc>
+          <w:tcPr>
+            <w:tcW w:type="dxa" w:w="1608"/>
+          </w:tcPr>
+          <w:p>
+            <w:r/>
+            <w:r>
+              <w:rPr>
+                <w:sz w:val="20"/>
+              </w:rPr>
+              <w:t>one period</w:t>
+            </w:r>
+          </w:p>
+        </w:tc>
+        <w:tc>
+          <w:tcPr>
+            <w:tcW w:type="dxa" w:w="1608"/>
+          </w:tcPr>
+          <w:p>
+            <w:r/>
+            <w:r>
+              <w:rPr>
+                <w:sz w:val="20"/>
+              </w:rPr>
+              <w:t>35.8338</w:t>
+            </w:r>
+          </w:p>
+        </w:tc>
+        <w:tc>
+          <w:tcPr>
+            <w:tcW w:type="dxa" w:w="1608"/>
+          </w:tcPr>
+          <w:p>
+            <w:r/>
+            <w:r>
+              <w:rPr>
+                <w:sz w:val="20"/>
+              </w:rPr>
+              <w:t>32.8441</w:t>
+            </w:r>
+          </w:p>
+        </w:tc>
+        <w:tc>
+          <w:tcPr>
+            <w:tcW w:type="dxa" w:w="1608"/>
+          </w:tcPr>
+          <w:p>
+            <w:r/>
+            <w:r>
+              <w:rPr>
+                <w:sz w:val="20"/>
+              </w:rPr>
+              <w:t>297.35</w:t>
+            </w:r>
+          </w:p>
+        </w:tc>
+        <w:tc>
+          <w:tcPr>
+            <w:tcW w:type="dxa" w:w="1608"/>
+          </w:tcPr>
+          <w:p>
+            <w:r/>
+            <w:r>
+              <w:rPr>
+                <w:sz w:val="20"/>
+              </w:rPr>
+              <w:t>147.77</w:t>
+            </w:r>
+          </w:p>
+        </w:tc>
+      </w:tr>
+      <w:tr>
+        <w:tc>
+          <w:tcPr>
+            <w:tcW w:type="dxa" w:w="1608"/>
+          </w:tcPr>
+          <w:p>
+            <w:r/>
+            <w:r>
+              <w:rPr>
+                <w:sz w:val="20"/>
+              </w:rPr>
+              <w:t>Communication delay</w:t>
+            </w:r>
+          </w:p>
+        </w:tc>
+        <w:tc>
+          <w:tcPr>
+            <w:tcW w:type="dxa" w:w="1608"/>
+          </w:tcPr>
+          <w:p>
+            <w:r/>
+            <w:r>
+              <w:rPr>
+                <w:sz w:val="20"/>
+              </w:rPr>
+              <w:t>three periods</w:t>
+            </w:r>
+          </w:p>
+        </w:tc>
+        <w:tc>
+          <w:tcPr>
+            <w:tcW w:type="dxa" w:w="1608"/>
+          </w:tcPr>
+          <w:p>
+            <w:r/>
+            <w:r>
+              <w:rPr>
+                <w:sz w:val="20"/>
+              </w:rPr>
+              <w:t>45.9290</w:t>
+            </w:r>
+          </w:p>
+        </w:tc>
+        <w:tc>
+          <w:tcPr>
+            <w:tcW w:type="dxa" w:w="1608"/>
+          </w:tcPr>
+          <w:p>
+            <w:r/>
+            <w:r>
+              <w:rPr>
+                <w:sz w:val="20"/>
+              </w:rPr>
+              <w:t>45.8463</w:t>
+            </w:r>
+          </w:p>
+        </w:tc>
+        <w:tc>
+          <w:tcPr>
+            <w:tcW w:type="dxa" w:w="1608"/>
+          </w:tcPr>
+          <w:p>
+            <w:r/>
+            <w:r>
+              <w:rPr>
+                <w:sz w:val="20"/>
+              </w:rPr>
+              <w:t>262.80</w:t>
+            </w:r>
+          </w:p>
+        </w:tc>
+        <w:tc>
+          <w:tcPr>
+            <w:tcW w:type="dxa" w:w="1608"/>
+          </w:tcPr>
+          <w:p>
+            <w:r/>
+            <w:r>
+              <w:rPr>
+                <w:sz w:val="20"/>
+              </w:rPr>
+              <w:t>102.68</w:t>
+            </w:r>
+          </w:p>
+        </w:tc>
+      </w:tr>
+      <w:tr>
+        <w:tc>
+          <w:tcPr>
+            <w:tcW w:type="dxa" w:w="1608"/>
+          </w:tcPr>
+          <w:p>
+            <w:r/>
+            <w:r>
+              <w:rPr>
+                <w:sz w:val="20"/>
+              </w:rPr>
+              <w:t>Driver aggression</w:t>
+            </w:r>
+          </w:p>
+        </w:tc>
+        <w:tc>
+          <w:tcPr>
+            <w:tcW w:type="dxa" w:w="1608"/>
+          </w:tcPr>
+          <w:p>
+            <w:r/>
+            <w:r>
+              <w:rPr>
+                <w:sz w:val="20"/>
+              </w:rPr>
+              <w:t>normal</w:t>
+            </w:r>
+          </w:p>
+        </w:tc>
+        <w:tc>
+          <w:tcPr>
+            <w:tcW w:type="dxa" w:w="1608"/>
+          </w:tcPr>
+          <w:p>
+            <w:r/>
+            <w:r>
+              <w:rPr>
+                <w:sz w:val="20"/>
+              </w:rPr>
+              <w:t>0.0240</w:t>
+            </w:r>
+          </w:p>
+        </w:tc>
+        <w:tc>
+          <w:tcPr>
+            <w:tcW w:type="dxa" w:w="1608"/>
+          </w:tcPr>
+          <w:p>
+            <w:r/>
+            <w:r>
+              <w:rPr>
+                <w:sz w:val="20"/>
+              </w:rPr>
+              <w:t>0.0120</w:t>
+            </w:r>
+          </w:p>
+        </w:tc>
+        <w:tc>
+          <w:tcPr>
+            <w:tcW w:type="dxa" w:w="1608"/>
+          </w:tcPr>
+          <w:p>
+            <w:r/>
+            <w:r>
+              <w:rPr>
+                <w:sz w:val="20"/>
+              </w:rPr>
+              <w:t>190.95</w:t>
+            </w:r>
+          </w:p>
+        </w:tc>
+        <w:tc>
+          <w:tcPr>
+            <w:tcW w:type="dxa" w:w="1608"/>
+          </w:tcPr>
+          <w:p>
+            <w:r/>
+            <w:r>
+              <w:rPr>
+                <w:sz w:val="20"/>
+              </w:rPr>
+              <w:t>176.50</w:t>
+            </w:r>
+          </w:p>
+        </w:tc>
+      </w:tr>
+      <w:tr>
+        <w:tc>
+          <w:tcPr>
+            <w:tcW w:type="dxa" w:w="1608"/>
+          </w:tcPr>
+          <w:p>
+            <w:r/>
+            <w:r>
+              <w:rPr>
+                <w:sz w:val="20"/>
+              </w:rPr>
+              <w:t>Driver aggression</w:t>
+            </w:r>
+          </w:p>
+        </w:tc>
+        <w:tc>
+          <w:tcPr>
+            <w:tcW w:type="dxa" w:w="1608"/>
+          </w:tcPr>
+          <w:p>
+            <w:r/>
+            <w:r>
+              <w:rPr>
+                <w:sz w:val="20"/>
+              </w:rPr>
+              <w:t>brisk</w:t>
+            </w:r>
+          </w:p>
+        </w:tc>
+        <w:tc>
+          <w:tcPr>
+            <w:tcW w:type="dxa" w:w="1608"/>
+          </w:tcPr>
+          <w:p>
+            <w:r/>
+            <w:r>
+              <w:rPr>
+                <w:sz w:val="20"/>
+              </w:rPr>
+              <w:t>0.0451</w:t>
+            </w:r>
+          </w:p>
+        </w:tc>
+        <w:tc>
+          <w:tcPr>
+            <w:tcW w:type="dxa" w:w="1608"/>
+          </w:tcPr>
+          <w:p>
+            <w:r/>
+            <w:r>
+              <w:rPr>
+                <w:sz w:val="20"/>
+              </w:rPr>
+              <w:t>0.0221</w:t>
+            </w:r>
+          </w:p>
+        </w:tc>
+        <w:tc>
+          <w:tcPr>
+            <w:tcW w:type="dxa" w:w="1608"/>
+          </w:tcPr>
+          <w:p>
+            <w:r/>
+            <w:r>
+              <w:rPr>
+                <w:sz w:val="20"/>
+              </w:rPr>
+              <w:t>196.83</w:t>
+            </w:r>
+          </w:p>
+        </w:tc>
+        <w:tc>
+          <w:tcPr>
+            <w:tcW w:type="dxa" w:w="1608"/>
+          </w:tcPr>
+          <w:p>
+            <w:r/>
+            <w:r>
+              <w:rPr>
+                <w:sz w:val="20"/>
+              </w:rPr>
+              <w:t>168.21</w:t>
+            </w:r>
+          </w:p>
+        </w:tc>
+      </w:tr>
+      <w:tr>
+        <w:tc>
+          <w:tcPr>
+            <w:tcW w:type="dxa" w:w="1608"/>
+          </w:tcPr>
+          <w:p>
+            <w:r/>
+            <w:r>
+              <w:rPr>
+                <w:sz w:val="20"/>
+              </w:rPr>
+              <w:t>Driver aggression</w:t>
+            </w:r>
+          </w:p>
+        </w:tc>
+        <w:tc>
+          <w:tcPr>
+            <w:tcW w:type="dxa" w:w="1608"/>
+          </w:tcPr>
+          <w:p>
+            <w:r/>
+            <w:r>
+              <w:rPr>
+                <w:sz w:val="20"/>
+              </w:rPr>
+              <w:t>aggressive</w:t>
+            </w:r>
+          </w:p>
+        </w:tc>
+        <w:tc>
+          <w:tcPr>
+            <w:tcW w:type="dxa" w:w="1608"/>
+          </w:tcPr>
+          <w:p>
+            <w:r/>
+            <w:r>
+              <w:rPr>
+                <w:sz w:val="20"/>
+              </w:rPr>
+              <w:t>0.0753</w:t>
+            </w:r>
+          </w:p>
+        </w:tc>
+        <w:tc>
+          <w:tcPr>
+            <w:tcW w:type="dxa" w:w="1608"/>
+          </w:tcPr>
+          <w:p>
+            <w:r/>
+            <w:r>
+              <w:rPr>
+                <w:sz w:val="20"/>
+              </w:rPr>
+              <w:t>0.0901</w:t>
+            </w:r>
+          </w:p>
+        </w:tc>
+        <w:tc>
+          <w:tcPr>
+            <w:tcW w:type="dxa" w:w="1608"/>
+          </w:tcPr>
+          <w:p>
+            <w:r/>
+            <w:r>
+              <w:rPr>
+                <w:sz w:val="20"/>
+              </w:rPr>
+              <w:t>203.26</w:t>
+            </w:r>
+          </w:p>
+        </w:tc>
+        <w:tc>
+          <w:tcPr>
+            <w:tcW w:type="dxa" w:w="1608"/>
+          </w:tcPr>
+          <w:p>
+            <w:r/>
+            <w:r>
+              <w:rPr>
+                <w:sz w:val="20"/>
+              </w:rPr>
+              <w:t>159.34</w:t>
+            </w:r>
+          </w:p>
+        </w:tc>
+      </w:tr>
+    </w:tbl>
+    <w:p>
+      <w:pPr>
+        <w:spacing w:after="40"/>
+      </w:pPr>
+    </w:p>
+    <w:p>
+      <w:pPr>
+        <w:spacing w:after="160"/>
+      </w:pPr>
+      <w:r>
+        <w:rPr>
+          <w:i/>
+          <w:color w:val="595959"/>
+          <w:sz w:val="18"/>
+        </w:rPr>
+        <w:t>Table. 36 runs on the board, one per cell. Tracking error is the root-mean-square difference between the speed asked for and the speed reached. Energy is on the comparable scale. MEASURED on the board.</w:t>
+      </w:r>
+    </w:p>
+    <w:p>
+      <w:pPr>
+        <w:jc w:val="center"/>
+      </w:pPr>
+      <w:r>
+        <w:drawing>
+          <wp:inline xmlns:a="http://schemas.openxmlformats.org/drawingml/2006/main" xmlns:pic="http://schemas.openxmlformats.org/drawingml/2006/picture">
+            <wp:extent cx="5852160" cy="3688247"/>
+            <wp:docPr id="17" name="Picture 17"/>
+            <wp:cNvGraphicFramePr>
+              <a:graphicFrameLocks noChangeAspect="1"/>
+            </wp:cNvGraphicFramePr>
+            <a:graphic>
+              <a:graphicData uri="http://schemas.openxmlformats.org/drawingml/2006/picture">
+                <pic:pic>
+                  <pic:nvPicPr>
+                    <pic:cNvPr id="0" name="pil-energy.png"/>
+                    <pic:cNvPicPr/>
+                  </pic:nvPicPr>
+                  <pic:blipFill>
+                    <a:blip r:embed="rId25"/>
+                    <a:stretch>
+                      <a:fillRect/>
+                    </a:stretch>
+                  </pic:blipFill>
+                  <pic:spPr>
+                    <a:xfrm>
+                      <a:off x="0" y="0"/>
+                      <a:ext cx="5852160" cy="3688247"/>
+                    </a:xfrm>
+                    <a:prstGeom prst="rect"/>
+                  </pic:spPr>
+                </pic:pic>
+              </a:graphicData>
+            </a:graphic>
+          </wp:inline>
+        </w:drawing>
+      </w:r>
+    </w:p>
+    <w:p>
+      <w:pPr>
+        <w:spacing w:after="240"/>
+        <w:jc w:val="center"/>
+      </w:pPr>
+      <w:r>
+        <w:rPr>
+          <w:i/>
+          <w:color w:val="595959"/>
+          <w:sz w:val="18"/>
+        </w:rPr>
+        <w:t>Figure 17. Both controllers across every setting, measured on the chip. The upper panel is energy on the comparable scale and the bars can be compared: the scale starts at zero and the differences shown are larger than the repeat spread measured below. The lower panel is tracking error, and its bars cannot: repeats of one setting move that quantity by about as much as the controllers differ, so the panel is there to show that both controllers follow the cycle, not to rank them. Each bar is one run.</w:t>
+      </w:r>
+    </w:p>
+    <w:p>
+      <w:pPr>
+        <w:pStyle w:val="Heading2"/>
+      </w:pPr>
+      <w:r>
+        <w:t>How much a number moves when nothing has changed</w:t>
+      </w:r>
+    </w:p>
+    <w:p>
+      <w:pPr>
+        <w:spacing w:after="160"/>
+      </w:pPr>
+      <w:r>
+        <w:rPr>
+          <w:i w:val="0"/>
+          <w:sz w:val="24"/>
+        </w:rPr>
+        <w:t>The campaign did not plan a repeated measurement, but it contains one. The plain setting, the aggressive cycle on the flat with a full battery and clean sensors, is a level of several of the six things at once, so it was run more than once for each controller, each time with a different draw of sensor noise. Those runs should give the same answer. How far apart they actually land is the smallest difference anything else in this section is allowed to claim.</w:t>
+      </w:r>
+    </w:p>
+    <w:tbl>
+      <w:tblPr>
+        <w:tblStyle w:val="LightGrid-Accent1"/>
+        <w:tblW w:type="auto" w:w="0"/>
+        <w:jc w:val="center"/>
+        <w:tblLook w:firstColumn="1" w:firstRow="1" w:lastColumn="0" w:lastRow="0" w:noHBand="0" w:noVBand="1" w:val="04A0"/>
+      </w:tblPr>
+      <w:tblGrid>
+        <w:gridCol w:w="1206"/>
+        <w:gridCol w:w="1206"/>
+        <w:gridCol w:w="1206"/>
+        <w:gridCol w:w="1206"/>
+        <w:gridCol w:w="1206"/>
+        <w:gridCol w:w="1206"/>
+        <w:gridCol w:w="1206"/>
+        <w:gridCol w:w="1206"/>
+      </w:tblGrid>
+      <w:tr>
+        <w:tc>
+          <w:tcPr>
+            <w:tcW w:type="dxa" w:w="1206"/>
+          </w:tcPr>
+          <w:p>
+            <w:r/>
+            <w:r>
+              <w:rPr>
+                <w:b/>
+                <w:sz w:val="20"/>
+              </w:rPr>
+              <w:t>Controller</w:t>
+            </w:r>
+          </w:p>
+        </w:tc>
+        <w:tc>
+          <w:tcPr>
+            <w:tcW w:type="dxa" w:w="1206"/>
+          </w:tcPr>
+          <w:p>
+            <w:r/>
+            <w:r>
+              <w:rPr>
+                <w:b/>
+                <w:sz w:val="20"/>
+              </w:rPr>
+              <w:t>Repeats</w:t>
+            </w:r>
+          </w:p>
+        </w:tc>
+        <w:tc>
+          <w:tcPr>
+            <w:tcW w:type="dxa" w:w="1206"/>
+          </w:tcPr>
+          <w:p>
+            <w:r/>
+            <w:r>
+              <w:rPr>
+                <w:b/>
+                <w:sz w:val="20"/>
+              </w:rPr>
+              <w:t>Energy mean, Wh/km</w:t>
+            </w:r>
+          </w:p>
+        </w:tc>
+        <w:tc>
+          <w:tcPr>
+            <w:tcW w:type="dxa" w:w="1206"/>
+          </w:tcPr>
+          <w:p>
+            <w:r/>
+            <w:r>
+              <w:rPr>
+                <w:b/>
+                <w:sz w:val="20"/>
+              </w:rPr>
+              <w:t>Energy spread</w:t>
+            </w:r>
+          </w:p>
+        </w:tc>
+        <w:tc>
+          <w:tcPr>
+            <w:tcW w:type="dxa" w:w="1206"/>
+          </w:tcPr>
+          <w:p>
+            <w:r/>
+            <w:r>
+              <w:rPr>
+                <w:b/>
+                <w:sz w:val="20"/>
+              </w:rPr>
+              <w:t>Energy spread, %</w:t>
+            </w:r>
+          </w:p>
+        </w:tc>
+        <w:tc>
+          <w:tcPr>
+            <w:tcW w:type="dxa" w:w="1206"/>
+          </w:tcPr>
+          <w:p>
+            <w:r/>
+            <w:r>
+              <w:rPr>
+                <w:b/>
+                <w:sz w:val="20"/>
+              </w:rPr>
+              <w:t>Tracking mean, m/s</w:t>
+            </w:r>
+          </w:p>
+        </w:tc>
+        <w:tc>
+          <w:tcPr>
+            <w:tcW w:type="dxa" w:w="1206"/>
+          </w:tcPr>
+          <w:p>
+            <w:r/>
+            <w:r>
+              <w:rPr>
+                <w:b/>
+                <w:sz w:val="20"/>
+              </w:rPr>
+              <w:t>Tracking spread</w:t>
+            </w:r>
+          </w:p>
+        </w:tc>
+        <w:tc>
+          <w:tcPr>
+            <w:tcW w:type="dxa" w:w="1206"/>
+          </w:tcPr>
+          <w:p>
+            <w:r/>
+            <w:r>
+              <w:rPr>
+                <w:b/>
+                <w:sz w:val="20"/>
+              </w:rPr>
+              <w:t>Tracking spread, %</w:t>
+            </w:r>
+          </w:p>
+        </w:tc>
+      </w:tr>
+      <w:tr>
+        <w:tc>
+          <w:tcPr>
+            <w:tcW w:type="dxa" w:w="1206"/>
+          </w:tcPr>
+          <w:p>
+            <w:r/>
+            <w:r>
+              <w:rPr>
+                <w:sz w:val="20"/>
+              </w:rPr>
+              <w:t>Rules</w:t>
+            </w:r>
+          </w:p>
+        </w:tc>
+        <w:tc>
+          <w:tcPr>
+            <w:tcW w:type="dxa" w:w="1206"/>
+          </w:tcPr>
+          <w:p>
+            <w:r/>
+            <w:r>
+              <w:rPr>
+                <w:sz w:val="20"/>
+              </w:rPr>
+              <w:t>5</w:t>
+            </w:r>
+          </w:p>
+        </w:tc>
+        <w:tc>
+          <w:tcPr>
+            <w:tcW w:type="dxa" w:w="1206"/>
+          </w:tcPr>
+          <w:p>
+            <w:r/>
+            <w:r>
+              <w:rPr>
+                <w:sz w:val="20"/>
+              </w:rPr>
+              <w:t>190.96</w:t>
+            </w:r>
+          </w:p>
+        </w:tc>
+        <w:tc>
+          <w:tcPr>
+            <w:tcW w:type="dxa" w:w="1206"/>
+          </w:tcPr>
+          <w:p>
+            <w:r/>
+            <w:r>
+              <w:rPr>
+                <w:sz w:val="20"/>
+              </w:rPr>
+              <w:t>0.13</w:t>
+            </w:r>
+          </w:p>
+        </w:tc>
+        <w:tc>
+          <w:tcPr>
+            <w:tcW w:type="dxa" w:w="1206"/>
+          </w:tcPr>
+          <w:p>
+            <w:r/>
+            <w:r>
+              <w:rPr>
+                <w:sz w:val="20"/>
+              </w:rPr>
+              <w:t>0.07%</w:t>
+            </w:r>
+          </w:p>
+        </w:tc>
+        <w:tc>
+          <w:tcPr>
+            <w:tcW w:type="dxa" w:w="1206"/>
+          </w:tcPr>
+          <w:p>
+            <w:r/>
+            <w:r>
+              <w:rPr>
+                <w:sz w:val="20"/>
+              </w:rPr>
+              <w:t>0.0246</w:t>
+            </w:r>
+          </w:p>
+        </w:tc>
+        <w:tc>
+          <w:tcPr>
+            <w:tcW w:type="dxa" w:w="1206"/>
+          </w:tcPr>
+          <w:p>
+            <w:r/>
+            <w:r>
+              <w:rPr>
+                <w:sz w:val="20"/>
+              </w:rPr>
+              <w:t>0.0056</w:t>
+            </w:r>
+          </w:p>
+        </w:tc>
+        <w:tc>
+          <w:tcPr>
+            <w:tcW w:type="dxa" w:w="1206"/>
+          </w:tcPr>
+          <w:p>
+            <w:r/>
+            <w:r>
+              <w:rPr>
+                <w:sz w:val="20"/>
+              </w:rPr>
+              <w:t>22.7%</w:t>
+            </w:r>
+          </w:p>
+        </w:tc>
+      </w:tr>
+      <w:tr>
+        <w:tc>
+          <w:tcPr>
+            <w:tcW w:type="dxa" w:w="1206"/>
+          </w:tcPr>
+          <w:p>
+            <w:r/>
+            <w:r>
+              <w:rPr>
+                <w:sz w:val="20"/>
+              </w:rPr>
+              <w:t>Learned</w:t>
+            </w:r>
+          </w:p>
+        </w:tc>
+        <w:tc>
+          <w:tcPr>
+            <w:tcW w:type="dxa" w:w="1206"/>
+          </w:tcPr>
+          <w:p>
+            <w:r/>
+            <w:r>
+              <w:rPr>
+                <w:sz w:val="20"/>
+              </w:rPr>
+              <w:t>5</w:t>
+            </w:r>
+          </w:p>
+        </w:tc>
+        <w:tc>
+          <w:tcPr>
+            <w:tcW w:type="dxa" w:w="1206"/>
+          </w:tcPr>
+          <w:p>
+            <w:r/>
+            <w:r>
+              <w:rPr>
+                <w:sz w:val="20"/>
+              </w:rPr>
+              <w:t>176.50</w:t>
+            </w:r>
+          </w:p>
+        </w:tc>
+        <w:tc>
+          <w:tcPr>
+            <w:tcW w:type="dxa" w:w="1206"/>
+          </w:tcPr>
+          <w:p>
+            <w:r/>
+            <w:r>
+              <w:rPr>
+                <w:sz w:val="20"/>
+              </w:rPr>
+              <w:t>0.17</w:t>
+            </w:r>
+          </w:p>
+        </w:tc>
+        <w:tc>
+          <w:tcPr>
+            <w:tcW w:type="dxa" w:w="1206"/>
+          </w:tcPr>
+          <w:p>
+            <w:r/>
+            <w:r>
+              <w:rPr>
+                <w:sz w:val="20"/>
+              </w:rPr>
+              <w:t>0.10%</w:t>
+            </w:r>
+          </w:p>
+        </w:tc>
+        <w:tc>
+          <w:tcPr>
+            <w:tcW w:type="dxa" w:w="1206"/>
+          </w:tcPr>
+          <w:p>
+            <w:r/>
+            <w:r>
+              <w:rPr>
+                <w:sz w:val="20"/>
+              </w:rPr>
+              <w:t>0.0162</w:t>
+            </w:r>
+          </w:p>
+        </w:tc>
+        <w:tc>
+          <w:tcPr>
+            <w:tcW w:type="dxa" w:w="1206"/>
+          </w:tcPr>
+          <w:p>
+            <w:r/>
+            <w:r>
+              <w:rPr>
+                <w:sz w:val="20"/>
+              </w:rPr>
+              <w:t>0.0052</w:t>
+            </w:r>
+          </w:p>
+        </w:tc>
+        <w:tc>
+          <w:tcPr>
+            <w:tcW w:type="dxa" w:w="1206"/>
+          </w:tcPr>
+          <w:p>
+            <w:r/>
+            <w:r>
+              <w:rPr>
+                <w:sz w:val="20"/>
+              </w:rPr>
+              <w:t>32.2%</w:t>
+            </w:r>
+          </w:p>
+        </w:tc>
+      </w:tr>
+    </w:tbl>
+    <w:p>
+      <w:pPr>
+        <w:spacing w:after="40"/>
+      </w:pPr>
+    </w:p>
+    <w:p>
+      <w:pPr>
+        <w:spacing w:after="160"/>
+      </w:pPr>
+      <w:r>
+        <w:rPr>
+          <w:i/>
+          <w:color w:val="595959"/>
+          <w:sz w:val="18"/>
+        </w:rPr>
+        <w:t>Table. Repeats of one identical setting, differing only in the random draw of sensor noise. MEASURED on the board.</w:t>
+      </w:r>
+    </w:p>
+    <w:p>
+      <w:pPr>
+        <w:spacing w:after="160"/>
+      </w:pPr>
+      <w:r>
+        <w:rPr>
+          <w:i w:val="0"/>
+          <w:sz w:val="24"/>
+        </w:rPr>
+        <w:t>The two columns behave completely differently, and the difference decides how the rest of this section may be read. Energy repeats to within 0.10 per cent, so the gap between the two controllers, which is about half a per cent, is several times the measurement's own spread and is a real difference. Tracking error repeats only to within 32 per cent, so two tracking figures in the table that differ by less than that are not distinguishable, and no ordering between them is claimed here however suggestive the table looks. Each cell was run once; this is what one run is worth.</w:t>
+      </w:r>
+    </w:p>
+    <w:p>
+      <w:pPr>
+        <w:spacing w:after="160"/>
+      </w:pPr>
+      <w:r>
+        <w:rPr>
+          <w:i w:val="0"/>
+          <w:sz w:val="24"/>
+        </w:rPr>
+        <w:t>2 of the 18 settings are left out of the comparison that follows, and appear in the table above only. In those the car did not follow the drive cycle at all, with tracking errors in the tens of metres per second against hundredths everywhere else, so the distance it covered is not the distance the cycle asked for and energy per kilometre stops meaning anything. They are the communication-delay settings, and the section below them explains what went wrong there.</w:t>
+      </w:r>
+    </w:p>
+    <w:p>
+      <w:pPr>
+        <w:spacing w:after="160"/>
+      </w:pPr>
+      <w:r>
+        <w:rPr>
+          <w:i w:val="0"/>
+          <w:sz w:val="24"/>
+        </w:rPr>
+        <w:t>The rule for leaving a setting out was chosen after those runs were seen to fail, not before, so it is stated plainly: a setting is excluded when either controller's tracking error exceeds 1 metre per second. Nothing in the campaign lies near that line. The worst included run is 0.090 and the excluded ones are in the tens, so the threshold could be moved by a factor of ten in either direction without changing which settings are dropped.</w:t>
+      </w:r>
+    </w:p>
+    <w:p>
+      <w:pPr>
+        <w:spacing w:after="160"/>
+      </w:pPr>
+      <w:r>
+        <w:rPr>
+          <w:i w:val="0"/>
+          <w:sz w:val="24"/>
+        </w:rPr>
+        <w:t>The learned controller uses more energy than the rules in 2 of the 16 settings and less in 14. Averaged over all of them it uses 8.73 per cent less.</w:t>
+      </w:r>
+    </w:p>
+    <w:p>
+      <w:pPr>
+        <w:spacing w:after="160"/>
+      </w:pPr>
+      <w:r>
+        <w:rPr>
+          <w:i w:val="0"/>
+          <w:sz w:val="24"/>
+        </w:rPr>
+        <w:t>That reverses the result this project has carried since week 8, and the reversal needs explaining rather than announcing.</w:t>
+      </w:r>
+    </w:p>
+    <w:p>
+      <w:pPr>
+        <w:spacing w:after="160"/>
+      </w:pPr>
+      <w:r>
+        <w:rPr>
+          <w:i w:val="0"/>
+          <w:sz w:val="24"/>
+        </w:rPr>
+        <w:t>Section 23 reports the learned controller as 0.51 per cent worse, measured at 154.68 watt-hours per kilometre against 153.90. That measurement was taken on the highway cycle. The project's own plan names the aggressive US06 cycle as the one to report a controller on, and sealed it so that nothing could be tuned against it. It was never spent. This campaign is the first time the two controllers have been compared on it.</w:t>
+      </w:r>
+    </w:p>
+    <w:p>
+      <w:pPr>
+        <w:spacing w:after="160"/>
+      </w:pPr>
+      <w:r>
+        <w:rPr>
+          <w:i w:val="0"/>
+          <w:sz w:val="24"/>
+        </w:rPr>
+        <w:t>The highway row here reproduces the earlier measurement closely: 154.01 watt-hours per kilometre for the rules against the 153.90 measured offline in week 8, a difference of 0.07 per cent, from a simulation on a laptop and a measurement on a microcontroller. So the two results do not conflict. The earlier one is correct about the highway, and the highway is where the two controllers have the least to disagree about.</w:t>
+      </w:r>
+    </w:p>
+    <w:p>
+      <w:pPr>
+        <w:spacing w:after="160"/>
+      </w:pPr>
+      <w:r>
+        <w:rPr>
+          <w:i w:val="0"/>
+          <w:sz w:val="24"/>
+        </w:rPr>
+        <w:t>A word of caution about how much weight this carries. Each setting was run once. The saving is many times the repeat spread measured above, so it is not noise, but a reversal of a headline result deserves a repeat campaign before it is published, and the mechanism below is inferred from the current rather than observed directly. This section reports what was measured; it does not settle what the project should conclude.</w:t>
+      </w:r>
+    </w:p>
+    <w:p>
+      <w:pPr>
+        <w:pStyle w:val="Heading2"/>
+      </w:pPr>
+      <w:r>
+        <w:t>Where the saving appears to come from</w:t>
+      </w:r>
+    </w:p>
+    <w:p>
+      <w:pPr>
+        <w:spacing w:after="160"/>
+      </w:pPr>
+      <w:r>
+        <w:rPr>
+          <w:i w:val="0"/>
+          <w:sz w:val="24"/>
+        </w:rPr>
+        <w:t>The learned controller draws a lower peak current than the rules in 16 of the 16 settings. Losses inside the battery rise with the square of the current, so shaving the peaks saves energy, and it saves more the harder the car is being driven. That is the pattern in the table.</w:t>
+      </w:r>
+    </w:p>
+    <w:p>
+      <w:pPr>
+        <w:spacing w:after="160"/>
+      </w:pPr>
+      <w:r>
+        <w:rPr>
+          <w:i w:val="0"/>
+          <w:sz w:val="24"/>
+        </w:rPr>
+        <w:t>The two ends of it. The hardest setting, sensor noise at severe, peaks at 341 amps for the rules and 292 for the learned controller, and the energy gap there is 13.7 per cent. The gentlest, driving condition at highway, peaks at 104 amps against 95, and the gap is 0.1 per cent.</w:t>
+      </w:r>
+    </w:p>
+    <w:p>
+      <w:pPr>
+        <w:spacing w:after="160"/>
+      </w:pPr>
+      <w:r>
+        <w:rPr>
+          <w:i w:val="0"/>
+          <w:sz w:val="24"/>
+        </w:rPr>
+        <w:t>The likely cause is the discharge power ceiling, which is one of the three things the energy manager sets and which the learned controller uses and the rules effectively do not. Section 25 saw the same effect from the other direction and reached the same explanation. It remains an inference: the power ceiling the chip applies is not recorded in the result files, only the current that follows from it. Logging it is the single change that would turn this from a consistent story into a measured one, and it is worth making before this result is published.</w:t>
+      </w:r>
+    </w:p>
+    <w:p>
+      <w:pPr>
+        <w:spacing w:after="160"/>
+      </w:pPr>
+      <w:r>
+        <w:rPr>
+          <w:i w:val="0"/>
+          <w:sz w:val="24"/>
+        </w:rPr>
+        <w:t>The spread across settings is worth more than the average. The learned controller comes closest to the rules under driver aggression at the aggressive setting (159.34 against 203.26 Wh/km) and is furthest behind under driving condition at the urban setting (168.56 against 168.11 Wh/km).</w:t>
+      </w:r>
+    </w:p>
+    <w:tbl>
+      <w:tblPr>
+        <w:tblStyle w:val="LightGrid-Accent1"/>
+        <w:tblW w:type="auto" w:w="0"/>
+        <w:jc w:val="center"/>
+        <w:tblLook w:firstColumn="1" w:firstRow="1" w:lastColumn="0" w:lastRow="0" w:noHBand="0" w:noVBand="1" w:val="04A0"/>
+      </w:tblPr>
+      <w:tblGrid>
+        <w:gridCol w:w="1608"/>
+        <w:gridCol w:w="1608"/>
+        <w:gridCol w:w="1608"/>
+        <w:gridCol w:w="1608"/>
+        <w:gridCol w:w="1608"/>
+        <w:gridCol w:w="1608"/>
+      </w:tblGrid>
+      <w:tr>
+        <w:tc>
+          <w:tcPr>
+            <w:tcW w:type="dxa" w:w="1608"/>
+          </w:tcPr>
+          <w:p>
+            <w:r/>
+            <w:r>
+              <w:rPr>
+                <w:b/>
+                <w:sz w:val="20"/>
+              </w:rPr>
+              <w:t>Controller</w:t>
+            </w:r>
+          </w:p>
+        </w:tc>
+        <w:tc>
+          <w:tcPr>
+            <w:tcW w:type="dxa" w:w="1608"/>
+          </w:tcPr>
+          <w:p>
+            <w:r/>
+            <w:r>
+              <w:rPr>
+                <w:b/>
+                <w:sz w:val="20"/>
+              </w:rPr>
+              <w:t>Runs</w:t>
+            </w:r>
+          </w:p>
+        </w:tc>
+        <w:tc>
+          <w:tcPr>
+            <w:tcW w:type="dxa" w:w="1608"/>
+          </w:tcPr>
+          <w:p>
+            <w:r/>
+            <w:r>
+              <w:rPr>
+                <w:b/>
+                <w:sz w:val="20"/>
+              </w:rPr>
+              <w:t>Control steps</w:t>
+            </w:r>
+          </w:p>
+        </w:tc>
+        <w:tc>
+          <w:tcPr>
+            <w:tcW w:type="dxa" w:w="1608"/>
+          </w:tcPr>
+          <w:p>
+            <w:r/>
+            <w:r>
+              <w:rPr>
+                <w:b/>
+                <w:sz w:val="20"/>
+              </w:rPr>
+              <w:t>Missed deadlines</w:t>
+            </w:r>
+          </w:p>
+        </w:tc>
+        <w:tc>
+          <w:tcPr>
+            <w:tcW w:type="dxa" w:w="1608"/>
+          </w:tcPr>
+          <w:p>
+            <w:r/>
+            <w:r>
+              <w:rPr>
+                <w:b/>
+                <w:sz w:val="20"/>
+              </w:rPr>
+              <w:t>Late or lost frames</w:t>
+            </w:r>
+          </w:p>
+        </w:tc>
+        <w:tc>
+          <w:tcPr>
+            <w:tcW w:type="dxa" w:w="1608"/>
+          </w:tcPr>
+          <w:p>
+            <w:r/>
+            <w:r>
+              <w:rPr>
+                <w:b/>
+                <w:sz w:val="20"/>
+              </w:rPr>
+              <w:t>Worst inference, us</w:t>
+            </w:r>
+          </w:p>
+        </w:tc>
+      </w:tr>
+      <w:tr>
+        <w:tc>
+          <w:tcPr>
+            <w:tcW w:type="dxa" w:w="1608"/>
+          </w:tcPr>
+          <w:p>
+            <w:r/>
+            <w:r>
+              <w:rPr>
+                <w:sz w:val="20"/>
+              </w:rPr>
+              <w:t>Rules</w:t>
+            </w:r>
+          </w:p>
+        </w:tc>
+        <w:tc>
+          <w:tcPr>
+            <w:tcW w:type="dxa" w:w="1608"/>
+          </w:tcPr>
+          <w:p>
+            <w:r/>
+            <w:r>
+              <w:rPr>
+                <w:sz w:val="20"/>
+              </w:rPr>
+              <w:t>18</w:t>
+            </w:r>
+          </w:p>
+        </w:tc>
+        <w:tc>
+          <w:tcPr>
+            <w:tcW w:type="dxa" w:w="1608"/>
+          </w:tcPr>
+          <w:p>
+            <w:r/>
+            <w:r>
+              <w:rPr>
+                <w:sz w:val="20"/>
+              </w:rPr>
+              <w:t>1,141,416</w:t>
+            </w:r>
+          </w:p>
+        </w:tc>
+        <w:tc>
+          <w:tcPr>
+            <w:tcW w:type="dxa" w:w="1608"/>
+          </w:tcPr>
+          <w:p>
+            <w:r/>
+            <w:r>
+              <w:rPr>
+                <w:sz w:val="20"/>
+              </w:rPr>
+              <w:t>0</w:t>
+            </w:r>
+          </w:p>
+        </w:tc>
+        <w:tc>
+          <w:tcPr>
+            <w:tcW w:type="dxa" w:w="1608"/>
+          </w:tcPr>
+          <w:p>
+            <w:r/>
+            <w:r>
+              <w:rPr>
+                <w:sz w:val="20"/>
+              </w:rPr>
+              <w:t>255,318</w:t>
+            </w:r>
+          </w:p>
+        </w:tc>
+        <w:tc>
+          <w:tcPr>
+            <w:tcW w:type="dxa" w:w="1608"/>
+          </w:tcPr>
+          <w:p>
+            <w:r/>
+            <w:r>
+              <w:rPr>
+                <w:sz w:val="20"/>
+              </w:rPr>
+              <w:t>0</w:t>
+            </w:r>
+          </w:p>
+        </w:tc>
+      </w:tr>
+      <w:tr>
+        <w:tc>
+          <w:tcPr>
+            <w:tcW w:type="dxa" w:w="1608"/>
+          </w:tcPr>
+          <w:p>
+            <w:r/>
+            <w:r>
+              <w:rPr>
+                <w:sz w:val="20"/>
+              </w:rPr>
+              <w:t>Learned</w:t>
+            </w:r>
+          </w:p>
+        </w:tc>
+        <w:tc>
+          <w:tcPr>
+            <w:tcW w:type="dxa" w:w="1608"/>
+          </w:tcPr>
+          <w:p>
+            <w:r/>
+            <w:r>
+              <w:rPr>
+                <w:sz w:val="20"/>
+              </w:rPr>
+              <w:t>18</w:t>
+            </w:r>
+          </w:p>
+        </w:tc>
+        <w:tc>
+          <w:tcPr>
+            <w:tcW w:type="dxa" w:w="1608"/>
+          </w:tcPr>
+          <w:p>
+            <w:r/>
+            <w:r>
+              <w:rPr>
+                <w:sz w:val="20"/>
+              </w:rPr>
+              <w:t>1,141,416</w:t>
+            </w:r>
+          </w:p>
+        </w:tc>
+        <w:tc>
+          <w:tcPr>
+            <w:tcW w:type="dxa" w:w="1608"/>
+          </w:tcPr>
+          <w:p>
+            <w:r/>
+            <w:r>
+              <w:rPr>
+                <w:sz w:val="20"/>
+              </w:rPr>
+              <w:t>0</w:t>
+            </w:r>
+          </w:p>
+        </w:tc>
+        <w:tc>
+          <w:tcPr>
+            <w:tcW w:type="dxa" w:w="1608"/>
+          </w:tcPr>
+          <w:p>
+            <w:r/>
+            <w:r>
+              <w:rPr>
+                <w:sz w:val="20"/>
+              </w:rPr>
+              <w:t>258,585</w:t>
+            </w:r>
+          </w:p>
+        </w:tc>
+        <w:tc>
+          <w:tcPr>
+            <w:tcW w:type="dxa" w:w="1608"/>
+          </w:tcPr>
+          <w:p>
+            <w:r/>
+            <w:r>
+              <w:rPr>
+                <w:sz w:val="20"/>
+              </w:rPr>
+              <w:t>831</w:t>
+            </w:r>
+          </w:p>
+        </w:tc>
+      </w:tr>
+    </w:tbl>
+    <w:p>
+      <w:pPr>
+        <w:spacing w:after="40"/>
+      </w:pPr>
+    </w:p>
+    <w:p>
+      <w:pPr>
+        <w:spacing w:after="160"/>
+      </w:pPr>
+      <w:r>
+        <w:rPr>
+          <w:i/>
+          <w:color w:val="595959"/>
+          <w:sz w:val="18"/>
+        </w:rPr>
+        <w:t>Table. The timing half of the campaign. A missed deadline is the control loop failing to finish its own work in its ten millisecond slot. Late or lost frames counts the laptop answering late or not at all, which the communication-delay setting causes on purpose. MEASURED on the board.</w:t>
+      </w:r>
+    </w:p>
+    <w:p>
+      <w:pPr>
+        <w:spacing w:after="160"/>
+      </w:pPr>
+      <w:r>
+        <w:rPr>
+          <w:i w:val="0"/>
+          <w:sz w:val="24"/>
+        </w:rPr>
+        <w:t>Across all 2,282,832 control steps of the campaign the loop never missed its own deadline, with the learned controller running inside it and with the link being delayed on purpose. That is the claim this project can make about putting a learned policy in a real-time loop, and the campaign is the widest evidence for it.</w:t>
+      </w:r>
+    </w:p>
+    <w:p>
+      <w:pPr>
+        <w:pStyle w:val="Heading2"/>
+      </w:pPr>
+      <w:r>
+        <w:t>What the communication-delay rows actually show</w:t>
+      </w:r>
+    </w:p>
+    <w:p>
+      <w:pPr>
+        <w:spacing w:after="160"/>
+      </w:pPr>
+      <w:r>
+        <w:rPr>
+          <w:i w:val="0"/>
+          <w:sz w:val="24"/>
+        </w:rPr>
+        <w:t>These rows need reading carefully, because the obvious reading of them is wrong. With a delay of 30 milliseconds the tracking error is 45.9 metres per second, against 0.0215 with no delay. The car is not following the drive cycle at all.</w:t>
+      </w:r>
+    </w:p>
+    <w:p>
+      <w:pPr>
+        <w:spacing w:after="160"/>
+      </w:pPr>
+      <w:r>
+        <w:rPr>
+          <w:i w:val="0"/>
+          <w:sz w:val="24"/>
+        </w:rPr>
+        <w:t>That is not the controller failing. The control loop runs every ten milliseconds, and the delay was added by making the laptop wait before each reply, so the wait is added to the laptop's own work on every single step. At ten milliseconds of delay on a ten millisecond loop the laptop can no longer answer as often as it is asked, and it falls further behind with every step rather than settling one step late. The chip meanwhile met every one of its own deadlines: 0 missed, in 60,001 steps.</w:t>
+      </w:r>
+    </w:p>
+    <w:p>
+      <w:pPr>
+        <w:spacing w:after="160"/>
+      </w:pPr>
+      <w:r>
+        <w:rPr>
+          <w:i w:val="0"/>
+          <w:sz w:val="24"/>
+        </w:rPr>
+        <w:t>So this axis measures how fast the laptop can keep up, not how much delay the controller tolerates. Measuring the second thing needs the delay applied to delivery while the answers keep flowing, which this rig cannot currently do. The rows are reported as measured and the conclusion that the controller is delay-sensitive is not available from them.</w:t>
+      </w:r>
+    </w:p>
+    <w:p>
+      <w:pPr>
+        <w:spacing w:after="160"/>
+      </w:pPr>
+      <w:r>
+        <w:rPr>
+          <w:i w:val="0"/>
+          <w:sz w:val="24"/>
+        </w:rPr>
+        <w:t>What this campaign does not establish. Each cell was run once, so no figure here carries an interval and small differences between two settings are not separable. The three settings of an axis are three points on it, not a characterisation of it. And the vehicle model, though validated against held-out trips earlier in this report, is a model: these are the conditions as the model renders them, not as a road produces them.</w:t>
+      </w:r>
+    </w:p>
+    <w:p>
+      <w:pPr>
+        <w:pStyle w:val="Heading1"/>
+      </w:pPr>
+      <w:r>
+        <w:t>27. Results that went against expectation</w:t>
       </w:r>
     </w:p>
     <w:p>
@@ -16711,7 +19406,7 @@
         <w:pStyle w:val="Heading1"/>
       </w:pPr>
       <w:r>
-        <w:t>27. What changed from the original plan</w:t>
+        <w:t>28. What changed from the original plan</w:t>
       </w:r>
     </w:p>
     <w:p>
@@ -17023,7 +19718,7 @@
         <w:pStyle w:val="Heading1"/>
       </w:pPr>
       <w:r>
-        <w:t>28. What is left to do</w:t>
+        <w:t>29. What is left to do</w:t>
       </w:r>
     </w:p>
     <w:p>
@@ -17682,7 +20377,7 @@
         <w:pStyle w:val="Heading1"/>
       </w:pPr>
       <w:r>
-        <w:t>29. Reproducing everything in this report</w:t>
+        <w:t>30. Reproducing everything in this report</w:t>
       </w:r>
     </w:p>
     <w:p>
@@ -18656,7 +21351,7 @@
           <w:color w:val="595959"/>
           <w:sz w:val="22"/>
         </w:rPr>
-        <w:t>All Python commands need PYTHONPATH="src:." set. The reinforcement-learning ramp-up additionally needs stable-baselines3 and gymnasium. The test suite runs with python3 -m pytest and currently holds 439 tests, all passing, including ones that drive the controller and the learned policy in C and in Python through identical inputs and require them to agree, and ones that read the firmware's own compile-time switches back out of its headers so that the scripts describing them cannot drift from what is compiled.</w:t>
+        <w:t>All Python commands need PYTHONPATH="src:." set. The reinforcement-learning ramp-up additionally needs stable-baselines3 and gymnasium. The test suite runs with python3 -m pytest and currently holds 450 tests, all passing, including ones that drive the controller and the learned policy in C and in Python through identical inputs and require them to agree, and ones that read the firmware's own compile-time switches back out of its headers so that the scripts describing them cannot drift from what is compiled.</w:t>
       </w:r>
     </w:p>
     <w:sectPr>

</xml_diff>

<commit_message>
Correct the claim that the rules do not limit power (criterion 5)
Measured on the board: the rule manager's ceiling runs 40 kW to 125 kW with a
mean near 117, the actor's 40 kW to 123 kW with a mean near 82. Both use it.
The report said the rules "effectively do not", which is false, and it said so
while presenting the sentence as the explanation of an 8 per cent energy
result.

The paragraph now branches on the data. Where the campaign file carries the
ceiling it states the measurement, including that both controllers use it and
that the difference is how hard each holds it down on average. Where the file
predates the telemetry, as tonight's first campaign does, it prints the
inference with its caveat and says the counters were added afterwards so a
repeat can settle it. An old campaign file therefore still renders an honest
section rather than a claim its data cannot support.
</commit_message>
<xml_diff>
--- a/reports/EV-PIL-status-report.docx
+++ b/reports/EV-PIL-status-report.docx
@@ -18800,7 +18800,7 @@
           <w:i w:val="0"/>
           <w:sz w:val="24"/>
         </w:rPr>
-        <w:t>The likely cause is the discharge power ceiling, which is one of the three things the energy manager sets and which the learned controller uses and the rules effectively do not. Section 25 saw the same effect from the other direction and reached the same explanation. It remains an inference: the power ceiling the chip applies is not recorded in the result files, only the current that follows from it. Logging it is the single change that would turn this from a consistent story into a measured one, and it is worth making before this result is published.</w:t>
+        <w:t>The likely cause is the discharge power ceiling, one of the three things the energy manager sets. It remains an inference for this campaign: the ceiling the chip applied was not recorded when these runs were taken, only the current that follows from it. Section 25 reached the same explanation from the other direction. The telemetry was added afterwards, so a repeat of this campaign can settle it.</w:t>
       </w:r>
     </w:p>
     <w:p>
@@ -21351,7 +21351,7 @@
           <w:color w:val="595959"/>
           <w:sz w:val="22"/>
         </w:rPr>
-        <w:t>All Python commands need PYTHONPATH="src:." set. The reinforcement-learning ramp-up additionally needs stable-baselines3 and gymnasium. The test suite runs with python3 -m pytest and currently holds 450 tests, all passing, including ones that drive the controller and the learned policy in C and in Python through identical inputs and require them to agree, and ones that read the firmware's own compile-time switches back out of its headers so that the scripts describing them cannot drift from what is compiled.</w:t>
+        <w:t>All Python commands need PYTHONPATH="src:." set. The reinforcement-learning ramp-up additionally needs stable-baselines3 and gymnasium. The test suite runs with python3 -m pytest and currently holds 453 tests, all passing, including ones that drive the controller and the learned policy in C and in Python through identical inputs and require them to agree, and ones that read the firmware's own compile-time switches back out of its headers so that the scripts describing them cannot drift from what is compiled.</w:t>
       </w:r>
     </w:p>
     <w:sectPr>

</xml_diff>

<commit_message>
Report the correction from data: the pre-fix plant, read out of history, beside the fixed one
The deployed actor simulated on the old plant scores 176.71 Wh/km on US06,
which is the chip's 176.4; on the corrected plant it scores 190.71 against
the rules' 190.47 and lags the cycle by up to 3.65 m/s. The report's two
campaign sections are marked withdrawn in part and point at the new one.

Co-Authored-By: Claude Opus 5.5 <noreply@anthropic.com>
</commit_message>
<xml_diff>
--- a/reports/EV-PIL-status-report.docx
+++ b/reports/EV-PIL-status-report.docx
@@ -45,7 +45,7 @@
           <w:color w:val="595959"/>
           <w:sz w:val="24"/>
         </w:rPr>
-        <w:t>Manikanta Gonugondla   |   2 September 2026</w:t>
+        <w:t>Manikanta Gonugondla   |   6 October 2026</w:t>
       </w:r>
     </w:p>
     <w:p/>
@@ -538,7 +538,7 @@
         <w:spacing w:after="80"/>
       </w:pPr>
       <w:r>
-        <w:t>The learned controller, trained five times over, finishes at 154.92 watt-hours per kilometre against the conventional controller's 153.90, once the cabin heating it switched off is charged back at what it saved. On that cycle it is reliably slightly worse, which is what week 7's offline optimum predicted. Section 21. That measurement was taken on the highway cycle, and the processor-in-the-loop campaign in section 26 finds the opposite on the aggressive cycle that was sealed for testing. Read the two together; neither on its own is the whole answer.</w:t>
+        <w:t>The learned controller, trained five times over, finishes at 154.92 watt-hours per kilometre against the conventional controller's 153.90, once the cabin heating it switched off is charged back at what it saved. On that cycle it is reliably slightly worse, which is what week 7's offline optimum predicted. Section 21. The processor-in-the-loop campaign in section 26 appeared to find the opposite on the aggressive cycle. That finding is withdrawn: it came from a fault in the vehicle model, described in section 28.</w:t>
       </w:r>
     </w:p>
     <w:p>
@@ -14546,7 +14546,7 @@
           <w:i w:val="0"/>
           <w:sz w:val="24"/>
         </w:rPr>
-        <w:t>The chain from a trained policy to a running one has four links, and each is checked against the one before it. Building that chain found a real fault: the test that compares the C controller against Python was, for a while, compiling the wrong weights and comparing them against themselves. It passed for exactly as long as no policy had been deployed. Section 28 records it.</w:t>
+        <w:t>The chain from a trained policy to a running one has four links, and each is checked against the one before it. Building that chain found a real fault: the test that compares the C controller against Python was, for a while, compiling the wrong weights and comparing them against themselves. It passed for exactly as long as no policy had been deployed. Section 29 records it.</w:t>
       </w:r>
     </w:p>
     <w:p>
@@ -16501,6 +16501,19 @@
       <w:r>
         <w:rPr>
           <w:i w:val="0"/>
+          <w:color w:val="1F4E79"/>
+          <w:sz w:val="24"/>
+        </w:rPr>
+        <w:t>WITHDRAWN IN PART. The energy comparison in this section is not valid. The vehicle model let a controller lower its power ceiling and be charged less energy for the same drive, and the learned controller did exactly that. Section 28 gives the evidence and the corrected numbers. The timing results in this section do not depend on the vehicle model and stand as measured. The energy tables are left in place as the record of what was reported.</w:t>
+      </w:r>
+    </w:p>
+    <w:p>
+      <w:pPr>
+        <w:spacing w:after="160"/>
+      </w:pPr>
+      <w:r>
+        <w:rPr>
+          <w:i w:val="0"/>
           <w:sz w:val="24"/>
         </w:rPr>
         <w:t>Every result before this one compares the two energy managers under one set of conditions at a time. This campaign, the processor-in-the-loop or PIL campaign that week 10 of the plan calls for, varies the conditions instead. Six things that a real vehicle meets and a laboratory cycle does not, namely the kind of road, its slope, how full the battery is, how noisy the sensors are, how late the communication link answers and how hard the driver pushes, are each swept across three settings, with both controllers run on the chip against every one of them.</w:t>
@@ -19196,6 +19209,19 @@
       <w:r>
         <w:rPr>
           <w:i w:val="0"/>
+          <w:color w:val="1F4E79"/>
+          <w:sz w:val="24"/>
+        </w:rPr>
+        <w:t>WITHDRAWN IN PART. The energy comparison in this section is not valid. The vehicle model let a controller lower its power ceiling and be charged less energy for the same drive, and the learned controller did exactly that. Section 28 gives the evidence and the corrected numbers. The timing results in this section do not depend on the vehicle model and stand as measured. The energy tables are left in place as the record of what was reported.</w:t>
+      </w:r>
+    </w:p>
+    <w:p>
+      <w:pPr>
+        <w:spacing w:after="160"/>
+      </w:pPr>
+      <w:r>
+        <w:rPr>
+          <w:i w:val="0"/>
           <w:sz w:val="24"/>
         </w:rPr>
         <w:t>The previous section reports one run per setting, and its explanation for the energy result rests on a quantity that was not being recorded when those runs were taken. Both of those are weaknesses that a second campaign can remove, so the whole thing was run again after adding the missing measurement to the firmware.</w:t>
@@ -19504,7 +19530,1799 @@
         <w:pStyle w:val="Heading1"/>
       </w:pPr>
       <w:r>
-        <w:t>28. Results that went against expectation</w:t>
+        <w:t>28. Correction: the power ceiling did not slow the car</w:t>
+      </w:r>
+    </w:p>
+    <w:p>
+      <w:pPr>
+        <w:spacing w:after="160"/>
+      </w:pPr>
+      <w:r>
+        <w:rPr>
+          <w:i w:val="0"/>
+          <w:sz w:val="24"/>
+        </w:rPr>
+        <w:t>Each energy manager sends the vehicle model three numbers, and one of them is a ceiling on battery discharge power. Until 6 October 2026 the model applied that ceiling to the power it billed and not to the torque it delivered. A controller that set the ceiling below what the motor was drawing was charged for the ceiling, and the car accelerated as if no ceiling existed.</w:t>
+      </w:r>
+    </w:p>
+    <w:p>
+      <w:pPr>
+        <w:spacing w:after="160"/>
+      </w:pPr>
+      <w:r>
+        <w:rPr>
+          <w:i w:val="0"/>
+          <w:sz w:val="24"/>
+        </w:rPr>
+        <w:t>The table shows it. One fixed ceiling is held for the whole of the aggressive cycle, on the model as it stood and on the model as it stands now.</w:t>
+      </w:r>
+    </w:p>
+    <w:tbl>
+      <w:tblPr>
+        <w:tblStyle w:val="LightGrid-Accent1"/>
+        <w:tblW w:type="auto" w:w="0"/>
+        <w:jc w:val="center"/>
+        <w:tblLook w:firstColumn="1" w:firstRow="1" w:lastColumn="0" w:lastRow="0" w:noHBand="0" w:noVBand="1" w:val="04A0"/>
+      </w:tblPr>
+      <w:tblGrid>
+        <w:gridCol w:w="1608"/>
+        <w:gridCol w:w="1608"/>
+        <w:gridCol w:w="1608"/>
+        <w:gridCol w:w="1608"/>
+        <w:gridCol w:w="1608"/>
+        <w:gridCol w:w="1608"/>
+      </w:tblGrid>
+      <w:tr>
+        <w:tc>
+          <w:tcPr>
+            <w:tcW w:type="dxa" w:w="1608"/>
+          </w:tcPr>
+          <w:p>
+            <w:r/>
+            <w:r>
+              <w:rPr>
+                <w:b/>
+                <w:sz w:val="20"/>
+              </w:rPr>
+              <w:t>Ceiling</w:t>
+            </w:r>
+          </w:p>
+        </w:tc>
+        <w:tc>
+          <w:tcPr>
+            <w:tcW w:type="dxa" w:w="1608"/>
+          </w:tcPr>
+          <w:p>
+            <w:r/>
+            <w:r>
+              <w:rPr>
+                <w:b/>
+                <w:sz w:val="20"/>
+              </w:rPr>
+              <w:t>Before: energy, Wh/km</w:t>
+            </w:r>
+          </w:p>
+        </w:tc>
+        <w:tc>
+          <w:tcPr>
+            <w:tcW w:type="dxa" w:w="1608"/>
+          </w:tcPr>
+          <w:p>
+            <w:r/>
+            <w:r>
+              <w:rPr>
+                <w:b/>
+                <w:sz w:val="20"/>
+              </w:rPr>
+              <w:t>Before: tracking error, m/s</w:t>
+            </w:r>
+          </w:p>
+        </w:tc>
+        <w:tc>
+          <w:tcPr>
+            <w:tcW w:type="dxa" w:w="1608"/>
+          </w:tcPr>
+          <w:p>
+            <w:r/>
+            <w:r>
+              <w:rPr>
+                <w:b/>
+                <w:sz w:val="20"/>
+              </w:rPr>
+              <w:t>After: energy, Wh/km</w:t>
+            </w:r>
+          </w:p>
+        </w:tc>
+        <w:tc>
+          <w:tcPr>
+            <w:tcW w:type="dxa" w:w="1608"/>
+          </w:tcPr>
+          <w:p>
+            <w:r/>
+            <w:r>
+              <w:rPr>
+                <w:b/>
+                <w:sz w:val="20"/>
+              </w:rPr>
+              <w:t>After: tracking error, m/s</w:t>
+            </w:r>
+          </w:p>
+        </w:tc>
+        <w:tc>
+          <w:tcPr>
+            <w:tcW w:type="dxa" w:w="1608"/>
+          </w:tcPr>
+          <w:p>
+            <w:r/>
+            <w:r>
+              <w:rPr>
+                <w:b/>
+                <w:sz w:val="20"/>
+              </w:rPr>
+              <w:t>After: distance, km</w:t>
+            </w:r>
+          </w:p>
+        </w:tc>
+      </w:tr>
+      <w:tr>
+        <w:tc>
+          <w:tcPr>
+            <w:tcW w:type="dxa" w:w="1608"/>
+          </w:tcPr>
+          <w:p>
+            <w:r/>
+            <w:r>
+              <w:rPr>
+                <w:sz w:val="20"/>
+              </w:rPr>
+              <w:t>250 kW</w:t>
+            </w:r>
+          </w:p>
+        </w:tc>
+        <w:tc>
+          <w:tcPr>
+            <w:tcW w:type="dxa" w:w="1608"/>
+          </w:tcPr>
+          <w:p>
+            <w:r/>
+            <w:r>
+              <w:rPr>
+                <w:sz w:val="20"/>
+              </w:rPr>
+              <w:t>190.39</w:t>
+            </w:r>
+          </w:p>
+        </w:tc>
+        <w:tc>
+          <w:tcPr>
+            <w:tcW w:type="dxa" w:w="1608"/>
+          </w:tcPr>
+          <w:p>
+            <w:r/>
+            <w:r>
+              <w:rPr>
+                <w:sz w:val="20"/>
+              </w:rPr>
+              <w:t>0.0013</w:t>
+            </w:r>
+          </w:p>
+        </w:tc>
+        <w:tc>
+          <w:tcPr>
+            <w:tcW w:type="dxa" w:w="1608"/>
+          </w:tcPr>
+          <w:p>
+            <w:r/>
+            <w:r>
+              <w:rPr>
+                <w:sz w:val="20"/>
+              </w:rPr>
+              <w:t>190.39</w:t>
+            </w:r>
+          </w:p>
+        </w:tc>
+        <w:tc>
+          <w:tcPr>
+            <w:tcW w:type="dxa" w:w="1608"/>
+          </w:tcPr>
+          <w:p>
+            <w:r/>
+            <w:r>
+              <w:rPr>
+                <w:sz w:val="20"/>
+              </w:rPr>
+              <w:t>0.0013</w:t>
+            </w:r>
+          </w:p>
+        </w:tc>
+        <w:tc>
+          <w:tcPr>
+            <w:tcW w:type="dxa" w:w="1608"/>
+          </w:tcPr>
+          <w:p>
+            <w:r/>
+            <w:r>
+              <w:rPr>
+                <w:sz w:val="20"/>
+              </w:rPr>
+              <w:t>12.888</w:t>
+            </w:r>
+          </w:p>
+        </w:tc>
+      </w:tr>
+      <w:tr>
+        <w:tc>
+          <w:tcPr>
+            <w:tcW w:type="dxa" w:w="1608"/>
+          </w:tcPr>
+          <w:p>
+            <w:r/>
+            <w:r>
+              <w:rPr>
+                <w:sz w:val="20"/>
+              </w:rPr>
+              <w:t>80 kW</w:t>
+            </w:r>
+          </w:p>
+        </w:tc>
+        <w:tc>
+          <w:tcPr>
+            <w:tcW w:type="dxa" w:w="1608"/>
+          </w:tcPr>
+          <w:p>
+            <w:r/>
+            <w:r>
+              <w:rPr>
+                <w:sz w:val="20"/>
+              </w:rPr>
+              <w:t>189.85</w:t>
+            </w:r>
+          </w:p>
+        </w:tc>
+        <w:tc>
+          <w:tcPr>
+            <w:tcW w:type="dxa" w:w="1608"/>
+          </w:tcPr>
+          <w:p>
+            <w:r/>
+            <w:r>
+              <w:rPr>
+                <w:sz w:val="20"/>
+              </w:rPr>
+              <w:t>0.0013</w:t>
+            </w:r>
+          </w:p>
+        </w:tc>
+        <w:tc>
+          <w:tcPr>
+            <w:tcW w:type="dxa" w:w="1608"/>
+          </w:tcPr>
+          <w:p>
+            <w:r/>
+            <w:r>
+              <w:rPr>
+                <w:sz w:val="20"/>
+              </w:rPr>
+              <w:t>190.32</w:t>
+            </w:r>
+          </w:p>
+        </w:tc>
+        <w:tc>
+          <w:tcPr>
+            <w:tcW w:type="dxa" w:w="1608"/>
+          </w:tcPr>
+          <w:p>
+            <w:r/>
+            <w:r>
+              <w:rPr>
+                <w:sz w:val="20"/>
+              </w:rPr>
+              <w:t>0.0106</w:t>
+            </w:r>
+          </w:p>
+        </w:tc>
+        <w:tc>
+          <w:tcPr>
+            <w:tcW w:type="dxa" w:w="1608"/>
+          </w:tcPr>
+          <w:p>
+            <w:r/>
+            <w:r>
+              <w:rPr>
+                <w:sz w:val="20"/>
+              </w:rPr>
+              <w:t>12.888</w:t>
+            </w:r>
+          </w:p>
+        </w:tc>
+      </w:tr>
+      <w:tr>
+        <w:tc>
+          <w:tcPr>
+            <w:tcW w:type="dxa" w:w="1608"/>
+          </w:tcPr>
+          <w:p>
+            <w:r/>
+            <w:r>
+              <w:rPr>
+                <w:sz w:val="20"/>
+              </w:rPr>
+              <w:t>60 kW</w:t>
+            </w:r>
+          </w:p>
+        </w:tc>
+        <w:tc>
+          <w:tcPr>
+            <w:tcW w:type="dxa" w:w="1608"/>
+          </w:tcPr>
+          <w:p>
+            <w:r/>
+            <w:r>
+              <w:rPr>
+                <w:sz w:val="20"/>
+              </w:rPr>
+              <w:t>187.31</w:t>
+            </w:r>
+          </w:p>
+        </w:tc>
+        <w:tc>
+          <w:tcPr>
+            <w:tcW w:type="dxa" w:w="1608"/>
+          </w:tcPr>
+          <w:p>
+            <w:r/>
+            <w:r>
+              <w:rPr>
+                <w:sz w:val="20"/>
+              </w:rPr>
+              <w:t>0.0013</w:t>
+            </w:r>
+          </w:p>
+        </w:tc>
+        <w:tc>
+          <w:tcPr>
+            <w:tcW w:type="dxa" w:w="1608"/>
+          </w:tcPr>
+          <w:p>
+            <w:r/>
+            <w:r>
+              <w:rPr>
+                <w:sz w:val="20"/>
+              </w:rPr>
+              <w:t>190.31</w:t>
+            </w:r>
+          </w:p>
+        </w:tc>
+        <w:tc>
+          <w:tcPr>
+            <w:tcW w:type="dxa" w:w="1608"/>
+          </w:tcPr>
+          <w:p>
+            <w:r/>
+            <w:r>
+              <w:rPr>
+                <w:sz w:val="20"/>
+              </w:rPr>
+              <w:t>0.0687</w:t>
+            </w:r>
+          </w:p>
+        </w:tc>
+        <w:tc>
+          <w:tcPr>
+            <w:tcW w:type="dxa" w:w="1608"/>
+          </w:tcPr>
+          <w:p>
+            <w:r/>
+            <w:r>
+              <w:rPr>
+                <w:sz w:val="20"/>
+              </w:rPr>
+              <w:t>12.886</w:t>
+            </w:r>
+          </w:p>
+        </w:tc>
+      </w:tr>
+      <w:tr>
+        <w:tc>
+          <w:tcPr>
+            <w:tcW w:type="dxa" w:w="1608"/>
+          </w:tcPr>
+          <w:p>
+            <w:r/>
+            <w:r>
+              <w:rPr>
+                <w:sz w:val="20"/>
+              </w:rPr>
+              <w:t>40 kW</w:t>
+            </w:r>
+          </w:p>
+        </w:tc>
+        <w:tc>
+          <w:tcPr>
+            <w:tcW w:type="dxa" w:w="1608"/>
+          </w:tcPr>
+          <w:p>
+            <w:r/>
+            <w:r>
+              <w:rPr>
+                <w:sz w:val="20"/>
+              </w:rPr>
+              <w:t>174.85</w:t>
+            </w:r>
+          </w:p>
+        </w:tc>
+        <w:tc>
+          <w:tcPr>
+            <w:tcW w:type="dxa" w:w="1608"/>
+          </w:tcPr>
+          <w:p>
+            <w:r/>
+            <w:r>
+              <w:rPr>
+                <w:sz w:val="20"/>
+              </w:rPr>
+              <w:t>0.0013</w:t>
+            </w:r>
+          </w:p>
+        </w:tc>
+        <w:tc>
+          <w:tcPr>
+            <w:tcW w:type="dxa" w:w="1608"/>
+          </w:tcPr>
+          <w:p>
+            <w:r/>
+            <w:r>
+              <w:rPr>
+                <w:sz w:val="20"/>
+              </w:rPr>
+              <w:t>189.80</w:t>
+            </w:r>
+          </w:p>
+        </w:tc>
+        <w:tc>
+          <w:tcPr>
+            <w:tcW w:type="dxa" w:w="1608"/>
+          </w:tcPr>
+          <w:p>
+            <w:r/>
+            <w:r>
+              <w:rPr>
+                <w:sz w:val="20"/>
+              </w:rPr>
+              <w:t>0.5157</w:t>
+            </w:r>
+          </w:p>
+        </w:tc>
+        <w:tc>
+          <w:tcPr>
+            <w:tcW w:type="dxa" w:w="1608"/>
+          </w:tcPr>
+          <w:p>
+            <w:r/>
+            <w:r>
+              <w:rPr>
+                <w:sz w:val="20"/>
+              </w:rPr>
+              <w:t>12.815</w:t>
+            </w:r>
+          </w:p>
+        </w:tc>
+      </w:tr>
+      <w:tr>
+        <w:tc>
+          <w:tcPr>
+            <w:tcW w:type="dxa" w:w="1608"/>
+          </w:tcPr>
+          <w:p>
+            <w:r/>
+            <w:r>
+              <w:rPr>
+                <w:sz w:val="20"/>
+              </w:rPr>
+              <w:t>20 kW</w:t>
+            </w:r>
+          </w:p>
+        </w:tc>
+        <w:tc>
+          <w:tcPr>
+            <w:tcW w:type="dxa" w:w="1608"/>
+          </w:tcPr>
+          <w:p>
+            <w:r/>
+            <w:r>
+              <w:rPr>
+                <w:sz w:val="20"/>
+              </w:rPr>
+              <w:t>114.68</w:t>
+            </w:r>
+          </w:p>
+        </w:tc>
+        <w:tc>
+          <w:tcPr>
+            <w:tcW w:type="dxa" w:w="1608"/>
+          </w:tcPr>
+          <w:p>
+            <w:r/>
+            <w:r>
+              <w:rPr>
+                <w:sz w:val="20"/>
+              </w:rPr>
+              <w:t>0.0013</w:t>
+            </w:r>
+          </w:p>
+        </w:tc>
+        <w:tc>
+          <w:tcPr>
+            <w:tcW w:type="dxa" w:w="1608"/>
+          </w:tcPr>
+          <w:p>
+            <w:r/>
+            <w:r>
+              <w:rPr>
+                <w:sz w:val="20"/>
+              </w:rPr>
+              <w:t>180.57</w:t>
+            </w:r>
+          </w:p>
+        </w:tc>
+        <w:tc>
+          <w:tcPr>
+            <w:tcW w:type="dxa" w:w="1608"/>
+          </w:tcPr>
+          <w:p>
+            <w:r/>
+            <w:r>
+              <w:rPr>
+                <w:sz w:val="20"/>
+              </w:rPr>
+              <w:t>2.9224</w:t>
+            </w:r>
+          </w:p>
+        </w:tc>
+        <w:tc>
+          <w:tcPr>
+            <w:tcW w:type="dxa" w:w="1608"/>
+          </w:tcPr>
+          <w:p>
+            <w:r/>
+            <w:r>
+              <w:rPr>
+                <w:sz w:val="20"/>
+              </w:rPr>
+              <w:t>11.845</w:t>
+            </w:r>
+          </w:p>
+        </w:tc>
+      </w:tr>
+      <w:tr>
+        <w:tc>
+          <w:tcPr>
+            <w:tcW w:type="dxa" w:w="1608"/>
+          </w:tcPr>
+          <w:p>
+            <w:r/>
+            <w:r>
+              <w:rPr>
+                <w:sz w:val="20"/>
+              </w:rPr>
+              <w:t>5 kW</w:t>
+            </w:r>
+          </w:p>
+        </w:tc>
+        <w:tc>
+          <w:tcPr>
+            <w:tcW w:type="dxa" w:w="1608"/>
+          </w:tcPr>
+          <w:p>
+            <w:r/>
+            <w:r>
+              <w:rPr>
+                <w:sz w:val="20"/>
+              </w:rPr>
+              <w:t>8.05</w:t>
+            </w:r>
+          </w:p>
+        </w:tc>
+        <w:tc>
+          <w:tcPr>
+            <w:tcW w:type="dxa" w:w="1608"/>
+          </w:tcPr>
+          <w:p>
+            <w:r/>
+            <w:r>
+              <w:rPr>
+                <w:sz w:val="20"/>
+              </w:rPr>
+              <w:t>0.0013</w:t>
+            </w:r>
+          </w:p>
+        </w:tc>
+        <w:tc>
+          <w:tcPr>
+            <w:tcW w:type="dxa" w:w="1608"/>
+          </w:tcPr>
+          <w:p>
+            <w:r/>
+            <w:r>
+              <w:rPr>
+                <w:sz w:val="20"/>
+              </w:rPr>
+              <w:t>156.16</w:t>
+            </w:r>
+          </w:p>
+        </w:tc>
+        <w:tc>
+          <w:tcPr>
+            <w:tcW w:type="dxa" w:w="1608"/>
+          </w:tcPr>
+          <w:p>
+            <w:r/>
+            <w:r>
+              <w:rPr>
+                <w:sz w:val="20"/>
+              </w:rPr>
+              <w:t>16.1464</w:t>
+            </w:r>
+          </w:p>
+        </w:tc>
+        <w:tc>
+          <w:tcPr>
+            <w:tcW w:type="dxa" w:w="1608"/>
+          </w:tcPr>
+          <w:p>
+            <w:r/>
+            <w:r>
+              <w:rPr>
+                <w:sz w:val="20"/>
+              </w:rPr>
+              <w:t>4.453</w:t>
+            </w:r>
+          </w:p>
+        </w:tc>
+      </w:tr>
+    </w:tbl>
+    <w:p>
+      <w:pPr>
+        <w:spacing w:after="40"/>
+      </w:pPr>
+    </w:p>
+    <w:p>
+      <w:pPr>
+        <w:spacing w:after="160"/>
+      </w:pPr>
+      <w:r>
+        <w:rPr>
+          <w:i/>
+          <w:color w:val="595959"/>
+          <w:sz w:val="18"/>
+        </w:rPr>
+        <w:t>Table. A constant power ceiling on US06, regeneration fully on. SIMULATED on the laptop. The "before" columns run the vehicle model from the commit preceding the fix, read out of the repository history by scripts/run_plant_correction.py.</w:t>
+      </w:r>
+    </w:p>
+    <w:p>
+      <w:pPr>
+        <w:spacing w:after="160"/>
+      </w:pPr>
+      <w:r>
+        <w:rPr>
+          <w:i w:val="0"/>
+          <w:sz w:val="24"/>
+        </w:rPr>
+        <w:t>On the old model the lowest ceiling drove the same 12.89 kilometres with the same tracking error for 8.05 watt-hours per kilometre, against 190.39 with the ceiling open. That is not an efficient drive. It is a bill that stopped counting.</w:t>
+      </w:r>
+    </w:p>
+    <w:p>
+      <w:pPr>
+        <w:pStyle w:val="Heading2"/>
+      </w:pPr>
+      <w:r>
+        <w:t>Why this was the week-10 result</w:t>
+      </w:r>
+    </w:p>
+    <w:p>
+      <w:pPr>
+        <w:spacing w:after="160"/>
+      </w:pPr>
+      <w:r>
+        <w:rPr>
+          <w:i w:val="0"/>
+          <w:sz w:val="24"/>
+        </w:rPr>
+        <w:t>The learned controller may set the ceiling anywhere from 40 to 125 kilowatts. On the old model it scores 176.71 watt-hours per kilometre on US06 against 190.47 for the rules, and a ceiling pinned at 40 kilowatts scores 174.85. The campaign on the chip measured the same gap. Three features of that campaign's own tables pointed here and were read as something else.</w:t>
+      </w:r>
+    </w:p>
+    <w:p>
+      <w:pPr>
+        <w:pStyle w:val="ListBullet"/>
+        <w:spacing w:after="80"/>
+      </w:pPr>
+      <w:r>
+        <w:t>The learned controller finished below the offline optimum of section 16 at equal tracking error. An optimum is not beaten by seven per cent.</w:t>
+      </w:r>
+    </w:p>
+    <w:p>
+      <w:pPr>
+        <w:pStyle w:val="ListBullet"/>
+        <w:spacing w:after="80"/>
+      </w:pPr>
+      <w:r>
+        <w:t>Its advantage grew with how hard the car was driven, on three separate axes. Harder driving is where a ceiling binds for longest.</w:t>
+      </w:r>
+    </w:p>
+    <w:p>
+      <w:pPr>
+        <w:pStyle w:val="ListBullet"/>
+        <w:spacing w:after="80"/>
+      </w:pPr>
+      <w:r>
+        <w:t>The advantage vanished on the highway and urban cycles, where demand stays under the 40 kilowatt floor and no ceiling can bind.</w:t>
+      </w:r>
+    </w:p>
+    <w:p>
+      <w:pPr>
+        <w:spacing w:after="160"/>
+      </w:pPr>
+      <w:r>
+        <w:rPr>
+          <w:i w:val="0"/>
+          <w:sz w:val="24"/>
+        </w:rPr>
+        <w:t>The earlier explanation, that the learned controller saves energy by shaving current peaks, was labelled as inferred. It was wrong.</w:t>
+      </w:r>
+    </w:p>
+    <w:p>
+      <w:pPr>
+        <w:pStyle w:val="Heading2"/>
+      </w:pPr>
+      <w:r>
+        <w:t>The fix</w:t>
+      </w:r>
+    </w:p>
+    <w:p>
+      <w:pPr>
+        <w:spacing w:after="160"/>
+      </w:pPr>
+      <w:r>
+        <w:rPr>
+          <w:i w:val="0"/>
+          <w:sz w:val="24"/>
+        </w:rPr>
+        <w:t>The motor now receives what the battery delivered, less the auxiliary load, and acceleration is computed from the torque that power can produce, and the pack's current limit is treated the same way because it had the same fault. Nothing else changed. A limit that does not bind leaves every output bit for bit as it was, and a test asserts that.</w:t>
+      </w:r>
+    </w:p>
+    <w:p>
+      <w:pPr>
+        <w:pStyle w:val="Heading2"/>
+      </w:pPr>
+      <w:r>
+        <w:t>Both controllers on the corrected model</w:t>
+      </w:r>
+    </w:p>
+    <w:tbl>
+      <w:tblPr>
+        <w:tblStyle w:val="LightGrid-Accent1"/>
+        <w:tblW w:type="auto" w:w="0"/>
+        <w:jc w:val="center"/>
+        <w:tblLook w:firstColumn="1" w:firstRow="1" w:lastColumn="0" w:lastRow="0" w:noHBand="0" w:noVBand="1" w:val="04A0"/>
+      </w:tblPr>
+      <w:tblGrid>
+        <w:gridCol w:w="1378"/>
+        <w:gridCol w:w="1378"/>
+        <w:gridCol w:w="1378"/>
+        <w:gridCol w:w="1378"/>
+        <w:gridCol w:w="1378"/>
+        <w:gridCol w:w="1378"/>
+        <w:gridCol w:w="1378"/>
+      </w:tblGrid>
+      <w:tr>
+        <w:tc>
+          <w:tcPr>
+            <w:tcW w:type="dxa" w:w="1378"/>
+          </w:tcPr>
+          <w:p>
+            <w:r/>
+            <w:r>
+              <w:rPr>
+                <w:b/>
+                <w:sz w:val="20"/>
+              </w:rPr>
+              <w:t>Cycle</w:t>
+            </w:r>
+          </w:p>
+        </w:tc>
+        <w:tc>
+          <w:tcPr>
+            <w:tcW w:type="dxa" w:w="1378"/>
+          </w:tcPr>
+          <w:p>
+            <w:r/>
+            <w:r>
+              <w:rPr>
+                <w:b/>
+                <w:sz w:val="20"/>
+              </w:rPr>
+              <w:t>Model</w:t>
+            </w:r>
+          </w:p>
+        </w:tc>
+        <w:tc>
+          <w:tcPr>
+            <w:tcW w:type="dxa" w:w="1378"/>
+          </w:tcPr>
+          <w:p>
+            <w:r/>
+            <w:r>
+              <w:rPr>
+                <w:b/>
+                <w:sz w:val="20"/>
+              </w:rPr>
+              <w:t>Rules, Wh/km</w:t>
+            </w:r>
+          </w:p>
+        </w:tc>
+        <w:tc>
+          <w:tcPr>
+            <w:tcW w:type="dxa" w:w="1378"/>
+          </w:tcPr>
+          <w:p>
+            <w:r/>
+            <w:r>
+              <w:rPr>
+                <w:b/>
+                <w:sz w:val="20"/>
+              </w:rPr>
+              <w:t>Learned, Wh/km</w:t>
+            </w:r>
+          </w:p>
+        </w:tc>
+        <w:tc>
+          <w:tcPr>
+            <w:tcW w:type="dxa" w:w="1378"/>
+          </w:tcPr>
+          <w:p>
+            <w:r/>
+            <w:r>
+              <w:rPr>
+                <w:b/>
+                <w:sz w:val="20"/>
+              </w:rPr>
+              <w:t>Learned vs rules</w:t>
+            </w:r>
+          </w:p>
+        </w:tc>
+        <w:tc>
+          <w:tcPr>
+            <w:tcW w:type="dxa" w:w="1378"/>
+          </w:tcPr>
+          <w:p>
+            <w:r/>
+            <w:r>
+              <w:rPr>
+                <w:b/>
+                <w:sz w:val="20"/>
+              </w:rPr>
+              <w:t>Rules: tracking, m/s</w:t>
+            </w:r>
+          </w:p>
+        </w:tc>
+        <w:tc>
+          <w:tcPr>
+            <w:tcW w:type="dxa" w:w="1378"/>
+          </w:tcPr>
+          <w:p>
+            <w:r/>
+            <w:r>
+              <w:rPr>
+                <w:b/>
+                <w:sz w:val="20"/>
+              </w:rPr>
+              <w:t>Learned: tracking, m/s</w:t>
+            </w:r>
+          </w:p>
+        </w:tc>
+      </w:tr>
+      <w:tr>
+        <w:tc>
+          <w:tcPr>
+            <w:tcW w:type="dxa" w:w="1378"/>
+          </w:tcPr>
+          <w:p>
+            <w:r/>
+            <w:r>
+              <w:rPr>
+                <w:sz w:val="20"/>
+              </w:rPr>
+              <w:t>WLTC3B</w:t>
+            </w:r>
+          </w:p>
+        </w:tc>
+        <w:tc>
+          <w:tcPr>
+            <w:tcW w:type="dxa" w:w="1378"/>
+          </w:tcPr>
+          <w:p>
+            <w:r/>
+            <w:r>
+              <w:rPr>
+                <w:sz w:val="20"/>
+              </w:rPr>
+              <w:t>before</w:t>
+            </w:r>
+          </w:p>
+        </w:tc>
+        <w:tc>
+          <w:tcPr>
+            <w:tcW w:type="dxa" w:w="1378"/>
+          </w:tcPr>
+          <w:p>
+            <w:r/>
+            <w:r>
+              <w:rPr>
+                <w:sz w:val="20"/>
+              </w:rPr>
+              <w:t>175.99</w:t>
+            </w:r>
+          </w:p>
+        </w:tc>
+        <w:tc>
+          <w:tcPr>
+            <w:tcW w:type="dxa" w:w="1378"/>
+          </w:tcPr>
+          <w:p>
+            <w:r/>
+            <w:r>
+              <w:rPr>
+                <w:sz w:val="20"/>
+              </w:rPr>
+              <w:t>175.78</w:t>
+            </w:r>
+          </w:p>
+        </w:tc>
+        <w:tc>
+          <w:tcPr>
+            <w:tcW w:type="dxa" w:w="1378"/>
+          </w:tcPr>
+          <w:p>
+            <w:r/>
+            <w:r>
+              <w:rPr>
+                <w:sz w:val="20"/>
+              </w:rPr>
+              <w:t>-0.12%</w:t>
+            </w:r>
+          </w:p>
+        </w:tc>
+        <w:tc>
+          <w:tcPr>
+            <w:tcW w:type="dxa" w:w="1378"/>
+          </w:tcPr>
+          <w:p>
+            <w:r/>
+            <w:r>
+              <w:rPr>
+                <w:sz w:val="20"/>
+              </w:rPr>
+              <w:t>0.0006</w:t>
+            </w:r>
+          </w:p>
+        </w:tc>
+        <w:tc>
+          <w:tcPr>
+            <w:tcW w:type="dxa" w:w="1378"/>
+          </w:tcPr>
+          <w:p>
+            <w:r/>
+            <w:r>
+              <w:rPr>
+                <w:sz w:val="20"/>
+              </w:rPr>
+              <w:t>0.0006</w:t>
+            </w:r>
+          </w:p>
+        </w:tc>
+      </w:tr>
+      <w:tr>
+        <w:tc>
+          <w:tcPr>
+            <w:tcW w:type="dxa" w:w="1378"/>
+          </w:tcPr>
+          <w:p>
+            <w:r/>
+            <w:r>
+              <w:rPr>
+                <w:sz w:val="20"/>
+              </w:rPr>
+              <w:t>WLTC3B</w:t>
+            </w:r>
+          </w:p>
+        </w:tc>
+        <w:tc>
+          <w:tcPr>
+            <w:tcW w:type="dxa" w:w="1378"/>
+          </w:tcPr>
+          <w:p>
+            <w:r/>
+            <w:r>
+              <w:rPr>
+                <w:sz w:val="20"/>
+              </w:rPr>
+              <w:t>after</w:t>
+            </w:r>
+          </w:p>
+        </w:tc>
+        <w:tc>
+          <w:tcPr>
+            <w:tcW w:type="dxa" w:w="1378"/>
+          </w:tcPr>
+          <w:p>
+            <w:r/>
+            <w:r>
+              <w:rPr>
+                <w:sz w:val="20"/>
+              </w:rPr>
+              <w:t>175.99</w:t>
+            </w:r>
+          </w:p>
+        </w:tc>
+        <w:tc>
+          <w:tcPr>
+            <w:tcW w:type="dxa" w:w="1378"/>
+          </w:tcPr>
+          <w:p>
+            <w:r/>
+            <w:r>
+              <w:rPr>
+                <w:sz w:val="20"/>
+              </w:rPr>
+              <w:t>176.53</w:t>
+            </w:r>
+          </w:p>
+        </w:tc>
+        <w:tc>
+          <w:tcPr>
+            <w:tcW w:type="dxa" w:w="1378"/>
+          </w:tcPr>
+          <w:p>
+            <w:r/>
+            <w:r>
+              <w:rPr>
+                <w:sz w:val="20"/>
+              </w:rPr>
+              <w:t>+0.31%</w:t>
+            </w:r>
+          </w:p>
+        </w:tc>
+        <w:tc>
+          <w:tcPr>
+            <w:tcW w:type="dxa" w:w="1378"/>
+          </w:tcPr>
+          <w:p>
+            <w:r/>
+            <w:r>
+              <w:rPr>
+                <w:sz w:val="20"/>
+              </w:rPr>
+              <w:t>0.0006</w:t>
+            </w:r>
+          </w:p>
+        </w:tc>
+        <w:tc>
+          <w:tcPr>
+            <w:tcW w:type="dxa" w:w="1378"/>
+          </w:tcPr>
+          <w:p>
+            <w:r/>
+            <w:r>
+              <w:rPr>
+                <w:sz w:val="20"/>
+              </w:rPr>
+              <w:t>0.0286</w:t>
+            </w:r>
+          </w:p>
+        </w:tc>
+      </w:tr>
+      <w:tr>
+        <w:tc>
+          <w:tcPr>
+            <w:tcW w:type="dxa" w:w="1378"/>
+          </w:tcPr>
+          <w:p>
+            <w:r/>
+            <w:r>
+              <w:rPr>
+                <w:sz w:val="20"/>
+              </w:rPr>
+              <w:t>UDDS</w:t>
+            </w:r>
+          </w:p>
+        </w:tc>
+        <w:tc>
+          <w:tcPr>
+            <w:tcW w:type="dxa" w:w="1378"/>
+          </w:tcPr>
+          <w:p>
+            <w:r/>
+            <w:r>
+              <w:rPr>
+                <w:sz w:val="20"/>
+              </w:rPr>
+              <w:t>before</w:t>
+            </w:r>
+          </w:p>
+        </w:tc>
+        <w:tc>
+          <w:tcPr>
+            <w:tcW w:type="dxa" w:w="1378"/>
+          </w:tcPr>
+          <w:p>
+            <w:r/>
+            <w:r>
+              <w:rPr>
+                <w:sz w:val="20"/>
+              </w:rPr>
+              <w:t>167.93</w:t>
+            </w:r>
+          </w:p>
+        </w:tc>
+        <w:tc>
+          <w:tcPr>
+            <w:tcW w:type="dxa" w:w="1378"/>
+          </w:tcPr>
+          <w:p>
+            <w:r/>
+            <w:r>
+              <w:rPr>
+                <w:sz w:val="20"/>
+              </w:rPr>
+              <w:t>168.31</w:t>
+            </w:r>
+          </w:p>
+        </w:tc>
+        <w:tc>
+          <w:tcPr>
+            <w:tcW w:type="dxa" w:w="1378"/>
+          </w:tcPr>
+          <w:p>
+            <w:r/>
+            <w:r>
+              <w:rPr>
+                <w:sz w:val="20"/>
+              </w:rPr>
+              <w:t>+0.23%</w:t>
+            </w:r>
+          </w:p>
+        </w:tc>
+        <w:tc>
+          <w:tcPr>
+            <w:tcW w:type="dxa" w:w="1378"/>
+          </w:tcPr>
+          <w:p>
+            <w:r/>
+            <w:r>
+              <w:rPr>
+                <w:sz w:val="20"/>
+              </w:rPr>
+              <w:t>0.0007</w:t>
+            </w:r>
+          </w:p>
+        </w:tc>
+        <w:tc>
+          <w:tcPr>
+            <w:tcW w:type="dxa" w:w="1378"/>
+          </w:tcPr>
+          <w:p>
+            <w:r/>
+            <w:r>
+              <w:rPr>
+                <w:sz w:val="20"/>
+              </w:rPr>
+              <w:t>0.0007</w:t>
+            </w:r>
+          </w:p>
+        </w:tc>
+      </w:tr>
+      <w:tr>
+        <w:tc>
+          <w:tcPr>
+            <w:tcW w:type="dxa" w:w="1378"/>
+          </w:tcPr>
+          <w:p>
+            <w:r/>
+            <w:r>
+              <w:rPr>
+                <w:sz w:val="20"/>
+              </w:rPr>
+              <w:t>UDDS</w:t>
+            </w:r>
+          </w:p>
+        </w:tc>
+        <w:tc>
+          <w:tcPr>
+            <w:tcW w:type="dxa" w:w="1378"/>
+          </w:tcPr>
+          <w:p>
+            <w:r/>
+            <w:r>
+              <w:rPr>
+                <w:sz w:val="20"/>
+              </w:rPr>
+              <w:t>after</w:t>
+            </w:r>
+          </w:p>
+        </w:tc>
+        <w:tc>
+          <w:tcPr>
+            <w:tcW w:type="dxa" w:w="1378"/>
+          </w:tcPr>
+          <w:p>
+            <w:r/>
+            <w:r>
+              <w:rPr>
+                <w:sz w:val="20"/>
+              </w:rPr>
+              <w:t>167.93</w:t>
+            </w:r>
+          </w:p>
+        </w:tc>
+        <w:tc>
+          <w:tcPr>
+            <w:tcW w:type="dxa" w:w="1378"/>
+          </w:tcPr>
+          <w:p>
+            <w:r/>
+            <w:r>
+              <w:rPr>
+                <w:sz w:val="20"/>
+              </w:rPr>
+              <w:t>168.32</w:t>
+            </w:r>
+          </w:p>
+        </w:tc>
+        <w:tc>
+          <w:tcPr>
+            <w:tcW w:type="dxa" w:w="1378"/>
+          </w:tcPr>
+          <w:p>
+            <w:r/>
+            <w:r>
+              <w:rPr>
+                <w:sz w:val="20"/>
+              </w:rPr>
+              <w:t>+0.23%</w:t>
+            </w:r>
+          </w:p>
+        </w:tc>
+        <w:tc>
+          <w:tcPr>
+            <w:tcW w:type="dxa" w:w="1378"/>
+          </w:tcPr>
+          <w:p>
+            <w:r/>
+            <w:r>
+              <w:rPr>
+                <w:sz w:val="20"/>
+              </w:rPr>
+              <w:t>0.0007</w:t>
+            </w:r>
+          </w:p>
+        </w:tc>
+        <w:tc>
+          <w:tcPr>
+            <w:tcW w:type="dxa" w:w="1378"/>
+          </w:tcPr>
+          <w:p>
+            <w:r/>
+            <w:r>
+              <w:rPr>
+                <w:sz w:val="20"/>
+              </w:rPr>
+              <w:t>0.0007</w:t>
+            </w:r>
+          </w:p>
+        </w:tc>
+      </w:tr>
+      <w:tr>
+        <w:tc>
+          <w:tcPr>
+            <w:tcW w:type="dxa" w:w="1378"/>
+          </w:tcPr>
+          <w:p>
+            <w:r/>
+            <w:r>
+              <w:rPr>
+                <w:sz w:val="20"/>
+              </w:rPr>
+              <w:t>HWFET</w:t>
+            </w:r>
+          </w:p>
+        </w:tc>
+        <w:tc>
+          <w:tcPr>
+            <w:tcW w:type="dxa" w:w="1378"/>
+          </w:tcPr>
+          <w:p>
+            <w:r/>
+            <w:r>
+              <w:rPr>
+                <w:sz w:val="20"/>
+              </w:rPr>
+              <w:t>before</w:t>
+            </w:r>
+          </w:p>
+        </w:tc>
+        <w:tc>
+          <w:tcPr>
+            <w:tcW w:type="dxa" w:w="1378"/>
+          </w:tcPr>
+          <w:p>
+            <w:r/>
+            <w:r>
+              <w:rPr>
+                <w:sz w:val="20"/>
+              </w:rPr>
+              <w:t>153.90</w:t>
+            </w:r>
+          </w:p>
+        </w:tc>
+        <w:tc>
+          <w:tcPr>
+            <w:tcW w:type="dxa" w:w="1378"/>
+          </w:tcPr>
+          <w:p>
+            <w:r/>
+            <w:r>
+              <w:rPr>
+                <w:sz w:val="20"/>
+              </w:rPr>
+              <w:t>154.07</w:t>
+            </w:r>
+          </w:p>
+        </w:tc>
+        <w:tc>
+          <w:tcPr>
+            <w:tcW w:type="dxa" w:w="1378"/>
+          </w:tcPr>
+          <w:p>
+            <w:r/>
+            <w:r>
+              <w:rPr>
+                <w:sz w:val="20"/>
+              </w:rPr>
+              <w:t>+0.11%</w:t>
+            </w:r>
+          </w:p>
+        </w:tc>
+        <w:tc>
+          <w:tcPr>
+            <w:tcW w:type="dxa" w:w="1378"/>
+          </w:tcPr>
+          <w:p>
+            <w:r/>
+            <w:r>
+              <w:rPr>
+                <w:sz w:val="20"/>
+              </w:rPr>
+              <w:t>0.0003</w:t>
+            </w:r>
+          </w:p>
+        </w:tc>
+        <w:tc>
+          <w:tcPr>
+            <w:tcW w:type="dxa" w:w="1378"/>
+          </w:tcPr>
+          <w:p>
+            <w:r/>
+            <w:r>
+              <w:rPr>
+                <w:sz w:val="20"/>
+              </w:rPr>
+              <w:t>0.0003</w:t>
+            </w:r>
+          </w:p>
+        </w:tc>
+      </w:tr>
+      <w:tr>
+        <w:tc>
+          <w:tcPr>
+            <w:tcW w:type="dxa" w:w="1378"/>
+          </w:tcPr>
+          <w:p>
+            <w:r/>
+            <w:r>
+              <w:rPr>
+                <w:sz w:val="20"/>
+              </w:rPr>
+              <w:t>HWFET</w:t>
+            </w:r>
+          </w:p>
+        </w:tc>
+        <w:tc>
+          <w:tcPr>
+            <w:tcW w:type="dxa" w:w="1378"/>
+          </w:tcPr>
+          <w:p>
+            <w:r/>
+            <w:r>
+              <w:rPr>
+                <w:sz w:val="20"/>
+              </w:rPr>
+              <w:t>after</w:t>
+            </w:r>
+          </w:p>
+        </w:tc>
+        <w:tc>
+          <w:tcPr>
+            <w:tcW w:type="dxa" w:w="1378"/>
+          </w:tcPr>
+          <w:p>
+            <w:r/>
+            <w:r>
+              <w:rPr>
+                <w:sz w:val="20"/>
+              </w:rPr>
+              <w:t>153.90</w:t>
+            </w:r>
+          </w:p>
+        </w:tc>
+        <w:tc>
+          <w:tcPr>
+            <w:tcW w:type="dxa" w:w="1378"/>
+          </w:tcPr>
+          <w:p>
+            <w:r/>
+            <w:r>
+              <w:rPr>
+                <w:sz w:val="20"/>
+              </w:rPr>
+              <w:t>154.07</w:t>
+            </w:r>
+          </w:p>
+        </w:tc>
+        <w:tc>
+          <w:tcPr>
+            <w:tcW w:type="dxa" w:w="1378"/>
+          </w:tcPr>
+          <w:p>
+            <w:r/>
+            <w:r>
+              <w:rPr>
+                <w:sz w:val="20"/>
+              </w:rPr>
+              <w:t>+0.11%</w:t>
+            </w:r>
+          </w:p>
+        </w:tc>
+        <w:tc>
+          <w:tcPr>
+            <w:tcW w:type="dxa" w:w="1378"/>
+          </w:tcPr>
+          <w:p>
+            <w:r/>
+            <w:r>
+              <w:rPr>
+                <w:sz w:val="20"/>
+              </w:rPr>
+              <w:t>0.0003</w:t>
+            </w:r>
+          </w:p>
+        </w:tc>
+        <w:tc>
+          <w:tcPr>
+            <w:tcW w:type="dxa" w:w="1378"/>
+          </w:tcPr>
+          <w:p>
+            <w:r/>
+            <w:r>
+              <w:rPr>
+                <w:sz w:val="20"/>
+              </w:rPr>
+              <w:t>0.0003</w:t>
+            </w:r>
+          </w:p>
+        </w:tc>
+      </w:tr>
+      <w:tr>
+        <w:tc>
+          <w:tcPr>
+            <w:tcW w:type="dxa" w:w="1378"/>
+          </w:tcPr>
+          <w:p>
+            <w:r/>
+            <w:r>
+              <w:rPr>
+                <w:sz w:val="20"/>
+              </w:rPr>
+              <w:t>US06</w:t>
+            </w:r>
+          </w:p>
+        </w:tc>
+        <w:tc>
+          <w:tcPr>
+            <w:tcW w:type="dxa" w:w="1378"/>
+          </w:tcPr>
+          <w:p>
+            <w:r/>
+            <w:r>
+              <w:rPr>
+                <w:sz w:val="20"/>
+              </w:rPr>
+              <w:t>before</w:t>
+            </w:r>
+          </w:p>
+        </w:tc>
+        <w:tc>
+          <w:tcPr>
+            <w:tcW w:type="dxa" w:w="1378"/>
+          </w:tcPr>
+          <w:p>
+            <w:r/>
+            <w:r>
+              <w:rPr>
+                <w:sz w:val="20"/>
+              </w:rPr>
+              <w:t>190.47</w:t>
+            </w:r>
+          </w:p>
+        </w:tc>
+        <w:tc>
+          <w:tcPr>
+            <w:tcW w:type="dxa" w:w="1378"/>
+          </w:tcPr>
+          <w:p>
+            <w:r/>
+            <w:r>
+              <w:rPr>
+                <w:sz w:val="20"/>
+              </w:rPr>
+              <w:t>176.71</w:t>
+            </w:r>
+          </w:p>
+        </w:tc>
+        <w:tc>
+          <w:tcPr>
+            <w:tcW w:type="dxa" w:w="1378"/>
+          </w:tcPr>
+          <w:p>
+            <w:r/>
+            <w:r>
+              <w:rPr>
+                <w:sz w:val="20"/>
+              </w:rPr>
+              <w:t>-7.22%</w:t>
+            </w:r>
+          </w:p>
+        </w:tc>
+        <w:tc>
+          <w:tcPr>
+            <w:tcW w:type="dxa" w:w="1378"/>
+          </w:tcPr>
+          <w:p>
+            <w:r/>
+            <w:r>
+              <w:rPr>
+                <w:sz w:val="20"/>
+              </w:rPr>
+              <w:t>0.0013</w:t>
+            </w:r>
+          </w:p>
+        </w:tc>
+        <w:tc>
+          <w:tcPr>
+            <w:tcW w:type="dxa" w:w="1378"/>
+          </w:tcPr>
+          <w:p>
+            <w:r/>
+            <w:r>
+              <w:rPr>
+                <w:sz w:val="20"/>
+              </w:rPr>
+              <w:t>0.0013</w:t>
+            </w:r>
+          </w:p>
+        </w:tc>
+      </w:tr>
+      <w:tr>
+        <w:tc>
+          <w:tcPr>
+            <w:tcW w:type="dxa" w:w="1378"/>
+          </w:tcPr>
+          <w:p>
+            <w:r/>
+            <w:r>
+              <w:rPr>
+                <w:sz w:val="20"/>
+              </w:rPr>
+              <w:t>US06</w:t>
+            </w:r>
+          </w:p>
+        </w:tc>
+        <w:tc>
+          <w:tcPr>
+            <w:tcW w:type="dxa" w:w="1378"/>
+          </w:tcPr>
+          <w:p>
+            <w:r/>
+            <w:r>
+              <w:rPr>
+                <w:sz w:val="20"/>
+              </w:rPr>
+              <w:t>after</w:t>
+            </w:r>
+          </w:p>
+        </w:tc>
+        <w:tc>
+          <w:tcPr>
+            <w:tcW w:type="dxa" w:w="1378"/>
+          </w:tcPr>
+          <w:p>
+            <w:r/>
+            <w:r>
+              <w:rPr>
+                <w:sz w:val="20"/>
+              </w:rPr>
+              <w:t>190.47</w:t>
+            </w:r>
+          </w:p>
+        </w:tc>
+        <w:tc>
+          <w:tcPr>
+            <w:tcW w:type="dxa" w:w="1378"/>
+          </w:tcPr>
+          <w:p>
+            <w:r/>
+            <w:r>
+              <w:rPr>
+                <w:sz w:val="20"/>
+              </w:rPr>
+              <w:t>190.71</w:t>
+            </w:r>
+          </w:p>
+        </w:tc>
+        <w:tc>
+          <w:tcPr>
+            <w:tcW w:type="dxa" w:w="1378"/>
+          </w:tcPr>
+          <w:p>
+            <w:r/>
+            <w:r>
+              <w:rPr>
+                <w:sz w:val="20"/>
+              </w:rPr>
+              <w:t>+0.13%</w:t>
+            </w:r>
+          </w:p>
+        </w:tc>
+        <w:tc>
+          <w:tcPr>
+            <w:tcW w:type="dxa" w:w="1378"/>
+          </w:tcPr>
+          <w:p>
+            <w:r/>
+            <w:r>
+              <w:rPr>
+                <w:sz w:val="20"/>
+              </w:rPr>
+              <w:t>0.0013</w:t>
+            </w:r>
+          </w:p>
+        </w:tc>
+        <w:tc>
+          <w:tcPr>
+            <w:tcW w:type="dxa" w:w="1378"/>
+          </w:tcPr>
+          <w:p>
+            <w:r/>
+            <w:r>
+              <w:rPr>
+                <w:sz w:val="20"/>
+              </w:rPr>
+              <w:t>0.4815</w:t>
+            </w:r>
+          </w:p>
+        </w:tc>
+      </w:tr>
+    </w:tbl>
+    <w:p>
+      <w:pPr>
+        <w:spacing w:after="40"/>
+      </w:pPr>
+    </w:p>
+    <w:p>
+      <w:pPr>
+        <w:spacing w:after="160"/>
+      </w:pPr>
+      <w:r>
+        <w:rPr>
+          <w:i/>
+          <w:color w:val="595959"/>
+          <w:sz w:val="18"/>
+        </w:rPr>
+        <w:t>Table. The rule manager and the deployed learned controller, before and after the fix. SIMULATED on the laptop.</w:t>
+      </w:r>
+    </w:p>
+    <w:p>
+      <w:pPr>
+        <w:spacing w:after="160"/>
+      </w:pPr>
+      <w:r>
+        <w:rPr>
+          <w:i w:val="0"/>
+          <w:sz w:val="24"/>
+        </w:rPr>
+        <w:t>The rules barely move: 190.47 before, 190.47 after. Their ceiling sits near 125 kilowatts and almost never binds. The deployed learned controller goes from 176.71 to 190.71, and its tracking error on US06 rises from 0.0013 to 0.4815 metres per second, with a worst lag of 3.65. It was trained on a model that paid it to lower the ceiling, and on a model that does not, the habit only costs it speed.</w:t>
+      </w:r>
+    </w:p>
+    <w:p>
+      <w:pPr>
+        <w:pStyle w:val="Heading2"/>
+      </w:pPr>
+      <w:r>
+        <w:t>What stands and what does not</w:t>
+      </w:r>
+    </w:p>
+    <w:p>
+      <w:pPr>
+        <w:pStyle w:val="ListBullet"/>
+        <w:spacing w:after="80"/>
+      </w:pPr>
+      <w:r>
+        <w:t>Withdrawn: the statement that the learned controller uses less energy than the rules in 14 of 16 settings, and its repeat.</w:t>
+      </w:r>
+    </w:p>
+    <w:p>
+      <w:pPr>
+        <w:pStyle w:val="ListBullet"/>
+        <w:spacing w:after="80"/>
+      </w:pPr>
+      <w:r>
+        <w:t>Unaffected: every timing result. Missed deadlines, inference time and jitter are measured on the chip and do not pass through the energy bookkeeping.</w:t>
+      </w:r>
+    </w:p>
+    <w:p>
+      <w:pPr>
+        <w:pStyle w:val="ListBullet"/>
+        <w:spacing w:after="80"/>
+      </w:pPr>
+      <w:r>
+        <w:t>Unaffected: the offline optimum and the highway comparison of section 21. No ceiling bound in either.</w:t>
+      </w:r>
+    </w:p>
+    <w:p>
+      <w:pPr>
+        <w:pStyle w:val="ListBullet"/>
+        <w:spacing w:after="80"/>
+      </w:pPr>
+      <w:r>
+        <w:t>To be re-measured: the learned-controller runs of the failure-handling sweep in section 25, where the ceiling also bound.</w:t>
+      </w:r>
+    </w:p>
+    <w:p>
+      <w:pPr>
+        <w:pStyle w:val="Heading2"/>
+      </w:pPr>
+      <w:r>
+        <w:t>The campaign again, on the corrected model</w:t>
+      </w:r>
+    </w:p>
+    <w:p>
+      <w:pPr>
+        <w:spacing w:after="160"/>
+      </w:pPr>
+      <w:r>
+        <w:rPr>
+          <w:i/>
+          <w:color w:val="595959"/>
+          <w:sz w:val="24"/>
+        </w:rPr>
+        <w:t>The campaign was being re-run on the board against the corrected model when this report was generated.</w:t>
+      </w:r>
+    </w:p>
+    <w:p>
+      <w:pPr>
+        <w:pStyle w:val="Heading1"/>
+      </w:pPr>
+      <w:r>
+        <w:t>29. Results that went against expectation</w:t>
       </w:r>
     </w:p>
     <w:p>
@@ -19724,7 +21542,7 @@
         <w:pStyle w:val="Heading1"/>
       </w:pPr>
       <w:r>
-        <w:t>29. What changed from the original plan</w:t>
+        <w:t>30. What changed from the original plan</w:t>
       </w:r>
     </w:p>
     <w:p>
@@ -20036,7 +21854,7 @@
         <w:pStyle w:val="Heading1"/>
       </w:pPr>
       <w:r>
-        <w:t>30. What is left to do</w:t>
+        <w:t>31. What is left to do</w:t>
       </w:r>
     </w:p>
     <w:p>
@@ -20695,7 +22513,7 @@
         <w:pStyle w:val="Heading1"/>
       </w:pPr>
       <w:r>
-        <w:t>31. Reproducing everything in this report</w:t>
+        <w:t>32. Reproducing everything in this report</w:t>
       </w:r>
     </w:p>
     <w:p>
@@ -21669,7 +23487,7 @@
           <w:color w:val="595959"/>
           <w:sz w:val="22"/>
         </w:rPr>
-        <w:t>All Python commands need PYTHONPATH="src:." set. The reinforcement-learning ramp-up additionally needs stable-baselines3 and gymnasium. The test suite runs with python3 -m pytest and currently holds 453 tests, all passing, including ones that drive the controller and the learned policy in C and in Python through identical inputs and require them to agree, and ones that read the firmware's own compile-time switches back out of its headers so that the scripts describing them cannot drift from what is compiled.</w:t>
+        <w:t>All Python commands need PYTHONPATH="src:." set. The reinforcement-learning ramp-up additionally needs stable-baselines3 and gymnasium. The test suite runs with python3 -m pytest and currently holds 462 tests, all passing, including ones that drive the controller and the learned policy in C and in Python through identical inputs and require them to agree, and ones that read the firmware's own compile-time switches back out of its headers so that the scripts describing them cannot drift from what is compiled.</w:t>
       </w:r>
     </w:p>
     <w:sectPr>

</xml_diff>

<commit_message>
A figure for the correction: what a fixed ceiling bought before and costs now
Co-Authored-By: Claude Opus 5.5 <noreply@anthropic.com>
</commit_message>
<xml_diff>
--- a/reports/EV-PIL-status-report.docx
+++ b/reports/EV-PIL-status-report.docx
@@ -20197,6 +20197,59 @@
           <w:sz w:val="18"/>
         </w:rPr>
         <w:t>Table. A constant power ceiling on US06, regeneration fully on. SIMULATED on the laptop. The "before" columns run the vehicle model from the commit preceding the fix, read out of the repository history by scripts/run_plant_correction.py.</w:t>
+      </w:r>
+    </w:p>
+    <w:p>
+      <w:pPr>
+        <w:jc w:val="center"/>
+      </w:pPr>
+      <w:r>
+        <w:drawing>
+          <wp:inline xmlns:a="http://schemas.openxmlformats.org/drawingml/2006/main" xmlns:pic="http://schemas.openxmlformats.org/drawingml/2006/picture">
+            <wp:extent cx="5852160" cy="1890698"/>
+            <wp:docPr id="18" name="Picture 18"/>
+            <wp:cNvGraphicFramePr>
+              <a:graphicFrameLocks noChangeAspect="1"/>
+            </wp:cNvGraphicFramePr>
+            <a:graphic>
+              <a:graphicData uri="http://schemas.openxmlformats.org/drawingml/2006/picture">
+                <pic:pic>
+                  <pic:nvPicPr>
+                    <pic:cNvPr id="0" name="plant-correction.png"/>
+                    <pic:cNvPicPr/>
+                  </pic:nvPicPr>
+                  <pic:blipFill>
+                    <a:blip r:embed="rId26"/>
+                    <a:stretch>
+                      <a:fillRect/>
+                    </a:stretch>
+                  </pic:blipFill>
+                  <pic:spPr>
+                    <a:xfrm>
+                      <a:off x="0" y="0"/>
+                      <a:ext cx="5852160" cy="1890698"/>
+                    </a:xfrm>
+                    <a:prstGeom prst="rect"/>
+                  </pic:spPr>
+                </pic:pic>
+              </a:graphicData>
+            </a:graphic>
+          </wp:inline>
+        </w:drawing>
+      </w:r>
+    </w:p>
+    <w:p>
+      <w:pPr>
+        <w:spacing w:after="240"/>
+        <w:jc w:val="center"/>
+      </w:pPr>
+      <w:r>
+        <w:rPr>
+          <w:i/>
+          <w:color w:val="595959"/>
+          <w:sz w:val="18"/>
+        </w:rPr>
+        <w:t>Figure 18. One fixed power ceiling on US06, before the fix in orange and after it in blue. Before, a lower ceiling reduced the energy billed and left tracking and distance untouched. After, it costs both. The horizontal axis is not to scale. SIMULATED.</w:t>
       </w:r>
     </w:p>
     <w:p>

</xml_diff>

<commit_message>
Criteria 1-3: the corrected board campaign and outage sweep, measured, with the documents built from them
36 runs on the corrected plant, 2,282,832 control steps, none late. The
learned controller uses less energy than the rules in 1 of 16 valid settings
and 0.94% more on average. A4 swept again at eight outage lengths. The four
rule cells first taken on a loaded host are kept in their own file beside
the re-runs that replaced them.

The report sections, the supervisor note generator, the campaign validator
and the finisher are the Codex agent's work in this repository, committed
here because its finisher stopped at the render step (no LibreOffice) after
building the documents and passing the full suite (473 passed, 1 skipped).
Documents are not yet reviewed page by page; that follows.

Co-Authored-By: Claude Opus 5.5 <noreply@anthropic.com>
</commit_message>
<xml_diff>
--- a/reports/EV-PIL-status-report.docx
+++ b/reports/EV-PIL-status-report.docx
@@ -45,7 +45,7 @@
           <w:color w:val="595959"/>
           <w:sz w:val="24"/>
         </w:rPr>
-        <w:t>Manikanta Gonugondla   |   6 October 2026</w:t>
+        <w:t>Manikanta Gonugondla   |   7 October 2026</w:t>
       </w:r>
     </w:p>
     <w:p/>
@@ -86,6 +86,30 @@
           <w:sz w:val="24"/>
         </w:rPr>
         <w:t>The project builds an energy-management controller for an electric car and runs it on a real ESP32-S3 microcontroller. The car itself is simulated in Python. The microcontroller and the simulation talk to each other over a serial cable in real time, so the controller has to meet real deadlines on real silicon rather than in a notebook.</w:t>
+      </w:r>
+    </w:p>
+    <w:p>
+      <w:pPr>
+        <w:spacing w:after="160"/>
+      </w:pPr>
+      <w:r>
+        <w:rPr>
+          <w:i w:val="0"/>
+          <w:sz w:val="24"/>
+        </w:rPr>
+        <w:t>Current correction: the week-10 energy-gain claim is withdrawn because a vehicle-model power ceiling reduced the energy billed without reducing delivered torque. Section 28 separates the original evidence, the fix, and new measurements.</w:t>
+      </w:r>
+    </w:p>
+    <w:p>
+      <w:pPr>
+        <w:spacing w:after="160"/>
+      </w:pPr>
+      <w:r>
+        <w:rPr>
+          <w:i w:val="0"/>
+          <w:sz w:val="24"/>
+        </w:rPr>
+        <w:t>Corrected-model retraining on validation: the no-forecast learned arm averages 154.86 watt-hours per kilometre against 153.90 for the rules. SIMULATED. The corrected board campaign is complete and tabulated in the correction section. The corrected A4 sweep is complete.</w:t>
       </w:r>
     </w:p>
     <w:p>
@@ -15553,6 +15577,19 @@
       </w:pPr>
       <w:r>
         <w:rPr>
+          <w:i/>
+          <w:color w:val="595959"/>
+          <w:sz w:val="20"/>
+        </w:rPr>
+        <w:t>HISTORICAL MEASUREMENT. This sweep used the vehicle model before the power-ceiling correction. Its energy and current-limit interpretation is superseded; corrected-model measurements, when complete, appear in section 28.</w:t>
+      </w:r>
+    </w:p>
+    <w:p>
+      <w:pPr>
+        <w:spacing w:after="160"/>
+      </w:pPr>
+      <w:r>
+        <w:rPr>
           <w:i w:val="0"/>
           <w:sz w:val="24"/>
         </w:rPr>
@@ -21290,7 +21327,7 @@
           <w:color w:val="595959"/>
           <w:sz w:val="18"/>
         </w:rPr>
-        <w:t>Table. The rule manager and the deployed learned controller, before and after the fix. SIMULATED on the laptop.</w:t>
+        <w:t>Table. The rule manager and the learned controller exported before retraining, before and after the fix. SIMULATED on the laptop. This snapshot is not the retrained policy.</w:t>
       </w:r>
     </w:p>
     <w:p>
@@ -21310,6 +21347,1376 @@
         <w:pStyle w:val="Heading2"/>
       </w:pPr>
       <w:r>
+        <w:t>Retraining on the corrected vehicle model</w:t>
+      </w:r>
+    </w:p>
+    <w:tbl>
+      <w:tblPr>
+        <w:tblStyle w:val="LightGrid-Accent1"/>
+        <w:tblW w:type="auto" w:w="0"/>
+        <w:jc w:val="center"/>
+        <w:tblLook w:firstColumn="1" w:firstRow="1" w:lastColumn="0" w:lastRow="0" w:noHBand="0" w:noVBand="1" w:val="04A0"/>
+      </w:tblPr>
+      <w:tblGrid>
+        <w:gridCol w:w="1930"/>
+        <w:gridCol w:w="1930"/>
+        <w:gridCol w:w="1930"/>
+        <w:gridCol w:w="1930"/>
+        <w:gridCol w:w="1930"/>
+      </w:tblGrid>
+      <w:tr>
+        <w:tc>
+          <w:tcPr>
+            <w:tcW w:type="dxa" w:w="1930"/>
+          </w:tcPr>
+          <w:p>
+            <w:r/>
+            <w:r>
+              <w:rPr>
+                <w:b/>
+                <w:sz w:val="20"/>
+              </w:rPr>
+              <w:t>Controller</w:t>
+            </w:r>
+          </w:p>
+        </w:tc>
+        <w:tc>
+          <w:tcPr>
+            <w:tcW w:type="dxa" w:w="1930"/>
+          </w:tcPr>
+          <w:p>
+            <w:r/>
+            <w:r>
+              <w:rPr>
+                <w:b/>
+                <w:sz w:val="20"/>
+              </w:rPr>
+              <w:t>Mean, Wh/km</w:t>
+            </w:r>
+          </w:p>
+        </w:tc>
+        <w:tc>
+          <w:tcPr>
+            <w:tcW w:type="dxa" w:w="1930"/>
+          </w:tcPr>
+          <w:p>
+            <w:r/>
+            <w:r>
+              <w:rPr>
+                <w:b/>
+                <w:sz w:val="20"/>
+              </w:rPr>
+              <w:t>Seed SD, Wh/km</w:t>
+            </w:r>
+          </w:p>
+        </w:tc>
+        <w:tc>
+          <w:tcPr>
+            <w:tcW w:type="dxa" w:w="1930"/>
+          </w:tcPr>
+          <w:p>
+            <w:r/>
+            <w:r>
+              <w:rPr>
+                <w:b/>
+                <w:sz w:val="20"/>
+              </w:rPr>
+              <w:t>95% interval, Wh/km</w:t>
+            </w:r>
+          </w:p>
+        </w:tc>
+        <w:tc>
+          <w:tcPr>
+            <w:tcW w:type="dxa" w:w="1930"/>
+          </w:tcPr>
+          <w:p>
+            <w:r/>
+            <w:r>
+              <w:rPr>
+                <w:b/>
+                <w:sz w:val="20"/>
+              </w:rPr>
+              <w:t>Against rules</w:t>
+            </w:r>
+          </w:p>
+        </w:tc>
+      </w:tr>
+      <w:tr>
+        <w:tc>
+          <w:tcPr>
+            <w:tcW w:type="dxa" w:w="1930"/>
+          </w:tcPr>
+          <w:p>
+            <w:r/>
+            <w:r>
+              <w:rPr>
+                <w:sz w:val="20"/>
+              </w:rPr>
+              <w:t>Rule manager</w:t>
+            </w:r>
+          </w:p>
+        </w:tc>
+        <w:tc>
+          <w:tcPr>
+            <w:tcW w:type="dxa" w:w="1930"/>
+          </w:tcPr>
+          <w:p>
+            <w:r/>
+            <w:r>
+              <w:rPr>
+                <w:sz w:val="20"/>
+              </w:rPr>
+              <w:t>153.90</w:t>
+            </w:r>
+          </w:p>
+        </w:tc>
+        <w:tc>
+          <w:tcPr>
+            <w:tcW w:type="dxa" w:w="1930"/>
+          </w:tcPr>
+          <w:p>
+            <w:r/>
+            <w:r>
+              <w:rPr>
+                <w:sz w:val="20"/>
+              </w:rPr>
+            </w:r>
+          </w:p>
+        </w:tc>
+        <w:tc>
+          <w:tcPr>
+            <w:tcW w:type="dxa" w:w="1930"/>
+          </w:tcPr>
+          <w:p>
+            <w:r/>
+            <w:r>
+              <w:rPr>
+                <w:sz w:val="20"/>
+              </w:rPr>
+            </w:r>
+          </w:p>
+        </w:tc>
+        <w:tc>
+          <w:tcPr>
+            <w:tcW w:type="dxa" w:w="1930"/>
+          </w:tcPr>
+          <w:p>
+            <w:r/>
+            <w:r>
+              <w:rPr>
+                <w:sz w:val="20"/>
+              </w:rPr>
+            </w:r>
+          </w:p>
+        </w:tc>
+      </w:tr>
+      <w:tr>
+        <w:tc>
+          <w:tcPr>
+            <w:tcW w:type="dxa" w:w="1930"/>
+          </w:tcPr>
+          <w:p>
+            <w:r/>
+            <w:r>
+              <w:rPr>
+                <w:sz w:val="20"/>
+              </w:rPr>
+              <w:t>without forecast</w:t>
+            </w:r>
+          </w:p>
+        </w:tc>
+        <w:tc>
+          <w:tcPr>
+            <w:tcW w:type="dxa" w:w="1930"/>
+          </w:tcPr>
+          <w:p>
+            <w:r/>
+            <w:r>
+              <w:rPr>
+                <w:sz w:val="20"/>
+              </w:rPr>
+              <w:t>154.86</w:t>
+            </w:r>
+          </w:p>
+        </w:tc>
+        <w:tc>
+          <w:tcPr>
+            <w:tcW w:type="dxa" w:w="1930"/>
+          </w:tcPr>
+          <w:p>
+            <w:r/>
+            <w:r>
+              <w:rPr>
+                <w:sz w:val="20"/>
+              </w:rPr>
+              <w:t>0.51</w:t>
+            </w:r>
+          </w:p>
+        </w:tc>
+        <w:tc>
+          <w:tcPr>
+            <w:tcW w:type="dxa" w:w="1930"/>
+          </w:tcPr>
+          <w:p>
+            <w:r/>
+            <w:r>
+              <w:rPr>
+                <w:sz w:val="20"/>
+              </w:rPr>
+              <w:t>154.48 to 155.28</w:t>
+            </w:r>
+          </w:p>
+        </w:tc>
+        <w:tc>
+          <w:tcPr>
+            <w:tcW w:type="dxa" w:w="1930"/>
+          </w:tcPr>
+          <w:p>
+            <w:r/>
+            <w:r>
+              <w:rPr>
+                <w:sz w:val="20"/>
+              </w:rPr>
+              <w:t>+0.62%</w:t>
+            </w:r>
+          </w:p>
+        </w:tc>
+      </w:tr>
+      <w:tr>
+        <w:tc>
+          <w:tcPr>
+            <w:tcW w:type="dxa" w:w="1930"/>
+          </w:tcPr>
+          <w:p>
+            <w:r/>
+            <w:r>
+              <w:rPr>
+                <w:sz w:val="20"/>
+              </w:rPr>
+              <w:t>with forecast</w:t>
+            </w:r>
+          </w:p>
+        </w:tc>
+        <w:tc>
+          <w:tcPr>
+            <w:tcW w:type="dxa" w:w="1930"/>
+          </w:tcPr>
+          <w:p>
+            <w:r/>
+            <w:r>
+              <w:rPr>
+                <w:sz w:val="20"/>
+              </w:rPr>
+              <w:t>155.12</w:t>
+            </w:r>
+          </w:p>
+        </w:tc>
+        <w:tc>
+          <w:tcPr>
+            <w:tcW w:type="dxa" w:w="1930"/>
+          </w:tcPr>
+          <w:p>
+            <w:r/>
+            <w:r>
+              <w:rPr>
+                <w:sz w:val="20"/>
+              </w:rPr>
+              <w:t>0.82</w:t>
+            </w:r>
+          </w:p>
+        </w:tc>
+        <w:tc>
+          <w:tcPr>
+            <w:tcW w:type="dxa" w:w="1930"/>
+          </w:tcPr>
+          <w:p>
+            <w:r/>
+            <w:r>
+              <w:rPr>
+                <w:sz w:val="20"/>
+              </w:rPr>
+              <w:t>154.51 to 155.73</w:t>
+            </w:r>
+          </w:p>
+        </w:tc>
+        <w:tc>
+          <w:tcPr>
+            <w:tcW w:type="dxa" w:w="1930"/>
+          </w:tcPr>
+          <w:p>
+            <w:r/>
+            <w:r>
+              <w:rPr>
+                <w:sz w:val="20"/>
+              </w:rPr>
+              <w:t>+0.79%</w:t>
+            </w:r>
+          </w:p>
+        </w:tc>
+      </w:tr>
+    </w:tbl>
+    <w:p>
+      <w:pPr>
+        <w:spacing w:after="40"/>
+      </w:pPr>
+    </w:p>
+    <w:p>
+      <w:pPr>
+        <w:spacing w:after="160"/>
+      </w:pPr>
+      <w:r>
+        <w:rPr>
+          <w:i/>
+          <w:color w:val="595959"/>
+          <w:sz w:val="18"/>
+        </w:rPr>
+        <w:t>Table. SIMULATED on HWFET, the validation cycle, with 5 training seeds per learned arm. Shed cabin heat is charged back. These values come from docs/week11-sac-corrected.json.</w:t>
+      </w:r>
+    </w:p>
+    <w:p>
+      <w:pPr>
+        <w:spacing w:after="160"/>
+      </w:pPr>
+      <w:r>
+        <w:rPr>
+          <w:i w:val="0"/>
+          <w:sz w:val="24"/>
+        </w:rPr>
+        <w:t>The no-forecast seed selected on validation is seed 3, at 154.21 watt-hours per kilometre. It was exported for the corrected board campaign. Selection used validation rather than US06. Exporting weights is not a board measurement.</w:t>
+      </w:r>
+    </w:p>
+    <w:p>
+      <w:pPr>
+        <w:spacing w:after="160"/>
+      </w:pPr>
+      <w:r>
+        <w:rPr>
+          <w:i w:val="0"/>
+          <w:sz w:val="24"/>
+        </w:rPr>
+        <w:t>The paired forecast difference is +0.262 watt-hours per kilometre, with a 95% interval from -0.698 to +0.982. The interval includes zero, so this retraining does not show a forecast benefit.</w:t>
+      </w:r>
+    </w:p>
+    <w:p>
+      <w:pPr>
+        <w:pStyle w:val="Heading2"/>
+      </w:pPr>
+      <w:r>
+        <w:t>Link outages on the corrected model</w:t>
+      </w:r>
+    </w:p>
+    <w:tbl>
+      <w:tblPr>
+        <w:tblStyle w:val="LightGrid-Accent1"/>
+        <w:tblW w:type="auto" w:w="0"/>
+        <w:jc w:val="center"/>
+        <w:tblLook w:firstColumn="1" w:firstRow="1" w:lastColumn="0" w:lastRow="0" w:noHBand="0" w:noVBand="1" w:val="04A0"/>
+      </w:tblPr>
+      <w:tblGrid>
+        <w:gridCol w:w="1378"/>
+        <w:gridCol w:w="1378"/>
+        <w:gridCol w:w="1378"/>
+        <w:gridCol w:w="1378"/>
+        <w:gridCol w:w="1378"/>
+        <w:gridCol w:w="1378"/>
+        <w:gridCol w:w="1378"/>
+      </w:tblGrid>
+      <w:tr>
+        <w:tc>
+          <w:tcPr>
+            <w:tcW w:type="dxa" w:w="1378"/>
+          </w:tcPr>
+          <w:p>
+            <w:r/>
+            <w:r>
+              <w:rPr>
+                <w:b/>
+                <w:sz w:val="20"/>
+              </w:rPr>
+              <w:t>Outage, s</w:t>
+            </w:r>
+          </w:p>
+        </w:tc>
+        <w:tc>
+          <w:tcPr>
+            <w:tcW w:type="dxa" w:w="1378"/>
+          </w:tcPr>
+          <w:p>
+            <w:r/>
+            <w:r>
+              <w:rPr>
+                <w:b/>
+                <w:sz w:val="20"/>
+              </w:rPr>
+              <w:t>Median on, m/s</w:t>
+            </w:r>
+          </w:p>
+        </w:tc>
+        <w:tc>
+          <w:tcPr>
+            <w:tcW w:type="dxa" w:w="1378"/>
+          </w:tcPr>
+          <w:p>
+            <w:r/>
+            <w:r>
+              <w:rPr>
+                <w:b/>
+                <w:sz w:val="20"/>
+              </w:rPr>
+              <w:t>Median off, m/s</w:t>
+            </w:r>
+          </w:p>
+        </w:tc>
+        <w:tc>
+          <w:tcPr>
+            <w:tcW w:type="dxa" w:w="1378"/>
+          </w:tcPr>
+          <w:p>
+            <w:r/>
+            <w:r>
+              <w:rPr>
+                <w:b/>
+                <w:sz w:val="20"/>
+              </w:rPr>
+              <w:t>Worst on, m/s</w:t>
+            </w:r>
+          </w:p>
+        </w:tc>
+        <w:tc>
+          <w:tcPr>
+            <w:tcW w:type="dxa" w:w="1378"/>
+          </w:tcPr>
+          <w:p>
+            <w:r/>
+            <w:r>
+              <w:rPr>
+                <w:b/>
+                <w:sz w:val="20"/>
+              </w:rPr>
+              <w:t>Worst off, m/s</w:t>
+            </w:r>
+          </w:p>
+        </w:tc>
+        <w:tc>
+          <w:tcPr>
+            <w:tcW w:type="dxa" w:w="1378"/>
+          </w:tcPr>
+          <w:p>
+            <w:r/>
+            <w:r>
+              <w:rPr>
+                <w:b/>
+                <w:sz w:val="20"/>
+              </w:rPr>
+              <w:t>Late on</w:t>
+            </w:r>
+          </w:p>
+        </w:tc>
+        <w:tc>
+          <w:tcPr>
+            <w:tcW w:type="dxa" w:w="1378"/>
+          </w:tcPr>
+          <w:p>
+            <w:r/>
+            <w:r>
+              <w:rPr>
+                <w:b/>
+                <w:sz w:val="20"/>
+              </w:rPr>
+              <w:t>Late off</w:t>
+            </w:r>
+          </w:p>
+        </w:tc>
+      </w:tr>
+      <w:tr>
+        <w:tc>
+          <w:tcPr>
+            <w:tcW w:type="dxa" w:w="1378"/>
+          </w:tcPr>
+          <w:p>
+            <w:r/>
+            <w:r>
+              <w:rPr>
+                <w:sz w:val="20"/>
+              </w:rPr>
+              <w:t>0.2</w:t>
+            </w:r>
+          </w:p>
+        </w:tc>
+        <w:tc>
+          <w:tcPr>
+            <w:tcW w:type="dxa" w:w="1378"/>
+          </w:tcPr>
+          <w:p>
+            <w:r/>
+            <w:r>
+              <w:rPr>
+                <w:sz w:val="20"/>
+              </w:rPr>
+              <w:t>0.060</w:t>
+            </w:r>
+          </w:p>
+        </w:tc>
+        <w:tc>
+          <w:tcPr>
+            <w:tcW w:type="dxa" w:w="1378"/>
+          </w:tcPr>
+          <w:p>
+            <w:r/>
+            <w:r>
+              <w:rPr>
+                <w:sz w:val="20"/>
+              </w:rPr>
+              <w:t>0.059</w:t>
+            </w:r>
+          </w:p>
+        </w:tc>
+        <w:tc>
+          <w:tcPr>
+            <w:tcW w:type="dxa" w:w="1378"/>
+          </w:tcPr>
+          <w:p>
+            <w:r/>
+            <w:r>
+              <w:rPr>
+                <w:sz w:val="20"/>
+              </w:rPr>
+              <w:t>0.228</w:t>
+            </w:r>
+          </w:p>
+        </w:tc>
+        <w:tc>
+          <w:tcPr>
+            <w:tcW w:type="dxa" w:w="1378"/>
+          </w:tcPr>
+          <w:p>
+            <w:r/>
+            <w:r>
+              <w:rPr>
+                <w:sz w:val="20"/>
+              </w:rPr>
+              <w:t>0.182</w:t>
+            </w:r>
+          </w:p>
+        </w:tc>
+        <w:tc>
+          <w:tcPr>
+            <w:tcW w:type="dxa" w:w="1378"/>
+          </w:tcPr>
+          <w:p>
+            <w:r/>
+            <w:r>
+              <w:rPr>
+                <w:sz w:val="20"/>
+              </w:rPr>
+              <w:t>0</w:t>
+            </w:r>
+          </w:p>
+        </w:tc>
+        <w:tc>
+          <w:tcPr>
+            <w:tcW w:type="dxa" w:w="1378"/>
+          </w:tcPr>
+          <w:p>
+            <w:r/>
+            <w:r>
+              <w:rPr>
+                <w:sz w:val="20"/>
+              </w:rPr>
+              <w:t>0</w:t>
+            </w:r>
+          </w:p>
+        </w:tc>
+      </w:tr>
+      <w:tr>
+        <w:tc>
+          <w:tcPr>
+            <w:tcW w:type="dxa" w:w="1378"/>
+          </w:tcPr>
+          <w:p>
+            <w:r/>
+            <w:r>
+              <w:rPr>
+                <w:sz w:val="20"/>
+              </w:rPr>
+              <w:t>0.5</w:t>
+            </w:r>
+          </w:p>
+        </w:tc>
+        <w:tc>
+          <w:tcPr>
+            <w:tcW w:type="dxa" w:w="1378"/>
+          </w:tcPr>
+          <w:p>
+            <w:r/>
+            <w:r>
+              <w:rPr>
+                <w:sz w:val="20"/>
+              </w:rPr>
+              <w:t>0.171</w:t>
+            </w:r>
+          </w:p>
+        </w:tc>
+        <w:tc>
+          <w:tcPr>
+            <w:tcW w:type="dxa" w:w="1378"/>
+          </w:tcPr>
+          <w:p>
+            <w:r/>
+            <w:r>
+              <w:rPr>
+                <w:sz w:val="20"/>
+              </w:rPr>
+              <w:t>0.103</w:t>
+            </w:r>
+          </w:p>
+        </w:tc>
+        <w:tc>
+          <w:tcPr>
+            <w:tcW w:type="dxa" w:w="1378"/>
+          </w:tcPr>
+          <w:p>
+            <w:r/>
+            <w:r>
+              <w:rPr>
+                <w:sz w:val="20"/>
+              </w:rPr>
+              <w:t>0.571</w:t>
+            </w:r>
+          </w:p>
+        </w:tc>
+        <w:tc>
+          <w:tcPr>
+            <w:tcW w:type="dxa" w:w="1378"/>
+          </w:tcPr>
+          <w:p>
+            <w:r/>
+            <w:r>
+              <w:rPr>
+                <w:sz w:val="20"/>
+              </w:rPr>
+              <w:t>0.202</w:t>
+            </w:r>
+          </w:p>
+        </w:tc>
+        <w:tc>
+          <w:tcPr>
+            <w:tcW w:type="dxa" w:w="1378"/>
+          </w:tcPr>
+          <w:p>
+            <w:r/>
+            <w:r>
+              <w:rPr>
+                <w:sz w:val="20"/>
+              </w:rPr>
+              <w:t>0</w:t>
+            </w:r>
+          </w:p>
+        </w:tc>
+        <w:tc>
+          <w:tcPr>
+            <w:tcW w:type="dxa" w:w="1378"/>
+          </w:tcPr>
+          <w:p>
+            <w:r/>
+            <w:r>
+              <w:rPr>
+                <w:sz w:val="20"/>
+              </w:rPr>
+              <w:t>0</w:t>
+            </w:r>
+          </w:p>
+        </w:tc>
+      </w:tr>
+      <w:tr>
+        <w:tc>
+          <w:tcPr>
+            <w:tcW w:type="dxa" w:w="1378"/>
+          </w:tcPr>
+          <w:p>
+            <w:r/>
+            <w:r>
+              <w:rPr>
+                <w:sz w:val="20"/>
+              </w:rPr>
+              <w:t>1</w:t>
+            </w:r>
+          </w:p>
+        </w:tc>
+        <w:tc>
+          <w:tcPr>
+            <w:tcW w:type="dxa" w:w="1378"/>
+          </w:tcPr>
+          <w:p>
+            <w:r/>
+            <w:r>
+              <w:rPr>
+                <w:sz w:val="20"/>
+              </w:rPr>
+              <w:t>0.353</w:t>
+            </w:r>
+          </w:p>
+        </w:tc>
+        <w:tc>
+          <w:tcPr>
+            <w:tcW w:type="dxa" w:w="1378"/>
+          </w:tcPr>
+          <w:p>
+            <w:r/>
+            <w:r>
+              <w:rPr>
+                <w:sz w:val="20"/>
+              </w:rPr>
+              <w:t>0.157</w:t>
+            </w:r>
+          </w:p>
+        </w:tc>
+        <w:tc>
+          <w:tcPr>
+            <w:tcW w:type="dxa" w:w="1378"/>
+          </w:tcPr>
+          <w:p>
+            <w:r/>
+            <w:r>
+              <w:rPr>
+                <w:sz w:val="20"/>
+              </w:rPr>
+              <w:t>1.341</w:t>
+            </w:r>
+          </w:p>
+        </w:tc>
+        <w:tc>
+          <w:tcPr>
+            <w:tcW w:type="dxa" w:w="1378"/>
+          </w:tcPr>
+          <w:p>
+            <w:r/>
+            <w:r>
+              <w:rPr>
+                <w:sz w:val="20"/>
+              </w:rPr>
+              <w:t>0.370</w:t>
+            </w:r>
+          </w:p>
+        </w:tc>
+        <w:tc>
+          <w:tcPr>
+            <w:tcW w:type="dxa" w:w="1378"/>
+          </w:tcPr>
+          <w:p>
+            <w:r/>
+            <w:r>
+              <w:rPr>
+                <w:sz w:val="20"/>
+              </w:rPr>
+              <w:t>0</w:t>
+            </w:r>
+          </w:p>
+        </w:tc>
+        <w:tc>
+          <w:tcPr>
+            <w:tcW w:type="dxa" w:w="1378"/>
+          </w:tcPr>
+          <w:p>
+            <w:r/>
+            <w:r>
+              <w:rPr>
+                <w:sz w:val="20"/>
+              </w:rPr>
+              <w:t>0</w:t>
+            </w:r>
+          </w:p>
+        </w:tc>
+      </w:tr>
+      <w:tr>
+        <w:tc>
+          <w:tcPr>
+            <w:tcW w:type="dxa" w:w="1378"/>
+          </w:tcPr>
+          <w:p>
+            <w:r/>
+            <w:r>
+              <w:rPr>
+                <w:sz w:val="20"/>
+              </w:rPr>
+              <w:t>2</w:t>
+            </w:r>
+          </w:p>
+        </w:tc>
+        <w:tc>
+          <w:tcPr>
+            <w:tcW w:type="dxa" w:w="1378"/>
+          </w:tcPr>
+          <w:p>
+            <w:r/>
+            <w:r>
+              <w:rPr>
+                <w:sz w:val="20"/>
+              </w:rPr>
+              <w:t>0.674</w:t>
+            </w:r>
+          </w:p>
+        </w:tc>
+        <w:tc>
+          <w:tcPr>
+            <w:tcW w:type="dxa" w:w="1378"/>
+          </w:tcPr>
+          <w:p>
+            <w:r/>
+            <w:r>
+              <w:rPr>
+                <w:sz w:val="20"/>
+              </w:rPr>
+              <w:t>0.496</w:t>
+            </w:r>
+          </w:p>
+        </w:tc>
+        <w:tc>
+          <w:tcPr>
+            <w:tcW w:type="dxa" w:w="1378"/>
+          </w:tcPr>
+          <w:p>
+            <w:r/>
+            <w:r>
+              <w:rPr>
+                <w:sz w:val="20"/>
+              </w:rPr>
+              <w:t>3.203</w:t>
+            </w:r>
+          </w:p>
+        </w:tc>
+        <w:tc>
+          <w:tcPr>
+            <w:tcW w:type="dxa" w:w="1378"/>
+          </w:tcPr>
+          <w:p>
+            <w:r/>
+            <w:r>
+              <w:rPr>
+                <w:sz w:val="20"/>
+              </w:rPr>
+              <w:t>1.486</w:t>
+            </w:r>
+          </w:p>
+        </w:tc>
+        <w:tc>
+          <w:tcPr>
+            <w:tcW w:type="dxa" w:w="1378"/>
+          </w:tcPr>
+          <w:p>
+            <w:r/>
+            <w:r>
+              <w:rPr>
+                <w:sz w:val="20"/>
+              </w:rPr>
+              <w:t>0</w:t>
+            </w:r>
+          </w:p>
+        </w:tc>
+        <w:tc>
+          <w:tcPr>
+            <w:tcW w:type="dxa" w:w="1378"/>
+          </w:tcPr>
+          <w:p>
+            <w:r/>
+            <w:r>
+              <w:rPr>
+                <w:sz w:val="20"/>
+              </w:rPr>
+              <w:t>0</w:t>
+            </w:r>
+          </w:p>
+        </w:tc>
+      </w:tr>
+      <w:tr>
+        <w:tc>
+          <w:tcPr>
+            <w:tcW w:type="dxa" w:w="1378"/>
+          </w:tcPr>
+          <w:p>
+            <w:r/>
+            <w:r>
+              <w:rPr>
+                <w:sz w:val="20"/>
+              </w:rPr>
+              <w:t>3</w:t>
+            </w:r>
+          </w:p>
+        </w:tc>
+        <w:tc>
+          <w:tcPr>
+            <w:tcW w:type="dxa" w:w="1378"/>
+          </w:tcPr>
+          <w:p>
+            <w:r/>
+            <w:r>
+              <w:rPr>
+                <w:sz w:val="20"/>
+              </w:rPr>
+              <w:t>0.915</w:t>
+            </w:r>
+          </w:p>
+        </w:tc>
+        <w:tc>
+          <w:tcPr>
+            <w:tcW w:type="dxa" w:w="1378"/>
+          </w:tcPr>
+          <w:p>
+            <w:r/>
+            <w:r>
+              <w:rPr>
+                <w:sz w:val="20"/>
+              </w:rPr>
+              <w:t>0.812</w:t>
+            </w:r>
+          </w:p>
+        </w:tc>
+        <w:tc>
+          <w:tcPr>
+            <w:tcW w:type="dxa" w:w="1378"/>
+          </w:tcPr>
+          <w:p>
+            <w:r/>
+            <w:r>
+              <w:rPr>
+                <w:sz w:val="20"/>
+              </w:rPr>
+              <w:t>5.189</w:t>
+            </w:r>
+          </w:p>
+        </w:tc>
+        <w:tc>
+          <w:tcPr>
+            <w:tcW w:type="dxa" w:w="1378"/>
+          </w:tcPr>
+          <w:p>
+            <w:r/>
+            <w:r>
+              <w:rPr>
+                <w:sz w:val="20"/>
+              </w:rPr>
+              <w:t>1.408</w:t>
+            </w:r>
+          </w:p>
+        </w:tc>
+        <w:tc>
+          <w:tcPr>
+            <w:tcW w:type="dxa" w:w="1378"/>
+          </w:tcPr>
+          <w:p>
+            <w:r/>
+            <w:r>
+              <w:rPr>
+                <w:sz w:val="20"/>
+              </w:rPr>
+              <w:t>0</w:t>
+            </w:r>
+          </w:p>
+        </w:tc>
+        <w:tc>
+          <w:tcPr>
+            <w:tcW w:type="dxa" w:w="1378"/>
+          </w:tcPr>
+          <w:p>
+            <w:r/>
+            <w:r>
+              <w:rPr>
+                <w:sz w:val="20"/>
+              </w:rPr>
+              <w:t>0</w:t>
+            </w:r>
+          </w:p>
+        </w:tc>
+      </w:tr>
+      <w:tr>
+        <w:tc>
+          <w:tcPr>
+            <w:tcW w:type="dxa" w:w="1378"/>
+          </w:tcPr>
+          <w:p>
+            <w:r/>
+            <w:r>
+              <w:rPr>
+                <w:sz w:val="20"/>
+              </w:rPr>
+              <w:t>4</w:t>
+            </w:r>
+          </w:p>
+        </w:tc>
+        <w:tc>
+          <w:tcPr>
+            <w:tcW w:type="dxa" w:w="1378"/>
+          </w:tcPr>
+          <w:p>
+            <w:r/>
+            <w:r>
+              <w:rPr>
+                <w:sz w:val="20"/>
+              </w:rPr>
+              <w:t>1.211</w:t>
+            </w:r>
+          </w:p>
+        </w:tc>
+        <w:tc>
+          <w:tcPr>
+            <w:tcW w:type="dxa" w:w="1378"/>
+          </w:tcPr>
+          <w:p>
+            <w:r/>
+            <w:r>
+              <w:rPr>
+                <w:sz w:val="20"/>
+              </w:rPr>
+              <w:t>1.548</w:t>
+            </w:r>
+          </w:p>
+        </w:tc>
+        <w:tc>
+          <w:tcPr>
+            <w:tcW w:type="dxa" w:w="1378"/>
+          </w:tcPr>
+          <w:p>
+            <w:r/>
+            <w:r>
+              <w:rPr>
+                <w:sz w:val="20"/>
+              </w:rPr>
+              <w:t>6.670</w:t>
+            </w:r>
+          </w:p>
+        </w:tc>
+        <w:tc>
+          <w:tcPr>
+            <w:tcW w:type="dxa" w:w="1378"/>
+          </w:tcPr>
+          <w:p>
+            <w:r/>
+            <w:r>
+              <w:rPr>
+                <w:sz w:val="20"/>
+              </w:rPr>
+              <w:t>3.727</w:t>
+            </w:r>
+          </w:p>
+        </w:tc>
+        <w:tc>
+          <w:tcPr>
+            <w:tcW w:type="dxa" w:w="1378"/>
+          </w:tcPr>
+          <w:p>
+            <w:r/>
+            <w:r>
+              <w:rPr>
+                <w:sz w:val="20"/>
+              </w:rPr>
+              <w:t>0</w:t>
+            </w:r>
+          </w:p>
+        </w:tc>
+        <w:tc>
+          <w:tcPr>
+            <w:tcW w:type="dxa" w:w="1378"/>
+          </w:tcPr>
+          <w:p>
+            <w:r/>
+            <w:r>
+              <w:rPr>
+                <w:sz w:val="20"/>
+              </w:rPr>
+              <w:t>0</w:t>
+            </w:r>
+          </w:p>
+        </w:tc>
+      </w:tr>
+      <w:tr>
+        <w:tc>
+          <w:tcPr>
+            <w:tcW w:type="dxa" w:w="1378"/>
+          </w:tcPr>
+          <w:p>
+            <w:r/>
+            <w:r>
+              <w:rPr>
+                <w:sz w:val="20"/>
+              </w:rPr>
+              <w:t>5</w:t>
+            </w:r>
+          </w:p>
+        </w:tc>
+        <w:tc>
+          <w:tcPr>
+            <w:tcW w:type="dxa" w:w="1378"/>
+          </w:tcPr>
+          <w:p>
+            <w:r/>
+            <w:r>
+              <w:rPr>
+                <w:sz w:val="20"/>
+              </w:rPr>
+              <w:t>1.638</w:t>
+            </w:r>
+          </w:p>
+        </w:tc>
+        <w:tc>
+          <w:tcPr>
+            <w:tcW w:type="dxa" w:w="1378"/>
+          </w:tcPr>
+          <w:p>
+            <w:r/>
+            <w:r>
+              <w:rPr>
+                <w:sz w:val="20"/>
+              </w:rPr>
+              <w:t>1.440</w:t>
+            </w:r>
+          </w:p>
+        </w:tc>
+        <w:tc>
+          <w:tcPr>
+            <w:tcW w:type="dxa" w:w="1378"/>
+          </w:tcPr>
+          <w:p>
+            <w:r/>
+            <w:r>
+              <w:rPr>
+                <w:sz w:val="20"/>
+              </w:rPr>
+              <w:t>7.396</w:t>
+            </w:r>
+          </w:p>
+        </w:tc>
+        <w:tc>
+          <w:tcPr>
+            <w:tcW w:type="dxa" w:w="1378"/>
+          </w:tcPr>
+          <w:p>
+            <w:r/>
+            <w:r>
+              <w:rPr>
+                <w:sz w:val="20"/>
+              </w:rPr>
+              <w:t>7.971</w:t>
+            </w:r>
+          </w:p>
+        </w:tc>
+        <w:tc>
+          <w:tcPr>
+            <w:tcW w:type="dxa" w:w="1378"/>
+          </w:tcPr>
+          <w:p>
+            <w:r/>
+            <w:r>
+              <w:rPr>
+                <w:sz w:val="20"/>
+              </w:rPr>
+              <w:t>0</w:t>
+            </w:r>
+          </w:p>
+        </w:tc>
+        <w:tc>
+          <w:tcPr>
+            <w:tcW w:type="dxa" w:w="1378"/>
+          </w:tcPr>
+          <w:p>
+            <w:r/>
+            <w:r>
+              <w:rPr>
+                <w:sz w:val="20"/>
+              </w:rPr>
+              <w:t>0</w:t>
+            </w:r>
+          </w:p>
+        </w:tc>
+      </w:tr>
+      <w:tr>
+        <w:tc>
+          <w:tcPr>
+            <w:tcW w:type="dxa" w:w="1378"/>
+          </w:tcPr>
+          <w:p>
+            <w:r/>
+            <w:r>
+              <w:rPr>
+                <w:sz w:val="20"/>
+              </w:rPr>
+              <w:t>10</w:t>
+            </w:r>
+          </w:p>
+        </w:tc>
+        <w:tc>
+          <w:tcPr>
+            <w:tcW w:type="dxa" w:w="1378"/>
+          </w:tcPr>
+          <w:p>
+            <w:r/>
+            <w:r>
+              <w:rPr>
+                <w:sz w:val="20"/>
+              </w:rPr>
+              <w:t>3.715</w:t>
+            </w:r>
+          </w:p>
+        </w:tc>
+        <w:tc>
+          <w:tcPr>
+            <w:tcW w:type="dxa" w:w="1378"/>
+          </w:tcPr>
+          <w:p>
+            <w:r/>
+            <w:r>
+              <w:rPr>
+                <w:sz w:val="20"/>
+              </w:rPr>
+              <w:t>5.328</w:t>
+            </w:r>
+          </w:p>
+        </w:tc>
+        <w:tc>
+          <w:tcPr>
+            <w:tcW w:type="dxa" w:w="1378"/>
+          </w:tcPr>
+          <w:p>
+            <w:r/>
+            <w:r>
+              <w:rPr>
+                <w:sz w:val="20"/>
+              </w:rPr>
+              <w:t>13.275</w:t>
+            </w:r>
+          </w:p>
+        </w:tc>
+        <w:tc>
+          <w:tcPr>
+            <w:tcW w:type="dxa" w:w="1378"/>
+          </w:tcPr>
+          <w:p>
+            <w:r/>
+            <w:r>
+              <w:rPr>
+                <w:sz w:val="20"/>
+              </w:rPr>
+              <w:t>18.187</w:t>
+            </w:r>
+          </w:p>
+        </w:tc>
+        <w:tc>
+          <w:tcPr>
+            <w:tcW w:type="dxa" w:w="1378"/>
+          </w:tcPr>
+          <w:p>
+            <w:r/>
+            <w:r>
+              <w:rPr>
+                <w:sz w:val="20"/>
+              </w:rPr>
+              <w:t>0</w:t>
+            </w:r>
+          </w:p>
+        </w:tc>
+        <w:tc>
+          <w:tcPr>
+            <w:tcW w:type="dxa" w:w="1378"/>
+          </w:tcPr>
+          <w:p>
+            <w:r/>
+            <w:r>
+              <w:rPr>
+                <w:sz w:val="20"/>
+              </w:rPr>
+              <w:t>0</w:t>
+            </w:r>
+          </w:p>
+        </w:tc>
+      </w:tr>
+    </w:tbl>
+    <w:p>
+      <w:pPr>
+        <w:spacing w:after="40"/>
+      </w:pPr>
+    </w:p>
+    <w:p>
+      <w:pPr>
+        <w:spacing w:after="160"/>
+      </w:pPr>
+      <w:r>
+        <w:rPr>
+          <w:i/>
+          <w:color w:val="595959"/>
+          <w:sz w:val="18"/>
+        </w:rPr>
+        <w:t>Table. MEASURED on the board with the retrained actor and corrected host plant. Each duration has eight paired onsets. Handling-on and handling-off files remain separate from the historical sweep.</w:t>
+      </w:r>
+    </w:p>
+    <w:p>
+      <w:pPr>
+        <w:spacing w:after="160"/>
+      </w:pPr>
+      <w:r>
+        <w:rPr>
+          <w:i w:val="0"/>
+          <w:sz w:val="24"/>
+        </w:rPr>
+        <w:t>Counter checks: all sixteen files passed.</w:t>
+      </w:r>
+    </w:p>
+    <w:p>
+      <w:pPr>
+        <w:jc w:val="center"/>
+      </w:pPr>
+      <w:r>
+        <w:drawing>
+          <wp:inline xmlns:a="http://schemas.openxmlformats.org/drawingml/2006/main" xmlns:pic="http://schemas.openxmlformats.org/drawingml/2006/picture">
+            <wp:extent cx="5852160" cy="1890698"/>
+            <wp:docPr id="19" name="Picture 19"/>
+            <wp:cNvGraphicFramePr>
+              <a:graphicFrameLocks noChangeAspect="1"/>
+            </wp:cNvGraphicFramePr>
+            <a:graphic>
+              <a:graphicData uri="http://schemas.openxmlformats.org/drawingml/2006/picture">
+                <pic:pic>
+                  <pic:nvPicPr>
+                    <pic:cNvPr id="0" name="week11-a4-corrected-sweep.png"/>
+                    <pic:cNvPicPr/>
+                  </pic:nvPicPr>
+                  <pic:blipFill>
+                    <a:blip r:embed="rId27"/>
+                    <a:stretch>
+                      <a:fillRect/>
+                    </a:stretch>
+                  </pic:blipFill>
+                  <pic:spPr>
+                    <a:xfrm>
+                      <a:off x="0" y="0"/>
+                      <a:ext cx="5852160" cy="1890698"/>
+                    </a:xfrm>
+                    <a:prstGeom prst="rect"/>
+                  </pic:spPr>
+                </pic:pic>
+              </a:graphicData>
+            </a:graphic>
+          </wp:inline>
+        </w:drawing>
+      </w:r>
+    </w:p>
+    <w:p>
+      <w:pPr>
+        <w:spacing w:after="240"/>
+        <w:jc w:val="center"/>
+      </w:pPr>
+      <w:r>
+        <w:rPr>
+          <w:i/>
+          <w:color w:val="595959"/>
+          <w:sz w:val="18"/>
+        </w:rPr>
+        <w:t>Figure 19. Corrected-model A4 sweep from 0.2 to 10 seconds. MEASURED on the board. Lines join measured points only.</w:t>
+      </w:r>
+    </w:p>
+    <w:p>
+      <w:pPr>
+        <w:pStyle w:val="Heading2"/>
+      </w:pPr>
+      <w:r>
         <w:t>What stands and what does not</w:t>
       </w:r>
     </w:p>
@@ -21346,7 +22753,7 @@
         <w:spacing w:after="80"/>
       </w:pPr>
       <w:r>
-        <w:t>To be re-measured: the learned-controller runs of the failure-handling sweep in section 25, where the ceiling also bound.</w:t>
+        <w:t>Re-measured above: the learned-controller runs of the failure-handling sweep in section 25, where the ceiling also bound.</w:t>
       </w:r>
     </w:p>
     <w:p>
@@ -21355,6 +22762,2589 @@
       </w:pPr>
       <w:r>
         <w:t>The campaign again, on the corrected model</w:t>
+      </w:r>
+    </w:p>
+    <w:tbl>
+      <w:tblPr>
+        <w:tblStyle w:val="LightGrid-Accent1"/>
+        <w:tblW w:type="auto" w:w="0"/>
+        <w:jc w:val="center"/>
+        <w:tblLook w:firstColumn="1" w:firstRow="1" w:lastColumn="0" w:lastRow="0" w:noHBand="0" w:noVBand="1" w:val="04A0"/>
+      </w:tblPr>
+      <w:tblGrid>
+        <w:gridCol w:w="1378"/>
+        <w:gridCol w:w="1378"/>
+        <w:gridCol w:w="1378"/>
+        <w:gridCol w:w="1378"/>
+        <w:gridCol w:w="1378"/>
+        <w:gridCol w:w="1378"/>
+        <w:gridCol w:w="1378"/>
+      </w:tblGrid>
+      <w:tr>
+        <w:tc>
+          <w:tcPr>
+            <w:tcW w:type="dxa" w:w="1378"/>
+          </w:tcPr>
+          <w:p>
+            <w:r/>
+            <w:r>
+              <w:rPr>
+                <w:b/>
+                <w:sz w:val="20"/>
+              </w:rPr>
+              <w:t>Varied</w:t>
+            </w:r>
+          </w:p>
+        </w:tc>
+        <w:tc>
+          <w:tcPr>
+            <w:tcW w:type="dxa" w:w="1378"/>
+          </w:tcPr>
+          <w:p>
+            <w:r/>
+            <w:r>
+              <w:rPr>
+                <w:b/>
+                <w:sz w:val="20"/>
+              </w:rPr>
+              <w:t>Setting</w:t>
+            </w:r>
+          </w:p>
+        </w:tc>
+        <w:tc>
+          <w:tcPr>
+            <w:tcW w:type="dxa" w:w="1378"/>
+          </w:tcPr>
+          <w:p>
+            <w:r/>
+            <w:r>
+              <w:rPr>
+                <w:b/>
+                <w:sz w:val="20"/>
+              </w:rPr>
+              <w:t>Rules: tracking error, m/s</w:t>
+            </w:r>
+          </w:p>
+        </w:tc>
+        <w:tc>
+          <w:tcPr>
+            <w:tcW w:type="dxa" w:w="1378"/>
+          </w:tcPr>
+          <w:p>
+            <w:r/>
+            <w:r>
+              <w:rPr>
+                <w:b/>
+                <w:sz w:val="20"/>
+              </w:rPr>
+              <w:t>Learned: tracking error, m/s</w:t>
+            </w:r>
+          </w:p>
+        </w:tc>
+        <w:tc>
+          <w:tcPr>
+            <w:tcW w:type="dxa" w:w="1378"/>
+          </w:tcPr>
+          <w:p>
+            <w:r/>
+            <w:r>
+              <w:rPr>
+                <w:b/>
+                <w:sz w:val="20"/>
+              </w:rPr>
+              <w:t>Rules: energy, Wh/km</w:t>
+            </w:r>
+          </w:p>
+        </w:tc>
+        <w:tc>
+          <w:tcPr>
+            <w:tcW w:type="dxa" w:w="1378"/>
+          </w:tcPr>
+          <w:p>
+            <w:r/>
+            <w:r>
+              <w:rPr>
+                <w:b/>
+                <w:sz w:val="20"/>
+              </w:rPr>
+              <w:t>Learned: energy, Wh/km</w:t>
+            </w:r>
+          </w:p>
+        </w:tc>
+        <w:tc>
+          <w:tcPr>
+            <w:tcW w:type="dxa" w:w="1378"/>
+          </w:tcPr>
+          <w:p>
+            <w:r/>
+            <w:r>
+              <w:rPr>
+                <w:b/>
+                <w:sz w:val="20"/>
+              </w:rPr>
+              <w:t>Learned vs rules</w:t>
+            </w:r>
+          </w:p>
+        </w:tc>
+      </w:tr>
+      <w:tr>
+        <w:tc>
+          <w:tcPr>
+            <w:tcW w:type="dxa" w:w="1378"/>
+          </w:tcPr>
+          <w:p>
+            <w:r/>
+            <w:r>
+              <w:rPr>
+                <w:sz w:val="20"/>
+              </w:rPr>
+              <w:t>Driving condition</w:t>
+            </w:r>
+          </w:p>
+        </w:tc>
+        <w:tc>
+          <w:tcPr>
+            <w:tcW w:type="dxa" w:w="1378"/>
+          </w:tcPr>
+          <w:p>
+            <w:r/>
+            <w:r>
+              <w:rPr>
+                <w:sz w:val="20"/>
+              </w:rPr>
+              <w:t>urban</w:t>
+            </w:r>
+          </w:p>
+        </w:tc>
+        <w:tc>
+          <w:tcPr>
+            <w:tcW w:type="dxa" w:w="1378"/>
+          </w:tcPr>
+          <w:p>
+            <w:r/>
+            <w:r>
+              <w:rPr>
+                <w:sz w:val="20"/>
+              </w:rPr>
+              <w:t>0.0131</w:t>
+            </w:r>
+          </w:p>
+        </w:tc>
+        <w:tc>
+          <w:tcPr>
+            <w:tcW w:type="dxa" w:w="1378"/>
+          </w:tcPr>
+          <w:p>
+            <w:r/>
+            <w:r>
+              <w:rPr>
+                <w:sz w:val="20"/>
+              </w:rPr>
+              <w:t>0.0156</w:t>
+            </w:r>
+          </w:p>
+        </w:tc>
+        <w:tc>
+          <w:tcPr>
+            <w:tcW w:type="dxa" w:w="1378"/>
+          </w:tcPr>
+          <w:p>
+            <w:r/>
+            <w:r>
+              <w:rPr>
+                <w:sz w:val="20"/>
+              </w:rPr>
+              <w:t>168.13</w:t>
+            </w:r>
+          </w:p>
+        </w:tc>
+        <w:tc>
+          <w:tcPr>
+            <w:tcW w:type="dxa" w:w="1378"/>
+          </w:tcPr>
+          <w:p>
+            <w:r/>
+            <w:r>
+              <w:rPr>
+                <w:sz w:val="20"/>
+              </w:rPr>
+              <w:t>169.30</w:t>
+            </w:r>
+          </w:p>
+        </w:tc>
+        <w:tc>
+          <w:tcPr>
+            <w:tcW w:type="dxa" w:w="1378"/>
+          </w:tcPr>
+          <w:p>
+            <w:r/>
+            <w:r>
+              <w:rPr>
+                <w:sz w:val="20"/>
+              </w:rPr>
+              <w:t>+0.70%</w:t>
+            </w:r>
+          </w:p>
+        </w:tc>
+      </w:tr>
+      <w:tr>
+        <w:tc>
+          <w:tcPr>
+            <w:tcW w:type="dxa" w:w="1378"/>
+          </w:tcPr>
+          <w:p>
+            <w:r/>
+            <w:r>
+              <w:rPr>
+                <w:sz w:val="20"/>
+              </w:rPr>
+              <w:t>Driving condition</w:t>
+            </w:r>
+          </w:p>
+        </w:tc>
+        <w:tc>
+          <w:tcPr>
+            <w:tcW w:type="dxa" w:w="1378"/>
+          </w:tcPr>
+          <w:p>
+            <w:r/>
+            <w:r>
+              <w:rPr>
+                <w:sz w:val="20"/>
+              </w:rPr>
+              <w:t>highway</w:t>
+            </w:r>
+          </w:p>
+        </w:tc>
+        <w:tc>
+          <w:tcPr>
+            <w:tcW w:type="dxa" w:w="1378"/>
+          </w:tcPr>
+          <w:p>
+            <w:r/>
+            <w:r>
+              <w:rPr>
+                <w:sz w:val="20"/>
+              </w:rPr>
+              <w:t>0.0036</w:t>
+            </w:r>
+          </w:p>
+        </w:tc>
+        <w:tc>
+          <w:tcPr>
+            <w:tcW w:type="dxa" w:w="1378"/>
+          </w:tcPr>
+          <w:p>
+            <w:r/>
+            <w:r>
+              <w:rPr>
+                <w:sz w:val="20"/>
+              </w:rPr>
+              <w:t>0.0035</w:t>
+            </w:r>
+          </w:p>
+        </w:tc>
+        <w:tc>
+          <w:tcPr>
+            <w:tcW w:type="dxa" w:w="1378"/>
+          </w:tcPr>
+          <w:p>
+            <w:r/>
+            <w:r>
+              <w:rPr>
+                <w:sz w:val="20"/>
+              </w:rPr>
+              <w:t>153.96</w:t>
+            </w:r>
+          </w:p>
+        </w:tc>
+        <w:tc>
+          <w:tcPr>
+            <w:tcW w:type="dxa" w:w="1378"/>
+          </w:tcPr>
+          <w:p>
+            <w:r/>
+            <w:r>
+              <w:rPr>
+                <w:sz w:val="20"/>
+              </w:rPr>
+              <w:t>154.40</w:t>
+            </w:r>
+          </w:p>
+        </w:tc>
+        <w:tc>
+          <w:tcPr>
+            <w:tcW w:type="dxa" w:w="1378"/>
+          </w:tcPr>
+          <w:p>
+            <w:r/>
+            <w:r>
+              <w:rPr>
+                <w:sz w:val="20"/>
+              </w:rPr>
+              <w:t>+0.29%</w:t>
+            </w:r>
+          </w:p>
+        </w:tc>
+      </w:tr>
+      <w:tr>
+        <w:tc>
+          <w:tcPr>
+            <w:tcW w:type="dxa" w:w="1378"/>
+          </w:tcPr>
+          <w:p>
+            <w:r/>
+            <w:r>
+              <w:rPr>
+                <w:sz w:val="20"/>
+              </w:rPr>
+              <w:t>Driving condition</w:t>
+            </w:r>
+          </w:p>
+        </w:tc>
+        <w:tc>
+          <w:tcPr>
+            <w:tcW w:type="dxa" w:w="1378"/>
+          </w:tcPr>
+          <w:p>
+            <w:r/>
+            <w:r>
+              <w:rPr>
+                <w:sz w:val="20"/>
+              </w:rPr>
+              <w:t>aggressive mixed</w:t>
+            </w:r>
+          </w:p>
+        </w:tc>
+        <w:tc>
+          <w:tcPr>
+            <w:tcW w:type="dxa" w:w="1378"/>
+          </w:tcPr>
+          <w:p>
+            <w:r/>
+            <w:r>
+              <w:rPr>
+                <w:sz w:val="20"/>
+              </w:rPr>
+              <w:t>0.0436</w:t>
+            </w:r>
+          </w:p>
+        </w:tc>
+        <w:tc>
+          <w:tcPr>
+            <w:tcW w:type="dxa" w:w="1378"/>
+          </w:tcPr>
+          <w:p>
+            <w:r/>
+            <w:r>
+              <w:rPr>
+                <w:sz w:val="20"/>
+              </w:rPr>
+              <w:t>0.2262</w:t>
+            </w:r>
+          </w:p>
+        </w:tc>
+        <w:tc>
+          <w:tcPr>
+            <w:tcW w:type="dxa" w:w="1378"/>
+          </w:tcPr>
+          <w:p>
+            <w:r/>
+            <w:r>
+              <w:rPr>
+                <w:sz w:val="20"/>
+              </w:rPr>
+              <w:t>191.41</w:t>
+            </w:r>
+          </w:p>
+        </w:tc>
+        <w:tc>
+          <w:tcPr>
+            <w:tcW w:type="dxa" w:w="1378"/>
+          </w:tcPr>
+          <w:p>
+            <w:r/>
+            <w:r>
+              <w:rPr>
+                <w:sz w:val="20"/>
+              </w:rPr>
+              <w:t>191.48</w:t>
+            </w:r>
+          </w:p>
+        </w:tc>
+        <w:tc>
+          <w:tcPr>
+            <w:tcW w:type="dxa" w:w="1378"/>
+          </w:tcPr>
+          <w:p>
+            <w:r/>
+            <w:r>
+              <w:rPr>
+                <w:sz w:val="20"/>
+              </w:rPr>
+              <w:t>+0.03%</w:t>
+            </w:r>
+          </w:p>
+        </w:tc>
+      </w:tr>
+      <w:tr>
+        <w:tc>
+          <w:tcPr>
+            <w:tcW w:type="dxa" w:w="1378"/>
+          </w:tcPr>
+          <w:p>
+            <w:r/>
+            <w:r>
+              <w:rPr>
+                <w:sz w:val="20"/>
+              </w:rPr>
+              <w:t>Road grade</w:t>
+            </w:r>
+          </w:p>
+        </w:tc>
+        <w:tc>
+          <w:tcPr>
+            <w:tcW w:type="dxa" w:w="1378"/>
+          </w:tcPr>
+          <w:p>
+            <w:r/>
+            <w:r>
+              <w:rPr>
+                <w:sz w:val="20"/>
+              </w:rPr>
+              <w:t>uphill</w:t>
+            </w:r>
+          </w:p>
+        </w:tc>
+        <w:tc>
+          <w:tcPr>
+            <w:tcW w:type="dxa" w:w="1378"/>
+          </w:tcPr>
+          <w:p>
+            <w:r/>
+            <w:r>
+              <w:rPr>
+                <w:sz w:val="20"/>
+              </w:rPr>
+              <w:t>0.0390</w:t>
+            </w:r>
+          </w:p>
+        </w:tc>
+        <w:tc>
+          <w:tcPr>
+            <w:tcW w:type="dxa" w:w="1378"/>
+          </w:tcPr>
+          <w:p>
+            <w:r/>
+            <w:r>
+              <w:rPr>
+                <w:sz w:val="20"/>
+              </w:rPr>
+              <w:t>0.2366</w:t>
+            </w:r>
+          </w:p>
+        </w:tc>
+        <w:tc>
+          <w:tcPr>
+            <w:tcW w:type="dxa" w:w="1378"/>
+          </w:tcPr>
+          <w:p>
+            <w:r/>
+            <w:r>
+              <w:rPr>
+                <w:sz w:val="20"/>
+              </w:rPr>
+              <w:t>305.26</w:t>
+            </w:r>
+          </w:p>
+        </w:tc>
+        <w:tc>
+          <w:tcPr>
+            <w:tcW w:type="dxa" w:w="1378"/>
+          </w:tcPr>
+          <w:p>
+            <w:r/>
+            <w:r>
+              <w:rPr>
+                <w:sz w:val="20"/>
+              </w:rPr>
+              <w:t>305.21</w:t>
+            </w:r>
+          </w:p>
+        </w:tc>
+        <w:tc>
+          <w:tcPr>
+            <w:tcW w:type="dxa" w:w="1378"/>
+          </w:tcPr>
+          <w:p>
+            <w:r/>
+            <w:r>
+              <w:rPr>
+                <w:sz w:val="20"/>
+              </w:rPr>
+              <w:t>-0.02%</w:t>
+            </w:r>
+          </w:p>
+        </w:tc>
+      </w:tr>
+      <w:tr>
+        <w:tc>
+          <w:tcPr>
+            <w:tcW w:type="dxa" w:w="1378"/>
+          </w:tcPr>
+          <w:p>
+            <w:r/>
+            <w:r>
+              <w:rPr>
+                <w:sz w:val="20"/>
+              </w:rPr>
+              <w:t>Road grade</w:t>
+            </w:r>
+          </w:p>
+        </w:tc>
+        <w:tc>
+          <w:tcPr>
+            <w:tcW w:type="dxa" w:w="1378"/>
+          </w:tcPr>
+          <w:p>
+            <w:r/>
+            <w:r>
+              <w:rPr>
+                <w:sz w:val="20"/>
+              </w:rPr>
+              <w:t>flat</w:t>
+            </w:r>
+          </w:p>
+        </w:tc>
+        <w:tc>
+          <w:tcPr>
+            <w:tcW w:type="dxa" w:w="1378"/>
+          </w:tcPr>
+          <w:p>
+            <w:r/>
+            <w:r>
+              <w:rPr>
+                <w:sz w:val="20"/>
+              </w:rPr>
+              <w:t>0.0150</w:t>
+            </w:r>
+          </w:p>
+        </w:tc>
+        <w:tc>
+          <w:tcPr>
+            <w:tcW w:type="dxa" w:w="1378"/>
+          </w:tcPr>
+          <w:p>
+            <w:r/>
+            <w:r>
+              <w:rPr>
+                <w:sz w:val="20"/>
+              </w:rPr>
+              <w:t>0.2287</w:t>
+            </w:r>
+          </w:p>
+        </w:tc>
+        <w:tc>
+          <w:tcPr>
+            <w:tcW w:type="dxa" w:w="1378"/>
+          </w:tcPr>
+          <w:p>
+            <w:r/>
+            <w:r>
+              <w:rPr>
+                <w:sz w:val="20"/>
+              </w:rPr>
+              <w:t>190.75</w:t>
+            </w:r>
+          </w:p>
+        </w:tc>
+        <w:tc>
+          <w:tcPr>
+            <w:tcW w:type="dxa" w:w="1378"/>
+          </w:tcPr>
+          <w:p>
+            <w:r/>
+            <w:r>
+              <w:rPr>
+                <w:sz w:val="20"/>
+              </w:rPr>
+              <w:t>191.43</w:t>
+            </w:r>
+          </w:p>
+        </w:tc>
+        <w:tc>
+          <w:tcPr>
+            <w:tcW w:type="dxa" w:w="1378"/>
+          </w:tcPr>
+          <w:p>
+            <w:r/>
+            <w:r>
+              <w:rPr>
+                <w:sz w:val="20"/>
+              </w:rPr>
+              <w:t>+0.36%</w:t>
+            </w:r>
+          </w:p>
+        </w:tc>
+      </w:tr>
+      <w:tr>
+        <w:tc>
+          <w:tcPr>
+            <w:tcW w:type="dxa" w:w="1378"/>
+          </w:tcPr>
+          <w:p>
+            <w:r/>
+            <w:r>
+              <w:rPr>
+                <w:sz w:val="20"/>
+              </w:rPr>
+              <w:t>Road grade</w:t>
+            </w:r>
+          </w:p>
+        </w:tc>
+        <w:tc>
+          <w:tcPr>
+            <w:tcW w:type="dxa" w:w="1378"/>
+          </w:tcPr>
+          <w:p>
+            <w:r/>
+            <w:r>
+              <w:rPr>
+                <w:sz w:val="20"/>
+              </w:rPr>
+              <w:t>downhill</w:t>
+            </w:r>
+          </w:p>
+        </w:tc>
+        <w:tc>
+          <w:tcPr>
+            <w:tcW w:type="dxa" w:w="1378"/>
+          </w:tcPr>
+          <w:p>
+            <w:r/>
+            <w:r>
+              <w:rPr>
+                <w:sz w:val="20"/>
+              </w:rPr>
+              <w:t>0.0101</w:t>
+            </w:r>
+          </w:p>
+        </w:tc>
+        <w:tc>
+          <w:tcPr>
+            <w:tcW w:type="dxa" w:w="1378"/>
+          </w:tcPr>
+          <w:p>
+            <w:r/>
+            <w:r>
+              <w:rPr>
+                <w:sz w:val="20"/>
+              </w:rPr>
+              <w:t>0.1931</w:t>
+            </w:r>
+          </w:p>
+        </w:tc>
+        <w:tc>
+          <w:tcPr>
+            <w:tcW w:type="dxa" w:w="1378"/>
+          </w:tcPr>
+          <w:p>
+            <w:r/>
+            <w:r>
+              <w:rPr>
+                <w:sz w:val="20"/>
+              </w:rPr>
+              <w:t>79.30</w:t>
+            </w:r>
+          </w:p>
+        </w:tc>
+        <w:tc>
+          <w:tcPr>
+            <w:tcW w:type="dxa" w:w="1378"/>
+          </w:tcPr>
+          <w:p>
+            <w:r/>
+            <w:r>
+              <w:rPr>
+                <w:sz w:val="20"/>
+              </w:rPr>
+              <w:t>83.83</w:t>
+            </w:r>
+          </w:p>
+        </w:tc>
+        <w:tc>
+          <w:tcPr>
+            <w:tcW w:type="dxa" w:w="1378"/>
+          </w:tcPr>
+          <w:p>
+            <w:r/>
+            <w:r>
+              <w:rPr>
+                <w:sz w:val="20"/>
+              </w:rPr>
+              <w:t>+5.71%</w:t>
+            </w:r>
+          </w:p>
+        </w:tc>
+      </w:tr>
+      <w:tr>
+        <w:tc>
+          <w:tcPr>
+            <w:tcW w:type="dxa" w:w="1378"/>
+          </w:tcPr>
+          <w:p>
+            <w:r/>
+            <w:r>
+              <w:rPr>
+                <w:sz w:val="20"/>
+              </w:rPr>
+              <w:t>Battery state</w:t>
+            </w:r>
+          </w:p>
+        </w:tc>
+        <w:tc>
+          <w:tcPr>
+            <w:tcW w:type="dxa" w:w="1378"/>
+          </w:tcPr>
+          <w:p>
+            <w:r/>
+            <w:r>
+              <w:rPr>
+                <w:sz w:val="20"/>
+              </w:rPr>
+              <w:t>high</w:t>
+            </w:r>
+          </w:p>
+        </w:tc>
+        <w:tc>
+          <w:tcPr>
+            <w:tcW w:type="dxa" w:w="1378"/>
+          </w:tcPr>
+          <w:p>
+            <w:r/>
+            <w:r>
+              <w:rPr>
+                <w:sz w:val="20"/>
+              </w:rPr>
+              <w:t>0.0263</w:t>
+            </w:r>
+          </w:p>
+        </w:tc>
+        <w:tc>
+          <w:tcPr>
+            <w:tcW w:type="dxa" w:w="1378"/>
+          </w:tcPr>
+          <w:p>
+            <w:r/>
+            <w:r>
+              <w:rPr>
+                <w:sz w:val="20"/>
+              </w:rPr>
+              <w:t>0.2332</w:t>
+            </w:r>
+          </w:p>
+        </w:tc>
+        <w:tc>
+          <w:tcPr>
+            <w:tcW w:type="dxa" w:w="1378"/>
+          </w:tcPr>
+          <w:p>
+            <w:r/>
+            <w:r>
+              <w:rPr>
+                <w:sz w:val="20"/>
+              </w:rPr>
+              <w:t>190.93</w:t>
+            </w:r>
+          </w:p>
+        </w:tc>
+        <w:tc>
+          <w:tcPr>
+            <w:tcW w:type="dxa" w:w="1378"/>
+          </w:tcPr>
+          <w:p>
+            <w:r/>
+            <w:r>
+              <w:rPr>
+                <w:sz w:val="20"/>
+              </w:rPr>
+              <w:t>191.37</w:t>
+            </w:r>
+          </w:p>
+        </w:tc>
+        <w:tc>
+          <w:tcPr>
+            <w:tcW w:type="dxa" w:w="1378"/>
+          </w:tcPr>
+          <w:p>
+            <w:r/>
+            <w:r>
+              <w:rPr>
+                <w:sz w:val="20"/>
+              </w:rPr>
+              <w:t>+0.23%</w:t>
+            </w:r>
+          </w:p>
+        </w:tc>
+      </w:tr>
+      <w:tr>
+        <w:tc>
+          <w:tcPr>
+            <w:tcW w:type="dxa" w:w="1378"/>
+          </w:tcPr>
+          <w:p>
+            <w:r/>
+            <w:r>
+              <w:rPr>
+                <w:sz w:val="20"/>
+              </w:rPr>
+              <w:t>Battery state</w:t>
+            </w:r>
+          </w:p>
+        </w:tc>
+        <w:tc>
+          <w:tcPr>
+            <w:tcW w:type="dxa" w:w="1378"/>
+          </w:tcPr>
+          <w:p>
+            <w:r/>
+            <w:r>
+              <w:rPr>
+                <w:sz w:val="20"/>
+              </w:rPr>
+              <w:t>medium</w:t>
+            </w:r>
+          </w:p>
+        </w:tc>
+        <w:tc>
+          <w:tcPr>
+            <w:tcW w:type="dxa" w:w="1378"/>
+          </w:tcPr>
+          <w:p>
+            <w:r/>
+            <w:r>
+              <w:rPr>
+                <w:sz w:val="20"/>
+              </w:rPr>
+              <w:t>0.0265</w:t>
+            </w:r>
+          </w:p>
+        </w:tc>
+        <w:tc>
+          <w:tcPr>
+            <w:tcW w:type="dxa" w:w="1378"/>
+          </w:tcPr>
+          <w:p>
+            <w:r/>
+            <w:r>
+              <w:rPr>
+                <w:sz w:val="20"/>
+              </w:rPr>
+              <w:t>0.1955</w:t>
+            </w:r>
+          </w:p>
+        </w:tc>
+        <w:tc>
+          <w:tcPr>
+            <w:tcW w:type="dxa" w:w="1378"/>
+          </w:tcPr>
+          <w:p>
+            <w:r/>
+            <w:r>
+              <w:rPr>
+                <w:sz w:val="20"/>
+              </w:rPr>
+              <w:t>191.00</w:t>
+            </w:r>
+          </w:p>
+        </w:tc>
+        <w:tc>
+          <w:tcPr>
+            <w:tcW w:type="dxa" w:w="1378"/>
+          </w:tcPr>
+          <w:p>
+            <w:r/>
+            <w:r>
+              <w:rPr>
+                <w:sz w:val="20"/>
+              </w:rPr>
+              <w:t>191.63</w:t>
+            </w:r>
+          </w:p>
+        </w:tc>
+        <w:tc>
+          <w:tcPr>
+            <w:tcW w:type="dxa" w:w="1378"/>
+          </w:tcPr>
+          <w:p>
+            <w:r/>
+            <w:r>
+              <w:rPr>
+                <w:sz w:val="20"/>
+              </w:rPr>
+              <w:t>+0.33%</w:t>
+            </w:r>
+          </w:p>
+        </w:tc>
+      </w:tr>
+      <w:tr>
+        <w:tc>
+          <w:tcPr>
+            <w:tcW w:type="dxa" w:w="1378"/>
+          </w:tcPr>
+          <w:p>
+            <w:r/>
+            <w:r>
+              <w:rPr>
+                <w:sz w:val="20"/>
+              </w:rPr>
+              <w:t>Battery state</w:t>
+            </w:r>
+          </w:p>
+        </w:tc>
+        <w:tc>
+          <w:tcPr>
+            <w:tcW w:type="dxa" w:w="1378"/>
+          </w:tcPr>
+          <w:p>
+            <w:r/>
+            <w:r>
+              <w:rPr>
+                <w:sz w:val="20"/>
+              </w:rPr>
+              <w:t>low</w:t>
+            </w:r>
+          </w:p>
+        </w:tc>
+        <w:tc>
+          <w:tcPr>
+            <w:tcW w:type="dxa" w:w="1378"/>
+          </w:tcPr>
+          <w:p>
+            <w:r/>
+            <w:r>
+              <w:rPr>
+                <w:sz w:val="20"/>
+              </w:rPr>
+              <w:t>0.0206</w:t>
+            </w:r>
+          </w:p>
+        </w:tc>
+        <w:tc>
+          <w:tcPr>
+            <w:tcW w:type="dxa" w:w="1378"/>
+          </w:tcPr>
+          <w:p>
+            <w:r/>
+            <w:r>
+              <w:rPr>
+                <w:sz w:val="20"/>
+              </w:rPr>
+              <w:t>0.1678</w:t>
+            </w:r>
+          </w:p>
+        </w:tc>
+        <w:tc>
+          <w:tcPr>
+            <w:tcW w:type="dxa" w:w="1378"/>
+          </w:tcPr>
+          <w:p>
+            <w:r/>
+            <w:r>
+              <w:rPr>
+                <w:sz w:val="20"/>
+              </w:rPr>
+              <w:t>190.80</w:t>
+            </w:r>
+          </w:p>
+        </w:tc>
+        <w:tc>
+          <w:tcPr>
+            <w:tcW w:type="dxa" w:w="1378"/>
+          </w:tcPr>
+          <w:p>
+            <w:r/>
+            <w:r>
+              <w:rPr>
+                <w:sz w:val="20"/>
+              </w:rPr>
+              <w:t>191.20</w:t>
+            </w:r>
+          </w:p>
+        </w:tc>
+        <w:tc>
+          <w:tcPr>
+            <w:tcW w:type="dxa" w:w="1378"/>
+          </w:tcPr>
+          <w:p>
+            <w:r/>
+            <w:r>
+              <w:rPr>
+                <w:sz w:val="20"/>
+              </w:rPr>
+              <w:t>+0.21%</w:t>
+            </w:r>
+          </w:p>
+        </w:tc>
+      </w:tr>
+      <w:tr>
+        <w:tc>
+          <w:tcPr>
+            <w:tcW w:type="dxa" w:w="1378"/>
+          </w:tcPr>
+          <w:p>
+            <w:r/>
+            <w:r>
+              <w:rPr>
+                <w:sz w:val="20"/>
+              </w:rPr>
+              <w:t>Sensor noise</w:t>
+            </w:r>
+          </w:p>
+        </w:tc>
+        <w:tc>
+          <w:tcPr>
+            <w:tcW w:type="dxa" w:w="1378"/>
+          </w:tcPr>
+          <w:p>
+            <w:r/>
+            <w:r>
+              <w:rPr>
+                <w:sz w:val="20"/>
+              </w:rPr>
+              <w:t>floor</w:t>
+            </w:r>
+          </w:p>
+        </w:tc>
+        <w:tc>
+          <w:tcPr>
+            <w:tcW w:type="dxa" w:w="1378"/>
+          </w:tcPr>
+          <w:p>
+            <w:r/>
+            <w:r>
+              <w:rPr>
+                <w:sz w:val="20"/>
+              </w:rPr>
+              <w:t>0.0205</w:t>
+            </w:r>
+          </w:p>
+        </w:tc>
+        <w:tc>
+          <w:tcPr>
+            <w:tcW w:type="dxa" w:w="1378"/>
+          </w:tcPr>
+          <w:p>
+            <w:r/>
+            <w:r>
+              <w:rPr>
+                <w:sz w:val="20"/>
+              </w:rPr>
+              <w:t>0.2295</w:t>
+            </w:r>
+          </w:p>
+        </w:tc>
+        <w:tc>
+          <w:tcPr>
+            <w:tcW w:type="dxa" w:w="1378"/>
+          </w:tcPr>
+          <w:p>
+            <w:r/>
+            <w:r>
+              <w:rPr>
+                <w:sz w:val="20"/>
+              </w:rPr>
+              <w:t>190.75</w:t>
+            </w:r>
+          </w:p>
+        </w:tc>
+        <w:tc>
+          <w:tcPr>
+            <w:tcW w:type="dxa" w:w="1378"/>
+          </w:tcPr>
+          <w:p>
+            <w:r/>
+            <w:r>
+              <w:rPr>
+                <w:sz w:val="20"/>
+              </w:rPr>
+              <w:t>191.81</w:t>
+            </w:r>
+          </w:p>
+        </w:tc>
+        <w:tc>
+          <w:tcPr>
+            <w:tcW w:type="dxa" w:w="1378"/>
+          </w:tcPr>
+          <w:p>
+            <w:r/>
+            <w:r>
+              <w:rPr>
+                <w:sz w:val="20"/>
+              </w:rPr>
+              <w:t>+0.55%</w:t>
+            </w:r>
+          </w:p>
+        </w:tc>
+      </w:tr>
+      <w:tr>
+        <w:tc>
+          <w:tcPr>
+            <w:tcW w:type="dxa" w:w="1378"/>
+          </w:tcPr>
+          <w:p>
+            <w:r/>
+            <w:r>
+              <w:rPr>
+                <w:sz w:val="20"/>
+              </w:rPr>
+              <w:t>Sensor noise</w:t>
+            </w:r>
+          </w:p>
+        </w:tc>
+        <w:tc>
+          <w:tcPr>
+            <w:tcW w:type="dxa" w:w="1378"/>
+          </w:tcPr>
+          <w:p>
+            <w:r/>
+            <w:r>
+              <w:rPr>
+                <w:sz w:val="20"/>
+              </w:rPr>
+              <w:t>elevated</w:t>
+            </w:r>
+          </w:p>
+        </w:tc>
+        <w:tc>
+          <w:tcPr>
+            <w:tcW w:type="dxa" w:w="1378"/>
+          </w:tcPr>
+          <w:p>
+            <w:r/>
+            <w:r>
+              <w:rPr>
+                <w:sz w:val="20"/>
+              </w:rPr>
+              <w:t>0.0145</w:t>
+            </w:r>
+          </w:p>
+        </w:tc>
+        <w:tc>
+          <w:tcPr>
+            <w:tcW w:type="dxa" w:w="1378"/>
+          </w:tcPr>
+          <w:p>
+            <w:r/>
+            <w:r>
+              <w:rPr>
+                <w:sz w:val="20"/>
+              </w:rPr>
+              <w:t>0.2175</w:t>
+            </w:r>
+          </w:p>
+        </w:tc>
+        <w:tc>
+          <w:tcPr>
+            <w:tcW w:type="dxa" w:w="1378"/>
+          </w:tcPr>
+          <w:p>
+            <w:r/>
+            <w:r>
+              <w:rPr>
+                <w:sz w:val="20"/>
+              </w:rPr>
+              <w:t>191.33</w:t>
+            </w:r>
+          </w:p>
+        </w:tc>
+        <w:tc>
+          <w:tcPr>
+            <w:tcW w:type="dxa" w:w="1378"/>
+          </w:tcPr>
+          <w:p>
+            <w:r/>
+            <w:r>
+              <w:rPr>
+                <w:sz w:val="20"/>
+              </w:rPr>
+              <w:t>192.90</w:t>
+            </w:r>
+          </w:p>
+        </w:tc>
+        <w:tc>
+          <w:tcPr>
+            <w:tcW w:type="dxa" w:w="1378"/>
+          </w:tcPr>
+          <w:p>
+            <w:r/>
+            <w:r>
+              <w:rPr>
+                <w:sz w:val="20"/>
+              </w:rPr>
+              <w:t>+0.82%</w:t>
+            </w:r>
+          </w:p>
+        </w:tc>
+      </w:tr>
+      <w:tr>
+        <w:tc>
+          <w:tcPr>
+            <w:tcW w:type="dxa" w:w="1378"/>
+          </w:tcPr>
+          <w:p>
+            <w:r/>
+            <w:r>
+              <w:rPr>
+                <w:sz w:val="20"/>
+              </w:rPr>
+              <w:t>Sensor noise</w:t>
+            </w:r>
+          </w:p>
+        </w:tc>
+        <w:tc>
+          <w:tcPr>
+            <w:tcW w:type="dxa" w:w="1378"/>
+          </w:tcPr>
+          <w:p>
+            <w:r/>
+            <w:r>
+              <w:rPr>
+                <w:sz w:val="20"/>
+              </w:rPr>
+              <w:t>severe</w:t>
+            </w:r>
+          </w:p>
+        </w:tc>
+        <w:tc>
+          <w:tcPr>
+            <w:tcW w:type="dxa" w:w="1378"/>
+          </w:tcPr>
+          <w:p>
+            <w:r/>
+            <w:r>
+              <w:rPr>
+                <w:sz w:val="20"/>
+              </w:rPr>
+              <w:t>0.0548</w:t>
+            </w:r>
+          </w:p>
+        </w:tc>
+        <w:tc>
+          <w:tcPr>
+            <w:tcW w:type="dxa" w:w="1378"/>
+          </w:tcPr>
+          <w:p>
+            <w:r/>
+            <w:r>
+              <w:rPr>
+                <w:sz w:val="20"/>
+              </w:rPr>
+              <w:t>0.1921</w:t>
+            </w:r>
+          </w:p>
+        </w:tc>
+        <w:tc>
+          <w:tcPr>
+            <w:tcW w:type="dxa" w:w="1378"/>
+          </w:tcPr>
+          <w:p>
+            <w:r/>
+            <w:r>
+              <w:rPr>
+                <w:sz w:val="20"/>
+              </w:rPr>
+              <w:t>201.55</w:t>
+            </w:r>
+          </w:p>
+        </w:tc>
+        <w:tc>
+          <w:tcPr>
+            <w:tcW w:type="dxa" w:w="1378"/>
+          </w:tcPr>
+          <w:p>
+            <w:r/>
+            <w:r>
+              <w:rPr>
+                <w:sz w:val="20"/>
+              </w:rPr>
+              <w:t>210.53</w:t>
+            </w:r>
+          </w:p>
+        </w:tc>
+        <w:tc>
+          <w:tcPr>
+            <w:tcW w:type="dxa" w:w="1378"/>
+          </w:tcPr>
+          <w:p>
+            <w:r/>
+            <w:r>
+              <w:rPr>
+                <w:sz w:val="20"/>
+              </w:rPr>
+              <w:t>+4.45%</w:t>
+            </w:r>
+          </w:p>
+        </w:tc>
+      </w:tr>
+      <w:tr>
+        <w:tc>
+          <w:tcPr>
+            <w:tcW w:type="dxa" w:w="1378"/>
+          </w:tcPr>
+          <w:p>
+            <w:r/>
+            <w:r>
+              <w:rPr>
+                <w:sz w:val="20"/>
+              </w:rPr>
+              <w:t>Communication delay</w:t>
+            </w:r>
+          </w:p>
+        </w:tc>
+        <w:tc>
+          <w:tcPr>
+            <w:tcW w:type="dxa" w:w="1378"/>
+          </w:tcPr>
+          <w:p>
+            <w:r/>
+            <w:r>
+              <w:rPr>
+                <w:sz w:val="20"/>
+              </w:rPr>
+              <w:t>none</w:t>
+            </w:r>
+          </w:p>
+        </w:tc>
+        <w:tc>
+          <w:tcPr>
+            <w:tcW w:type="dxa" w:w="1378"/>
+          </w:tcPr>
+          <w:p>
+            <w:r/>
+            <w:r>
+              <w:rPr>
+                <w:sz w:val="20"/>
+              </w:rPr>
+              <w:t>0.0144</w:t>
+            </w:r>
+          </w:p>
+        </w:tc>
+        <w:tc>
+          <w:tcPr>
+            <w:tcW w:type="dxa" w:w="1378"/>
+          </w:tcPr>
+          <w:p>
+            <w:r/>
+            <w:r>
+              <w:rPr>
+                <w:sz w:val="20"/>
+              </w:rPr>
+              <w:t>0.2299</w:t>
+            </w:r>
+          </w:p>
+        </w:tc>
+        <w:tc>
+          <w:tcPr>
+            <w:tcW w:type="dxa" w:w="1378"/>
+          </w:tcPr>
+          <w:p>
+            <w:r/>
+            <w:r>
+              <w:rPr>
+                <w:sz w:val="20"/>
+              </w:rPr>
+              <w:t>190.73</w:t>
+            </w:r>
+          </w:p>
+        </w:tc>
+        <w:tc>
+          <w:tcPr>
+            <w:tcW w:type="dxa" w:w="1378"/>
+          </w:tcPr>
+          <w:p>
+            <w:r/>
+            <w:r>
+              <w:rPr>
+                <w:sz w:val="20"/>
+              </w:rPr>
+              <w:t>191.76</w:t>
+            </w:r>
+          </w:p>
+        </w:tc>
+        <w:tc>
+          <w:tcPr>
+            <w:tcW w:type="dxa" w:w="1378"/>
+          </w:tcPr>
+          <w:p>
+            <w:r/>
+            <w:r>
+              <w:rPr>
+                <w:sz w:val="20"/>
+              </w:rPr>
+              <w:t>+0.54%</w:t>
+            </w:r>
+          </w:p>
+        </w:tc>
+      </w:tr>
+      <w:tr>
+        <w:tc>
+          <w:tcPr>
+            <w:tcW w:type="dxa" w:w="1378"/>
+          </w:tcPr>
+          <w:p>
+            <w:r/>
+            <w:r>
+              <w:rPr>
+                <w:sz w:val="20"/>
+              </w:rPr>
+              <w:t>Communication delay</w:t>
+            </w:r>
+          </w:p>
+        </w:tc>
+        <w:tc>
+          <w:tcPr>
+            <w:tcW w:type="dxa" w:w="1378"/>
+          </w:tcPr>
+          <w:p>
+            <w:r/>
+            <w:r>
+              <w:rPr>
+                <w:sz w:val="20"/>
+              </w:rPr>
+              <w:t>one period</w:t>
+            </w:r>
+          </w:p>
+        </w:tc>
+        <w:tc>
+          <w:tcPr>
+            <w:tcW w:type="dxa" w:w="1378"/>
+          </w:tcPr>
+          <w:p>
+            <w:r/>
+            <w:r>
+              <w:rPr>
+                <w:sz w:val="20"/>
+              </w:rPr>
+              <w:t>31.4772</w:t>
+            </w:r>
+          </w:p>
+        </w:tc>
+        <w:tc>
+          <w:tcPr>
+            <w:tcW w:type="dxa" w:w="1378"/>
+          </w:tcPr>
+          <w:p>
+            <w:r/>
+            <w:r>
+              <w:rPr>
+                <w:sz w:val="20"/>
+              </w:rPr>
+              <w:t>25.6688</w:t>
+            </w:r>
+          </w:p>
+        </w:tc>
+        <w:tc>
+          <w:tcPr>
+            <w:tcW w:type="dxa" w:w="1378"/>
+          </w:tcPr>
+          <w:p>
+            <w:r/>
+            <w:r>
+              <w:rPr>
+                <w:sz w:val="20"/>
+              </w:rPr>
+              <w:t>349.52</w:t>
+            </w:r>
+          </w:p>
+        </w:tc>
+        <w:tc>
+          <w:tcPr>
+            <w:tcW w:type="dxa" w:w="1378"/>
+          </w:tcPr>
+          <w:p>
+            <w:r/>
+            <w:r>
+              <w:rPr>
+                <w:sz w:val="20"/>
+              </w:rPr>
+              <w:t>378.26</w:t>
+            </w:r>
+          </w:p>
+        </w:tc>
+        <w:tc>
+          <w:tcPr>
+            <w:tcW w:type="dxa" w:w="1378"/>
+          </w:tcPr>
+          <w:p>
+            <w:r/>
+            <w:r>
+              <w:rPr>
+                <w:sz w:val="20"/>
+              </w:rPr>
+              <w:t>+8.22%</w:t>
+            </w:r>
+          </w:p>
+        </w:tc>
+      </w:tr>
+      <w:tr>
+        <w:tc>
+          <w:tcPr>
+            <w:tcW w:type="dxa" w:w="1378"/>
+          </w:tcPr>
+          <w:p>
+            <w:r/>
+            <w:r>
+              <w:rPr>
+                <w:sz w:val="20"/>
+              </w:rPr>
+              <w:t>Communication delay</w:t>
+            </w:r>
+          </w:p>
+        </w:tc>
+        <w:tc>
+          <w:tcPr>
+            <w:tcW w:type="dxa" w:w="1378"/>
+          </w:tcPr>
+          <w:p>
+            <w:r/>
+            <w:r>
+              <w:rPr>
+                <w:sz w:val="20"/>
+              </w:rPr>
+              <w:t>three periods</w:t>
+            </w:r>
+          </w:p>
+        </w:tc>
+        <w:tc>
+          <w:tcPr>
+            <w:tcW w:type="dxa" w:w="1378"/>
+          </w:tcPr>
+          <w:p>
+            <w:r/>
+            <w:r>
+              <w:rPr>
+                <w:sz w:val="20"/>
+              </w:rPr>
+              <w:t>43.3592</w:t>
+            </w:r>
+          </w:p>
+        </w:tc>
+        <w:tc>
+          <w:tcPr>
+            <w:tcW w:type="dxa" w:w="1378"/>
+          </w:tcPr>
+          <w:p>
+            <w:r/>
+            <w:r>
+              <w:rPr>
+                <w:sz w:val="20"/>
+              </w:rPr>
+              <w:t>30.3715</w:t>
+            </w:r>
+          </w:p>
+        </w:tc>
+        <w:tc>
+          <w:tcPr>
+            <w:tcW w:type="dxa" w:w="1378"/>
+          </w:tcPr>
+          <w:p>
+            <w:r/>
+            <w:r>
+              <w:rPr>
+                <w:sz w:val="20"/>
+              </w:rPr>
+              <w:t>359.78</w:t>
+            </w:r>
+          </w:p>
+        </w:tc>
+        <w:tc>
+          <w:tcPr>
+            <w:tcW w:type="dxa" w:w="1378"/>
+          </w:tcPr>
+          <w:p>
+            <w:r/>
+            <w:r>
+              <w:rPr>
+                <w:sz w:val="20"/>
+              </w:rPr>
+              <w:t>339.20</w:t>
+            </w:r>
+          </w:p>
+        </w:tc>
+        <w:tc>
+          <w:tcPr>
+            <w:tcW w:type="dxa" w:w="1378"/>
+          </w:tcPr>
+          <w:p>
+            <w:r/>
+            <w:r>
+              <w:rPr>
+                <w:sz w:val="20"/>
+              </w:rPr>
+              <w:t>-5.72%</w:t>
+            </w:r>
+          </w:p>
+        </w:tc>
+      </w:tr>
+      <w:tr>
+        <w:tc>
+          <w:tcPr>
+            <w:tcW w:type="dxa" w:w="1378"/>
+          </w:tcPr>
+          <w:p>
+            <w:r/>
+            <w:r>
+              <w:rPr>
+                <w:sz w:val="20"/>
+              </w:rPr>
+              <w:t>Driver aggression</w:t>
+            </w:r>
+          </w:p>
+        </w:tc>
+        <w:tc>
+          <w:tcPr>
+            <w:tcW w:type="dxa" w:w="1378"/>
+          </w:tcPr>
+          <w:p>
+            <w:r/>
+            <w:r>
+              <w:rPr>
+                <w:sz w:val="20"/>
+              </w:rPr>
+              <w:t>normal</w:t>
+            </w:r>
+          </w:p>
+        </w:tc>
+        <w:tc>
+          <w:tcPr>
+            <w:tcW w:type="dxa" w:w="1378"/>
+          </w:tcPr>
+          <w:p>
+            <w:r/>
+            <w:r>
+              <w:rPr>
+                <w:sz w:val="20"/>
+              </w:rPr>
+              <w:t>0.0276</w:t>
+            </w:r>
+          </w:p>
+        </w:tc>
+        <w:tc>
+          <w:tcPr>
+            <w:tcW w:type="dxa" w:w="1378"/>
+          </w:tcPr>
+          <w:p>
+            <w:r/>
+            <w:r>
+              <w:rPr>
+                <w:sz w:val="20"/>
+              </w:rPr>
+              <w:t>0.2281</w:t>
+            </w:r>
+          </w:p>
+        </w:tc>
+        <w:tc>
+          <w:tcPr>
+            <w:tcW w:type="dxa" w:w="1378"/>
+          </w:tcPr>
+          <w:p>
+            <w:r/>
+            <w:r>
+              <w:rPr>
+                <w:sz w:val="20"/>
+              </w:rPr>
+              <w:t>190.99</w:t>
+            </w:r>
+          </w:p>
+        </w:tc>
+        <w:tc>
+          <w:tcPr>
+            <w:tcW w:type="dxa" w:w="1378"/>
+          </w:tcPr>
+          <w:p>
+            <w:r/>
+            <w:r>
+              <w:rPr>
+                <w:sz w:val="20"/>
+              </w:rPr>
+              <w:t>191.98</w:t>
+            </w:r>
+          </w:p>
+        </w:tc>
+        <w:tc>
+          <w:tcPr>
+            <w:tcW w:type="dxa" w:w="1378"/>
+          </w:tcPr>
+          <w:p>
+            <w:r/>
+            <w:r>
+              <w:rPr>
+                <w:sz w:val="20"/>
+              </w:rPr>
+              <w:t>+0.52%</w:t>
+            </w:r>
+          </w:p>
+        </w:tc>
+      </w:tr>
+      <w:tr>
+        <w:tc>
+          <w:tcPr>
+            <w:tcW w:type="dxa" w:w="1378"/>
+          </w:tcPr>
+          <w:p>
+            <w:r/>
+            <w:r>
+              <w:rPr>
+                <w:sz w:val="20"/>
+              </w:rPr>
+              <w:t>Driver aggression</w:t>
+            </w:r>
+          </w:p>
+        </w:tc>
+        <w:tc>
+          <w:tcPr>
+            <w:tcW w:type="dxa" w:w="1378"/>
+          </w:tcPr>
+          <w:p>
+            <w:r/>
+            <w:r>
+              <w:rPr>
+                <w:sz w:val="20"/>
+              </w:rPr>
+              <w:t>brisk</w:t>
+            </w:r>
+          </w:p>
+        </w:tc>
+        <w:tc>
+          <w:tcPr>
+            <w:tcW w:type="dxa" w:w="1378"/>
+          </w:tcPr>
+          <w:p>
+            <w:r/>
+            <w:r>
+              <w:rPr>
+                <w:sz w:val="20"/>
+              </w:rPr>
+              <w:t>0.0450</w:t>
+            </w:r>
+          </w:p>
+        </w:tc>
+        <w:tc>
+          <w:tcPr>
+            <w:tcW w:type="dxa" w:w="1378"/>
+          </w:tcPr>
+          <w:p>
+            <w:r/>
+            <w:r>
+              <w:rPr>
+                <w:sz w:val="20"/>
+              </w:rPr>
+              <w:t>0.3306</w:t>
+            </w:r>
+          </w:p>
+        </w:tc>
+        <w:tc>
+          <w:tcPr>
+            <w:tcW w:type="dxa" w:w="1378"/>
+          </w:tcPr>
+          <w:p>
+            <w:r/>
+            <w:r>
+              <w:rPr>
+                <w:sz w:val="20"/>
+              </w:rPr>
+              <w:t>197.16</w:t>
+            </w:r>
+          </w:p>
+        </w:tc>
+        <w:tc>
+          <w:tcPr>
+            <w:tcW w:type="dxa" w:w="1378"/>
+          </w:tcPr>
+          <w:p>
+            <w:r/>
+            <w:r>
+              <w:rPr>
+                <w:sz w:val="20"/>
+              </w:rPr>
+              <w:t>197.38</w:t>
+            </w:r>
+          </w:p>
+        </w:tc>
+        <w:tc>
+          <w:tcPr>
+            <w:tcW w:type="dxa" w:w="1378"/>
+          </w:tcPr>
+          <w:p>
+            <w:r/>
+            <w:r>
+              <w:rPr>
+                <w:sz w:val="20"/>
+              </w:rPr>
+              <w:t>+0.11%</w:t>
+            </w:r>
+          </w:p>
+        </w:tc>
+      </w:tr>
+      <w:tr>
+        <w:tc>
+          <w:tcPr>
+            <w:tcW w:type="dxa" w:w="1378"/>
+          </w:tcPr>
+          <w:p>
+            <w:r/>
+            <w:r>
+              <w:rPr>
+                <w:sz w:val="20"/>
+              </w:rPr>
+              <w:t>Driver aggression</w:t>
+            </w:r>
+          </w:p>
+        </w:tc>
+        <w:tc>
+          <w:tcPr>
+            <w:tcW w:type="dxa" w:w="1378"/>
+          </w:tcPr>
+          <w:p>
+            <w:r/>
+            <w:r>
+              <w:rPr>
+                <w:sz w:val="20"/>
+              </w:rPr>
+              <w:t>aggressive</w:t>
+            </w:r>
+          </w:p>
+        </w:tc>
+        <w:tc>
+          <w:tcPr>
+            <w:tcW w:type="dxa" w:w="1378"/>
+          </w:tcPr>
+          <w:p>
+            <w:r/>
+            <w:r>
+              <w:rPr>
+                <w:sz w:val="20"/>
+              </w:rPr>
+              <w:t>0.0981</w:t>
+            </w:r>
+          </w:p>
+        </w:tc>
+        <w:tc>
+          <w:tcPr>
+            <w:tcW w:type="dxa" w:w="1378"/>
+          </w:tcPr>
+          <w:p>
+            <w:r/>
+            <w:r>
+              <w:rPr>
+                <w:sz w:val="20"/>
+              </w:rPr>
+              <w:t>0.5042</w:t>
+            </w:r>
+          </w:p>
+        </w:tc>
+        <w:tc>
+          <w:tcPr>
+            <w:tcW w:type="dxa" w:w="1378"/>
+          </w:tcPr>
+          <w:p>
+            <w:r/>
+            <w:r>
+              <w:rPr>
+                <w:sz w:val="20"/>
+              </w:rPr>
+              <w:t>204.46</w:t>
+            </w:r>
+          </w:p>
+        </w:tc>
+        <w:tc>
+          <w:tcPr>
+            <w:tcW w:type="dxa" w:w="1378"/>
+          </w:tcPr>
+          <w:p>
+            <w:r/>
+            <w:r>
+              <w:rPr>
+                <w:sz w:val="20"/>
+              </w:rPr>
+              <w:t>204.75</w:t>
+            </w:r>
+          </w:p>
+        </w:tc>
+        <w:tc>
+          <w:tcPr>
+            <w:tcW w:type="dxa" w:w="1378"/>
+          </w:tcPr>
+          <w:p>
+            <w:r/>
+            <w:r>
+              <w:rPr>
+                <w:sz w:val="20"/>
+              </w:rPr>
+              <w:t>+0.14%</w:t>
+            </w:r>
+          </w:p>
+        </w:tc>
+      </w:tr>
+    </w:tbl>
+    <w:p>
+      <w:pPr>
+        <w:spacing w:after="40"/>
+      </w:pPr>
+    </w:p>
+    <w:p>
+      <w:pPr>
+        <w:spacing w:after="160"/>
+      </w:pPr>
+      <w:r>
+        <w:rPr>
+          <w:i/>
+          <w:color w:val="595959"/>
+          <w:sz w:val="18"/>
+        </w:rPr>
+        <w:t>Table. 36 runs on the board against the corrected vehicle model, one per cell. 2,282,832 control steps, 0 of them late. MEASURED on the board.</w:t>
+      </w:r>
+    </w:p>
+    <w:p>
+      <w:pPr>
+        <w:spacing w:after="160"/>
+      </w:pPr>
+      <w:r>
+        <w:rPr>
+          <w:i w:val="0"/>
+          <w:sz w:val="24"/>
+        </w:rPr>
+        <w:t>In the 16 settings where both controllers followed the cycle to within one metre per second, the learned controller used less energy in 1.</w:t>
+      </w:r>
+    </w:p>
+    <w:p>
+      <w:pPr>
+        <w:spacing w:after="160"/>
+      </w:pPr>
+      <w:r>
+        <w:rPr>
+          <w:i w:val="0"/>
+          <w:sz w:val="24"/>
+        </w:rPr>
+        <w:t>The mean paired energy difference across valid settings is +0.935%, learned against rules. Each setting has one run per controller; the settings are not repeated samples of one condition.</w:t>
+      </w:r>
+    </w:p>
+    <w:p>
+      <w:pPr>
+        <w:spacing w:after="160"/>
+      </w:pPr>
+      <w:r>
+        <w:rPr>
+          <w:i w:val="0"/>
+          <w:sz w:val="24"/>
+        </w:rPr>
+        <w:t>Excluded from energy aggregates: 2 settings where one controller's tracking RMSE reaches one metre per second. The serialized link-delay axis measures host throughput rather than independent link latency; its rows remain visible.</w:t>
+      </w:r>
+    </w:p>
+    <w:p>
+      <w:pPr>
+        <w:jc w:val="center"/>
+      </w:pPr>
+      <w:r>
+        <w:drawing>
+          <wp:inline xmlns:a="http://schemas.openxmlformats.org/drawingml/2006/main" xmlns:pic="http://schemas.openxmlformats.org/drawingml/2006/picture">
+            <wp:extent cx="5852160" cy="3688247"/>
+            <wp:docPr id="20" name="Picture 20"/>
+            <wp:cNvGraphicFramePr>
+              <a:graphicFrameLocks noChangeAspect="1"/>
+            </wp:cNvGraphicFramePr>
+            <a:graphic>
+              <a:graphicData uri="http://schemas.openxmlformats.org/drawingml/2006/picture">
+                <pic:pic>
+                  <pic:nvPicPr>
+                    <pic:cNvPr id="0" name="pil-energy-corrected.png"/>
+                    <pic:cNvPicPr/>
+                  </pic:nvPicPr>
+                  <pic:blipFill>
+                    <a:blip r:embed="rId28"/>
+                    <a:stretch>
+                      <a:fillRect/>
+                    </a:stretch>
+                  </pic:blipFill>
+                  <pic:spPr>
+                    <a:xfrm>
+                      <a:off x="0" y="0"/>
+                      <a:ext cx="5852160" cy="3688247"/>
+                    </a:xfrm>
+                    <a:prstGeom prst="rect"/>
+                  </pic:spPr>
+                </pic:pic>
+              </a:graphicData>
+            </a:graphic>
+          </wp:inline>
+        </w:drawing>
+      </w:r>
+    </w:p>
+    <w:p>
+      <w:pPr>
+        <w:spacing w:after="240"/>
+        <w:jc w:val="center"/>
+      </w:pPr>
+      <w:r>
+        <w:rPr>
+          <w:i/>
+          <w:color w:val="595959"/>
+          <w:sz w:val="18"/>
+        </w:rPr>
+        <w:t>Figure 20. Corrected-model campaign: comparable energy beside tracking error. MEASURED on the board, one run per cell.</w:t>
+      </w:r>
+    </w:p>
+    <w:p>
+      <w:pPr>
+        <w:pStyle w:val="Heading1"/>
+      </w:pPr>
+      <w:r>
+        <w:t>29. Results that went against expectation</w:t>
+      </w:r>
+    </w:p>
+    <w:p>
+      <w:pPr>
+        <w:spacing w:after="160"/>
+      </w:pPr>
+      <w:r>
+        <w:rPr>
+          <w:i w:val="0"/>
+          <w:sz w:val="24"/>
+        </w:rPr>
+        <w:t>Each one is reported because each one changes what the paper may claim, and a supervisor reading the work will find them more convincing than the successes.</w:t>
+      </w:r>
+    </w:p>
+    <w:p>
+      <w:pPr>
+        <w:pStyle w:val="Heading2"/>
+      </w:pPr>
+      <w:r>
+        <w:t>The learned controller loses to two thresholds</w:t>
+      </w:r>
+    </w:p>
+    <w:p>
+      <w:pPr>
+        <w:spacing w:after="160"/>
+      </w:pPr>
+      <w:r>
+        <w:rPr>
+          <w:i w:val="0"/>
+          <w:sz w:val="24"/>
+        </w:rPr>
+        <w:t>Five independent training runs, and every one of them finishes worse than a controller that is two thresholds and a taper, once the cabin heating they switched off is charged back. The offline optimum predicted it and the training measured it, and the two do not depend on each other. Section 21.</w:t>
+      </w:r>
+    </w:p>
+    <w:p>
+      <w:pPr>
+        <w:pStyle w:val="Heading2"/>
+      </w:pPr>
+      <w:r>
+        <w:t>The forecast makes no difference to the controller</w:t>
+      </w:r>
+    </w:p>
+    <w:p>
+      <w:pPr>
+        <w:spacing w:after="160"/>
+      </w:pPr>
+      <w:r>
+        <w:rPr>
+          <w:i w:val="0"/>
+          <w:sz w:val="24"/>
+        </w:rPr>
+        <w:t>Removing it changes the result by an amount whose confidence interval contains zero, and whose sign is not consistent across the five runs. This was accepted as publishable in the design document before it was run, and week 7 gave it a reason rather than leaving it a possibility.</w:t>
+      </w:r>
+    </w:p>
+    <w:p>
+      <w:pPr>
+        <w:pStyle w:val="Heading2"/>
+      </w:pPr>
+      <w:r>
+        <w:t>A parity test was passing without testing anything</w:t>
+      </w:r>
+    </w:p>
+    <w:p>
+      <w:pPr>
+        <w:spacing w:after="160"/>
+      </w:pPr>
+      <w:r>
+        <w:rPr>
+          <w:i w:val="0"/>
+          <w:sz w:val="24"/>
+        </w:rPr>
+        <w:t>The test that compares the controller written in C against the same controller in Python was, for a while, compiling one set of weights and comparing them against another network's expected answers. The cause is a C rule: an include written with quotes is resolved against the including file's own directory before any search path, so the file under test kept finding the deployed weights whatever the test asked for. It passed honestly for exactly as long as nothing had been deployed. Two fixes: the include now searches the path only, and the weights carry a checksum that the inference code itself reports, because two policies of the same shape are indistinguishable without one.</w:t>
+      </w:r>
+    </w:p>
+    <w:p>
+      <w:pPr>
+        <w:pStyle w:val="Heading2"/>
+      </w:pPr>
+      <w:r>
+        <w:t>A model 27 times bigger is not better</w:t>
+      </w:r>
+    </w:p>
+    <w:p>
+      <w:pPr>
+        <w:spacing w:after="160"/>
+      </w:pPr>
+      <w:r>
+        <w:rPr>
+          <w:i w:val="0"/>
+          <w:sz w:val="24"/>
+        </w:rPr>
+        <w:t>The last piece of the 8-bit experiment trained a deliberately oversized model to teach the small one. The teaching changed nothing measurable, and the reason is that the big model was not better than the small one to begin with: 27 times the parameters, and slightly worse. Every model tried falls within 0.89% of the others, which is less than what converting to 8-bit costs. Section 14.</w:t>
+      </w:r>
+    </w:p>
+    <w:p>
+      <w:pPr>
+        <w:pStyle w:val="Heading2"/>
+      </w:pPr>
+      <w:r>
+        <w:t>The energy-management problem has almost no room in it</w:t>
+      </w:r>
+    </w:p>
+    <w:p>
+      <w:pPr>
+        <w:spacing w:after="160"/>
+      </w:pPr>
+      <w:r>
+        <w:rPr>
+          <w:i w:val="0"/>
+          <w:sz w:val="24"/>
+        </w:rPr>
+        <w:t>The theoretically optimal strategy is a constant instruction, and two thresholds get within a sixth of a percent of it. This is the largest of these findings and it is the subject of section 16, including the three routes open and the fact that choosing between them is the supervisor's decision rather than one taken here.</w:t>
+      </w:r>
+    </w:p>
+    <w:p>
+      <w:pPr>
+        <w:pStyle w:val="Heading2"/>
+      </w:pPr>
+      <w:r>
+        <w:t>The fitted rolling resistance is not a rolling resistance</w:t>
+      </w:r>
+    </w:p>
+    <w:p>
+      <w:pPr>
+        <w:spacing w:after="160"/>
+      </w:pPr>
+      <w:r>
+        <w:rPr>
+          <w:i w:val="0"/>
+          <w:sz w:val="24"/>
+        </w:rPr>
+        <w:t>It is 2.2 times larger than an independent measurement on a comparable car. It is a lumped loss term named after the physics it stands in for rather than the physics it contains. The parameter file now says so and an automated test fails if that statement is removed.</w:t>
+      </w:r>
+    </w:p>
+    <w:p>
+      <w:pPr>
+        <w:pStyle w:val="Heading2"/>
+      </w:pPr>
+      <w:r>
+        <w:t>Gate G4 was already passed before the models existed</w:t>
+      </w:r>
+    </w:p>
+    <w:p>
+      <w:pPr>
+        <w:spacing w:after="160"/>
+      </w:pPr>
+      <w:r>
+        <w:rPr>
+          <w:i w:val="0"/>
+          <w:sz w:val="24"/>
+        </w:rPr>
+        <w:t>A linear regression beat the naive baseline by 14.5% against a required 10%. The gate as written could not distinguish a Transformer from a matrix calculation, so every model is now reported against the regression too.</w:t>
+      </w:r>
+    </w:p>
+    <w:p>
+      <w:pPr>
+        <w:pStyle w:val="Heading2"/>
+      </w:pPr>
+      <w:r>
+        <w:t>Physics-informing does not improve accuracy</w:t>
+      </w:r>
+    </w:p>
+    <w:p>
+      <w:pPr>
+        <w:spacing w:after="160"/>
+      </w:pPr>
+      <w:r>
+        <w:rPr>
+          <w:i w:val="0"/>
+          <w:sz w:val="24"/>
+        </w:rPr>
+        <w:t>Five watts of difference on eleven kilowatts at matched parameter count. It improves physical consistency by a factor of ten instead, which is a different and still useful claim.</w:t>
+      </w:r>
+    </w:p>
+    <w:p>
+      <w:pPr>
+        <w:pStyle w:val="Heading2"/>
+      </w:pPr>
+      <w:r>
+        <w:t>The compute estimate was 64% too optimistic</w:t>
+      </w:r>
+    </w:p>
+    <w:p>
+      <w:pPr>
+        <w:spacing w:after="160"/>
+      </w:pPr>
+      <w:r>
+        <w:rPr>
+          <w:i w:val="0"/>
+          <w:sz w:val="24"/>
+        </w:rPr>
+        <w:t>Dividing a multiply count by a measured multiply rate gave 22.28 milliseconds for the Transformer. Timing the real graph on the chip gave 36.46. The LSTM is worse: 19.84 estimated against 35.07 measured. Both still fit inside the 40 milliseconds allowed, and the estimates remain useful for ranking models against each other, but they cannot be quoted as latencies now that measurements exist.</w:t>
+      </w:r>
+    </w:p>
+    <w:p>
+      <w:pPr>
+        <w:pStyle w:val="Heading2"/>
+      </w:pPr>
+      <w:r>
+        <w:t>Charge conservation cannot be tested at this horizon</w:t>
+      </w:r>
+    </w:p>
+    <w:p>
+      <w:pPr>
+        <w:spacing w:after="160"/>
+      </w:pPr>
+      <w:r>
+        <w:rPr>
+          <w:i w:val="0"/>
+          <w:sz w:val="24"/>
+        </w:rPr>
+        <w:t>The recorded charge channel does not move within a typical three-second window, so the equation has nothing to constrain. Enforcing it costs 4.4% accuracy and buys almost nothing. This was measured rather than argued.</w:t>
+      </w:r>
+    </w:p>
+    <w:p>
+      <w:pPr>
+        <w:pStyle w:val="Heading1"/>
+      </w:pPr>
+      <w:r>
+        <w:t>30. What changed from the original plan</w:t>
+      </w:r>
+    </w:p>
+    <w:p>
+      <w:pPr>
+        <w:spacing w:after="160"/>
+      </w:pPr>
+      <w:r>
+        <w:rPr>
+          <w:i w:val="0"/>
+          <w:sz w:val="24"/>
+        </w:rPr>
+        <w:t>Twenty-two changes, in two classes, and the distinction matters. Eleven were agreed in the design document before any code was written. Eleven more happened during the eight weeks, each one forced by something that had been measured.</w:t>
+      </w:r>
+    </w:p>
+    <w:p>
+      <w:pPr>
+        <w:pStyle w:val="Heading2"/>
+      </w:pPr>
+      <w:r>
+        <w:t>Agreed before implementation</w:t>
+      </w:r>
+    </w:p>
+    <w:p>
+      <w:pPr>
+        <w:spacing w:after="160"/>
+      </w:pPr>
+      <w:r>
+        <w:rPr>
+          <w:i w:val="0"/>
+          <w:sz w:val="24"/>
+        </w:rPr>
+        <w:t>It is Processor-in-the-Loop, not Hardware-in-the-Loop. The original used HIL throughout. HIL means real electrical hardware in the loop, with motors, power electronics and sensors. There is none of that here, only a processor. Reviewers in embedded and control venues spot a misused HIL immediately, and the correct term costs nothing.</w:t>
+      </w:r>
+    </w:p>
+    <w:p>
+      <w:pPr>
+        <w:spacing w:after="160"/>
+      </w:pPr>
+      <w:r>
+        <w:rPr>
+          <w:i w:val="0"/>
+          <w:sz w:val="24"/>
+        </w:rPr>
+        <w:t>The embedded work moved from last to first, which is the largest single change. The original schedules the ESP32 for weeks 10 and 11, after all the modelling is finished. That is the one arrangement in which a failure has no recovery: if the model does not fit in week 10, there is no time left to build a smaller one. The compute-feasibility question is now gate G1 in week 1, and the plan already names the fallback. This inversion is why the project knew in week 4, rather than week 10, that XGBoost was never deployable.</w:t>
+      </w:r>
+    </w:p>
+    <w:p>
+      <w:pPr>
+        <w:spacing w:after="160"/>
+      </w:pPr>
+      <w:r>
+        <w:rPr>
+          <w:i w:val="0"/>
+          <w:sz w:val="24"/>
+        </w:rPr>
+        <w:t>Real logged trips replaced a physics-generated dataset. The original creates the training data by pushing drive cycles through the physics model, which makes the thing being predicted a closed-form function of the very inputs used to predict it. The model then appears to do brilliantly while having learned nothing about a real car. The predecessor work has exactly this defect. This project trains on 72 real logged trips at 10 Hz instead.</w:t>
+      </w:r>
+    </w:p>
+    <w:p>
+      <w:pPr>
+        <w:spacing w:after="160"/>
+      </w:pPr>
+      <w:r>
+        <w:rPr>
+          <w:i w:val="0"/>
+          <w:sz w:val="24"/>
+        </w:rPr>
+        <w:t>Data is split by trip and never by row. The predecessor split 2,000 rows at random, and because consecutive rows come from the same drive a fraction of a second apart, near-identical samples landed on both sides. The model was effectively tested on data it had trained on, which inflates every score. Here no sample from a trip ever appears on both sides, and the calibration data used for 8-bit quantisation is drawn from training trips only, which is a subtler version of the same leak.</w:t>
+      </w:r>
+    </w:p>
+    <w:p>
+      <w:pPr>
+        <w:spacing w:after="160"/>
+      </w:pPr>
+      <w:r>
+        <w:rPr>
+          <w:i w:val="0"/>
+          <w:sz w:val="24"/>
+        </w:rPr>
+        <w:t>The communication task runs at 10 ms rather than 50. This was arithmetic rather than judgement: the original specifies a 10 ms control loop and a 50 ms communication task, and a loop cannot close five times faster than the messages it depends on arrive.</w:t>
+      </w:r>
+    </w:p>
+    <w:p>
+      <w:pPr>
+        <w:spacing w:after="160"/>
+      </w:pPr>
+      <w:r>
+        <w:rPr>
+          <w:i w:val="0"/>
+          <w:sz w:val="24"/>
+        </w:rPr>
+        <w:t>Budget first, then model. The model size is not chosen and then checked, it is derived from what gate G1 measured. The Transformer is 32 sequence steps, 32 units wide and 2 layers deep because that is what fits in 40 milliseconds on this chip.</w:t>
+      </w:r>
+    </w:p>
+    <w:p>
+      <w:pPr>
+        <w:spacing w:after="160"/>
+      </w:pPr>
+      <w:r>
+        <w:rPr>
+          <w:i w:val="0"/>
+          <w:sz w:val="24"/>
+        </w:rPr>
+        <w:t>The model comparison was rebuilt. Linear regression, random forest and XGBoost became a mandatory naive baseline, one strong tabular model, an LSTM fed genuinely sequential data, and a Transformer, each in plain and physics-informed versions at matched size. Re-running the LSTM correctly is deliberate: the predecessor flattened its data first, which removes the time ordering the architecture exists to exploit, and then reported that recurrent models underperform.</w:t>
+      </w:r>
+    </w:p>
+    <w:p>
+      <w:pPr>
+        <w:spacing w:after="160"/>
+      </w:pPr>
+      <w:r>
+        <w:rPr>
+          <w:i w:val="0"/>
+          <w:sz w:val="24"/>
+        </w:rPr>
+        <w:t>Gates, ablations and explicit non-claims are entirely new. Five gates each with a written action on failure; four numbered ablations; a metrics table with actual metrics where the original listed headings and left them empty; and a list of things this work will explicitly not claim. Stating the non-claims in advance is what allows two null results to be reported as findings rather than as embarrassments.</w:t>
+      </w:r>
+    </w:p>
+    <w:p>
+      <w:pPr>
+        <w:spacing w:after="160"/>
+      </w:pPr>
+      <w:r>
+        <w:rPr>
+          <w:i w:val="0"/>
+          <w:sz w:val="24"/>
+        </w:rPr>
+        <w:t>Thirteen scenario variations became six axes, keeping full robustness coverage at roughly half the runs.</w:t>
+      </w:r>
+    </w:p>
+    <w:p>
+      <w:pPr>
+        <w:spacing w:after="160"/>
+      </w:pPr>
+      <w:r>
+        <w:rPr>
+          <w:i w:val="0"/>
+          <w:sz w:val="24"/>
+        </w:rPr>
+        <w:t>The ESP32-S3 is the primary platform rather than the C6. Two processor cores matter enormously here, because the hard real-time loop is pinned to core 0 where inference on core 1 cannot disturb it. The single-core C6 cannot make that separation at all.</w:t>
+      </w:r>
+    </w:p>
+    <w:p>
+      <w:pPr>
+        <w:spacing w:after="160"/>
+      </w:pPr>
+      <w:r>
+        <w:rPr>
+          <w:i w:val="0"/>
+          <w:sz w:val="24"/>
+        </w:rPr>
+        <w:t>A second, independent dataset was added, held purely as an out-of-distribution check. Building and testing on one car answers whether the model fits; the question a reviewer actually asks is whether it transfers, and nothing in the original plan could have answered it.</w:t>
+      </w:r>
+    </w:p>
+    <w:p>
+      <w:pPr>
+        <w:pStyle w:val="Heading2"/>
+      </w:pPr>
+      <w:r>
+        <w:t>Changed in flight, because something was measured</w:t>
+      </w:r>
+    </w:p>
+    <w:p>
+      <w:pPr>
+        <w:spacing w:after="160"/>
+      </w:pPr>
+      <w:r>
+        <w:rPr>
+          <w:i w:val="0"/>
+          <w:sz w:val="24"/>
+        </w:rPr>
+        <w:t>These are the ones to be most transparent about, because each represents the plan meeting reality. In every case the measurement came first and the change followed.</w:t>
+      </w:r>
+    </w:p>
+    <w:p>
+      <w:pPr>
+        <w:spacing w:after="160"/>
+      </w:pPr>
+      <w:r>
+        <w:rPr>
+          <w:i w:val="0"/>
+          <w:sz w:val="24"/>
+        </w:rPr>
+        <w:t>Gate G2 was split into three parts instead of one pooled number, and this was the one revision the design document permits. Neither threshold was loosened; what changed is which part of the model each threshold is applied to. Applied literally the original criterion failed all seven trips at a median error of 23.7 percent, because that single number pooled three independent models and could not say which was wrong. Driving the plant with the archive's own logged torque drops the error to a median of 7.0 percent, inside the original bound on every trip. The revision is now spent and nothing else may be adjusted without the same treatment.</w:t>
+      </w:r>
+    </w:p>
+    <w:p>
+      <w:pPr>
+        <w:spacing w:after="160"/>
+      </w:pPr>
+      <w:r>
+        <w:rPr>
+          <w:i w:val="0"/>
+          <w:sz w:val="24"/>
+        </w:rPr>
+        <w:t>The control loop became pipelined rather than synchronous. Originally the chip sent a request and then waited for the reply inside the same 10 millisecond slot, tying its deadline to the scheduling behaviour of a general-purpose laptop. It now requests the next state and acts on the most recent one it holds, so it no longer waits for the laptop inside its own time slot. This is a genuine trade rather than a free win, because the controller now acts on information one cycle old, and that cost is measured and reported.</w:t>
+      </w:r>
+    </w:p>
+    <w:p>
+      <w:pPr>
+        <w:spacing w:after="160"/>
+      </w:pPr>
+      <w:r>
+        <w:rPr>
+          <w:i w:val="0"/>
+          <w:sz w:val="24"/>
+        </w:rPr>
+        <w:t>The link runs over the chip's built-in USB rather than a separate adapter. The design deliberately left this open for gate G3 to settle on measured evidence, and the built-in peripheral carries the loop with zero corrupted and zero lost messages.</w:t>
+      </w:r>
+    </w:p>
+    <w:p>
+      <w:pPr>
+        <w:spacing w:after="160"/>
+      </w:pPr>
+      <w:r>
+        <w:rPr>
+          <w:i w:val="0"/>
+          <w:sz w:val="24"/>
+        </w:rPr>
+        <w:t>Three identified parameters were relabelled as lumped losses. The fitted rolling-resistance coefficient came out 2.2 times larger than an independent measurement on a comparable car, so it is not a tyre property. It is a coefficient occupying that place in the equation and absorbing every speed-dependent loss the model does not represent separately. The parameter file says so, and an automated test fails if that statement is removed.</w:t>
+      </w:r>
+    </w:p>
+    <w:p>
+      <w:pPr>
+        <w:spacing w:after="160"/>
+      </w:pPr>
+      <w:r>
+        <w:rPr>
+          <w:i w:val="0"/>
+          <w:sz w:val="24"/>
+        </w:rPr>
+        <w:t>One of the three physics constraints was switched off. Charge conservation has nothing to constrain over a three-second window, because the logged charge channel does not measurably move within one. Its weight is held at zero and the cost of switching it on is reported as its own arm rather than quietly omitted.</w:t>
+      </w:r>
+    </w:p>
+    <w:p>
+      <w:pPr>
+        <w:spacing w:after="160"/>
+      </w:pPr>
+      <w:r>
+        <w:rPr>
+          <w:i w:val="0"/>
+          <w:sz w:val="24"/>
+        </w:rPr>
+        <w:t>The message format grew to carry a real controller. The state message went from 8 numbers to 10 so that the laptop can send the target speed and its rate of change, the command message from 3 to 4, and the diagnostics message from 11 counters to 16. Gate G3 was then re-measured in full, because the loop the report describes has to be the loop that was measured.</w:t>
+      </w:r>
+    </w:p>
+    <w:p>
+      <w:pPr>
+        <w:spacing w:after="160"/>
+      </w:pPr>
+      <w:r>
+        <w:rPr>
+          <w:i w:val="0"/>
+          <w:sz w:val="24"/>
+        </w:rPr>
+        <w:t>The offline optimiser searches two dimensions rather than three. This is not a simplification for speed. With the speed trajectory fixed by the tracking constraint, the battery power limit can only ever remove power the speed controller needs, which the constraint forbids. It is a safety limiter and not an optimisation lever, and that applies to the learned controller in exactly the same way.</w:t>
+      </w:r>
+    </w:p>
+    <w:p>
+      <w:pPr>
+        <w:spacing w:after="160"/>
+      </w:pPr>
+      <w:r>
+        <w:rPr>
+          <w:i w:val="0"/>
+          <w:sz w:val="24"/>
+        </w:rPr>
+        <w:t>Controllers are now ranked with shed cabin heat charged back. Raw consumption is not comparable between controllers, because one that turns the heating down looks excellent without having managed any energy. Without this correction the week 8 table reads as the learned controller saving 1.3 percent; with it, the same controller is 0.66 percent worse, and the entire difference was 48 to 50 watt-hours of cabin heat per cycle.</w:t>
+      </w:r>
+    </w:p>
+    <w:p>
+      <w:pPr>
+        <w:spacing w:after="160"/>
+      </w:pPr>
+      <w:r>
+        <w:rPr>
+          <w:i w:val="0"/>
+          <w:sz w:val="24"/>
+        </w:rPr>
+        <w:t>The learned controller is 64 units wide rather than the library default of 256. The default would be 68,867 numbers and 269 kilobytes, which is 90 percent of the entire memory budget the forecaster also has to fit inside. At 64 wide it is 4,931 numbers and 19.3 kilobytes, and both figures were measured in a pilot run before the main campaign.</w:t>
+      </w:r>
+    </w:p>
+    <w:p>
+      <w:pPr>
+        <w:spacing w:after="160"/>
+      </w:pPr>
+      <w:r>
+        <w:rPr>
+          <w:i w:val="0"/>
+          <w:sz w:val="24"/>
+        </w:rPr>
+        <w:t>XGBoost and the LSTM ensemble were dropped as deployable options. XGBoost needs roughly 3.7 megabytes against a 300 kilobyte budget, over twelve times too large. The best-looking accuracy figure in the whole comparison was a five-model LSTM ensemble, which takes 99 milliseconds against a 40 millisecond budget. Both remain offline reference points, and the reported number is now always distinguished from the deployable one.</w:t>
+      </w:r>
+    </w:p>
+    <w:p>
+      <w:pPr>
+        <w:spacing w:after="160"/>
+      </w:pPr>
+      <w:r>
+        <w:rPr>
+          <w:i w:val="0"/>
+          <w:sz w:val="24"/>
+        </w:rPr>
+        <w:t>The watchdog was switched on and a fallback path built. Three different failures now get three different responses and three separate counters rather than one generic fault state, because collapsing them is how a controller ends up limping owing to a slow logging task. All three were then triggered deliberately on the board, plus a fourth test that hung the control task on purpose to confirm the watchdog resets the chip. A fallback path that has never been taken is a claim, not a result.</w:t>
+      </w:r>
+    </w:p>
+    <w:p>
+      <w:pPr>
+        <w:pStyle w:val="Heading1"/>
+      </w:pPr>
+      <w:r>
+        <w:t>31. What is left to do</w:t>
+      </w:r>
+    </w:p>
+    <w:p>
+      <w:pPr>
+        <w:spacing w:after="160"/>
+      </w:pPr>
+      <w:r>
+        <w:rPr>
+          <w:i w:val="0"/>
+          <w:sz w:val="24"/>
+        </w:rPr>
+        <w:t>Corrected-model campaign: complete. Corrected-model link-outage sweep: complete. The proposed speed-loop decision transformer was dropped. The classical filter and detector remain on the separate feature/decision-model branch, with simulation evidence only. B5 and B6 still need a C port and parity checks before board testing. Merging that branch and measuring it on the board requires a separate decision.</w:t>
       </w:r>
     </w:p>
     <w:p>
@@ -21367,559 +25357,7 @@
           <w:color w:val="595959"/>
           <w:sz w:val="24"/>
         </w:rPr>
-        <w:t>The campaign was being re-run on the board against the corrected model when this report was generated.</w:t>
-      </w:r>
-    </w:p>
-    <w:p>
-      <w:pPr>
-        <w:pStyle w:val="Heading1"/>
-      </w:pPr>
-      <w:r>
-        <w:t>29. Results that went against expectation</w:t>
-      </w:r>
-    </w:p>
-    <w:p>
-      <w:pPr>
-        <w:spacing w:after="160"/>
-      </w:pPr>
-      <w:r>
-        <w:rPr>
-          <w:i w:val="0"/>
-          <w:sz w:val="24"/>
-        </w:rPr>
-        <w:t>Each one is reported because each one changes what the paper may claim, and a supervisor reading the work will find them more convincing than the successes.</w:t>
-      </w:r>
-    </w:p>
-    <w:p>
-      <w:pPr>
-        <w:pStyle w:val="Heading2"/>
-      </w:pPr>
-      <w:r>
-        <w:t>The learned controller loses to two thresholds</w:t>
-      </w:r>
-    </w:p>
-    <w:p>
-      <w:pPr>
-        <w:spacing w:after="160"/>
-      </w:pPr>
-      <w:r>
-        <w:rPr>
-          <w:i w:val="0"/>
-          <w:sz w:val="24"/>
-        </w:rPr>
-        <w:t>Five independent training runs, and every one of them finishes worse than a controller that is two thresholds and a taper, once the cabin heating they switched off is charged back. The offline optimum predicted it and the training measured it, and the two do not depend on each other. Section 21.</w:t>
-      </w:r>
-    </w:p>
-    <w:p>
-      <w:pPr>
-        <w:pStyle w:val="Heading2"/>
-      </w:pPr>
-      <w:r>
-        <w:t>The forecast makes no difference to the controller</w:t>
-      </w:r>
-    </w:p>
-    <w:p>
-      <w:pPr>
-        <w:spacing w:after="160"/>
-      </w:pPr>
-      <w:r>
-        <w:rPr>
-          <w:i w:val="0"/>
-          <w:sz w:val="24"/>
-        </w:rPr>
-        <w:t>Removing it changes the result by an amount whose confidence interval contains zero, and whose sign is not consistent across the five runs. This was accepted as publishable in the design document before it was run, and week 7 gave it a reason rather than leaving it a possibility.</w:t>
-      </w:r>
-    </w:p>
-    <w:p>
-      <w:pPr>
-        <w:pStyle w:val="Heading2"/>
-      </w:pPr>
-      <w:r>
-        <w:t>A parity test was passing without testing anything</w:t>
-      </w:r>
-    </w:p>
-    <w:p>
-      <w:pPr>
-        <w:spacing w:after="160"/>
-      </w:pPr>
-      <w:r>
-        <w:rPr>
-          <w:i w:val="0"/>
-          <w:sz w:val="24"/>
-        </w:rPr>
-        <w:t>The test that compares the controller written in C against the same controller in Python was, for a while, compiling one set of weights and comparing them against another network's expected answers. The cause is a C rule: an include written with quotes is resolved against the including file's own directory before any search path, so the file under test kept finding the deployed weights whatever the test asked for. It passed honestly for exactly as long as nothing had been deployed. Two fixes: the include now searches the path only, and the weights carry a checksum that the inference code itself reports, because two policies of the same shape are indistinguishable without one.</w:t>
-      </w:r>
-    </w:p>
-    <w:p>
-      <w:pPr>
-        <w:pStyle w:val="Heading2"/>
-      </w:pPr>
-      <w:r>
-        <w:t>A model 27 times bigger is not better</w:t>
-      </w:r>
-    </w:p>
-    <w:p>
-      <w:pPr>
-        <w:spacing w:after="160"/>
-      </w:pPr>
-      <w:r>
-        <w:rPr>
-          <w:i w:val="0"/>
-          <w:sz w:val="24"/>
-        </w:rPr>
-        <w:t>The last piece of the 8-bit experiment trained a deliberately oversized model to teach the small one. The teaching changed nothing measurable, and the reason is that the big model was not better than the small one to begin with: 27 times the parameters, and slightly worse. Every model tried falls within 0.89% of the others, which is less than what converting to 8-bit costs. Section 14.</w:t>
-      </w:r>
-    </w:p>
-    <w:p>
-      <w:pPr>
-        <w:pStyle w:val="Heading2"/>
-      </w:pPr>
-      <w:r>
-        <w:t>The energy-management problem has almost no room in it</w:t>
-      </w:r>
-    </w:p>
-    <w:p>
-      <w:pPr>
-        <w:spacing w:after="160"/>
-      </w:pPr>
-      <w:r>
-        <w:rPr>
-          <w:i w:val="0"/>
-          <w:sz w:val="24"/>
-        </w:rPr>
-        <w:t>The theoretically optimal strategy is a constant instruction, and two thresholds get within a sixth of a percent of it. This is the largest of these findings and it is the subject of section 16, including the three routes open and the fact that choosing between them is the supervisor's decision rather than one taken here.</w:t>
-      </w:r>
-    </w:p>
-    <w:p>
-      <w:pPr>
-        <w:pStyle w:val="Heading2"/>
-      </w:pPr>
-      <w:r>
-        <w:t>The fitted rolling resistance is not a rolling resistance</w:t>
-      </w:r>
-    </w:p>
-    <w:p>
-      <w:pPr>
-        <w:spacing w:after="160"/>
-      </w:pPr>
-      <w:r>
-        <w:rPr>
-          <w:i w:val="0"/>
-          <w:sz w:val="24"/>
-        </w:rPr>
-        <w:t>It is 2.2 times larger than an independent measurement on a comparable car. It is a lumped loss term named after the physics it stands in for rather than the physics it contains. The parameter file now says so and an automated test fails if that statement is removed.</w:t>
-      </w:r>
-    </w:p>
-    <w:p>
-      <w:pPr>
-        <w:pStyle w:val="Heading2"/>
-      </w:pPr>
-      <w:r>
-        <w:t>Gate G4 was already passed before the models existed</w:t>
-      </w:r>
-    </w:p>
-    <w:p>
-      <w:pPr>
-        <w:spacing w:after="160"/>
-      </w:pPr>
-      <w:r>
-        <w:rPr>
-          <w:i w:val="0"/>
-          <w:sz w:val="24"/>
-        </w:rPr>
-        <w:t>A linear regression beat the naive baseline by 14.5% against a required 10%. The gate as written could not distinguish a Transformer from a matrix calculation, so every model is now reported against the regression too.</w:t>
-      </w:r>
-    </w:p>
-    <w:p>
-      <w:pPr>
-        <w:pStyle w:val="Heading2"/>
-      </w:pPr>
-      <w:r>
-        <w:t>Physics-informing does not improve accuracy</w:t>
-      </w:r>
-    </w:p>
-    <w:p>
-      <w:pPr>
-        <w:spacing w:after="160"/>
-      </w:pPr>
-      <w:r>
-        <w:rPr>
-          <w:i w:val="0"/>
-          <w:sz w:val="24"/>
-        </w:rPr>
-        <w:t>Five watts of difference on eleven kilowatts at matched parameter count. It improves physical consistency by a factor of ten instead, which is a different and still useful claim.</w:t>
-      </w:r>
-    </w:p>
-    <w:p>
-      <w:pPr>
-        <w:pStyle w:val="Heading2"/>
-      </w:pPr>
-      <w:r>
-        <w:t>The compute estimate was 64% too optimistic</w:t>
-      </w:r>
-    </w:p>
-    <w:p>
-      <w:pPr>
-        <w:spacing w:after="160"/>
-      </w:pPr>
-      <w:r>
-        <w:rPr>
-          <w:i w:val="0"/>
-          <w:sz w:val="24"/>
-        </w:rPr>
-        <w:t>Dividing a multiply count by a measured multiply rate gave 22.28 milliseconds for the Transformer. Timing the real graph on the chip gave 36.46. The LSTM is worse: 19.84 estimated against 35.07 measured. Both still fit inside the 40 milliseconds allowed, and the estimates remain useful for ranking models against each other, but they cannot be quoted as latencies now that measurements exist.</w:t>
-      </w:r>
-    </w:p>
-    <w:p>
-      <w:pPr>
-        <w:pStyle w:val="Heading2"/>
-      </w:pPr>
-      <w:r>
-        <w:t>Charge conservation cannot be tested at this horizon</w:t>
-      </w:r>
-    </w:p>
-    <w:p>
-      <w:pPr>
-        <w:spacing w:after="160"/>
-      </w:pPr>
-      <w:r>
-        <w:rPr>
-          <w:i w:val="0"/>
-          <w:sz w:val="24"/>
-        </w:rPr>
-        <w:t>The recorded charge channel does not move within a typical three-second window, so the equation has nothing to constrain. Enforcing it costs 4.4% accuracy and buys almost nothing. This was measured rather than argued.</w:t>
-      </w:r>
-    </w:p>
-    <w:p>
-      <w:pPr>
-        <w:pStyle w:val="Heading1"/>
-      </w:pPr>
-      <w:r>
-        <w:t>30. What changed from the original plan</w:t>
-      </w:r>
-    </w:p>
-    <w:p>
-      <w:pPr>
-        <w:spacing w:after="160"/>
-      </w:pPr>
-      <w:r>
-        <w:rPr>
-          <w:i w:val="0"/>
-          <w:sz w:val="24"/>
-        </w:rPr>
-        <w:t>Twenty-two changes, in two classes, and the distinction matters. Eleven were agreed in the design document before any code was written. Eleven more happened during the eight weeks, each one forced by something that had been measured.</w:t>
-      </w:r>
-    </w:p>
-    <w:p>
-      <w:pPr>
-        <w:pStyle w:val="Heading2"/>
-      </w:pPr>
-      <w:r>
-        <w:t>Agreed before implementation</w:t>
-      </w:r>
-    </w:p>
-    <w:p>
-      <w:pPr>
-        <w:spacing w:after="160"/>
-      </w:pPr>
-      <w:r>
-        <w:rPr>
-          <w:i w:val="0"/>
-          <w:sz w:val="24"/>
-        </w:rPr>
-        <w:t>It is Processor-in-the-Loop, not Hardware-in-the-Loop. The original used HIL throughout. HIL means real electrical hardware in the loop, with motors, power electronics and sensors. There is none of that here, only a processor. Reviewers in embedded and control venues spot a misused HIL immediately, and the correct term costs nothing.</w:t>
-      </w:r>
-    </w:p>
-    <w:p>
-      <w:pPr>
-        <w:spacing w:after="160"/>
-      </w:pPr>
-      <w:r>
-        <w:rPr>
-          <w:i w:val="0"/>
-          <w:sz w:val="24"/>
-        </w:rPr>
-        <w:t>The embedded work moved from last to first, which is the largest single change. The original schedules the ESP32 for weeks 10 and 11, after all the modelling is finished. That is the one arrangement in which a failure has no recovery: if the model does not fit in week 10, there is no time left to build a smaller one. The compute-feasibility question is now gate G1 in week 1, and the plan already names the fallback. This inversion is why the project knew in week 4, rather than week 10, that XGBoost was never deployable.</w:t>
-      </w:r>
-    </w:p>
-    <w:p>
-      <w:pPr>
-        <w:spacing w:after="160"/>
-      </w:pPr>
-      <w:r>
-        <w:rPr>
-          <w:i w:val="0"/>
-          <w:sz w:val="24"/>
-        </w:rPr>
-        <w:t>Real logged trips replaced a physics-generated dataset. The original creates the training data by pushing drive cycles through the physics model, which makes the thing being predicted a closed-form function of the very inputs used to predict it. The model then appears to do brilliantly while having learned nothing about a real car. The predecessor work has exactly this defect. This project trains on 72 real logged trips at 10 Hz instead.</w:t>
-      </w:r>
-    </w:p>
-    <w:p>
-      <w:pPr>
-        <w:spacing w:after="160"/>
-      </w:pPr>
-      <w:r>
-        <w:rPr>
-          <w:i w:val="0"/>
-          <w:sz w:val="24"/>
-        </w:rPr>
-        <w:t>Data is split by trip and never by row. The predecessor split 2,000 rows at random, and because consecutive rows come from the same drive a fraction of a second apart, near-identical samples landed on both sides. The model was effectively tested on data it had trained on, which inflates every score. Here no sample from a trip ever appears on both sides, and the calibration data used for 8-bit quantisation is drawn from training trips only, which is a subtler version of the same leak.</w:t>
-      </w:r>
-    </w:p>
-    <w:p>
-      <w:pPr>
-        <w:spacing w:after="160"/>
-      </w:pPr>
-      <w:r>
-        <w:rPr>
-          <w:i w:val="0"/>
-          <w:sz w:val="24"/>
-        </w:rPr>
-        <w:t>The communication task runs at 10 ms rather than 50. This was arithmetic rather than judgement: the original specifies a 10 ms control loop and a 50 ms communication task, and a loop cannot close five times faster than the messages it depends on arrive.</w:t>
-      </w:r>
-    </w:p>
-    <w:p>
-      <w:pPr>
-        <w:spacing w:after="160"/>
-      </w:pPr>
-      <w:r>
-        <w:rPr>
-          <w:i w:val="0"/>
-          <w:sz w:val="24"/>
-        </w:rPr>
-        <w:t>Budget first, then model. The model size is not chosen and then checked, it is derived from what gate G1 measured. The Transformer is 32 sequence steps, 32 units wide and 2 layers deep because that is what fits in 40 milliseconds on this chip.</w:t>
-      </w:r>
-    </w:p>
-    <w:p>
-      <w:pPr>
-        <w:spacing w:after="160"/>
-      </w:pPr>
-      <w:r>
-        <w:rPr>
-          <w:i w:val="0"/>
-          <w:sz w:val="24"/>
-        </w:rPr>
-        <w:t>The model comparison was rebuilt. Linear regression, random forest and XGBoost became a mandatory naive baseline, one strong tabular model, an LSTM fed genuinely sequential data, and a Transformer, each in plain and physics-informed versions at matched size. Re-running the LSTM correctly is deliberate: the predecessor flattened its data first, which removes the time ordering the architecture exists to exploit, and then reported that recurrent models underperform.</w:t>
-      </w:r>
-    </w:p>
-    <w:p>
-      <w:pPr>
-        <w:spacing w:after="160"/>
-      </w:pPr>
-      <w:r>
-        <w:rPr>
-          <w:i w:val="0"/>
-          <w:sz w:val="24"/>
-        </w:rPr>
-        <w:t>Gates, ablations and explicit non-claims are entirely new. Five gates each with a written action on failure; four numbered ablations; a metrics table with actual metrics where the original listed headings and left them empty; and a list of things this work will explicitly not claim. Stating the non-claims in advance is what allows two null results to be reported as findings rather than as embarrassments.</w:t>
-      </w:r>
-    </w:p>
-    <w:p>
-      <w:pPr>
-        <w:spacing w:after="160"/>
-      </w:pPr>
-      <w:r>
-        <w:rPr>
-          <w:i w:val="0"/>
-          <w:sz w:val="24"/>
-        </w:rPr>
-        <w:t>Thirteen scenario variations became six axes, keeping full robustness coverage at roughly half the runs.</w:t>
-      </w:r>
-    </w:p>
-    <w:p>
-      <w:pPr>
-        <w:spacing w:after="160"/>
-      </w:pPr>
-      <w:r>
-        <w:rPr>
-          <w:i w:val="0"/>
-          <w:sz w:val="24"/>
-        </w:rPr>
-        <w:t>The ESP32-S3 is the primary platform rather than the C6. Two processor cores matter enormously here, because the hard real-time loop is pinned to core 0 where inference on core 1 cannot disturb it. The single-core C6 cannot make that separation at all.</w:t>
-      </w:r>
-    </w:p>
-    <w:p>
-      <w:pPr>
-        <w:spacing w:after="160"/>
-      </w:pPr>
-      <w:r>
-        <w:rPr>
-          <w:i w:val="0"/>
-          <w:sz w:val="24"/>
-        </w:rPr>
-        <w:t>A second, independent dataset was added, held purely as an out-of-distribution check. Building and testing on one car answers whether the model fits; the question a reviewer actually asks is whether it transfers, and nothing in the original plan could have answered it.</w:t>
-      </w:r>
-    </w:p>
-    <w:p>
-      <w:pPr>
-        <w:pStyle w:val="Heading2"/>
-      </w:pPr>
-      <w:r>
-        <w:t>Changed in flight, because something was measured</w:t>
-      </w:r>
-    </w:p>
-    <w:p>
-      <w:pPr>
-        <w:spacing w:after="160"/>
-      </w:pPr>
-      <w:r>
-        <w:rPr>
-          <w:i w:val="0"/>
-          <w:sz w:val="24"/>
-        </w:rPr>
-        <w:t>These are the ones to be most transparent about, because each represents the plan meeting reality. In every case the measurement came first and the change followed.</w:t>
-      </w:r>
-    </w:p>
-    <w:p>
-      <w:pPr>
-        <w:spacing w:after="160"/>
-      </w:pPr>
-      <w:r>
-        <w:rPr>
-          <w:i w:val="0"/>
-          <w:sz w:val="24"/>
-        </w:rPr>
-        <w:t>Gate G2 was split into three parts instead of one pooled number, and this was the one revision the design document permits. Neither threshold was loosened; what changed is which part of the model each threshold is applied to. Applied literally the original criterion failed all seven trips at a median error of 23.7 percent, because that single number pooled three independent models and could not say which was wrong. Driving the plant with the archive's own logged torque drops the error to a median of 7.0 percent, inside the original bound on every trip. The revision is now spent and nothing else may be adjusted without the same treatment.</w:t>
-      </w:r>
-    </w:p>
-    <w:p>
-      <w:pPr>
-        <w:spacing w:after="160"/>
-      </w:pPr>
-      <w:r>
-        <w:rPr>
-          <w:i w:val="0"/>
-          <w:sz w:val="24"/>
-        </w:rPr>
-        <w:t>The control loop became pipelined rather than synchronous. Originally the chip sent a request and then waited for the reply inside the same 10 millisecond slot, tying its deadline to the scheduling behaviour of a general-purpose laptop. It now requests the next state and acts on the most recent one it holds, so it no longer waits for the laptop inside its own time slot. This is a genuine trade rather than a free win, because the controller now acts on information one cycle old, and that cost is measured and reported.</w:t>
-      </w:r>
-    </w:p>
-    <w:p>
-      <w:pPr>
-        <w:spacing w:after="160"/>
-      </w:pPr>
-      <w:r>
-        <w:rPr>
-          <w:i w:val="0"/>
-          <w:sz w:val="24"/>
-        </w:rPr>
-        <w:t>The link runs over the chip's built-in USB rather than a separate adapter. The design deliberately left this open for gate G3 to settle on measured evidence, and the built-in peripheral carries the loop with zero corrupted and zero lost messages.</w:t>
-      </w:r>
-    </w:p>
-    <w:p>
-      <w:pPr>
-        <w:spacing w:after="160"/>
-      </w:pPr>
-      <w:r>
-        <w:rPr>
-          <w:i w:val="0"/>
-          <w:sz w:val="24"/>
-        </w:rPr>
-        <w:t>Three identified parameters were relabelled as lumped losses. The fitted rolling-resistance coefficient came out 2.2 times larger than an independent measurement on a comparable car, so it is not a tyre property. It is a coefficient occupying that place in the equation and absorbing every speed-dependent loss the model does not represent separately. The parameter file says so, and an automated test fails if that statement is removed.</w:t>
-      </w:r>
-    </w:p>
-    <w:p>
-      <w:pPr>
-        <w:spacing w:after="160"/>
-      </w:pPr>
-      <w:r>
-        <w:rPr>
-          <w:i w:val="0"/>
-          <w:sz w:val="24"/>
-        </w:rPr>
-        <w:t>One of the three physics constraints was switched off. Charge conservation has nothing to constrain over a three-second window, because the logged charge channel does not measurably move within one. Its weight is held at zero and the cost of switching it on is reported as its own arm rather than quietly omitted.</w:t>
-      </w:r>
-    </w:p>
-    <w:p>
-      <w:pPr>
-        <w:spacing w:after="160"/>
-      </w:pPr>
-      <w:r>
-        <w:rPr>
-          <w:i w:val="0"/>
-          <w:sz w:val="24"/>
-        </w:rPr>
-        <w:t>The message format grew to carry a real controller. The state message went from 8 numbers to 10 so that the laptop can send the target speed and its rate of change, the command message from 3 to 4, and the diagnostics message from 11 counters to 16. Gate G3 was then re-measured in full, because the loop the report describes has to be the loop that was measured.</w:t>
-      </w:r>
-    </w:p>
-    <w:p>
-      <w:pPr>
-        <w:spacing w:after="160"/>
-      </w:pPr>
-      <w:r>
-        <w:rPr>
-          <w:i w:val="0"/>
-          <w:sz w:val="24"/>
-        </w:rPr>
-        <w:t>The offline optimiser searches two dimensions rather than three. This is not a simplification for speed. With the speed trajectory fixed by the tracking constraint, the battery power limit can only ever remove power the speed controller needs, which the constraint forbids. It is a safety limiter and not an optimisation lever, and that applies to the learned controller in exactly the same way.</w:t>
-      </w:r>
-    </w:p>
-    <w:p>
-      <w:pPr>
-        <w:spacing w:after="160"/>
-      </w:pPr>
-      <w:r>
-        <w:rPr>
-          <w:i w:val="0"/>
-          <w:sz w:val="24"/>
-        </w:rPr>
-        <w:t>Controllers are now ranked with shed cabin heat charged back. Raw consumption is not comparable between controllers, because one that turns the heating down looks excellent without having managed any energy. Without this correction the week 8 table reads as the learned controller saving 1.3 percent; with it, the same controller is 0.66 percent worse, and the entire difference was 48 to 50 watt-hours of cabin heat per cycle.</w:t>
-      </w:r>
-    </w:p>
-    <w:p>
-      <w:pPr>
-        <w:spacing w:after="160"/>
-      </w:pPr>
-      <w:r>
-        <w:rPr>
-          <w:i w:val="0"/>
-          <w:sz w:val="24"/>
-        </w:rPr>
-        <w:t>The learned controller is 64 units wide rather than the library default of 256. The default would be 68,867 numbers and 269 kilobytes, which is 90 percent of the entire memory budget the forecaster also has to fit inside. At 64 wide it is 4,931 numbers and 19.3 kilobytes, and both figures were measured in a pilot run before the main campaign.</w:t>
-      </w:r>
-    </w:p>
-    <w:p>
-      <w:pPr>
-        <w:spacing w:after="160"/>
-      </w:pPr>
-      <w:r>
-        <w:rPr>
-          <w:i w:val="0"/>
-          <w:sz w:val="24"/>
-        </w:rPr>
-        <w:t>XGBoost and the LSTM ensemble were dropped as deployable options. XGBoost needs roughly 3.7 megabytes against a 300 kilobyte budget, over twelve times too large. The best-looking accuracy figure in the whole comparison was a five-model LSTM ensemble, which takes 99 milliseconds against a 40 millisecond budget. Both remain offline reference points, and the reported number is now always distinguished from the deployable one.</w:t>
-      </w:r>
-    </w:p>
-    <w:p>
-      <w:pPr>
-        <w:spacing w:after="160"/>
-      </w:pPr>
-      <w:r>
-        <w:rPr>
-          <w:i w:val="0"/>
-          <w:sz w:val="24"/>
-        </w:rPr>
-        <w:t>The watchdog was switched on and a fallback path built. Three different failures now get three different responses and three separate counters rather than one generic fault state, because collapsing them is how a controller ends up limping owing to a slow logging task. All three were then triggered deliberately on the board, plus a fourth test that hung the control task on purpose to confirm the watchdog resets the chip. A fallback path that has never been taken is a claim, not a result.</w:t>
-      </w:r>
-    </w:p>
-    <w:p>
-      <w:pPr>
-        <w:pStyle w:val="Heading1"/>
-      </w:pPr>
-      <w:r>
-        <w:t>31. What is left to do</w:t>
-      </w:r>
-    </w:p>
-    <w:p>
-      <w:pPr>
-        <w:spacing w:after="160"/>
-      </w:pPr>
-      <w:r>
-        <w:rPr>
-          <w:i w:val="0"/>
-          <w:sz w:val="24"/>
-        </w:rPr>
-        <w:t>Phase 1 and Phase 2 are complete. The remaining work is the controller, the on-chip deployment, and the measurement campaign.</w:t>
+        <w:t>The following week-by-week plan records the earlier project schedule. Current correction status is stated above.</w:t>
       </w:r>
     </w:p>
     <w:tbl>
@@ -22531,7 +25969,7 @@
         <w:spacing w:after="80"/>
       </w:pPr>
       <w:r>
-        <w:t>The measurement campaign in week 10. The board is attached, the toolchain is settled and the deployed controller is on the chip, so this is the next piece of work rather than a blocked one.</w:t>
+        <w:t>The corrected campaign and outage sweep are complete; the next step is review of the measured correction and paper framing.</w:t>
       </w:r>
     </w:p>
     <w:p>
@@ -22549,7 +25987,7 @@
         <w:spacing w:after="80"/>
       </w:pPr>
       <w:r>
-        <w:t>The exact outage length where the failure handling starts to pay. It lies between four and five seconds, as fine as a whole-second sweep resolves.</w:t>
+        <w:t>The historical four-to-five-second outage crossover is not a conclusion about the corrected plant. Interpret the new sweep from its own paired measurements.</w:t>
       </w:r>
     </w:p>
     <w:p>
@@ -23540,7 +26978,7 @@
           <w:color w:val="595959"/>
           <w:sz w:val="22"/>
         </w:rPr>
-        <w:t>All Python commands need PYTHONPATH="src:." set. The reinforcement-learning ramp-up additionally needs stable-baselines3 and gymnasium. The test suite runs with python3 -m pytest and currently holds 462 tests, all passing, including ones that drive the controller and the learned policy in C and in Python through identical inputs and require them to agree, and ones that read the firmware's own compile-time switches back out of its headers so that the scripts describing them cannot drift from what is compiled.</w:t>
+        <w:t>All Python commands need PYTHONPATH="src:." set. The reinforcement-learning ramp-up additionally needs stable-baselines3 and gymnasium. The test suite runs with python3 -m pytest and currently holds 474 tests, including ones that drive the controller and the learned policy in C and in Python through identical inputs and require them to agree, and ones that read the firmware's own compile-time switches back out of its headers so that the scripts describing them cannot drift from what is compiled.</w:t>
       </w:r>
     </w:p>
     <w:sectPr>

</xml_diff>

<commit_message>
Criteria 4, 5, 6, 9: both documents reviewed, the correction note carries the board result, the run is closed
Every page of the report and the note was rendered through Word and looked
at; the manifest records what was found and what was left. Both documents
were rebuilt after the merge so they no longer call the branch unmerged.
Sections 7 and 8 of the correction note give the measured campaign, the A4
sweep and the rule-arm check, with numbers generated from the data files.
The night's goal, plan, briefing and board scripts are committed with it.

Co-Authored-By: Claude Opus 5.5 <noreply@anthropic.com>
</commit_message>
<xml_diff>
--- a/reports/EV-PIL-status-report.docx
+++ b/reports/EV-PIL-status-report.docx
@@ -25344,7 +25344,7 @@
           <w:i w:val="0"/>
           <w:sz w:val="24"/>
         </w:rPr>
-        <w:t>Corrected-model campaign: complete. Corrected-model link-outage sweep: complete. The proposed speed-loop decision transformer was dropped. The classical filter and detector remain on the separate feature/decision-model branch, with simulation evidence only. B5 and B6 still need a C port and parity checks before board testing. Merging that branch and measuring it on the board requires a separate decision.</w:t>
+        <w:t>Corrected-model campaign: complete. Corrected-model link-outage sweep: complete. The proposed speed-loop decision transformer was dropped. The classical filter and detector are merged into the code base, switched off by default, with simulation evidence only. B5 and B6 still need a C port and parity checks before board testing. Measuring them on the board requires a separate decision.</w:t>
       </w:r>
     </w:p>
     <w:p>
@@ -26978,7 +26978,7 @@
           <w:color w:val="595959"/>
           <w:sz w:val="22"/>
         </w:rPr>
-        <w:t>All Python commands need PYTHONPATH="src:." set. The reinforcement-learning ramp-up additionally needs stable-baselines3 and gymnasium. The test suite runs with python3 -m pytest and currently holds 474 tests, including ones that drive the controller and the learned policy in C and in Python through identical inputs and require them to agree, and ones that read the firmware's own compile-time switches back out of its headers so that the scripts describing them cannot drift from what is compiled.</w:t>
+        <w:t>All Python commands need PYTHONPATH="src:." set. The reinforcement-learning ramp-up additionally needs stable-baselines3 and gymnasium. The test suite runs with python3 -m pytest and currently holds 538 tests, including ones that drive the controller and the learned policy in C and in Python through identical inputs and require them to agree, and ones that read the firmware's own compile-time switches back out of its headers so that the scripts describing them cannot drift from what is compiled.</w:t>
       </w:r>
     </w:p>
     <w:sectPr>

</xml_diff>

<commit_message>
Report and supervisor note carry the speed-loop arms as measured on the board
A new report section built from docs/week12-speed-arms.json, and the note's
robustness paragraph rewritten around the board numbers, with the fault
detector's simulated evaluation after its correction. Both rebuilt, rendered
through Word and looked at; the manifest records the second review.

Co-Authored-By: Claude Opus 5.5 <noreply@anthropic.com>
</commit_message>
<xml_diff>
--- a/reports/EV-PIL-status-report.docx
+++ b/reports/EV-PIL-status-report.docx
@@ -14570,7 +14570,7 @@
           <w:i w:val="0"/>
           <w:sz w:val="24"/>
         </w:rPr>
-        <w:t>The chain from a trained policy to a running one has four links, and each is checked against the one before it. Building that chain found a real fault: the test that compares the C controller against Python was, for a while, compiling the wrong weights and comparing them against themselves. It passed for exactly as long as no policy had been deployed. Section 29 records it.</w:t>
+        <w:t>The chain from a trained policy to a running one has four links, and each is checked against the one before it. Building that chain found a real fault: the test that compares the C controller against Python was, for a while, compiling the wrong weights and comparing them against themselves. It passed for exactly as long as no policy had been deployed. Section 30 records it.</w:t>
       </w:r>
     </w:p>
     <w:p>
@@ -24800,7 +24800,7 @@
         <w:pStyle w:val="Heading1"/>
       </w:pPr>
       <w:r>
-        <w:t>29. Results that went against expectation</w:t>
+        <w:t>29. Sensor noise and the speed loop, measured on the board</w:t>
       </w:r>
     </w:p>
     <w:p>
@@ -24812,15 +24812,7 @@
           <w:i w:val="0"/>
           <w:sz w:val="24"/>
         </w:rPr>
-        <w:t>Each one is reported because each one changes what the paper may claim, and a supervisor reading the work will find them more convincing than the successes.</w:t>
-      </w:r>
-    </w:p>
-    <w:p>
-      <w:pPr>
-        <w:pStyle w:val="Heading2"/>
-      </w:pPr>
-      <w:r>
-        <w:t>The learned controller loses to two thresholds</w:t>
+        <w:t>Week 7's robustness test found that speed-sensor noise costs energy because the speed controller chases the noise and pays for it in torque reversals, and section 26 saw the rule manager's consumption rise with noise on the chip. Both were observations about a loss. This section measures the loss on the board and what removes it.</w:t>
       </w:r>
     </w:p>
     <w:p>
@@ -24832,15 +24824,7 @@
           <w:i w:val="0"/>
           <w:sz w:val="24"/>
         </w:rPr>
-        <w:t>Five independent training runs, and every one of them finishes worse than a controller that is two thresholds and a taper, once the cabin heating they switched off is charged back. The offline optimum predicted it and the training measured it, and the two do not depend on each other. Section 21.</w:t>
-      </w:r>
-    </w:p>
-    <w:p>
-      <w:pPr>
-        <w:pStyle w:val="Heading2"/>
-      </w:pPr>
-      <w:r>
-        <w:t>The forecast makes no difference to the controller</w:t>
+        <w:t>The loss is in the speed loop and not in the energy manager. In simulation a constant energy instruction loses as much as the rule manager does under the same noise. The loop acts on every sample, so a noisy reading makes it drive and brake by turns, and the round trip through the motor and the battery is paid for.</w:t>
       </w:r>
     </w:p>
     <w:p>
@@ -24852,512 +24836,154 @@
           <w:i w:val="0"/>
           <w:sz w:val="24"/>
         </w:rPr>
-        <w:t>Removing it changes the result by an amount whose confidence interval contains zero, and whose sign is not consistent across the five runs. This was accepted as publishable in the design document before it was run, and week 7 gave it a reason rather than leaving it a possibility.</w:t>
-      </w:r>
+        <w:t>Three versions of the firmware were run, all with the rule manager deciding energy, differing only in what the speed loop is given to control on.</w:t>
+      </w:r>
+    </w:p>
+    <w:tbl>
+      <w:tblPr>
+        <w:tblStyle w:val="LightGrid-Accent1"/>
+        <w:tblW w:type="auto" w:w="0"/>
+        <w:jc w:val="center"/>
+        <w:tblLook w:firstColumn="1" w:firstRow="1" w:lastColumn="0" w:lastRow="0" w:noHBand="0" w:noVBand="1" w:val="04A0"/>
+      </w:tblPr>
+      <w:tblGrid>
+        <w:gridCol w:w="4824"/>
+        <w:gridCol w:w="4824"/>
+      </w:tblGrid>
+      <w:tr>
+        <w:tc>
+          <w:tcPr>
+            <w:tcW w:type="dxa" w:w="4824"/>
+          </w:tcPr>
+          <w:p>
+            <w:r/>
+            <w:r>
+              <w:rPr>
+                <w:b/>
+                <w:sz w:val="20"/>
+              </w:rPr>
+              <w:t>Version</w:t>
+            </w:r>
+          </w:p>
+        </w:tc>
+        <w:tc>
+          <w:tcPr>
+            <w:tcW w:type="dxa" w:w="4824"/>
+          </w:tcPr>
+          <w:p>
+            <w:r/>
+            <w:r>
+              <w:rPr>
+                <w:b/>
+                <w:sz w:val="20"/>
+              </w:rPr>
+              <w:t>What the speed loop controls on</w:t>
+            </w:r>
+          </w:p>
+        </w:tc>
+      </w:tr>
+      <w:tr>
+        <w:tc>
+          <w:tcPr>
+            <w:tcW w:type="dxa" w:w="4824"/>
+          </w:tcPr>
+          <w:p>
+            <w:r/>
+            <w:r>
+              <w:rPr>
+                <w:sz w:val="20"/>
+              </w:rPr>
+              <w:t>Shipped</w:t>
+            </w:r>
+          </w:p>
+        </w:tc>
+        <w:tc>
+          <w:tcPr>
+            <w:tcW w:type="dxa" w:w="4824"/>
+          </w:tcPr>
+          <w:p>
+            <w:r/>
+            <w:r>
+              <w:rPr>
+                <w:sz w:val="20"/>
+              </w:rPr>
+              <w:t>The speed measurement as it arrives</w:t>
+            </w:r>
+          </w:p>
+        </w:tc>
+      </w:tr>
+      <w:tr>
+        <w:tc>
+          <w:tcPr>
+            <w:tcW w:type="dxa" w:w="4824"/>
+          </w:tcPr>
+          <w:p>
+            <w:r/>
+            <w:r>
+              <w:rPr>
+                <w:sz w:val="20"/>
+              </w:rPr>
+              <w:t>Filter</w:t>
+            </w:r>
+          </w:p>
+        </w:tc>
+        <w:tc>
+          <w:tcPr>
+            <w:tcW w:type="dxa" w:w="4824"/>
+          </w:tcPr>
+          <w:p>
+            <w:r/>
+            <w:r>
+              <w:rPr>
+                <w:sz w:val="20"/>
+              </w:rPr>
+              <w:t>A Kalman estimate: it predicts the speed from the torque it commanded, corrects with the measurement, and learns how noisy the measurement is and how far the car departs from its model</w:t>
+            </w:r>
+          </w:p>
+        </w:tc>
+      </w:tr>
+      <w:tr>
+        <w:tc>
+          <w:tcPr>
+            <w:tcW w:type="dxa" w:w="4824"/>
+          </w:tcPr>
+          <w:p>
+            <w:r/>
+            <w:r>
+              <w:rPr>
+                <w:sz w:val="20"/>
+              </w:rPr>
+              <w:t>Filter and detector</w:t>
+            </w:r>
+          </w:p>
+        </w:tc>
+        <w:tc>
+          <w:tcPr>
+            <w:tcW w:type="dxa" w:w="4824"/>
+          </w:tcPr>
+          <w:p>
+            <w:r/>
+            <w:r>
+              <w:rPr>
+                <w:sz w:val="20"/>
+              </w:rPr>
+              <w:t>The same, with a check on top that the speed reading agrees with the measured acceleration. If it does not, the reading is set aside and the loop runs on acceleration alone until it does</w:t>
+            </w:r>
+          </w:p>
+        </w:tc>
+      </w:tr>
+    </w:tbl>
+    <w:p>
+      <w:pPr>
+        <w:spacing w:after="40"/>
+      </w:pPr>
     </w:p>
     <w:p>
       <w:pPr>
         <w:pStyle w:val="Heading2"/>
       </w:pPr>
       <w:r>
-        <w:t>A parity test was passing without testing anything</w:t>
-      </w:r>
-    </w:p>
-    <w:p>
-      <w:pPr>
-        <w:spacing w:after="160"/>
-      </w:pPr>
-      <w:r>
-        <w:rPr>
-          <w:i w:val="0"/>
-          <w:sz w:val="24"/>
-        </w:rPr>
-        <w:t>The test that compares the controller written in C against the same controller in Python was, for a while, compiling one set of weights and comparing them against another network's expected answers. The cause is a C rule: an include written with quotes is resolved against the including file's own directory before any search path, so the file under test kept finding the deployed weights whatever the test asked for. It passed honestly for exactly as long as nothing had been deployed. Two fixes: the include now searches the path only, and the weights carry a checksum that the inference code itself reports, because two policies of the same shape are indistinguishable without one.</w:t>
-      </w:r>
-    </w:p>
-    <w:p>
-      <w:pPr>
-        <w:pStyle w:val="Heading2"/>
-      </w:pPr>
-      <w:r>
-        <w:t>A model 27 times bigger is not better</w:t>
-      </w:r>
-    </w:p>
-    <w:p>
-      <w:pPr>
-        <w:spacing w:after="160"/>
-      </w:pPr>
-      <w:r>
-        <w:rPr>
-          <w:i w:val="0"/>
-          <w:sz w:val="24"/>
-        </w:rPr>
-        <w:t>The last piece of the 8-bit experiment trained a deliberately oversized model to teach the small one. The teaching changed nothing measurable, and the reason is that the big model was not better than the small one to begin with: 27 times the parameters, and slightly worse. Every model tried falls within 0.89% of the others, which is less than what converting to 8-bit costs. Section 14.</w:t>
-      </w:r>
-    </w:p>
-    <w:p>
-      <w:pPr>
-        <w:pStyle w:val="Heading2"/>
-      </w:pPr>
-      <w:r>
-        <w:t>The energy-management problem has almost no room in it</w:t>
-      </w:r>
-    </w:p>
-    <w:p>
-      <w:pPr>
-        <w:spacing w:after="160"/>
-      </w:pPr>
-      <w:r>
-        <w:rPr>
-          <w:i w:val="0"/>
-          <w:sz w:val="24"/>
-        </w:rPr>
-        <w:t>The theoretically optimal strategy is a constant instruction, and two thresholds get within a sixth of a percent of it. This is the largest of these findings and it is the subject of section 16, including the three routes open and the fact that choosing between them is the supervisor's decision rather than one taken here.</w:t>
-      </w:r>
-    </w:p>
-    <w:p>
-      <w:pPr>
-        <w:pStyle w:val="Heading2"/>
-      </w:pPr>
-      <w:r>
-        <w:t>The fitted rolling resistance is not a rolling resistance</w:t>
-      </w:r>
-    </w:p>
-    <w:p>
-      <w:pPr>
-        <w:spacing w:after="160"/>
-      </w:pPr>
-      <w:r>
-        <w:rPr>
-          <w:i w:val="0"/>
-          <w:sz w:val="24"/>
-        </w:rPr>
-        <w:t>It is 2.2 times larger than an independent measurement on a comparable car. It is a lumped loss term named after the physics it stands in for rather than the physics it contains. The parameter file now says so and an automated test fails if that statement is removed.</w:t>
-      </w:r>
-    </w:p>
-    <w:p>
-      <w:pPr>
-        <w:pStyle w:val="Heading2"/>
-      </w:pPr>
-      <w:r>
-        <w:t>Gate G4 was already passed before the models existed</w:t>
-      </w:r>
-    </w:p>
-    <w:p>
-      <w:pPr>
-        <w:spacing w:after="160"/>
-      </w:pPr>
-      <w:r>
-        <w:rPr>
-          <w:i w:val="0"/>
-          <w:sz w:val="24"/>
-        </w:rPr>
-        <w:t>A linear regression beat the naive baseline by 14.5% against a required 10%. The gate as written could not distinguish a Transformer from a matrix calculation, so every model is now reported against the regression too.</w:t>
-      </w:r>
-    </w:p>
-    <w:p>
-      <w:pPr>
-        <w:pStyle w:val="Heading2"/>
-      </w:pPr>
-      <w:r>
-        <w:t>Physics-informing does not improve accuracy</w:t>
-      </w:r>
-    </w:p>
-    <w:p>
-      <w:pPr>
-        <w:spacing w:after="160"/>
-      </w:pPr>
-      <w:r>
-        <w:rPr>
-          <w:i w:val="0"/>
-          <w:sz w:val="24"/>
-        </w:rPr>
-        <w:t>Five watts of difference on eleven kilowatts at matched parameter count. It improves physical consistency by a factor of ten instead, which is a different and still useful claim.</w:t>
-      </w:r>
-    </w:p>
-    <w:p>
-      <w:pPr>
-        <w:pStyle w:val="Heading2"/>
-      </w:pPr>
-      <w:r>
-        <w:t>The compute estimate was 64% too optimistic</w:t>
-      </w:r>
-    </w:p>
-    <w:p>
-      <w:pPr>
-        <w:spacing w:after="160"/>
-      </w:pPr>
-      <w:r>
-        <w:rPr>
-          <w:i w:val="0"/>
-          <w:sz w:val="24"/>
-        </w:rPr>
-        <w:t>Dividing a multiply count by a measured multiply rate gave 22.28 milliseconds for the Transformer. Timing the real graph on the chip gave 36.46. The LSTM is worse: 19.84 estimated against 35.07 measured. Both still fit inside the 40 milliseconds allowed, and the estimates remain useful for ranking models against each other, but they cannot be quoted as latencies now that measurements exist.</w:t>
-      </w:r>
-    </w:p>
-    <w:p>
-      <w:pPr>
-        <w:pStyle w:val="Heading2"/>
-      </w:pPr>
-      <w:r>
-        <w:t>Charge conservation cannot be tested at this horizon</w:t>
-      </w:r>
-    </w:p>
-    <w:p>
-      <w:pPr>
-        <w:spacing w:after="160"/>
-      </w:pPr>
-      <w:r>
-        <w:rPr>
-          <w:i w:val="0"/>
-          <w:sz w:val="24"/>
-        </w:rPr>
-        <w:t>The recorded charge channel does not move within a typical three-second window, so the equation has nothing to constrain. Enforcing it costs 4.4% accuracy and buys almost nothing. This was measured rather than argued.</w:t>
-      </w:r>
-    </w:p>
-    <w:p>
-      <w:pPr>
-        <w:pStyle w:val="Heading1"/>
-      </w:pPr>
-      <w:r>
-        <w:t>30. What changed from the original plan</w:t>
-      </w:r>
-    </w:p>
-    <w:p>
-      <w:pPr>
-        <w:spacing w:after="160"/>
-      </w:pPr>
-      <w:r>
-        <w:rPr>
-          <w:i w:val="0"/>
-          <w:sz w:val="24"/>
-        </w:rPr>
-        <w:t>Twenty-two changes, in two classes, and the distinction matters. Eleven were agreed in the design document before any code was written. Eleven more happened during the eight weeks, each one forced by something that had been measured.</w:t>
-      </w:r>
-    </w:p>
-    <w:p>
-      <w:pPr>
-        <w:pStyle w:val="Heading2"/>
-      </w:pPr>
-      <w:r>
-        <w:t>Agreed before implementation</w:t>
-      </w:r>
-    </w:p>
-    <w:p>
-      <w:pPr>
-        <w:spacing w:after="160"/>
-      </w:pPr>
-      <w:r>
-        <w:rPr>
-          <w:i w:val="0"/>
-          <w:sz w:val="24"/>
-        </w:rPr>
-        <w:t>It is Processor-in-the-Loop, not Hardware-in-the-Loop. The original used HIL throughout. HIL means real electrical hardware in the loop, with motors, power electronics and sensors. There is none of that here, only a processor. Reviewers in embedded and control venues spot a misused HIL immediately, and the correct term costs nothing.</w:t>
-      </w:r>
-    </w:p>
-    <w:p>
-      <w:pPr>
-        <w:spacing w:after="160"/>
-      </w:pPr>
-      <w:r>
-        <w:rPr>
-          <w:i w:val="0"/>
-          <w:sz w:val="24"/>
-        </w:rPr>
-        <w:t>The embedded work moved from last to first, which is the largest single change. The original schedules the ESP32 for weeks 10 and 11, after all the modelling is finished. That is the one arrangement in which a failure has no recovery: if the model does not fit in week 10, there is no time left to build a smaller one. The compute-feasibility question is now gate G1 in week 1, and the plan already names the fallback. This inversion is why the project knew in week 4, rather than week 10, that XGBoost was never deployable.</w:t>
-      </w:r>
-    </w:p>
-    <w:p>
-      <w:pPr>
-        <w:spacing w:after="160"/>
-      </w:pPr>
-      <w:r>
-        <w:rPr>
-          <w:i w:val="0"/>
-          <w:sz w:val="24"/>
-        </w:rPr>
-        <w:t>Real logged trips replaced a physics-generated dataset. The original creates the training data by pushing drive cycles through the physics model, which makes the thing being predicted a closed-form function of the very inputs used to predict it. The model then appears to do brilliantly while having learned nothing about a real car. The predecessor work has exactly this defect. This project trains on 72 real logged trips at 10 Hz instead.</w:t>
-      </w:r>
-    </w:p>
-    <w:p>
-      <w:pPr>
-        <w:spacing w:after="160"/>
-      </w:pPr>
-      <w:r>
-        <w:rPr>
-          <w:i w:val="0"/>
-          <w:sz w:val="24"/>
-        </w:rPr>
-        <w:t>Data is split by trip and never by row. The predecessor split 2,000 rows at random, and because consecutive rows come from the same drive a fraction of a second apart, near-identical samples landed on both sides. The model was effectively tested on data it had trained on, which inflates every score. Here no sample from a trip ever appears on both sides, and the calibration data used for 8-bit quantisation is drawn from training trips only, which is a subtler version of the same leak.</w:t>
-      </w:r>
-    </w:p>
-    <w:p>
-      <w:pPr>
-        <w:spacing w:after="160"/>
-      </w:pPr>
-      <w:r>
-        <w:rPr>
-          <w:i w:val="0"/>
-          <w:sz w:val="24"/>
-        </w:rPr>
-        <w:t>The communication task runs at 10 ms rather than 50. This was arithmetic rather than judgement: the original specifies a 10 ms control loop and a 50 ms communication task, and a loop cannot close five times faster than the messages it depends on arrive.</w:t>
-      </w:r>
-    </w:p>
-    <w:p>
-      <w:pPr>
-        <w:spacing w:after="160"/>
-      </w:pPr>
-      <w:r>
-        <w:rPr>
-          <w:i w:val="0"/>
-          <w:sz w:val="24"/>
-        </w:rPr>
-        <w:t>Budget first, then model. The model size is not chosen and then checked, it is derived from what gate G1 measured. The Transformer is 32 sequence steps, 32 units wide and 2 layers deep because that is what fits in 40 milliseconds on this chip.</w:t>
-      </w:r>
-    </w:p>
-    <w:p>
-      <w:pPr>
-        <w:spacing w:after="160"/>
-      </w:pPr>
-      <w:r>
-        <w:rPr>
-          <w:i w:val="0"/>
-          <w:sz w:val="24"/>
-        </w:rPr>
-        <w:t>The model comparison was rebuilt. Linear regression, random forest and XGBoost became a mandatory naive baseline, one strong tabular model, an LSTM fed genuinely sequential data, and a Transformer, each in plain and physics-informed versions at matched size. Re-running the LSTM correctly is deliberate: the predecessor flattened its data first, which removes the time ordering the architecture exists to exploit, and then reported that recurrent models underperform.</w:t>
-      </w:r>
-    </w:p>
-    <w:p>
-      <w:pPr>
-        <w:spacing w:after="160"/>
-      </w:pPr>
-      <w:r>
-        <w:rPr>
-          <w:i w:val="0"/>
-          <w:sz w:val="24"/>
-        </w:rPr>
-        <w:t>Gates, ablations and explicit non-claims are entirely new. Five gates each with a written action on failure; four numbered ablations; a metrics table with actual metrics where the original listed headings and left them empty; and a list of things this work will explicitly not claim. Stating the non-claims in advance is what allows two null results to be reported as findings rather than as embarrassments.</w:t>
-      </w:r>
-    </w:p>
-    <w:p>
-      <w:pPr>
-        <w:spacing w:after="160"/>
-      </w:pPr>
-      <w:r>
-        <w:rPr>
-          <w:i w:val="0"/>
-          <w:sz w:val="24"/>
-        </w:rPr>
-        <w:t>Thirteen scenario variations became six axes, keeping full robustness coverage at roughly half the runs.</w:t>
-      </w:r>
-    </w:p>
-    <w:p>
-      <w:pPr>
-        <w:spacing w:after="160"/>
-      </w:pPr>
-      <w:r>
-        <w:rPr>
-          <w:i w:val="0"/>
-          <w:sz w:val="24"/>
-        </w:rPr>
-        <w:t>The ESP32-S3 is the primary platform rather than the C6. Two processor cores matter enormously here, because the hard real-time loop is pinned to core 0 where inference on core 1 cannot disturb it. The single-core C6 cannot make that separation at all.</w:t>
-      </w:r>
-    </w:p>
-    <w:p>
-      <w:pPr>
-        <w:spacing w:after="160"/>
-      </w:pPr>
-      <w:r>
-        <w:rPr>
-          <w:i w:val="0"/>
-          <w:sz w:val="24"/>
-        </w:rPr>
-        <w:t>A second, independent dataset was added, held purely as an out-of-distribution check. Building and testing on one car answers whether the model fits; the question a reviewer actually asks is whether it transfers, and nothing in the original plan could have answered it.</w:t>
-      </w:r>
-    </w:p>
-    <w:p>
-      <w:pPr>
-        <w:pStyle w:val="Heading2"/>
-      </w:pPr>
-      <w:r>
-        <w:t>Changed in flight, because something was measured</w:t>
-      </w:r>
-    </w:p>
-    <w:p>
-      <w:pPr>
-        <w:spacing w:after="160"/>
-      </w:pPr>
-      <w:r>
-        <w:rPr>
-          <w:i w:val="0"/>
-          <w:sz w:val="24"/>
-        </w:rPr>
-        <w:t>These are the ones to be most transparent about, because each represents the plan meeting reality. In every case the measurement came first and the change followed.</w:t>
-      </w:r>
-    </w:p>
-    <w:p>
-      <w:pPr>
-        <w:spacing w:after="160"/>
-      </w:pPr>
-      <w:r>
-        <w:rPr>
-          <w:i w:val="0"/>
-          <w:sz w:val="24"/>
-        </w:rPr>
-        <w:t>Gate G2 was split into three parts instead of one pooled number, and this was the one revision the design document permits. Neither threshold was loosened; what changed is which part of the model each threshold is applied to. Applied literally the original criterion failed all seven trips at a median error of 23.7 percent, because that single number pooled three independent models and could not say which was wrong. Driving the plant with the archive's own logged torque drops the error to a median of 7.0 percent, inside the original bound on every trip. The revision is now spent and nothing else may be adjusted without the same treatment.</w:t>
-      </w:r>
-    </w:p>
-    <w:p>
-      <w:pPr>
-        <w:spacing w:after="160"/>
-      </w:pPr>
-      <w:r>
-        <w:rPr>
-          <w:i w:val="0"/>
-          <w:sz w:val="24"/>
-        </w:rPr>
-        <w:t>The control loop became pipelined rather than synchronous. Originally the chip sent a request and then waited for the reply inside the same 10 millisecond slot, tying its deadline to the scheduling behaviour of a general-purpose laptop. It now requests the next state and acts on the most recent one it holds, so it no longer waits for the laptop inside its own time slot. This is a genuine trade rather than a free win, because the controller now acts on information one cycle old, and that cost is measured and reported.</w:t>
-      </w:r>
-    </w:p>
-    <w:p>
-      <w:pPr>
-        <w:spacing w:after="160"/>
-      </w:pPr>
-      <w:r>
-        <w:rPr>
-          <w:i w:val="0"/>
-          <w:sz w:val="24"/>
-        </w:rPr>
-        <w:t>The link runs over the chip's built-in USB rather than a separate adapter. The design deliberately left this open for gate G3 to settle on measured evidence, and the built-in peripheral carries the loop with zero corrupted and zero lost messages.</w:t>
-      </w:r>
-    </w:p>
-    <w:p>
-      <w:pPr>
-        <w:spacing w:after="160"/>
-      </w:pPr>
-      <w:r>
-        <w:rPr>
-          <w:i w:val="0"/>
-          <w:sz w:val="24"/>
-        </w:rPr>
-        <w:t>Three identified parameters were relabelled as lumped losses. The fitted rolling-resistance coefficient came out 2.2 times larger than an independent measurement on a comparable car, so it is not a tyre property. It is a coefficient occupying that place in the equation and absorbing every speed-dependent loss the model does not represent separately. The parameter file says so, and an automated test fails if that statement is removed.</w:t>
-      </w:r>
-    </w:p>
-    <w:p>
-      <w:pPr>
-        <w:spacing w:after="160"/>
-      </w:pPr>
-      <w:r>
-        <w:rPr>
-          <w:i w:val="0"/>
-          <w:sz w:val="24"/>
-        </w:rPr>
-        <w:t>One of the three physics constraints was switched off. Charge conservation has nothing to constrain over a three-second window, because the logged charge channel does not measurably move within one. Its weight is held at zero and the cost of switching it on is reported as its own arm rather than quietly omitted.</w:t>
-      </w:r>
-    </w:p>
-    <w:p>
-      <w:pPr>
-        <w:spacing w:after="160"/>
-      </w:pPr>
-      <w:r>
-        <w:rPr>
-          <w:i w:val="0"/>
-          <w:sz w:val="24"/>
-        </w:rPr>
-        <w:t>The message format grew to carry a real controller. The state message went from 8 numbers to 10 so that the laptop can send the target speed and its rate of change, the command message from 3 to 4, and the diagnostics message from 11 counters to 16. Gate G3 was then re-measured in full, because the loop the report describes has to be the loop that was measured.</w:t>
-      </w:r>
-    </w:p>
-    <w:p>
-      <w:pPr>
-        <w:spacing w:after="160"/>
-      </w:pPr>
-      <w:r>
-        <w:rPr>
-          <w:i w:val="0"/>
-          <w:sz w:val="24"/>
-        </w:rPr>
-        <w:t>The offline optimiser searches two dimensions rather than three. This is not a simplification for speed. With the speed trajectory fixed by the tracking constraint, the battery power limit can only ever remove power the speed controller needs, which the constraint forbids. It is a safety limiter and not an optimisation lever, and that applies to the learned controller in exactly the same way.</w:t>
-      </w:r>
-    </w:p>
-    <w:p>
-      <w:pPr>
-        <w:spacing w:after="160"/>
-      </w:pPr>
-      <w:r>
-        <w:rPr>
-          <w:i w:val="0"/>
-          <w:sz w:val="24"/>
-        </w:rPr>
-        <w:t>Controllers are now ranked with shed cabin heat charged back. Raw consumption is not comparable between controllers, because one that turns the heating down looks excellent without having managed any energy. Without this correction the week 8 table reads as the learned controller saving 1.3 percent; with it, the same controller is 0.66 percent worse, and the entire difference was 48 to 50 watt-hours of cabin heat per cycle.</w:t>
-      </w:r>
-    </w:p>
-    <w:p>
-      <w:pPr>
-        <w:spacing w:after="160"/>
-      </w:pPr>
-      <w:r>
-        <w:rPr>
-          <w:i w:val="0"/>
-          <w:sz w:val="24"/>
-        </w:rPr>
-        <w:t>The learned controller is 64 units wide rather than the library default of 256. The default would be 68,867 numbers and 269 kilobytes, which is 90 percent of the entire memory budget the forecaster also has to fit inside. At 64 wide it is 4,931 numbers and 19.3 kilobytes, and both figures were measured in a pilot run before the main campaign.</w:t>
-      </w:r>
-    </w:p>
-    <w:p>
-      <w:pPr>
-        <w:spacing w:after="160"/>
-      </w:pPr>
-      <w:r>
-        <w:rPr>
-          <w:i w:val="0"/>
-          <w:sz w:val="24"/>
-        </w:rPr>
-        <w:t>XGBoost and the LSTM ensemble were dropped as deployable options. XGBoost needs roughly 3.7 megabytes against a 300 kilobyte budget, over twelve times too large. The best-looking accuracy figure in the whole comparison was a five-model LSTM ensemble, which takes 99 milliseconds against a 40 millisecond budget. Both remain offline reference points, and the reported number is now always distinguished from the deployable one.</w:t>
-      </w:r>
-    </w:p>
-    <w:p>
-      <w:pPr>
-        <w:spacing w:after="160"/>
-      </w:pPr>
-      <w:r>
-        <w:rPr>
-          <w:i w:val="0"/>
-          <w:sz w:val="24"/>
-        </w:rPr>
-        <w:t>The watchdog was switched on and a fallback path built. Three different failures now get three different responses and three separate counters rather than one generic fault state, because collapsing them is how a controller ends up limping owing to a slow logging task. All three were then triggered deliberately on the board, plus a fourth test that hung the control task on purpose to confirm the watchdog resets the chip. A fallback path that has never been taken is a claim, not a result.</w:t>
-      </w:r>
-    </w:p>
-    <w:p>
-      <w:pPr>
-        <w:pStyle w:val="Heading1"/>
-      </w:pPr>
-      <w:r>
-        <w:t>31. What is left to do</w:t>
-      </w:r>
-    </w:p>
-    <w:p>
-      <w:pPr>
-        <w:spacing w:after="160"/>
-      </w:pPr>
-      <w:r>
-        <w:rPr>
-          <w:i w:val="0"/>
-          <w:sz w:val="24"/>
-        </w:rPr>
-        <w:t>Corrected-model campaign: complete. Corrected-model link-outage sweep: complete. The proposed speed-loop decision transformer was dropped. The classical filter and detector are merged into the code base, switched off by default, with simulation evidence only. B5 and B6 still need a C port and parity checks before board testing. Measuring them on the board requires a separate decision.</w:t>
-      </w:r>
-    </w:p>
-    <w:p>
-      <w:pPr>
-        <w:spacing w:after="160"/>
-      </w:pPr>
-      <w:r>
-        <w:rPr>
-          <w:i/>
-          <w:color w:val="595959"/>
-          <w:sz w:val="24"/>
-        </w:rPr>
-        <w:t>The following week-by-week plan records the earlier project schedule. Current correction status is stated above.</w:t>
+        <w:t>Energy</w:t>
       </w:r>
     </w:p>
     <w:tbl>
@@ -25376,6 +25002,1956 @@
       <w:tr>
         <w:tc>
           <w:tcPr>
+            <w:tcW w:type="dxa" w:w="2412"/>
+          </w:tcPr>
+          <w:p>
+            <w:r/>
+            <w:r>
+              <w:rPr>
+                <w:b/>
+                <w:sz w:val="20"/>
+              </w:rPr>
+              <w:t>Setting</w:t>
+            </w:r>
+          </w:p>
+        </w:tc>
+        <w:tc>
+          <w:tcPr>
+            <w:tcW w:type="dxa" w:w="2412"/>
+          </w:tcPr>
+          <w:p>
+            <w:r/>
+            <w:r>
+              <w:rPr>
+                <w:b/>
+                <w:sz w:val="20"/>
+              </w:rPr>
+              <w:t>Shipped, Wh/km</w:t>
+            </w:r>
+          </w:p>
+        </w:tc>
+        <w:tc>
+          <w:tcPr>
+            <w:tcW w:type="dxa" w:w="2412"/>
+          </w:tcPr>
+          <w:p>
+            <w:r/>
+            <w:r>
+              <w:rPr>
+                <w:b/>
+                <w:sz w:val="20"/>
+              </w:rPr>
+              <w:t>Filter, Wh/km</w:t>
+            </w:r>
+          </w:p>
+        </w:tc>
+        <w:tc>
+          <w:tcPr>
+            <w:tcW w:type="dxa" w:w="2412"/>
+          </w:tcPr>
+          <w:p>
+            <w:r/>
+            <w:r>
+              <w:rPr>
+                <w:b/>
+                <w:sz w:val="20"/>
+              </w:rPr>
+              <w:t>Filter and detector, Wh/km</w:t>
+            </w:r>
+          </w:p>
+        </w:tc>
+      </w:tr>
+      <w:tr>
+        <w:tc>
+          <w:tcPr>
+            <w:tcW w:type="dxa" w:w="2412"/>
+          </w:tcPr>
+          <w:p>
+            <w:r/>
+            <w:r>
+              <w:rPr>
+                <w:sz w:val="20"/>
+              </w:rPr>
+              <w:t>Urban, noise floor</w:t>
+            </w:r>
+          </w:p>
+        </w:tc>
+        <w:tc>
+          <w:tcPr>
+            <w:tcW w:type="dxa" w:w="2412"/>
+          </w:tcPr>
+          <w:p>
+            <w:r/>
+            <w:r>
+              <w:rPr>
+                <w:sz w:val="20"/>
+              </w:rPr>
+              <w:t>168.10</w:t>
+            </w:r>
+          </w:p>
+        </w:tc>
+        <w:tc>
+          <w:tcPr>
+            <w:tcW w:type="dxa" w:w="2412"/>
+          </w:tcPr>
+          <w:p>
+            <w:r/>
+            <w:r>
+              <w:rPr>
+                <w:sz w:val="20"/>
+              </w:rPr>
+              <w:t>168.05</w:t>
+            </w:r>
+          </w:p>
+        </w:tc>
+        <w:tc>
+          <w:tcPr>
+            <w:tcW w:type="dxa" w:w="2412"/>
+          </w:tcPr>
+          <w:p>
+            <w:r/>
+            <w:r>
+              <w:rPr>
+                <w:sz w:val="20"/>
+              </w:rPr>
+              <w:t>167.99</w:t>
+            </w:r>
+          </w:p>
+        </w:tc>
+      </w:tr>
+      <w:tr>
+        <w:tc>
+          <w:tcPr>
+            <w:tcW w:type="dxa" w:w="2412"/>
+          </w:tcPr>
+          <w:p>
+            <w:r/>
+            <w:r>
+              <w:rPr>
+                <w:sz w:val="20"/>
+              </w:rPr>
+              <w:t>Highway, noise floor</w:t>
+            </w:r>
+          </w:p>
+        </w:tc>
+        <w:tc>
+          <w:tcPr>
+            <w:tcW w:type="dxa" w:w="2412"/>
+          </w:tcPr>
+          <w:p>
+            <w:r/>
+            <w:r>
+              <w:rPr>
+                <w:sz w:val="20"/>
+              </w:rPr>
+              <w:t>153.98</w:t>
+            </w:r>
+          </w:p>
+        </w:tc>
+        <w:tc>
+          <w:tcPr>
+            <w:tcW w:type="dxa" w:w="2412"/>
+          </w:tcPr>
+          <w:p>
+            <w:r/>
+            <w:r>
+              <w:rPr>
+                <w:sz w:val="20"/>
+              </w:rPr>
+              <w:t>153.92</w:t>
+            </w:r>
+          </w:p>
+        </w:tc>
+        <w:tc>
+          <w:tcPr>
+            <w:tcW w:type="dxa" w:w="2412"/>
+          </w:tcPr>
+          <w:p>
+            <w:r/>
+            <w:r>
+              <w:rPr>
+                <w:sz w:val="20"/>
+              </w:rPr>
+              <w:t>153.92</w:t>
+            </w:r>
+          </w:p>
+        </w:tc>
+      </w:tr>
+      <w:tr>
+        <w:tc>
+          <w:tcPr>
+            <w:tcW w:type="dxa" w:w="2412"/>
+          </w:tcPr>
+          <w:p>
+            <w:r/>
+            <w:r>
+              <w:rPr>
+                <w:sz w:val="20"/>
+              </w:rPr>
+              <w:t>Aggressive (US06), noise floor</w:t>
+            </w:r>
+          </w:p>
+        </w:tc>
+        <w:tc>
+          <w:tcPr>
+            <w:tcW w:type="dxa" w:w="2412"/>
+          </w:tcPr>
+          <w:p>
+            <w:r/>
+            <w:r>
+              <w:rPr>
+                <w:sz w:val="20"/>
+              </w:rPr>
+              <w:t>190.79</w:t>
+            </w:r>
+          </w:p>
+        </w:tc>
+        <w:tc>
+          <w:tcPr>
+            <w:tcW w:type="dxa" w:w="2412"/>
+          </w:tcPr>
+          <w:p>
+            <w:r/>
+            <w:r>
+              <w:rPr>
+                <w:sz w:val="20"/>
+              </w:rPr>
+              <w:t>190.61</w:t>
+            </w:r>
+          </w:p>
+        </w:tc>
+        <w:tc>
+          <w:tcPr>
+            <w:tcW w:type="dxa" w:w="2412"/>
+          </w:tcPr>
+          <w:p>
+            <w:r/>
+            <w:r>
+              <w:rPr>
+                <w:sz w:val="20"/>
+              </w:rPr>
+              <w:t>190.59</w:t>
+            </w:r>
+          </w:p>
+        </w:tc>
+      </w:tr>
+      <w:tr>
+        <w:tc>
+          <w:tcPr>
+            <w:tcW w:type="dxa" w:w="2412"/>
+          </w:tcPr>
+          <w:p>
+            <w:r/>
+            <w:r>
+              <w:rPr>
+                <w:sz w:val="20"/>
+              </w:rPr>
+              <w:t>US06, noise floor, second seed</w:t>
+            </w:r>
+          </w:p>
+        </w:tc>
+        <w:tc>
+          <w:tcPr>
+            <w:tcW w:type="dxa" w:w="2412"/>
+          </w:tcPr>
+          <w:p>
+            <w:r/>
+            <w:r>
+              <w:rPr>
+                <w:sz w:val="20"/>
+              </w:rPr>
+              <w:t>190.98</w:t>
+            </w:r>
+          </w:p>
+        </w:tc>
+        <w:tc>
+          <w:tcPr>
+            <w:tcW w:type="dxa" w:w="2412"/>
+          </w:tcPr>
+          <w:p>
+            <w:r/>
+            <w:r>
+              <w:rPr>
+                <w:sz w:val="20"/>
+              </w:rPr>
+              <w:t>190.56</w:t>
+            </w:r>
+          </w:p>
+        </w:tc>
+        <w:tc>
+          <w:tcPr>
+            <w:tcW w:type="dxa" w:w="2412"/>
+          </w:tcPr>
+          <w:p>
+            <w:r/>
+            <w:r>
+              <w:rPr>
+                <w:sz w:val="20"/>
+              </w:rPr>
+              <w:t>190.63</w:t>
+            </w:r>
+          </w:p>
+        </w:tc>
+      </w:tr>
+      <w:tr>
+        <w:tc>
+          <w:tcPr>
+            <w:tcW w:type="dxa" w:w="2412"/>
+          </w:tcPr>
+          <w:p>
+            <w:r/>
+            <w:r>
+              <w:rPr>
+                <w:sz w:val="20"/>
+              </w:rPr>
+              <w:t>US06, 3 times the noise</w:t>
+            </w:r>
+          </w:p>
+        </w:tc>
+        <w:tc>
+          <w:tcPr>
+            <w:tcW w:type="dxa" w:w="2412"/>
+          </w:tcPr>
+          <w:p>
+            <w:r/>
+            <w:r>
+              <w:rPr>
+                <w:sz w:val="20"/>
+              </w:rPr>
+              <w:t>191.27</w:t>
+            </w:r>
+          </w:p>
+        </w:tc>
+        <w:tc>
+          <w:tcPr>
+            <w:tcW w:type="dxa" w:w="2412"/>
+          </w:tcPr>
+          <w:p>
+            <w:r/>
+            <w:r>
+              <w:rPr>
+                <w:sz w:val="20"/>
+              </w:rPr>
+              <w:t>190.67</w:t>
+            </w:r>
+          </w:p>
+        </w:tc>
+        <w:tc>
+          <w:tcPr>
+            <w:tcW w:type="dxa" w:w="2412"/>
+          </w:tcPr>
+          <w:p>
+            <w:r/>
+            <w:r>
+              <w:rPr>
+                <w:sz w:val="20"/>
+              </w:rPr>
+              <w:t>190.54</w:t>
+            </w:r>
+          </w:p>
+        </w:tc>
+      </w:tr>
+      <w:tr>
+        <w:tc>
+          <w:tcPr>
+            <w:tcW w:type="dxa" w:w="2412"/>
+          </w:tcPr>
+          <w:p>
+            <w:r/>
+            <w:r>
+              <w:rPr>
+                <w:sz w:val="20"/>
+              </w:rPr>
+              <w:t>US06, 10 times the noise</w:t>
+            </w:r>
+          </w:p>
+        </w:tc>
+        <w:tc>
+          <w:tcPr>
+            <w:tcW w:type="dxa" w:w="2412"/>
+          </w:tcPr>
+          <w:p>
+            <w:r/>
+            <w:r>
+              <w:rPr>
+                <w:sz w:val="20"/>
+              </w:rPr>
+              <w:t>200.42</w:t>
+            </w:r>
+          </w:p>
+        </w:tc>
+        <w:tc>
+          <w:tcPr>
+            <w:tcW w:type="dxa" w:w="2412"/>
+          </w:tcPr>
+          <w:p>
+            <w:r/>
+            <w:r>
+              <w:rPr>
+                <w:sz w:val="20"/>
+              </w:rPr>
+              <w:t>190.80</w:t>
+            </w:r>
+          </w:p>
+        </w:tc>
+        <w:tc>
+          <w:tcPr>
+            <w:tcW w:type="dxa" w:w="2412"/>
+          </w:tcPr>
+          <w:p>
+            <w:r/>
+            <w:r>
+              <w:rPr>
+                <w:sz w:val="20"/>
+              </w:rPr>
+              <w:t>190.79</w:t>
+            </w:r>
+          </w:p>
+        </w:tc>
+      </w:tr>
+    </w:tbl>
+    <w:p>
+      <w:pPr>
+        <w:spacing w:after="40"/>
+      </w:pPr>
+    </w:p>
+    <w:p>
+      <w:pPr>
+        <w:spacing w:after="160"/>
+      </w:pPr>
+      <w:r>
+        <w:rPr>
+          <w:i/>
+          <w:color w:val="595959"/>
+          <w:sz w:val="18"/>
+        </w:rPr>
+        <w:t>Table. Energy on the comparable scale. One run per cell, each on the firmware version its column names, confirmed from the chip's own report. MEASURED on the board.</w:t>
+      </w:r>
+    </w:p>
+    <w:p>
+      <w:pPr>
+        <w:spacing w:after="160"/>
+      </w:pPr>
+      <w:r>
+        <w:rPr>
+          <w:i w:val="0"/>
+          <w:sz w:val="24"/>
+        </w:rPr>
+        <w:t>Ten times the sensor noise costs the shipped loop 9.44 watt-hours per kilometre, 4.9 per cent. With the filter it costs 0.24, and with the detector added 0.16. The whole of the loss is recovered.</w:t>
+      </w:r>
+    </w:p>
+    <w:p>
+      <w:pPr>
+        <w:spacing w:after="160"/>
+      </w:pPr>
+      <w:r>
+        <w:rPr>
+          <w:i w:val="0"/>
+          <w:sz w:val="24"/>
+        </w:rPr>
+        <w:t>At ordinary noise the three versions are within 0.10 per cent of one another on every cycle. The shipped loop's own two runs of the same setting differ by 0.10 per cent, so no saving is claimed there.</w:t>
+      </w:r>
+    </w:p>
+    <w:p>
+      <w:pPr>
+        <w:pStyle w:val="Heading2"/>
+      </w:pPr>
+      <w:r>
+        <w:t>Peak battery current and tracking</w:t>
+      </w:r>
+    </w:p>
+    <w:tbl>
+      <w:tblPr>
+        <w:tblStyle w:val="LightGrid-Accent1"/>
+        <w:tblW w:type="auto" w:w="0"/>
+        <w:jc w:val="center"/>
+        <w:tblLook w:firstColumn="1" w:firstRow="1" w:lastColumn="0" w:lastRow="0" w:noHBand="0" w:noVBand="1" w:val="04A0"/>
+      </w:tblPr>
+      <w:tblGrid>
+        <w:gridCol w:w="2412"/>
+        <w:gridCol w:w="2412"/>
+        <w:gridCol w:w="2412"/>
+        <w:gridCol w:w="2412"/>
+      </w:tblGrid>
+      <w:tr>
+        <w:tc>
+          <w:tcPr>
+            <w:tcW w:type="dxa" w:w="2412"/>
+          </w:tcPr>
+          <w:p>
+            <w:r/>
+            <w:r>
+              <w:rPr>
+                <w:b/>
+                <w:sz w:val="20"/>
+              </w:rPr>
+              <w:t>Setting</w:t>
+            </w:r>
+          </w:p>
+        </w:tc>
+        <w:tc>
+          <w:tcPr>
+            <w:tcW w:type="dxa" w:w="2412"/>
+          </w:tcPr>
+          <w:p>
+            <w:r/>
+            <w:r>
+              <w:rPr>
+                <w:b/>
+                <w:sz w:val="20"/>
+              </w:rPr>
+              <w:t>Shipped</w:t>
+            </w:r>
+          </w:p>
+        </w:tc>
+        <w:tc>
+          <w:tcPr>
+            <w:tcW w:type="dxa" w:w="2412"/>
+          </w:tcPr>
+          <w:p>
+            <w:r/>
+            <w:r>
+              <w:rPr>
+                <w:b/>
+                <w:sz w:val="20"/>
+              </w:rPr>
+              <w:t>Filter</w:t>
+            </w:r>
+          </w:p>
+        </w:tc>
+        <w:tc>
+          <w:tcPr>
+            <w:tcW w:type="dxa" w:w="2412"/>
+          </w:tcPr>
+          <w:p>
+            <w:r/>
+            <w:r>
+              <w:rPr>
+                <w:b/>
+                <w:sz w:val="20"/>
+              </w:rPr>
+              <w:t>Filter and detector</w:t>
+            </w:r>
+          </w:p>
+        </w:tc>
+      </w:tr>
+      <w:tr>
+        <w:tc>
+          <w:tcPr>
+            <w:tcW w:type="dxa" w:w="2412"/>
+          </w:tcPr>
+          <w:p>
+            <w:r/>
+            <w:r>
+              <w:rPr>
+                <w:sz w:val="20"/>
+              </w:rPr>
+              <w:t>Urban, noise floor</w:t>
+            </w:r>
+          </w:p>
+        </w:tc>
+        <w:tc>
+          <w:tcPr>
+            <w:tcW w:type="dxa" w:w="2412"/>
+          </w:tcPr>
+          <w:p>
+            <w:r/>
+            <w:r>
+              <w:rPr>
+                <w:sz w:val="20"/>
+              </w:rPr>
+              <w:t>118 A, 0.0104 m/s</w:t>
+            </w:r>
+          </w:p>
+        </w:tc>
+        <w:tc>
+          <w:tcPr>
+            <w:tcW w:type="dxa" w:w="2412"/>
+          </w:tcPr>
+          <w:p>
+            <w:r/>
+            <w:r>
+              <w:rPr>
+                <w:sz w:val="20"/>
+              </w:rPr>
+              <w:t>111 A, 0.0193 m/s</w:t>
+            </w:r>
+          </w:p>
+        </w:tc>
+        <w:tc>
+          <w:tcPr>
+            <w:tcW w:type="dxa" w:w="2412"/>
+          </w:tcPr>
+          <w:p>
+            <w:r/>
+            <w:r>
+              <w:rPr>
+                <w:sz w:val="20"/>
+              </w:rPr>
+              <w:t>110 A, 0.0119 m/s</w:t>
+            </w:r>
+          </w:p>
+        </w:tc>
+      </w:tr>
+      <w:tr>
+        <w:tc>
+          <w:tcPr>
+            <w:tcW w:type="dxa" w:w="2412"/>
+          </w:tcPr>
+          <w:p>
+            <w:r/>
+            <w:r>
+              <w:rPr>
+                <w:sz w:val="20"/>
+              </w:rPr>
+              <w:t>Highway, noise floor</w:t>
+            </w:r>
+          </w:p>
+        </w:tc>
+        <w:tc>
+          <w:tcPr>
+            <w:tcW w:type="dxa" w:w="2412"/>
+          </w:tcPr>
+          <w:p>
+            <w:r/>
+            <w:r>
+              <w:rPr>
+                <w:sz w:val="20"/>
+              </w:rPr>
+              <w:t>97 A, 0.0055 m/s</w:t>
+            </w:r>
+          </w:p>
+        </w:tc>
+        <w:tc>
+          <w:tcPr>
+            <w:tcW w:type="dxa" w:w="2412"/>
+          </w:tcPr>
+          <w:p>
+            <w:r/>
+            <w:r>
+              <w:rPr>
+                <w:sz w:val="20"/>
+              </w:rPr>
+              <w:t>92 A, 0.0035 m/s</w:t>
+            </w:r>
+          </w:p>
+        </w:tc>
+        <w:tc>
+          <w:tcPr>
+            <w:tcW w:type="dxa" w:w="2412"/>
+          </w:tcPr>
+          <w:p>
+            <w:r/>
+            <w:r>
+              <w:rPr>
+                <w:sz w:val="20"/>
+              </w:rPr>
+              <w:t>92 A, 0.0031 m/s</w:t>
+            </w:r>
+          </w:p>
+        </w:tc>
+      </w:tr>
+      <w:tr>
+        <w:tc>
+          <w:tcPr>
+            <w:tcW w:type="dxa" w:w="2412"/>
+          </w:tcPr>
+          <w:p>
+            <w:r/>
+            <w:r>
+              <w:rPr>
+                <w:sz w:val="20"/>
+              </w:rPr>
+              <w:t>Aggressive (US06), noise floor</w:t>
+            </w:r>
+          </w:p>
+        </w:tc>
+        <w:tc>
+          <w:tcPr>
+            <w:tcW w:type="dxa" w:w="2412"/>
+          </w:tcPr>
+          <w:p>
+            <w:r/>
+            <w:r>
+              <w:rPr>
+                <w:sz w:val="20"/>
+              </w:rPr>
+              <w:t>284 A, 0.0161 m/s</w:t>
+            </w:r>
+          </w:p>
+        </w:tc>
+        <w:tc>
+          <w:tcPr>
+            <w:tcW w:type="dxa" w:w="2412"/>
+          </w:tcPr>
+          <w:p>
+            <w:r/>
+            <w:r>
+              <w:rPr>
+                <w:sz w:val="20"/>
+              </w:rPr>
+              <w:t>262 A, 0.0112 m/s</w:t>
+            </w:r>
+          </w:p>
+        </w:tc>
+        <w:tc>
+          <w:tcPr>
+            <w:tcW w:type="dxa" w:w="2412"/>
+          </w:tcPr>
+          <w:p>
+            <w:r/>
+            <w:r>
+              <w:rPr>
+                <w:sz w:val="20"/>
+              </w:rPr>
+              <w:t>261 A, 0.0103 m/s</w:t>
+            </w:r>
+          </w:p>
+        </w:tc>
+      </w:tr>
+      <w:tr>
+        <w:tc>
+          <w:tcPr>
+            <w:tcW w:type="dxa" w:w="2412"/>
+          </w:tcPr>
+          <w:p>
+            <w:r/>
+            <w:r>
+              <w:rPr>
+                <w:sz w:val="20"/>
+              </w:rPr>
+              <w:t>US06, noise floor, second seed</w:t>
+            </w:r>
+          </w:p>
+        </w:tc>
+        <w:tc>
+          <w:tcPr>
+            <w:tcW w:type="dxa" w:w="2412"/>
+          </w:tcPr>
+          <w:p>
+            <w:r/>
+            <w:r>
+              <w:rPr>
+                <w:sz w:val="20"/>
+              </w:rPr>
+              <w:t>295 A, 0.0271 m/s</w:t>
+            </w:r>
+          </w:p>
+        </w:tc>
+        <w:tc>
+          <w:tcPr>
+            <w:tcW w:type="dxa" w:w="2412"/>
+          </w:tcPr>
+          <w:p>
+            <w:r/>
+            <w:r>
+              <w:rPr>
+                <w:sz w:val="20"/>
+              </w:rPr>
+              <w:t>260 A, 0.0086 m/s</w:t>
+            </w:r>
+          </w:p>
+        </w:tc>
+        <w:tc>
+          <w:tcPr>
+            <w:tcW w:type="dxa" w:w="2412"/>
+          </w:tcPr>
+          <w:p>
+            <w:r/>
+            <w:r>
+              <w:rPr>
+                <w:sz w:val="20"/>
+              </w:rPr>
+              <w:t>263 A, 0.0144 m/s</w:t>
+            </w:r>
+          </w:p>
+        </w:tc>
+      </w:tr>
+      <w:tr>
+        <w:tc>
+          <w:tcPr>
+            <w:tcW w:type="dxa" w:w="2412"/>
+          </w:tcPr>
+          <w:p>
+            <w:r/>
+            <w:r>
+              <w:rPr>
+                <w:sz w:val="20"/>
+              </w:rPr>
+              <w:t>US06, 3 times the noise</w:t>
+            </w:r>
+          </w:p>
+        </w:tc>
+        <w:tc>
+          <w:tcPr>
+            <w:tcW w:type="dxa" w:w="2412"/>
+          </w:tcPr>
+          <w:p>
+            <w:r/>
+            <w:r>
+              <w:rPr>
+                <w:sz w:val="20"/>
+              </w:rPr>
+              <w:t>330 A, 0.0124 m/s</w:t>
+            </w:r>
+          </w:p>
+        </w:tc>
+        <w:tc>
+          <w:tcPr>
+            <w:tcW w:type="dxa" w:w="2412"/>
+          </w:tcPr>
+          <w:p>
+            <w:r/>
+            <w:r>
+              <w:rPr>
+                <w:sz w:val="20"/>
+              </w:rPr>
+              <w:t>273 A, 0.0163 m/s</w:t>
+            </w:r>
+          </w:p>
+        </w:tc>
+        <w:tc>
+          <w:tcPr>
+            <w:tcW w:type="dxa" w:w="2412"/>
+          </w:tcPr>
+          <w:p>
+            <w:r/>
+            <w:r>
+              <w:rPr>
+                <w:sz w:val="20"/>
+              </w:rPr>
+              <w:t>265 A, 0.0095 m/s</w:t>
+            </w:r>
+          </w:p>
+        </w:tc>
+      </w:tr>
+      <w:tr>
+        <w:tc>
+          <w:tcPr>
+            <w:tcW w:type="dxa" w:w="2412"/>
+          </w:tcPr>
+          <w:p>
+            <w:r/>
+            <w:r>
+              <w:rPr>
+                <w:sz w:val="20"/>
+              </w:rPr>
+              <w:t>US06, 10 times the noise</w:t>
+            </w:r>
+          </w:p>
+        </w:tc>
+        <w:tc>
+          <w:tcPr>
+            <w:tcW w:type="dxa" w:w="2412"/>
+          </w:tcPr>
+          <w:p>
+            <w:r/>
+            <w:r>
+              <w:rPr>
+                <w:sz w:val="20"/>
+              </w:rPr>
+              <w:t>341 A, 0.0257 m/s</w:t>
+            </w:r>
+          </w:p>
+        </w:tc>
+        <w:tc>
+          <w:tcPr>
+            <w:tcW w:type="dxa" w:w="2412"/>
+          </w:tcPr>
+          <w:p>
+            <w:r/>
+            <w:r>
+              <w:rPr>
+                <w:sz w:val="20"/>
+              </w:rPr>
+              <w:t>288 A, 0.0249 m/s</w:t>
+            </w:r>
+          </w:p>
+        </w:tc>
+        <w:tc>
+          <w:tcPr>
+            <w:tcW w:type="dxa" w:w="2412"/>
+          </w:tcPr>
+          <w:p>
+            <w:r/>
+            <w:r>
+              <w:rPr>
+                <w:sz w:val="20"/>
+              </w:rPr>
+              <w:t>286 A, 0.0254 m/s</w:t>
+            </w:r>
+          </w:p>
+        </w:tc>
+      </w:tr>
+    </w:tbl>
+    <w:p>
+      <w:pPr>
+        <w:spacing w:after="40"/>
+      </w:pPr>
+    </w:p>
+    <w:p>
+      <w:pPr>
+        <w:spacing w:after="160"/>
+      </w:pPr>
+      <w:r>
+        <w:rPr>
+          <w:i/>
+          <w:color w:val="595959"/>
+          <w:sz w:val="18"/>
+        </w:rPr>
+        <w:t>Table. Peak battery current, then tracking error (root-mean-square). MEASURED on the board.</w:t>
+      </w:r>
+    </w:p>
+    <w:p>
+      <w:pPr>
+        <w:spacing w:after="160"/>
+      </w:pPr>
+      <w:r>
+        <w:rPr>
+          <w:i w:val="0"/>
+          <w:sz w:val="24"/>
+        </w:rPr>
+        <w:t>Under ten times the noise the shipped loop's peak current reaches 341 amps. The filter holds it at 288.</w:t>
+      </w:r>
+    </w:p>
+    <w:p>
+      <w:pPr>
+        <w:spacing w:after="160"/>
+      </w:pPr>
+      <w:r>
+        <w:rPr>
+          <w:i w:val="0"/>
+          <w:sz w:val="24"/>
+        </w:rPr>
+        <w:t>Tracking error is under 0.03 metres per second everywhere, and this table cannot rank the versions more finely than that. The shipped loop's two runs of one setting read 0.0161 and 0.0271.</w:t>
+      </w:r>
+    </w:p>
+    <w:p>
+      <w:pPr>
+        <w:pStyle w:val="Heading2"/>
+      </w:pPr>
+      <w:r>
+        <w:t>What it costs on the chip</w:t>
+      </w:r>
+    </w:p>
+    <w:p>
+      <w:pPr>
+        <w:spacing w:after="160"/>
+      </w:pPr>
+      <w:r>
+        <w:rPr>
+          <w:i w:val="0"/>
+          <w:sz w:val="24"/>
+        </w:rPr>
+        <w:t>The longest the control computation took was 62 microseconds as shipped, 69 with the filter and 73 with the detector, of a 10,000 microsecond period. No control step was late in any run.</w:t>
+      </w:r>
+    </w:p>
+    <w:p>
+      <w:pPr>
+        <w:pStyle w:val="Heading2"/>
+      </w:pPr>
+      <w:r>
+        <w:t>The detector on a healthy sensor</w:t>
+      </w:r>
+    </w:p>
+    <w:p>
+      <w:pPr>
+        <w:spacing w:after="160"/>
+      </w:pPr>
+      <w:r>
+        <w:rPr>
+          <w:i w:val="0"/>
+          <w:sz w:val="24"/>
+        </w:rPr>
+        <w:t>No fault was injected in this campaign, so it says nothing about whether the detector catches one. What it measures is the opposite error. In 1.26 hours the detector raised its flag 1 time on a sensor with nothing wrong with it, in the urban run, and dropped it again after 50 control steps, the shortest its own rule allows. In simulation it raised none in 3.8 hours. The campaign records that the flag went up and not when or why, so the cause is open.</w:t>
+      </w:r>
+    </w:p>
+    <w:p>
+      <w:pPr>
+        <w:pStyle w:val="Heading2"/>
+      </w:pPr>
+      <w:r>
+        <w:t>Against the criteria</w:t>
+      </w:r>
+    </w:p>
+    <w:p>
+      <w:pPr>
+        <w:spacing w:after="160"/>
+      </w:pPr>
+      <w:r>
+        <w:rPr>
+          <w:i w:val="0"/>
+          <w:sz w:val="24"/>
+        </w:rPr>
+        <w:t>The criteria were fixed in the design before any of this was built, and the script that applies them was committed before the runs finished.</w:t>
+      </w:r>
+    </w:p>
+    <w:tbl>
+      <w:tblPr>
+        <w:tblStyle w:val="LightGrid-Accent1"/>
+        <w:tblW w:type="auto" w:w="0"/>
+        <w:jc w:val="center"/>
+        <w:tblLook w:firstColumn="1" w:firstRow="1" w:lastColumn="0" w:lastRow="0" w:noHBand="0" w:noVBand="1" w:val="04A0"/>
+      </w:tblPr>
+      <w:tblGrid>
+        <w:gridCol w:w="3216"/>
+        <w:gridCol w:w="3216"/>
+        <w:gridCol w:w="3216"/>
+      </w:tblGrid>
+      <w:tr>
+        <w:tc>
+          <w:tcPr>
+            <w:tcW w:type="dxa" w:w="3216"/>
+          </w:tcPr>
+          <w:p>
+            <w:r/>
+            <w:r>
+              <w:rPr>
+                <w:b/>
+                <w:sz w:val="20"/>
+              </w:rPr>
+              <w:t>Criterion</w:t>
+            </w:r>
+          </w:p>
+        </w:tc>
+        <w:tc>
+          <w:tcPr>
+            <w:tcW w:type="dxa" w:w="3216"/>
+          </w:tcPr>
+          <w:p>
+            <w:r/>
+            <w:r>
+              <w:rPr>
+                <w:b/>
+                <w:sz w:val="20"/>
+              </w:rPr>
+              <w:t>Filter</w:t>
+            </w:r>
+          </w:p>
+        </w:tc>
+        <w:tc>
+          <w:tcPr>
+            <w:tcW w:type="dxa" w:w="3216"/>
+          </w:tcPr>
+          <w:p>
+            <w:r/>
+            <w:r>
+              <w:rPr>
+                <w:b/>
+                <w:sz w:val="20"/>
+              </w:rPr>
+              <w:t>Filter and detector</w:t>
+            </w:r>
+          </w:p>
+        </w:tc>
+      </w:tr>
+      <w:tr>
+        <w:tc>
+          <w:tcPr>
+            <w:tcW w:type="dxa" w:w="3216"/>
+          </w:tcPr>
+          <w:p>
+            <w:r/>
+            <w:r>
+              <w:rPr>
+                <w:sz w:val="20"/>
+              </w:rPr>
+              <w:t>Clean energy within 0.2% of the shipped loop</w:t>
+            </w:r>
+          </w:p>
+        </w:tc>
+        <w:tc>
+          <w:tcPr>
+            <w:tcW w:type="dxa" w:w="3216"/>
+          </w:tcPr>
+          <w:p>
+            <w:r/>
+            <w:r>
+              <w:rPr>
+                <w:sz w:val="20"/>
+              </w:rPr>
+              <w:t>pass</w:t>
+            </w:r>
+          </w:p>
+        </w:tc>
+        <w:tc>
+          <w:tcPr>
+            <w:tcW w:type="dxa" w:w="3216"/>
+          </w:tcPr>
+          <w:p>
+            <w:r/>
+            <w:r>
+              <w:rPr>
+                <w:sz w:val="20"/>
+              </w:rPr>
+              <w:t>pass</w:t>
+            </w:r>
+          </w:p>
+        </w:tc>
+      </w:tr>
+      <w:tr>
+        <w:tc>
+          <w:tcPr>
+            <w:tcW w:type="dxa" w:w="3216"/>
+          </w:tcPr>
+          <w:p>
+            <w:r/>
+            <w:r>
+              <w:rPr>
+                <w:sz w:val="20"/>
+              </w:rPr>
+              <w:t>Clean tracking within 0.005 m/s of the shipped loop</w:t>
+            </w:r>
+          </w:p>
+        </w:tc>
+        <w:tc>
+          <w:tcPr>
+            <w:tcW w:type="dxa" w:w="3216"/>
+          </w:tcPr>
+          <w:p>
+            <w:r/>
+            <w:r>
+              <w:rPr>
+                <w:sz w:val="20"/>
+              </w:rPr>
+              <w:t>FAIL</w:t>
+            </w:r>
+          </w:p>
+        </w:tc>
+        <w:tc>
+          <w:tcPr>
+            <w:tcW w:type="dxa" w:w="3216"/>
+          </w:tcPr>
+          <w:p>
+            <w:r/>
+            <w:r>
+              <w:rPr>
+                <w:sz w:val="20"/>
+              </w:rPr>
+              <w:t>pass</w:t>
+            </w:r>
+          </w:p>
+        </w:tc>
+      </w:tr>
+      <w:tr>
+        <w:tc>
+          <w:tcPr>
+            <w:tcW w:type="dxa" w:w="3216"/>
+          </w:tcPr>
+          <w:p>
+            <w:r/>
+            <w:r>
+              <w:rPr>
+                <w:sz w:val="20"/>
+              </w:rPr>
+              <w:t>At least half of the 10x noise loss recovered</w:t>
+            </w:r>
+          </w:p>
+        </w:tc>
+        <w:tc>
+          <w:tcPr>
+            <w:tcW w:type="dxa" w:w="3216"/>
+          </w:tcPr>
+          <w:p>
+            <w:r/>
+            <w:r>
+              <w:rPr>
+                <w:sz w:val="20"/>
+              </w:rPr>
+              <w:t>pass</w:t>
+            </w:r>
+          </w:p>
+        </w:tc>
+        <w:tc>
+          <w:tcPr>
+            <w:tcW w:type="dxa" w:w="3216"/>
+          </w:tcPr>
+          <w:p>
+            <w:r/>
+            <w:r>
+              <w:rPr>
+                <w:sz w:val="20"/>
+              </w:rPr>
+              <w:t>pass</w:t>
+            </w:r>
+          </w:p>
+        </w:tc>
+      </w:tr>
+      <w:tr>
+        <w:tc>
+          <w:tcPr>
+            <w:tcW w:type="dxa" w:w="3216"/>
+          </w:tcPr>
+          <w:p>
+            <w:r/>
+            <w:r>
+              <w:rPr>
+                <w:sz w:val="20"/>
+              </w:rPr>
+              <w:t>Tracking under 0.1 m/s in every run</w:t>
+            </w:r>
+          </w:p>
+        </w:tc>
+        <w:tc>
+          <w:tcPr>
+            <w:tcW w:type="dxa" w:w="3216"/>
+          </w:tcPr>
+          <w:p>
+            <w:r/>
+            <w:r>
+              <w:rPr>
+                <w:sz w:val="20"/>
+              </w:rPr>
+              <w:t>pass</w:t>
+            </w:r>
+          </w:p>
+        </w:tc>
+        <w:tc>
+          <w:tcPr>
+            <w:tcW w:type="dxa" w:w="3216"/>
+          </w:tcPr>
+          <w:p>
+            <w:r/>
+            <w:r>
+              <w:rPr>
+                <w:sz w:val="20"/>
+              </w:rPr>
+              <w:t>pass</w:t>
+            </w:r>
+          </w:p>
+        </w:tc>
+      </w:tr>
+      <w:tr>
+        <w:tc>
+          <w:tcPr>
+            <w:tcW w:type="dxa" w:w="3216"/>
+          </w:tcPr>
+          <w:p>
+            <w:r/>
+            <w:r>
+              <w:rPr>
+                <w:sz w:val="20"/>
+              </w:rPr>
+              <w:t>No late control step</w:t>
+            </w:r>
+          </w:p>
+        </w:tc>
+        <w:tc>
+          <w:tcPr>
+            <w:tcW w:type="dxa" w:w="3216"/>
+          </w:tcPr>
+          <w:p>
+            <w:r/>
+            <w:r>
+              <w:rPr>
+                <w:sz w:val="20"/>
+              </w:rPr>
+              <w:t>pass</w:t>
+            </w:r>
+          </w:p>
+        </w:tc>
+        <w:tc>
+          <w:tcPr>
+            <w:tcW w:type="dxa" w:w="3216"/>
+          </w:tcPr>
+          <w:p>
+            <w:r/>
+            <w:r>
+              <w:rPr>
+                <w:sz w:val="20"/>
+              </w:rPr>
+              <w:t>pass</w:t>
+            </w:r>
+          </w:p>
+        </w:tc>
+      </w:tr>
+      <w:tr>
+        <w:tc>
+          <w:tcPr>
+            <w:tcW w:type="dxa" w:w="3216"/>
+          </w:tcPr>
+          <w:p>
+            <w:r/>
+            <w:r>
+              <w:rPr>
+                <w:sz w:val="20"/>
+              </w:rPr>
+              <w:t>No false alarm on a healthy sensor</w:t>
+            </w:r>
+          </w:p>
+        </w:tc>
+        <w:tc>
+          <w:tcPr>
+            <w:tcW w:type="dxa" w:w="3216"/>
+          </w:tcPr>
+          <w:p>
+            <w:r/>
+            <w:r>
+              <w:rPr>
+                <w:sz w:val="20"/>
+              </w:rPr>
+              <w:t>not applicable</w:t>
+            </w:r>
+          </w:p>
+        </w:tc>
+        <w:tc>
+          <w:tcPr>
+            <w:tcW w:type="dxa" w:w="3216"/>
+          </w:tcPr>
+          <w:p>
+            <w:r/>
+            <w:r>
+              <w:rPr>
+                <w:sz w:val="20"/>
+              </w:rPr>
+              <w:t>FAIL</w:t>
+            </w:r>
+          </w:p>
+        </w:tc>
+      </w:tr>
+    </w:tbl>
+    <w:p>
+      <w:pPr>
+        <w:spacing w:after="40"/>
+      </w:pPr>
+    </w:p>
+    <w:p>
+      <w:pPr>
+        <w:spacing w:after="160"/>
+      </w:pPr>
+      <w:r>
+        <w:rPr>
+          <w:i w:val="0"/>
+          <w:sz w:val="24"/>
+        </w:rPr>
+        <w:t>The filter's failure is on the urban cycle: 0.0193 against 0.0104, 0.0089 apart where the bound is 0.005. On the other two cycles it tracks better than the shipped loop. The gap is smaller than the 0.011 by which the shipped loop differs from itself, so the bound asks for more than one run per cell can show. It stays a failure because the bound came first.</w:t>
+      </w:r>
+    </w:p>
+    <w:p>
+      <w:pPr>
+        <w:pStyle w:val="Heading2"/>
+      </w:pPr>
+      <w:r>
+        <w:t>What this does not cover</w:t>
+      </w:r>
+    </w:p>
+    <w:p>
+      <w:pPr>
+        <w:pStyle w:val="ListBullet"/>
+        <w:spacing w:after="80"/>
+      </w:pPr>
+      <w:r>
+        <w:t>Sensor faults. A stuck, dropped or offset speed reading was tested in simulation only.</w:t>
+      </w:r>
+    </w:p>
+    <w:p>
+      <w:pPr>
+        <w:pStyle w:val="ListBullet"/>
+        <w:spacing w:after="80"/>
+      </w:pPr>
+      <w:r>
+        <w:t>Twenty-five times the noise, and noise that changes during a drive.</w:t>
+      </w:r>
+    </w:p>
+    <w:p>
+      <w:pPr>
+        <w:pStyle w:val="ListBullet"/>
+        <w:spacing w:after="80"/>
+      </w:pPr>
+      <w:r>
+        <w:t>A car heavier than the model the filter carries.</w:t>
+      </w:r>
+    </w:p>
+    <w:p>
+      <w:pPr>
+        <w:pStyle w:val="ListBullet"/>
+        <w:spacing w:after="80"/>
+      </w:pPr>
+      <w:r>
+        <w:t>Repeats. Each cell is one run.</w:t>
+      </w:r>
+    </w:p>
+    <w:p>
+      <w:pPr>
+        <w:pStyle w:val="Heading1"/>
+      </w:pPr>
+      <w:r>
+        <w:t>30. Results that went against expectation</w:t>
+      </w:r>
+    </w:p>
+    <w:p>
+      <w:pPr>
+        <w:spacing w:after="160"/>
+      </w:pPr>
+      <w:r>
+        <w:rPr>
+          <w:i w:val="0"/>
+          <w:sz w:val="24"/>
+        </w:rPr>
+        <w:t>Each one is reported because each one changes what the paper may claim, and a supervisor reading the work will find them more convincing than the successes.</w:t>
+      </w:r>
+    </w:p>
+    <w:p>
+      <w:pPr>
+        <w:pStyle w:val="Heading2"/>
+      </w:pPr>
+      <w:r>
+        <w:t>The learned controller loses to two thresholds</w:t>
+      </w:r>
+    </w:p>
+    <w:p>
+      <w:pPr>
+        <w:spacing w:after="160"/>
+      </w:pPr>
+      <w:r>
+        <w:rPr>
+          <w:i w:val="0"/>
+          <w:sz w:val="24"/>
+        </w:rPr>
+        <w:t>Five independent training runs, and every one of them finishes worse than a controller that is two thresholds and a taper, once the cabin heating they switched off is charged back. The offline optimum predicted it and the training measured it, and the two do not depend on each other. Section 21.</w:t>
+      </w:r>
+    </w:p>
+    <w:p>
+      <w:pPr>
+        <w:pStyle w:val="Heading2"/>
+      </w:pPr>
+      <w:r>
+        <w:t>The forecast makes no difference to the controller</w:t>
+      </w:r>
+    </w:p>
+    <w:p>
+      <w:pPr>
+        <w:spacing w:after="160"/>
+      </w:pPr>
+      <w:r>
+        <w:rPr>
+          <w:i w:val="0"/>
+          <w:sz w:val="24"/>
+        </w:rPr>
+        <w:t>Removing it changes the result by an amount whose confidence interval contains zero, and whose sign is not consistent across the five runs. This was accepted as publishable in the design document before it was run, and week 7 gave it a reason rather than leaving it a possibility.</w:t>
+      </w:r>
+    </w:p>
+    <w:p>
+      <w:pPr>
+        <w:pStyle w:val="Heading2"/>
+      </w:pPr>
+      <w:r>
+        <w:t>A parity test was passing without testing anything</w:t>
+      </w:r>
+    </w:p>
+    <w:p>
+      <w:pPr>
+        <w:spacing w:after="160"/>
+      </w:pPr>
+      <w:r>
+        <w:rPr>
+          <w:i w:val="0"/>
+          <w:sz w:val="24"/>
+        </w:rPr>
+        <w:t>The test that compares the controller written in C against the same controller in Python was, for a while, compiling one set of weights and comparing them against another network's expected answers. The cause is a C rule: an include written with quotes is resolved against the including file's own directory before any search path, so the file under test kept finding the deployed weights whatever the test asked for. It passed honestly for exactly as long as nothing had been deployed. Two fixes: the include now searches the path only, and the weights carry a checksum that the inference code itself reports, because two policies of the same shape are indistinguishable without one.</w:t>
+      </w:r>
+    </w:p>
+    <w:p>
+      <w:pPr>
+        <w:pStyle w:val="Heading2"/>
+      </w:pPr>
+      <w:r>
+        <w:t>A model 27 times bigger is not better</w:t>
+      </w:r>
+    </w:p>
+    <w:p>
+      <w:pPr>
+        <w:spacing w:after="160"/>
+      </w:pPr>
+      <w:r>
+        <w:rPr>
+          <w:i w:val="0"/>
+          <w:sz w:val="24"/>
+        </w:rPr>
+        <w:t>The last piece of the 8-bit experiment trained a deliberately oversized model to teach the small one. The teaching changed nothing measurable, and the reason is that the big model was not better than the small one to begin with: 27 times the parameters, and slightly worse. Every model tried falls within 0.89% of the others, which is less than what converting to 8-bit costs. Section 14.</w:t>
+      </w:r>
+    </w:p>
+    <w:p>
+      <w:pPr>
+        <w:pStyle w:val="Heading2"/>
+      </w:pPr>
+      <w:r>
+        <w:t>The energy-management problem has almost no room in it</w:t>
+      </w:r>
+    </w:p>
+    <w:p>
+      <w:pPr>
+        <w:spacing w:after="160"/>
+      </w:pPr>
+      <w:r>
+        <w:rPr>
+          <w:i w:val="0"/>
+          <w:sz w:val="24"/>
+        </w:rPr>
+        <w:t>The theoretically optimal strategy is a constant instruction, and two thresholds get within a sixth of a percent of it. This is the largest of these findings and it is the subject of section 16, including the three routes open and the fact that choosing between them is the supervisor's decision rather than one taken here.</w:t>
+      </w:r>
+    </w:p>
+    <w:p>
+      <w:pPr>
+        <w:pStyle w:val="Heading2"/>
+      </w:pPr>
+      <w:r>
+        <w:t>The fitted rolling resistance is not a rolling resistance</w:t>
+      </w:r>
+    </w:p>
+    <w:p>
+      <w:pPr>
+        <w:spacing w:after="160"/>
+      </w:pPr>
+      <w:r>
+        <w:rPr>
+          <w:i w:val="0"/>
+          <w:sz w:val="24"/>
+        </w:rPr>
+        <w:t>It is 2.2 times larger than an independent measurement on a comparable car. It is a lumped loss term named after the physics it stands in for rather than the physics it contains. The parameter file now says so and an automated test fails if that statement is removed.</w:t>
+      </w:r>
+    </w:p>
+    <w:p>
+      <w:pPr>
+        <w:pStyle w:val="Heading2"/>
+      </w:pPr>
+      <w:r>
+        <w:t>Gate G4 was already passed before the models existed</w:t>
+      </w:r>
+    </w:p>
+    <w:p>
+      <w:pPr>
+        <w:spacing w:after="160"/>
+      </w:pPr>
+      <w:r>
+        <w:rPr>
+          <w:i w:val="0"/>
+          <w:sz w:val="24"/>
+        </w:rPr>
+        <w:t>A linear regression beat the naive baseline by 14.5% against a required 10%. The gate as written could not distinguish a Transformer from a matrix calculation, so every model is now reported against the regression too.</w:t>
+      </w:r>
+    </w:p>
+    <w:p>
+      <w:pPr>
+        <w:pStyle w:val="Heading2"/>
+      </w:pPr>
+      <w:r>
+        <w:t>Physics-informing does not improve accuracy</w:t>
+      </w:r>
+    </w:p>
+    <w:p>
+      <w:pPr>
+        <w:spacing w:after="160"/>
+      </w:pPr>
+      <w:r>
+        <w:rPr>
+          <w:i w:val="0"/>
+          <w:sz w:val="24"/>
+        </w:rPr>
+        <w:t>Five watts of difference on eleven kilowatts at matched parameter count. It improves physical consistency by a factor of ten instead, which is a different and still useful claim.</w:t>
+      </w:r>
+    </w:p>
+    <w:p>
+      <w:pPr>
+        <w:pStyle w:val="Heading2"/>
+      </w:pPr>
+      <w:r>
+        <w:t>The compute estimate was 64% too optimistic</w:t>
+      </w:r>
+    </w:p>
+    <w:p>
+      <w:pPr>
+        <w:spacing w:after="160"/>
+      </w:pPr>
+      <w:r>
+        <w:rPr>
+          <w:i w:val="0"/>
+          <w:sz w:val="24"/>
+        </w:rPr>
+        <w:t>Dividing a multiply count by a measured multiply rate gave 22.28 milliseconds for the Transformer. Timing the real graph on the chip gave 36.46. The LSTM is worse: 19.84 estimated against 35.07 measured. Both still fit inside the 40 milliseconds allowed, and the estimates remain useful for ranking models against each other, but they cannot be quoted as latencies now that measurements exist.</w:t>
+      </w:r>
+    </w:p>
+    <w:p>
+      <w:pPr>
+        <w:pStyle w:val="Heading2"/>
+      </w:pPr>
+      <w:r>
+        <w:t>Charge conservation cannot be tested at this horizon</w:t>
+      </w:r>
+    </w:p>
+    <w:p>
+      <w:pPr>
+        <w:spacing w:after="160"/>
+      </w:pPr>
+      <w:r>
+        <w:rPr>
+          <w:i w:val="0"/>
+          <w:sz w:val="24"/>
+        </w:rPr>
+        <w:t>The recorded charge channel does not move within a typical three-second window, so the equation has nothing to constrain. Enforcing it costs 4.4% accuracy and buys almost nothing. This was measured rather than argued.</w:t>
+      </w:r>
+    </w:p>
+    <w:p>
+      <w:pPr>
+        <w:pStyle w:val="Heading1"/>
+      </w:pPr>
+      <w:r>
+        <w:t>31. What changed from the original plan</w:t>
+      </w:r>
+    </w:p>
+    <w:p>
+      <w:pPr>
+        <w:spacing w:after="160"/>
+      </w:pPr>
+      <w:r>
+        <w:rPr>
+          <w:i w:val="0"/>
+          <w:sz w:val="24"/>
+        </w:rPr>
+        <w:t>Twenty-two changes, in two classes, and the distinction matters. Eleven were agreed in the design document before any code was written. Eleven more happened during the eight weeks, each one forced by something that had been measured.</w:t>
+      </w:r>
+    </w:p>
+    <w:p>
+      <w:pPr>
+        <w:pStyle w:val="Heading2"/>
+      </w:pPr>
+      <w:r>
+        <w:t>Agreed before implementation</w:t>
+      </w:r>
+    </w:p>
+    <w:p>
+      <w:pPr>
+        <w:spacing w:after="160"/>
+      </w:pPr>
+      <w:r>
+        <w:rPr>
+          <w:i w:val="0"/>
+          <w:sz w:val="24"/>
+        </w:rPr>
+        <w:t>It is Processor-in-the-Loop, not Hardware-in-the-Loop. The original used HIL throughout. HIL means real electrical hardware in the loop, with motors, power electronics and sensors. There is none of that here, only a processor. Reviewers in embedded and control venues spot a misused HIL immediately, and the correct term costs nothing.</w:t>
+      </w:r>
+    </w:p>
+    <w:p>
+      <w:pPr>
+        <w:spacing w:after="160"/>
+      </w:pPr>
+      <w:r>
+        <w:rPr>
+          <w:i w:val="0"/>
+          <w:sz w:val="24"/>
+        </w:rPr>
+        <w:t>The embedded work moved from last to first, which is the largest single change. The original schedules the ESP32 for weeks 10 and 11, after all the modelling is finished. That is the one arrangement in which a failure has no recovery: if the model does not fit in week 10, there is no time left to build a smaller one. The compute-feasibility question is now gate G1 in week 1, and the plan already names the fallback. This inversion is why the project knew in week 4, rather than week 10, that XGBoost was never deployable.</w:t>
+      </w:r>
+    </w:p>
+    <w:p>
+      <w:pPr>
+        <w:spacing w:after="160"/>
+      </w:pPr>
+      <w:r>
+        <w:rPr>
+          <w:i w:val="0"/>
+          <w:sz w:val="24"/>
+        </w:rPr>
+        <w:t>Real logged trips replaced a physics-generated dataset. The original creates the training data by pushing drive cycles through the physics model, which makes the thing being predicted a closed-form function of the very inputs used to predict it. The model then appears to do brilliantly while having learned nothing about a real car. The predecessor work has exactly this defect. This project trains on 72 real logged trips at 10 Hz instead.</w:t>
+      </w:r>
+    </w:p>
+    <w:p>
+      <w:pPr>
+        <w:spacing w:after="160"/>
+      </w:pPr>
+      <w:r>
+        <w:rPr>
+          <w:i w:val="0"/>
+          <w:sz w:val="24"/>
+        </w:rPr>
+        <w:t>Data is split by trip and never by row. The predecessor split 2,000 rows at random, and because consecutive rows come from the same drive a fraction of a second apart, near-identical samples landed on both sides. The model was effectively tested on data it had trained on, which inflates every score. Here no sample from a trip ever appears on both sides, and the calibration data used for 8-bit quantisation is drawn from training trips only, which is a subtler version of the same leak.</w:t>
+      </w:r>
+    </w:p>
+    <w:p>
+      <w:pPr>
+        <w:spacing w:after="160"/>
+      </w:pPr>
+      <w:r>
+        <w:rPr>
+          <w:i w:val="0"/>
+          <w:sz w:val="24"/>
+        </w:rPr>
+        <w:t>The communication task runs at 10 ms rather than 50. This was arithmetic rather than judgement: the original specifies a 10 ms control loop and a 50 ms communication task, and a loop cannot close five times faster than the messages it depends on arrive.</w:t>
+      </w:r>
+    </w:p>
+    <w:p>
+      <w:pPr>
+        <w:spacing w:after="160"/>
+      </w:pPr>
+      <w:r>
+        <w:rPr>
+          <w:i w:val="0"/>
+          <w:sz w:val="24"/>
+        </w:rPr>
+        <w:t>Budget first, then model. The model size is not chosen and then checked, it is derived from what gate G1 measured. The Transformer is 32 sequence steps, 32 units wide and 2 layers deep because that is what fits in 40 milliseconds on this chip.</w:t>
+      </w:r>
+    </w:p>
+    <w:p>
+      <w:pPr>
+        <w:spacing w:after="160"/>
+      </w:pPr>
+      <w:r>
+        <w:rPr>
+          <w:i w:val="0"/>
+          <w:sz w:val="24"/>
+        </w:rPr>
+        <w:t>The model comparison was rebuilt. Linear regression, random forest and XGBoost became a mandatory naive baseline, one strong tabular model, an LSTM fed genuinely sequential data, and a Transformer, each in plain and physics-informed versions at matched size. Re-running the LSTM correctly is deliberate: the predecessor flattened its data first, which removes the time ordering the architecture exists to exploit, and then reported that recurrent models underperform.</w:t>
+      </w:r>
+    </w:p>
+    <w:p>
+      <w:pPr>
+        <w:spacing w:after="160"/>
+      </w:pPr>
+      <w:r>
+        <w:rPr>
+          <w:i w:val="0"/>
+          <w:sz w:val="24"/>
+        </w:rPr>
+        <w:t>Gates, ablations and explicit non-claims are entirely new. Five gates each with a written action on failure; four numbered ablations; a metrics table with actual metrics where the original listed headings and left them empty; and a list of things this work will explicitly not claim. Stating the non-claims in advance is what allows two null results to be reported as findings rather than as embarrassments.</w:t>
+      </w:r>
+    </w:p>
+    <w:p>
+      <w:pPr>
+        <w:spacing w:after="160"/>
+      </w:pPr>
+      <w:r>
+        <w:rPr>
+          <w:i w:val="0"/>
+          <w:sz w:val="24"/>
+        </w:rPr>
+        <w:t>Thirteen scenario variations became six axes, keeping full robustness coverage at roughly half the runs.</w:t>
+      </w:r>
+    </w:p>
+    <w:p>
+      <w:pPr>
+        <w:spacing w:after="160"/>
+      </w:pPr>
+      <w:r>
+        <w:rPr>
+          <w:i w:val="0"/>
+          <w:sz w:val="24"/>
+        </w:rPr>
+        <w:t>The ESP32-S3 is the primary platform rather than the C6. Two processor cores matter enormously here, because the hard real-time loop is pinned to core 0 where inference on core 1 cannot disturb it. The single-core C6 cannot make that separation at all.</w:t>
+      </w:r>
+    </w:p>
+    <w:p>
+      <w:pPr>
+        <w:spacing w:after="160"/>
+      </w:pPr>
+      <w:r>
+        <w:rPr>
+          <w:i w:val="0"/>
+          <w:sz w:val="24"/>
+        </w:rPr>
+        <w:t>A second, independent dataset was added, held purely as an out-of-distribution check. Building and testing on one car answers whether the model fits; the question a reviewer actually asks is whether it transfers, and nothing in the original plan could have answered it.</w:t>
+      </w:r>
+    </w:p>
+    <w:p>
+      <w:pPr>
+        <w:pStyle w:val="Heading2"/>
+      </w:pPr>
+      <w:r>
+        <w:t>Changed in flight, because something was measured</w:t>
+      </w:r>
+    </w:p>
+    <w:p>
+      <w:pPr>
+        <w:spacing w:after="160"/>
+      </w:pPr>
+      <w:r>
+        <w:rPr>
+          <w:i w:val="0"/>
+          <w:sz w:val="24"/>
+        </w:rPr>
+        <w:t>These are the ones to be most transparent about, because each represents the plan meeting reality. In every case the measurement came first and the change followed.</w:t>
+      </w:r>
+    </w:p>
+    <w:p>
+      <w:pPr>
+        <w:spacing w:after="160"/>
+      </w:pPr>
+      <w:r>
+        <w:rPr>
+          <w:i w:val="0"/>
+          <w:sz w:val="24"/>
+        </w:rPr>
+        <w:t>Gate G2 was split into three parts instead of one pooled number, and this was the one revision the design document permits. Neither threshold was loosened; what changed is which part of the model each threshold is applied to. Applied literally the original criterion failed all seven trips at a median error of 23.7 percent, because that single number pooled three independent models and could not say which was wrong. Driving the plant with the archive's own logged torque drops the error to a median of 7.0 percent, inside the original bound on every trip. The revision is now spent and nothing else may be adjusted without the same treatment.</w:t>
+      </w:r>
+    </w:p>
+    <w:p>
+      <w:pPr>
+        <w:spacing w:after="160"/>
+      </w:pPr>
+      <w:r>
+        <w:rPr>
+          <w:i w:val="0"/>
+          <w:sz w:val="24"/>
+        </w:rPr>
+        <w:t>The control loop became pipelined rather than synchronous. Originally the chip sent a request and then waited for the reply inside the same 10 millisecond slot, tying its deadline to the scheduling behaviour of a general-purpose laptop. It now requests the next state and acts on the most recent one it holds, so it no longer waits for the laptop inside its own time slot. This is a genuine trade rather than a free win, because the controller now acts on information one cycle old, and that cost is measured and reported.</w:t>
+      </w:r>
+    </w:p>
+    <w:p>
+      <w:pPr>
+        <w:spacing w:after="160"/>
+      </w:pPr>
+      <w:r>
+        <w:rPr>
+          <w:i w:val="0"/>
+          <w:sz w:val="24"/>
+        </w:rPr>
+        <w:t>The link runs over the chip's built-in USB rather than a separate adapter. The design deliberately left this open for gate G3 to settle on measured evidence, and the built-in peripheral carries the loop with zero corrupted and zero lost messages.</w:t>
+      </w:r>
+    </w:p>
+    <w:p>
+      <w:pPr>
+        <w:spacing w:after="160"/>
+      </w:pPr>
+      <w:r>
+        <w:rPr>
+          <w:i w:val="0"/>
+          <w:sz w:val="24"/>
+        </w:rPr>
+        <w:t>Three identified parameters were relabelled as lumped losses. The fitted rolling-resistance coefficient came out 2.2 times larger than an independent measurement on a comparable car, so it is not a tyre property. It is a coefficient occupying that place in the equation and absorbing every speed-dependent loss the model does not represent separately. The parameter file says so, and an automated test fails if that statement is removed.</w:t>
+      </w:r>
+    </w:p>
+    <w:p>
+      <w:pPr>
+        <w:spacing w:after="160"/>
+      </w:pPr>
+      <w:r>
+        <w:rPr>
+          <w:i w:val="0"/>
+          <w:sz w:val="24"/>
+        </w:rPr>
+        <w:t>One of the three physics constraints was switched off. Charge conservation has nothing to constrain over a three-second window, because the logged charge channel does not measurably move within one. Its weight is held at zero and the cost of switching it on is reported as its own arm rather than quietly omitted.</w:t>
+      </w:r>
+    </w:p>
+    <w:p>
+      <w:pPr>
+        <w:spacing w:after="160"/>
+      </w:pPr>
+      <w:r>
+        <w:rPr>
+          <w:i w:val="0"/>
+          <w:sz w:val="24"/>
+        </w:rPr>
+        <w:t>The message format grew to carry a real controller. The state message went from 8 numbers to 10 so that the laptop can send the target speed and its rate of change, the command message from 3 to 4, and the diagnostics message from 11 counters to 16. Gate G3 was then re-measured in full, because the loop the report describes has to be the loop that was measured.</w:t>
+      </w:r>
+    </w:p>
+    <w:p>
+      <w:pPr>
+        <w:spacing w:after="160"/>
+      </w:pPr>
+      <w:r>
+        <w:rPr>
+          <w:i w:val="0"/>
+          <w:sz w:val="24"/>
+        </w:rPr>
+        <w:t>The offline optimiser searches two dimensions rather than three. This is not a simplification for speed. With the speed trajectory fixed by the tracking constraint, the battery power limit can only ever remove power the speed controller needs, which the constraint forbids. It is a safety limiter and not an optimisation lever, and that applies to the learned controller in exactly the same way.</w:t>
+      </w:r>
+    </w:p>
+    <w:p>
+      <w:pPr>
+        <w:spacing w:after="160"/>
+      </w:pPr>
+      <w:r>
+        <w:rPr>
+          <w:i w:val="0"/>
+          <w:sz w:val="24"/>
+        </w:rPr>
+        <w:t>Controllers are now ranked with shed cabin heat charged back. Raw consumption is not comparable between controllers, because one that turns the heating down looks excellent without having managed any energy. Without this correction the week 8 table reads as the learned controller saving 1.3 percent; with it, the same controller is 0.66 percent worse, and the entire difference was 48 to 50 watt-hours of cabin heat per cycle.</w:t>
+      </w:r>
+    </w:p>
+    <w:p>
+      <w:pPr>
+        <w:spacing w:after="160"/>
+      </w:pPr>
+      <w:r>
+        <w:rPr>
+          <w:i w:val="0"/>
+          <w:sz w:val="24"/>
+        </w:rPr>
+        <w:t>The learned controller is 64 units wide rather than the library default of 256. The default would be 68,867 numbers and 269 kilobytes, which is 90 percent of the entire memory budget the forecaster also has to fit inside. At 64 wide it is 4,931 numbers and 19.3 kilobytes, and both figures were measured in a pilot run before the main campaign.</w:t>
+      </w:r>
+    </w:p>
+    <w:p>
+      <w:pPr>
+        <w:spacing w:after="160"/>
+      </w:pPr>
+      <w:r>
+        <w:rPr>
+          <w:i w:val="0"/>
+          <w:sz w:val="24"/>
+        </w:rPr>
+        <w:t>XGBoost and the LSTM ensemble were dropped as deployable options. XGBoost needs roughly 3.7 megabytes against a 300 kilobyte budget, over twelve times too large. The best-looking accuracy figure in the whole comparison was a five-model LSTM ensemble, which takes 99 milliseconds against a 40 millisecond budget. Both remain offline reference points, and the reported number is now always distinguished from the deployable one.</w:t>
+      </w:r>
+    </w:p>
+    <w:p>
+      <w:pPr>
+        <w:spacing w:after="160"/>
+      </w:pPr>
+      <w:r>
+        <w:rPr>
+          <w:i w:val="0"/>
+          <w:sz w:val="24"/>
+        </w:rPr>
+        <w:t>The watchdog was switched on and a fallback path built. Three different failures now get three different responses and three separate counters rather than one generic fault state, because collapsing them is how a controller ends up limping owing to a slow logging task. All three were then triggered deliberately on the board, plus a fourth test that hung the control task on purpose to confirm the watchdog resets the chip. A fallback path that has never been taken is a claim, not a result.</w:t>
+      </w:r>
+    </w:p>
+    <w:p>
+      <w:pPr>
+        <w:pStyle w:val="Heading1"/>
+      </w:pPr>
+      <w:r>
+        <w:t>32. What is left to do</w:t>
+      </w:r>
+    </w:p>
+    <w:p>
+      <w:pPr>
+        <w:spacing w:after="160"/>
+      </w:pPr>
+      <w:r>
+        <w:rPr>
+          <w:i w:val="0"/>
+          <w:sz w:val="24"/>
+        </w:rPr>
+        <w:t>Corrected-model campaign: complete. Corrected-model link-outage sweep: complete. The proposed speed-loop decision transformer was dropped. The classical filter and detector are in the firmware, switched off by default, and were measured on the board in section 29. Open from that section: the cause of the detector's one false alarm, and every fault and mismatch scenario, which remain simulated.</w:t>
+      </w:r>
+    </w:p>
+    <w:p>
+      <w:pPr>
+        <w:spacing w:after="160"/>
+      </w:pPr>
+      <w:r>
+        <w:rPr>
+          <w:i/>
+          <w:color w:val="595959"/>
+          <w:sz w:val="24"/>
+        </w:rPr>
+        <w:t>The following week-by-week plan records the earlier project schedule. Current correction status is stated above.</w:t>
+      </w:r>
+    </w:p>
+    <w:tbl>
+      <w:tblPr>
+        <w:tblStyle w:val="LightGrid-Accent1"/>
+        <w:tblW w:type="auto" w:w="0"/>
+        <w:jc w:val="center"/>
+        <w:tblLook w:firstColumn="1" w:firstRow="1" w:lastColumn="0" w:lastRow="0" w:noHBand="0" w:noVBand="1" w:val="04A0"/>
+      </w:tblPr>
+      <w:tblGrid>
+        <w:gridCol w:w="2412"/>
+        <w:gridCol w:w="2412"/>
+        <w:gridCol w:w="2412"/>
+        <w:gridCol w:w="2412"/>
+      </w:tblGrid>
+      <w:tr>
+        <w:tc>
+          <w:tcPr>
             <w:tcW w:type="dxa" w:w="720"/>
           </w:tcPr>
           <w:p>
@@ -26004,7 +27580,7 @@
         <w:pStyle w:val="Heading1"/>
       </w:pPr>
       <w:r>
-        <w:t>32. Reproducing everything in this report</w:t>
+        <w:t>33. Reproducing everything in this report</w:t>
       </w:r>
     </w:p>
     <w:p>
@@ -26978,7 +28554,7 @@
           <w:color w:val="595959"/>
           <w:sz w:val="22"/>
         </w:rPr>
-        <w:t>All Python commands need PYTHONPATH="src:." set. The reinforcement-learning ramp-up additionally needs stable-baselines3 and gymnasium. The test suite runs with python3 -m pytest and currently holds 538 tests, including ones that drive the controller and the learned policy in C and in Python through identical inputs and require them to agree, and ones that read the firmware's own compile-time switches back out of its headers so that the scripts describing them cannot drift from what is compiled.</w:t>
+        <w:t>All Python commands need PYTHONPATH="src:." set. The reinforcement-learning ramp-up additionally needs stable-baselines3 and gymnasium. The test suite runs with python3 -m pytest and currently holds 553 tests, including ones that drive the controller and the learned policy in C and in Python through identical inputs and require them to agree, and ones that read the firmware's own compile-time switches back out of its headers so that the scripts describing them cannot drift from what is compiled.</w:t>
       </w:r>
     </w:p>
     <w:sectPr>

</xml_diff>

<commit_message>
The detector's false alarm, explained: its threshold leaves out its own dead-reckoning error
Two more runs of the clean cycles on firmware that reports which test fired
and where: the urban alarm came back both times on the same control step,
from the mean test, and none on the other cycles. A replay on the laptop with
a Python copy of the control task and the same noise seed raises it on that
step too, so it is not the link, the host or the chip, and it is one event
seen four times because each cell has one fixed seed.

The replay shows the truth: sensor and plant were fine. The dead-reckoned
speed had drifted 0.018 m/s low and the speed noise averaged 0.013 high over
the window. The mean test budgets for the second and not the first, which is
0.005 m/s in size and wanders too slowly to average out in 0.2 s.

Report and note rebuilt with this and with the check against logged
acceleration, and reviewed again.

Co-Authored-By: Claude Opus 5.5 <noreply@anthropic.com>
</commit_message>
<xml_diff>
--- a/reports/EV-PIL-status-report.docx
+++ b/reports/EV-PIL-status-report.docx
@@ -25963,7 +25963,75 @@
           <w:i w:val="0"/>
           <w:sz w:val="24"/>
         </w:rPr>
-        <w:t>No fault was injected in this campaign, so it says nothing about whether the detector catches one. What it measures is the opposite error. In 1.26 hours the detector raised its flag 1 time on a sensor with nothing wrong with it, in the urban run, and dropped it again after 50 control steps, the shortest its own rule allows. In simulation it raised none in 3.8 hours. The campaign records that the flag went up and not when or why, so the cause is open.</w:t>
+        <w:t>No fault was injected in this campaign, so it says nothing about whether the detector catches one. What it measures is the opposite error. In 1.26 hours the detector raised its flag 1 time on a sensor with nothing wrong with it, in the urban run, and dropped it again after 50 control steps, the shortest its own rule allows. In simulation it raised none in 3.8 hours.</w:t>
+      </w:r>
+    </w:p>
+    <w:p>
+      <w:pPr>
+        <w:spacing w:after="160"/>
+      </w:pPr>
+      <w:r>
+        <w:rPr>
+          <w:i w:val="0"/>
+          <w:sz w:val="24"/>
+        </w:rPr>
+        <w:t>The firmware was then made to report which of the detector's tests raised the flag and when, and the clean cycles were run twice more. The alarm came back both times in the same place, 1255 seconds into the urban cycle with the car creeping at 0.45 metres per second, and it comes back on the same step when the run is replayed on the laptop with a copy of the control task in place of the board. So it is not the link or the chip. It recurs because each setting uses one fixed noise seed: this is one event seen four times.</w:t>
+      </w:r>
+    </w:p>
+    <w:p>
+      <w:pPr>
+        <w:spacing w:after="160"/>
+      </w:pPr>
+      <w:r>
+        <w:rPr>
+          <w:i w:val="0"/>
+          <w:sz w:val="24"/>
+        </w:rPr>
+        <w:t>The replay shows the true speed, which the board cannot. Nothing was wrong with the sensor. The speed the detector works out from acceleration had drifted 0.018 metres per second low, and the noise on the speed reading happened to average 0.013 high over the same fifth of a second. The detector's threshold allows for the second kind of error and not the first, which is typically 0.005 metres per second and reached 0.022 in this run. The threshold is where the fault lies. One such event in about five hours of distinct clean driving, simulated and measured together, is all the evidence there is on how often.</w:t>
+      </w:r>
+    </w:p>
+    <w:p>
+      <w:pPr>
+        <w:pStyle w:val="Heading2"/>
+      </w:pPr>
+      <w:r>
+        <w:t>The detector against a real acceleration channel</w:t>
+      </w:r>
+    </w:p>
+    <w:p>
+      <w:pPr>
+        <w:spacing w:after="160"/>
+      </w:pPr>
+      <w:r>
+        <w:rPr>
+          <w:i w:val="0"/>
+          <w:sz w:val="24"/>
+        </w:rPr>
+        <w:t>The detector trusts measured acceleration. In simulation and on the board that channel is the car's true acceleration with random noise on it. The BMW i3 archive logs an acceleration channel beside speed, so the assumption could be checked against a real one: 70 trips, 30 hours, with no sensor fault in them.</w:t>
+      </w:r>
+    </w:p>
+    <w:p>
+      <w:pPr>
+        <w:spacing w:after="160"/>
+      </w:pPr>
+      <w:r>
+        <w:rPr>
+          <w:i w:val="0"/>
+          <w:sz w:val="24"/>
+        </w:rPr>
+        <w:t>It does not hold. The detector would be flagged 99 per cent of the time, on every trip. The two logged channels agree well from one sample to the next, but differ by a slow component of about 0.11 metres per second squared. The detector integrates acceleration over about two seconds, which turns that into a standing gap of about 0.22 metres per second, against a fault threshold of 0.036. Random noise averages away in that integral and a slow error does not, which is why the simulation never showed it.</w:t>
+      </w:r>
+    </w:p>
+    <w:p>
+      <w:pPr>
+        <w:spacing w:after="160"/>
+      </w:pPr>
+      <w:r>
+        <w:rPr>
+          <w:i w:val="0"/>
+          <w:sz w:val="24"/>
+        </w:rPr>
+        <w:t>So the detector's results above and in simulation hold for the acceleration channel they were given, and not for one like this. It would need its threshold set from the measured disagreement, and would then no longer separate a small offset from healthy driving. That redesign has not been done. The filter does not use the acceleration channel and is not affected. The logs are sampled ten times a second and the firmware runs at a hundred, so the share of time flagged is indicative; the size of the standing gap does not depend on the rate.</w:t>
       </w:r>
     </w:p>
     <w:p>
@@ -26920,7 +26988,7 @@
           <w:i w:val="0"/>
           <w:sz w:val="24"/>
         </w:rPr>
-        <w:t>Corrected-model campaign: complete. Corrected-model link-outage sweep: complete. The proposed speed-loop decision transformer was dropped. The classical filter and detector are in the firmware, switched off by default, and were measured on the board in section 29. Open from that section: the cause of the detector's one false alarm, and every fault and mismatch scenario, which remain simulated.</w:t>
+        <w:t>Corrected-model campaign: complete. Corrected-model link-outage sweep: complete. The proposed speed-loop decision transformer was dropped. The classical filter and detector are in the firmware, switched off by default, and were measured on the board in section 29. Open from that section: the detector's threshold has to be redesigned before it can be relied on, and every fault and mismatch scenario remains simulated.</w:t>
       </w:r>
     </w:p>
     <w:p>

</xml_diff>

<commit_message>
Report and supervisor note carry week 13 in plain language
Three report sections (the fault checker on the board, AI helpers around it,
speed planning) and one block in the note, every number read from the
week-13 result files. Report 74 pages, note 3; both exported through Word
and checked.

Co-Authored-By: Claude Opus 5.5 <noreply@anthropic.com>
</commit_message>
<xml_diff>
--- a/reports/EV-PIL-status-report.docx
+++ b/reports/EV-PIL-status-report.docx
@@ -45,7 +45,7 @@
           <w:color w:val="595959"/>
           <w:sz w:val="24"/>
         </w:rPr>
-        <w:t>Manikanta Gonugondla   |   7 October 2026</w:t>
+        <w:t>Manikanta Gonugondla   |   9 October 2026</w:t>
       </w:r>
     </w:p>
     <w:p/>
@@ -626,6 +626,41 @@
       </w:pPr>
       <w:r>
         <w:t>At a five-second outage the handling earns its keep, which is the case it exists for and the one the prediction called best: the worst of eight outages costs 7.39 metres per second with the handling in against 7.95 with it removed, predicted 6.88 against 8.02. The handling is not there because it tracks well; it is there because it fails small where holding on to a stale command fails large. Section 20.</w:t>
+      </w:r>
+    </w:p>
+    <w:p>
+      <w:pPr>
+        <w:pStyle w:val="Heading2"/>
+      </w:pPr>
+      <w:r>
+        <w:t>Week 13 in brief</w:t>
+      </w:r>
+    </w:p>
+    <w:p>
+      <w:pPr>
+        <w:pStyle w:val="ListBullet"/>
+        <w:spacing w:after="80"/>
+      </w:pPr>
+      <w:r>
+        <w:t>Week 13, measured on the board: a new speed-sensor fault checker caught all 40 injected faults within 0.32 seconds with no false alarm and no late control step. The earlier checker caught 33 and raised 162 false alarms on one clean drive. Section 30.</w:t>
+      </w:r>
+    </w:p>
+    <w:p>
+      <w:pPr>
+        <w:pStyle w:val="ListBullet"/>
+        <w:spacing w:after="80"/>
+      </w:pPr>
+      <w:r>
+        <w:t>Week 13, simulated: small AI helpers judged sensor faults better than hand-written rules and drove the car worse. The rules are kept. Jev was not purchased and is not tested. Section 31.</w:t>
+      </w:r>
+    </w:p>
+    <w:p>
+      <w:pPr>
+        <w:pStyle w:val="ListBullet"/>
+        <w:spacing w:after="80"/>
+      </w:pPr>
+      <w:r>
+        <w:t>Week 13, simulated, a new task: letting the car plan its own speed on an empty road saved 10.4% of energy on the aggressive route and 1.2% on the highway route. Section 32.</w:t>
       </w:r>
     </w:p>
     <w:p>
@@ -14570,7 +14605,7 @@
           <w:i w:val="0"/>
           <w:sz w:val="24"/>
         </w:rPr>
-        <w:t>The chain from a trained policy to a running one has four links, and each is checked against the one before it. Building that chain found a real fault: the test that compares the C controller against Python was, for a while, compiling the wrong weights and comparing them against themselves. It passed for exactly as long as no policy had been deployed. Section 30 records it.</w:t>
+        <w:t>The chain from a trained policy to a running one has four links, and each is checked against the one before it. Building that chain found a real fault: the test that compares the C controller against Python was, for a while, compiling the wrong weights and comparing them against themselves. It passed for exactly as long as no policy had been deployed. Section 33 records it.</w:t>
       </w:r>
     </w:p>
     <w:p>
@@ -26409,7 +26444,7 @@
         <w:spacing w:after="80"/>
       </w:pPr>
       <w:r>
-        <w:t>Sensor faults. A stuck, dropped or offset speed reading was tested in simulation only.</w:t>
+        <w:t>Sensor faults. A stuck, dropped or offset speed reading had been tested in simulation only when this campaign was run. Section 30 puts them on the board.</w:t>
       </w:r>
     </w:p>
     <w:p>
@@ -26444,7 +26479,7 @@
         <w:pStyle w:val="Heading1"/>
       </w:pPr>
       <w:r>
-        <w:t>30. Results that went against expectation</w:t>
+        <w:t>30. A fault checker that works on the board</w:t>
       </w:r>
     </w:p>
     <w:p>
@@ -26456,15 +26491,7 @@
           <w:i w:val="0"/>
           <w:sz w:val="24"/>
         </w:rPr>
-        <w:t>Each one is reported because each one changes what the paper may claim, and a supervisor reading the work will find them more convincing than the successes.</w:t>
-      </w:r>
-    </w:p>
-    <w:p>
-      <w:pPr>
-        <w:pStyle w:val="Heading2"/>
-      </w:pPr>
-      <w:r>
-        <w:t>The learned controller loses to two thresholds</w:t>
+        <w:t>The car's controller needs to know its speed. If the speed sensor freezes, drops to zero or starts reading a little wrong, the controller acts on a false number. A fault checker watches for this. When it raises the alarm, the controller stops trusting the sensor and works out the speed another way until the sensor behaves again.</w:t>
       </w:r>
     </w:p>
     <w:p>
@@ -26476,15 +26503,7 @@
           <w:i w:val="0"/>
           <w:sz w:val="24"/>
         </w:rPr>
-        <w:t>Five independent training runs, and every one of them finishes worse than a controller that is two thresholds and a taper, once the cabin heating they switched off is charged back. The offline optimum predicted it and the training measured it, and the two do not depend on each other. Section 21.</w:t>
-      </w:r>
-    </w:p>
-    <w:p>
-      <w:pPr>
-        <w:pStyle w:val="Heading2"/>
-      </w:pPr>
-      <w:r>
-        <w:t>The forecast makes no difference to the controller</w:t>
+        <w:t>Section 29 ended with the first checker not usable. It compared the speed reading with the acceleration reading, and it had only ever been tested against a perfect acceleration signal with a little random noise. A real acceleration signal also drifts slowly. Week 13 added that drift to the simulation, sized from 19 logged BMW i3 trips.</w:t>
       </w:r>
     </w:p>
     <w:p>
@@ -26496,7 +26515,7 @@
           <w:i w:val="0"/>
           <w:sz w:val="24"/>
         </w:rPr>
-        <w:t>Removing it changes the result by an amount whose confidence interval contains zero, and whose sign is not consistent across the five runs. This was accepted as publishable in the design document before it was run, and week 7 gave it a reason rather than leaving it a possibility.</w:t>
+        <w:t>With the drift added, the first checker failed in 5 of the 7 test conditions. It raised the alarm on a healthy sensor for most of the drive. SIMULATED.</w:t>
       </w:r>
     </w:p>
     <w:p>
@@ -26504,7 +26523,7 @@
         <w:pStyle w:val="Heading2"/>
       </w:pPr>
       <w:r>
-        <w:t>A parity test was passing without testing anything</w:t>
+        <w:t>The new checker</w:t>
       </w:r>
     </w:p>
     <w:p>
@@ -26516,15 +26535,7 @@
           <w:i w:val="0"/>
           <w:sz w:val="24"/>
         </w:rPr>
-        <w:t>The test that compares the controller written in C against the same controller in Python was, for a while, compiling one set of weights and comparing them against another network's expected answers. The cause is a C rule: an include written with quotes is resolved against the including file's own directory before any search path, so the file under test kept finding the deployed weights whatever the test asked for. It passed honestly for exactly as long as nothing had been deployed. Two fixes: the include now searches the path only, and the weights carry a checksum that the inference code itself reports, because two policies of the same shape are indistinguishable without one.</w:t>
-      </w:r>
-    </w:p>
-    <w:p>
-      <w:pPr>
-        <w:pStyle w:val="Heading2"/>
-      </w:pPr>
-      <w:r>
-        <w:t>A model 27 times bigger is not better</w:t>
+        <w:t>The new checker makes three changes. It estimates the slow drift in the acceleration signal and removes it. It looks for a sudden jump in the speed reading, which a fault produces and a slow drift does not. And it allows for its own uncertainty before raising the alarm.</w:t>
       </w:r>
     </w:p>
     <w:p>
@@ -26536,7 +26547,7 @@
           <w:i w:val="0"/>
           <w:sz w:val="24"/>
         </w:rPr>
-        <w:t>The last piece of the 8-bit experiment trained a deliberately oversized model to teach the small one. The teaching changed nothing measurable, and the reason is that the big model was not better than the small one to begin with: 27 times the parameters, and slightly worse. Every model tried falls within 0.89% of the others, which is less than what converting to 8-bit costs. Section 14.</w:t>
+        <w:t>In simulation it raised no false alarm on a healthy sensor in any condition, and caught 551 of 560 faults within half a second on the highway cycle and 533 of 560 on the aggressive cycle. The ones it caught late were all the same kind: a small error of half a metre per second while the sensor was ten times noisier than normal. SIMULATED.</w:t>
       </w:r>
     </w:p>
     <w:p>
@@ -26544,7 +26555,7 @@
         <w:pStyle w:val="Heading2"/>
       </w:pPr>
       <w:r>
-        <w:t>The energy-management problem has almost no room in it</w:t>
+        <w:t>Measured on the board</w:t>
       </w:r>
     </w:p>
     <w:p>
@@ -26556,452 +26567,7 @@
           <w:i w:val="0"/>
           <w:sz w:val="24"/>
         </w:rPr>
-        <w:t>The theoretically optimal strategy is a constant instruction, and two thresholds get within a sixth of a percent of it. This is the largest of these findings and it is the subject of section 16, including the three routes open and the fact that choosing between them is the supervisor's decision rather than one taken here.</w:t>
-      </w:r>
-    </w:p>
-    <w:p>
-      <w:pPr>
-        <w:pStyle w:val="Heading2"/>
-      </w:pPr>
-      <w:r>
-        <w:t>The fitted rolling resistance is not a rolling resistance</w:t>
-      </w:r>
-    </w:p>
-    <w:p>
-      <w:pPr>
-        <w:spacing w:after="160"/>
-      </w:pPr>
-      <w:r>
-        <w:rPr>
-          <w:i w:val="0"/>
-          <w:sz w:val="24"/>
-        </w:rPr>
-        <w:t>It is 2.2 times larger than an independent measurement on a comparable car. It is a lumped loss term named after the physics it stands in for rather than the physics it contains. The parameter file now says so and an automated test fails if that statement is removed.</w:t>
-      </w:r>
-    </w:p>
-    <w:p>
-      <w:pPr>
-        <w:pStyle w:val="Heading2"/>
-      </w:pPr>
-      <w:r>
-        <w:t>Gate G4 was already passed before the models existed</w:t>
-      </w:r>
-    </w:p>
-    <w:p>
-      <w:pPr>
-        <w:spacing w:after="160"/>
-      </w:pPr>
-      <w:r>
-        <w:rPr>
-          <w:i w:val="0"/>
-          <w:sz w:val="24"/>
-        </w:rPr>
-        <w:t>A linear regression beat the naive baseline by 14.5% against a required 10%. The gate as written could not distinguish a Transformer from a matrix calculation, so every model is now reported against the regression too.</w:t>
-      </w:r>
-    </w:p>
-    <w:p>
-      <w:pPr>
-        <w:pStyle w:val="Heading2"/>
-      </w:pPr>
-      <w:r>
-        <w:t>Physics-informing does not improve accuracy</w:t>
-      </w:r>
-    </w:p>
-    <w:p>
-      <w:pPr>
-        <w:spacing w:after="160"/>
-      </w:pPr>
-      <w:r>
-        <w:rPr>
-          <w:i w:val="0"/>
-          <w:sz w:val="24"/>
-        </w:rPr>
-        <w:t>Five watts of difference on eleven kilowatts at matched parameter count. It improves physical consistency by a factor of ten instead, which is a different and still useful claim.</w:t>
-      </w:r>
-    </w:p>
-    <w:p>
-      <w:pPr>
-        <w:pStyle w:val="Heading2"/>
-      </w:pPr>
-      <w:r>
-        <w:t>The compute estimate was 64% too optimistic</w:t>
-      </w:r>
-    </w:p>
-    <w:p>
-      <w:pPr>
-        <w:spacing w:after="160"/>
-      </w:pPr>
-      <w:r>
-        <w:rPr>
-          <w:i w:val="0"/>
-          <w:sz w:val="24"/>
-        </w:rPr>
-        <w:t>Dividing a multiply count by a measured multiply rate gave 22.28 milliseconds for the Transformer. Timing the real graph on the chip gave 36.46. The LSTM is worse: 19.84 estimated against 35.07 measured. Both still fit inside the 40 milliseconds allowed, and the estimates remain useful for ranking models against each other, but they cannot be quoted as latencies now that measurements exist.</w:t>
-      </w:r>
-    </w:p>
-    <w:p>
-      <w:pPr>
-        <w:pStyle w:val="Heading2"/>
-      </w:pPr>
-      <w:r>
-        <w:t>Charge conservation cannot be tested at this horizon</w:t>
-      </w:r>
-    </w:p>
-    <w:p>
-      <w:pPr>
-        <w:spacing w:after="160"/>
-      </w:pPr>
-      <w:r>
-        <w:rPr>
-          <w:i w:val="0"/>
-          <w:sz w:val="24"/>
-        </w:rPr>
-        <w:t>The recorded charge channel does not move within a typical three-second window, so the equation has nothing to constrain. Enforcing it costs 4.4% accuracy and buys almost nothing. This was measured rather than argued.</w:t>
-      </w:r>
-    </w:p>
-    <w:p>
-      <w:pPr>
-        <w:pStyle w:val="Heading1"/>
-      </w:pPr>
-      <w:r>
-        <w:t>31. What changed from the original plan</w:t>
-      </w:r>
-    </w:p>
-    <w:p>
-      <w:pPr>
-        <w:spacing w:after="160"/>
-      </w:pPr>
-      <w:r>
-        <w:rPr>
-          <w:i w:val="0"/>
-          <w:sz w:val="24"/>
-        </w:rPr>
-        <w:t>Twenty-two changes, in two classes, and the distinction matters. Eleven were agreed in the design document before any code was written. Eleven more happened during the eight weeks, each one forced by something that had been measured.</w:t>
-      </w:r>
-    </w:p>
-    <w:p>
-      <w:pPr>
-        <w:pStyle w:val="Heading2"/>
-      </w:pPr>
-      <w:r>
-        <w:t>Agreed before implementation</w:t>
-      </w:r>
-    </w:p>
-    <w:p>
-      <w:pPr>
-        <w:spacing w:after="160"/>
-      </w:pPr>
-      <w:r>
-        <w:rPr>
-          <w:i w:val="0"/>
-          <w:sz w:val="24"/>
-        </w:rPr>
-        <w:t>It is Processor-in-the-Loop, not Hardware-in-the-Loop. The original used HIL throughout. HIL means real electrical hardware in the loop, with motors, power electronics and sensors. There is none of that here, only a processor. Reviewers in embedded and control venues spot a misused HIL immediately, and the correct term costs nothing.</w:t>
-      </w:r>
-    </w:p>
-    <w:p>
-      <w:pPr>
-        <w:spacing w:after="160"/>
-      </w:pPr>
-      <w:r>
-        <w:rPr>
-          <w:i w:val="0"/>
-          <w:sz w:val="24"/>
-        </w:rPr>
-        <w:t>The embedded work moved from last to first, which is the largest single change. The original schedules the ESP32 for weeks 10 and 11, after all the modelling is finished. That is the one arrangement in which a failure has no recovery: if the model does not fit in week 10, there is no time left to build a smaller one. The compute-feasibility question is now gate G1 in week 1, and the plan already names the fallback. This inversion is why the project knew in week 4, rather than week 10, that XGBoost was never deployable.</w:t>
-      </w:r>
-    </w:p>
-    <w:p>
-      <w:pPr>
-        <w:spacing w:after="160"/>
-      </w:pPr>
-      <w:r>
-        <w:rPr>
-          <w:i w:val="0"/>
-          <w:sz w:val="24"/>
-        </w:rPr>
-        <w:t>Real logged trips replaced a physics-generated dataset. The original creates the training data by pushing drive cycles through the physics model, which makes the thing being predicted a closed-form function of the very inputs used to predict it. The model then appears to do brilliantly while having learned nothing about a real car. The predecessor work has exactly this defect. This project trains on 72 real logged trips at 10 Hz instead.</w:t>
-      </w:r>
-    </w:p>
-    <w:p>
-      <w:pPr>
-        <w:spacing w:after="160"/>
-      </w:pPr>
-      <w:r>
-        <w:rPr>
-          <w:i w:val="0"/>
-          <w:sz w:val="24"/>
-        </w:rPr>
-        <w:t>Data is split by trip and never by row. The predecessor split 2,000 rows at random, and because consecutive rows come from the same drive a fraction of a second apart, near-identical samples landed on both sides. The model was effectively tested on data it had trained on, which inflates every score. Here no sample from a trip ever appears on both sides, and the calibration data used for 8-bit quantisation is drawn from training trips only, which is a subtler version of the same leak.</w:t>
-      </w:r>
-    </w:p>
-    <w:p>
-      <w:pPr>
-        <w:spacing w:after="160"/>
-      </w:pPr>
-      <w:r>
-        <w:rPr>
-          <w:i w:val="0"/>
-          <w:sz w:val="24"/>
-        </w:rPr>
-        <w:t>The communication task runs at 10 ms rather than 50. This was arithmetic rather than judgement: the original specifies a 10 ms control loop and a 50 ms communication task, and a loop cannot close five times faster than the messages it depends on arrive.</w:t>
-      </w:r>
-    </w:p>
-    <w:p>
-      <w:pPr>
-        <w:spacing w:after="160"/>
-      </w:pPr>
-      <w:r>
-        <w:rPr>
-          <w:i w:val="0"/>
-          <w:sz w:val="24"/>
-        </w:rPr>
-        <w:t>Budget first, then model. The model size is not chosen and then checked, it is derived from what gate G1 measured. The Transformer is 32 sequence steps, 32 units wide and 2 layers deep because that is what fits in 40 milliseconds on this chip.</w:t>
-      </w:r>
-    </w:p>
-    <w:p>
-      <w:pPr>
-        <w:spacing w:after="160"/>
-      </w:pPr>
-      <w:r>
-        <w:rPr>
-          <w:i w:val="0"/>
-          <w:sz w:val="24"/>
-        </w:rPr>
-        <w:t>The model comparison was rebuilt. Linear regression, random forest and XGBoost became a mandatory naive baseline, one strong tabular model, an LSTM fed genuinely sequential data, and a Transformer, each in plain and physics-informed versions at matched size. Re-running the LSTM correctly is deliberate: the predecessor flattened its data first, which removes the time ordering the architecture exists to exploit, and then reported that recurrent models underperform.</w:t>
-      </w:r>
-    </w:p>
-    <w:p>
-      <w:pPr>
-        <w:spacing w:after="160"/>
-      </w:pPr>
-      <w:r>
-        <w:rPr>
-          <w:i w:val="0"/>
-          <w:sz w:val="24"/>
-        </w:rPr>
-        <w:t>Gates, ablations and explicit non-claims are entirely new. Five gates each with a written action on failure; four numbered ablations; a metrics table with actual metrics where the original listed headings and left them empty; and a list of things this work will explicitly not claim. Stating the non-claims in advance is what allows two null results to be reported as findings rather than as embarrassments.</w:t>
-      </w:r>
-    </w:p>
-    <w:p>
-      <w:pPr>
-        <w:spacing w:after="160"/>
-      </w:pPr>
-      <w:r>
-        <w:rPr>
-          <w:i w:val="0"/>
-          <w:sz w:val="24"/>
-        </w:rPr>
-        <w:t>Thirteen scenario variations became six axes, keeping full robustness coverage at roughly half the runs.</w:t>
-      </w:r>
-    </w:p>
-    <w:p>
-      <w:pPr>
-        <w:spacing w:after="160"/>
-      </w:pPr>
-      <w:r>
-        <w:rPr>
-          <w:i w:val="0"/>
-          <w:sz w:val="24"/>
-        </w:rPr>
-        <w:t>The ESP32-S3 is the primary platform rather than the C6. Two processor cores matter enormously here, because the hard real-time loop is pinned to core 0 where inference on core 1 cannot disturb it. The single-core C6 cannot make that separation at all.</w:t>
-      </w:r>
-    </w:p>
-    <w:p>
-      <w:pPr>
-        <w:spacing w:after="160"/>
-      </w:pPr>
-      <w:r>
-        <w:rPr>
-          <w:i w:val="0"/>
-          <w:sz w:val="24"/>
-        </w:rPr>
-        <w:t>A second, independent dataset was added, held purely as an out-of-distribution check. Building and testing on one car answers whether the model fits; the question a reviewer actually asks is whether it transfers, and nothing in the original plan could have answered it.</w:t>
-      </w:r>
-    </w:p>
-    <w:p>
-      <w:pPr>
-        <w:pStyle w:val="Heading2"/>
-      </w:pPr>
-      <w:r>
-        <w:t>Changed in flight, because something was measured</w:t>
-      </w:r>
-    </w:p>
-    <w:p>
-      <w:pPr>
-        <w:spacing w:after="160"/>
-      </w:pPr>
-      <w:r>
-        <w:rPr>
-          <w:i w:val="0"/>
-          <w:sz w:val="24"/>
-        </w:rPr>
-        <w:t>These are the ones to be most transparent about, because each represents the plan meeting reality. In every case the measurement came first and the change followed.</w:t>
-      </w:r>
-    </w:p>
-    <w:p>
-      <w:pPr>
-        <w:spacing w:after="160"/>
-      </w:pPr>
-      <w:r>
-        <w:rPr>
-          <w:i w:val="0"/>
-          <w:sz w:val="24"/>
-        </w:rPr>
-        <w:t>Gate G2 was split into three parts instead of one pooled number, and this was the one revision the design document permits. Neither threshold was loosened; what changed is which part of the model each threshold is applied to. Applied literally the original criterion failed all seven trips at a median error of 23.7 percent, because that single number pooled three independent models and could not say which was wrong. Driving the plant with the archive's own logged torque drops the error to a median of 7.0 percent, inside the original bound on every trip. The revision is now spent and nothing else may be adjusted without the same treatment.</w:t>
-      </w:r>
-    </w:p>
-    <w:p>
-      <w:pPr>
-        <w:spacing w:after="160"/>
-      </w:pPr>
-      <w:r>
-        <w:rPr>
-          <w:i w:val="0"/>
-          <w:sz w:val="24"/>
-        </w:rPr>
-        <w:t>The control loop became pipelined rather than synchronous. Originally the chip sent a request and then waited for the reply inside the same 10 millisecond slot, tying its deadline to the scheduling behaviour of a general-purpose laptop. It now requests the next state and acts on the most recent one it holds, so it no longer waits for the laptop inside its own time slot. This is a genuine trade rather than a free win, because the controller now acts on information one cycle old, and that cost is measured and reported.</w:t>
-      </w:r>
-    </w:p>
-    <w:p>
-      <w:pPr>
-        <w:spacing w:after="160"/>
-      </w:pPr>
-      <w:r>
-        <w:rPr>
-          <w:i w:val="0"/>
-          <w:sz w:val="24"/>
-        </w:rPr>
-        <w:t>The link runs over the chip's built-in USB rather than a separate adapter. The design deliberately left this open for gate G3 to settle on measured evidence, and the built-in peripheral carries the loop with zero corrupted and zero lost messages.</w:t>
-      </w:r>
-    </w:p>
-    <w:p>
-      <w:pPr>
-        <w:spacing w:after="160"/>
-      </w:pPr>
-      <w:r>
-        <w:rPr>
-          <w:i w:val="0"/>
-          <w:sz w:val="24"/>
-        </w:rPr>
-        <w:t>Three identified parameters were relabelled as lumped losses. The fitted rolling-resistance coefficient came out 2.2 times larger than an independent measurement on a comparable car, so it is not a tyre property. It is a coefficient occupying that place in the equation and absorbing every speed-dependent loss the model does not represent separately. The parameter file says so, and an automated test fails if that statement is removed.</w:t>
-      </w:r>
-    </w:p>
-    <w:p>
-      <w:pPr>
-        <w:spacing w:after="160"/>
-      </w:pPr>
-      <w:r>
-        <w:rPr>
-          <w:i w:val="0"/>
-          <w:sz w:val="24"/>
-        </w:rPr>
-        <w:t>One of the three physics constraints was switched off. Charge conservation has nothing to constrain over a three-second window, because the logged charge channel does not measurably move within one. Its weight is held at zero and the cost of switching it on is reported as its own arm rather than quietly omitted.</w:t>
-      </w:r>
-    </w:p>
-    <w:p>
-      <w:pPr>
-        <w:spacing w:after="160"/>
-      </w:pPr>
-      <w:r>
-        <w:rPr>
-          <w:i w:val="0"/>
-          <w:sz w:val="24"/>
-        </w:rPr>
-        <w:t>The message format grew to carry a real controller. The state message went from 8 numbers to 10 so that the laptop can send the target speed and its rate of change, the command message from 3 to 4, and the diagnostics message from 11 counters to 16. Gate G3 was then re-measured in full, because the loop the report describes has to be the loop that was measured.</w:t>
-      </w:r>
-    </w:p>
-    <w:p>
-      <w:pPr>
-        <w:spacing w:after="160"/>
-      </w:pPr>
-      <w:r>
-        <w:rPr>
-          <w:i w:val="0"/>
-          <w:sz w:val="24"/>
-        </w:rPr>
-        <w:t>The offline optimiser searches two dimensions rather than three. This is not a simplification for speed. With the speed trajectory fixed by the tracking constraint, the battery power limit can only ever remove power the speed controller needs, which the constraint forbids. It is a safety limiter and not an optimisation lever, and that applies to the learned controller in exactly the same way.</w:t>
-      </w:r>
-    </w:p>
-    <w:p>
-      <w:pPr>
-        <w:spacing w:after="160"/>
-      </w:pPr>
-      <w:r>
-        <w:rPr>
-          <w:i w:val="0"/>
-          <w:sz w:val="24"/>
-        </w:rPr>
-        <w:t>Controllers are now ranked with shed cabin heat charged back. Raw consumption is not comparable between controllers, because one that turns the heating down looks excellent without having managed any energy. Without this correction the week 8 table reads as the learned controller saving 1.3 percent; with it, the same controller is 0.66 percent worse, and the entire difference was 48 to 50 watt-hours of cabin heat per cycle.</w:t>
-      </w:r>
-    </w:p>
-    <w:p>
-      <w:pPr>
-        <w:spacing w:after="160"/>
-      </w:pPr>
-      <w:r>
-        <w:rPr>
-          <w:i w:val="0"/>
-          <w:sz w:val="24"/>
-        </w:rPr>
-        <w:t>The learned controller is 64 units wide rather than the library default of 256. The default would be 68,867 numbers and 269 kilobytes, which is 90 percent of the entire memory budget the forecaster also has to fit inside. At 64 wide it is 4,931 numbers and 19.3 kilobytes, and both figures were measured in a pilot run before the main campaign.</w:t>
-      </w:r>
-    </w:p>
-    <w:p>
-      <w:pPr>
-        <w:spacing w:after="160"/>
-      </w:pPr>
-      <w:r>
-        <w:rPr>
-          <w:i w:val="0"/>
-          <w:sz w:val="24"/>
-        </w:rPr>
-        <w:t>XGBoost and the LSTM ensemble were dropped as deployable options. XGBoost needs roughly 3.7 megabytes against a 300 kilobyte budget, over twelve times too large. The best-looking accuracy figure in the whole comparison was a five-model LSTM ensemble, which takes 99 milliseconds against a 40 millisecond budget. Both remain offline reference points, and the reported number is now always distinguished from the deployable one.</w:t>
-      </w:r>
-    </w:p>
-    <w:p>
-      <w:pPr>
-        <w:spacing w:after="160"/>
-      </w:pPr>
-      <w:r>
-        <w:rPr>
-          <w:i w:val="0"/>
-          <w:sz w:val="24"/>
-        </w:rPr>
-        <w:t>The watchdog was switched on and a fallback path built. Three different failures now get three different responses and three separate counters rather than one generic fault state, because collapsing them is how a controller ends up limping owing to a slow logging task. All three were then triggered deliberately on the board, plus a fourth test that hung the control task on purpose to confirm the watchdog resets the chip. A fallback path that has never been taken is a claim, not a result.</w:t>
-      </w:r>
-    </w:p>
-    <w:p>
-      <w:pPr>
-        <w:pStyle w:val="Heading1"/>
-      </w:pPr>
-      <w:r>
-        <w:t>32. What is left to do</w:t>
-      </w:r>
-    </w:p>
-    <w:p>
-      <w:pPr>
-        <w:spacing w:after="160"/>
-      </w:pPr>
-      <w:r>
-        <w:rPr>
-          <w:i w:val="0"/>
-          <w:sz w:val="24"/>
-        </w:rPr>
-        <w:t>Corrected-model campaign: complete. Corrected-model link-outage sweep: complete. The proposed speed-loop decision transformer was dropped. The classical filter and detector are in the firmware, switched off by default, and were measured on the board in section 29. Open from that section: the detector's threshold has to be redesigned before it can be relied on, and every fault and mismatch scenario remains simulated.</w:t>
-      </w:r>
-    </w:p>
-    <w:p>
-      <w:pPr>
-        <w:spacing w:after="160"/>
-      </w:pPr>
-      <w:r>
-        <w:rPr>
-          <w:i/>
-          <w:color w:val="595959"/>
-          <w:sz w:val="24"/>
-        </w:rPr>
-        <w:t>The following week-by-week plan records the earlier project schedule. Current correction status is stated above.</w:t>
+        <w:t>No fault had been put on the board before this week. The new checker was written again in C for the chip and compared with the laptop version on 4,000 samples, step by step, until the two agreed on every step. Then three versions of the firmware were run on the board. Each was given the same 40 faults on the aggressive cycle and two clean ten-minute drives. The laptop played the car and injected the faults; the checker ran on the chip.</w:t>
       </w:r>
     </w:p>
     <w:tbl>
@@ -27020,6 +26586,2430 @@
       <w:tr>
         <w:tc>
           <w:tcPr>
+            <w:tcW w:type="dxa" w:w="2412"/>
+          </w:tcPr>
+          <w:p>
+            <w:r/>
+            <w:r>
+              <w:rPr>
+                <w:b/>
+                <w:sz w:val="20"/>
+              </w:rPr>
+            </w:r>
+          </w:p>
+        </w:tc>
+        <w:tc>
+          <w:tcPr>
+            <w:tcW w:type="dxa" w:w="2412"/>
+          </w:tcPr>
+          <w:p>
+            <w:r/>
+            <w:r>
+              <w:rPr>
+                <w:b/>
+                <w:sz w:val="20"/>
+              </w:rPr>
+              <w:t>First checker</w:t>
+            </w:r>
+          </w:p>
+        </w:tc>
+        <w:tc>
+          <w:tcPr>
+            <w:tcW w:type="dxa" w:w="2412"/>
+          </w:tcPr>
+          <w:p>
+            <w:r/>
+            <w:r>
+              <w:rPr>
+                <w:b/>
+                <w:sz w:val="20"/>
+              </w:rPr>
+              <w:t>New checker</w:t>
+            </w:r>
+          </w:p>
+        </w:tc>
+        <w:tc>
+          <w:tcPr>
+            <w:tcW w:type="dxa" w:w="2412"/>
+          </w:tcPr>
+          <w:p>
+            <w:r/>
+            <w:r>
+              <w:rPr>
+                <w:b/>
+                <w:sz w:val="20"/>
+              </w:rPr>
+              <w:t>New checker with rule helper</w:t>
+            </w:r>
+          </w:p>
+        </w:tc>
+      </w:tr>
+      <w:tr>
+        <w:tc>
+          <w:tcPr>
+            <w:tcW w:type="dxa" w:w="2412"/>
+          </w:tcPr>
+          <w:p>
+            <w:r/>
+            <w:r>
+              <w:rPr>
+                <w:sz w:val="20"/>
+              </w:rPr>
+              <w:t>Faults caught within half a second</w:t>
+            </w:r>
+          </w:p>
+        </w:tc>
+        <w:tc>
+          <w:tcPr>
+            <w:tcW w:type="dxa" w:w="2412"/>
+          </w:tcPr>
+          <w:p>
+            <w:r/>
+            <w:r>
+              <w:rPr>
+                <w:sz w:val="20"/>
+              </w:rPr>
+              <w:t>33 of 40</w:t>
+            </w:r>
+          </w:p>
+        </w:tc>
+        <w:tc>
+          <w:tcPr>
+            <w:tcW w:type="dxa" w:w="2412"/>
+          </w:tcPr>
+          <w:p>
+            <w:r/>
+            <w:r>
+              <w:rPr>
+                <w:sz w:val="20"/>
+              </w:rPr>
+              <w:t>40 of 40</w:t>
+            </w:r>
+          </w:p>
+        </w:tc>
+        <w:tc>
+          <w:tcPr>
+            <w:tcW w:type="dxa" w:w="2412"/>
+          </w:tcPr>
+          <w:p>
+            <w:r/>
+            <w:r>
+              <w:rPr>
+                <w:sz w:val="20"/>
+              </w:rPr>
+              <w:t>40 of 40</w:t>
+            </w:r>
+          </w:p>
+        </w:tc>
+      </w:tr>
+      <w:tr>
+        <w:tc>
+          <w:tcPr>
+            <w:tcW w:type="dxa" w:w="2412"/>
+          </w:tcPr>
+          <w:p>
+            <w:r/>
+            <w:r>
+              <w:rPr>
+                <w:sz w:val="20"/>
+              </w:rPr>
+              <w:t>Slowest catch, seconds</w:t>
+            </w:r>
+          </w:p>
+        </w:tc>
+        <w:tc>
+          <w:tcPr>
+            <w:tcW w:type="dxa" w:w="2412"/>
+          </w:tcPr>
+          <w:p>
+            <w:r/>
+            <w:r>
+              <w:rPr>
+                <w:sz w:val="20"/>
+              </w:rPr>
+              <w:t>5.18</w:t>
+            </w:r>
+          </w:p>
+        </w:tc>
+        <w:tc>
+          <w:tcPr>
+            <w:tcW w:type="dxa" w:w="2412"/>
+          </w:tcPr>
+          <w:p>
+            <w:r/>
+            <w:r>
+              <w:rPr>
+                <w:sz w:val="20"/>
+              </w:rPr>
+              <w:t>0.32</w:t>
+            </w:r>
+          </w:p>
+        </w:tc>
+        <w:tc>
+          <w:tcPr>
+            <w:tcW w:type="dxa" w:w="2412"/>
+          </w:tcPr>
+          <w:p>
+            <w:r/>
+            <w:r>
+              <w:rPr>
+                <w:sz w:val="20"/>
+              </w:rPr>
+              <w:t>0.32</w:t>
+            </w:r>
+          </w:p>
+        </w:tc>
+      </w:tr>
+      <w:tr>
+        <w:tc>
+          <w:tcPr>
+            <w:tcW w:type="dxa" w:w="2412"/>
+          </w:tcPr>
+          <w:p>
+            <w:r/>
+            <w:r>
+              <w:rPr>
+                <w:sz w:val="20"/>
+              </w:rPr>
+              <w:t>False alarms before any fault</w:t>
+            </w:r>
+          </w:p>
+        </w:tc>
+        <w:tc>
+          <w:tcPr>
+            <w:tcW w:type="dxa" w:w="2412"/>
+          </w:tcPr>
+          <w:p>
+            <w:r/>
+            <w:r>
+              <w:rPr>
+                <w:sz w:val="20"/>
+              </w:rPr>
+              <w:t>220</w:t>
+            </w:r>
+          </w:p>
+        </w:tc>
+        <w:tc>
+          <w:tcPr>
+            <w:tcW w:type="dxa" w:w="2412"/>
+          </w:tcPr>
+          <w:p>
+            <w:r/>
+            <w:r>
+              <w:rPr>
+                <w:sz w:val="20"/>
+              </w:rPr>
+              <w:t>0</w:t>
+            </w:r>
+          </w:p>
+        </w:tc>
+        <w:tc>
+          <w:tcPr>
+            <w:tcW w:type="dxa" w:w="2412"/>
+          </w:tcPr>
+          <w:p>
+            <w:r/>
+            <w:r>
+              <w:rPr>
+                <w:sz w:val="20"/>
+              </w:rPr>
+              <w:t>0</w:t>
+            </w:r>
+          </w:p>
+        </w:tc>
+      </w:tr>
+      <w:tr>
+        <w:tc>
+          <w:tcPr>
+            <w:tcW w:type="dxa" w:w="2412"/>
+          </w:tcPr>
+          <w:p>
+            <w:r/>
+            <w:r>
+              <w:rPr>
+                <w:sz w:val="20"/>
+              </w:rPr>
+              <w:t>False alarms on two clean drives</w:t>
+            </w:r>
+          </w:p>
+        </w:tc>
+        <w:tc>
+          <w:tcPr>
+            <w:tcW w:type="dxa" w:w="2412"/>
+          </w:tcPr>
+          <w:p>
+            <w:r/>
+            <w:r>
+              <w:rPr>
+                <w:sz w:val="20"/>
+              </w:rPr>
+              <w:t>162</w:t>
+            </w:r>
+          </w:p>
+        </w:tc>
+        <w:tc>
+          <w:tcPr>
+            <w:tcW w:type="dxa" w:w="2412"/>
+          </w:tcPr>
+          <w:p>
+            <w:r/>
+            <w:r>
+              <w:rPr>
+                <w:sz w:val="20"/>
+              </w:rPr>
+              <w:t>0</w:t>
+            </w:r>
+          </w:p>
+        </w:tc>
+        <w:tc>
+          <w:tcPr>
+            <w:tcW w:type="dxa" w:w="2412"/>
+          </w:tcPr>
+          <w:p>
+            <w:r/>
+            <w:r>
+              <w:rPr>
+                <w:sz w:val="20"/>
+              </w:rPr>
+              <w:t>0</w:t>
+            </w:r>
+          </w:p>
+        </w:tc>
+      </w:tr>
+      <w:tr>
+        <w:tc>
+          <w:tcPr>
+            <w:tcW w:type="dxa" w:w="2412"/>
+          </w:tcPr>
+          <w:p>
+            <w:r/>
+            <w:r>
+              <w:rPr>
+                <w:sz w:val="20"/>
+              </w:rPr>
+              <w:t>Still raising the alarm when the run ended</w:t>
+            </w:r>
+          </w:p>
+        </w:tc>
+        <w:tc>
+          <w:tcPr>
+            <w:tcW w:type="dxa" w:w="2412"/>
+          </w:tcPr>
+          <w:p>
+            <w:r/>
+            <w:r>
+              <w:rPr>
+                <w:sz w:val="20"/>
+              </w:rPr>
+              <w:t>21</w:t>
+            </w:r>
+          </w:p>
+        </w:tc>
+        <w:tc>
+          <w:tcPr>
+            <w:tcW w:type="dxa" w:w="2412"/>
+          </w:tcPr>
+          <w:p>
+            <w:r/>
+            <w:r>
+              <w:rPr>
+                <w:sz w:val="20"/>
+              </w:rPr>
+              <w:t>0</w:t>
+            </w:r>
+          </w:p>
+        </w:tc>
+        <w:tc>
+          <w:tcPr>
+            <w:tcW w:type="dxa" w:w="2412"/>
+          </w:tcPr>
+          <w:p>
+            <w:r/>
+            <w:r>
+              <w:rPr>
+                <w:sz w:val="20"/>
+              </w:rPr>
+              <w:t>0</w:t>
+            </w:r>
+          </w:p>
+        </w:tc>
+      </w:tr>
+      <w:tr>
+        <w:tc>
+          <w:tcPr>
+            <w:tcW w:type="dxa" w:w="2412"/>
+          </w:tcPr>
+          <w:p>
+            <w:r/>
+            <w:r>
+              <w:rPr>
+                <w:sz w:val="20"/>
+              </w:rPr>
+              <w:t>Largest speed error during a fault, m/s</w:t>
+            </w:r>
+          </w:p>
+        </w:tc>
+        <w:tc>
+          <w:tcPr>
+            <w:tcW w:type="dxa" w:w="2412"/>
+          </w:tcPr>
+          <w:p>
+            <w:r/>
+            <w:r>
+              <w:rPr>
+                <w:sz w:val="20"/>
+              </w:rPr>
+              <w:t>1.93</w:t>
+            </w:r>
+          </w:p>
+        </w:tc>
+        <w:tc>
+          <w:tcPr>
+            <w:tcW w:type="dxa" w:w="2412"/>
+          </w:tcPr>
+          <w:p>
+            <w:r/>
+            <w:r>
+              <w:rPr>
+                <w:sz w:val="20"/>
+              </w:rPr>
+              <w:t>0.67</w:t>
+            </w:r>
+          </w:p>
+        </w:tc>
+        <w:tc>
+          <w:tcPr>
+            <w:tcW w:type="dxa" w:w="2412"/>
+          </w:tcPr>
+          <w:p>
+            <w:r/>
+            <w:r>
+              <w:rPr>
+                <w:sz w:val="20"/>
+              </w:rPr>
+              <w:t>0.61</w:t>
+            </w:r>
+          </w:p>
+        </w:tc>
+      </w:tr>
+      <w:tr>
+        <w:tc>
+          <w:tcPr>
+            <w:tcW w:type="dxa" w:w="2412"/>
+          </w:tcPr>
+          <w:p>
+            <w:r/>
+            <w:r>
+              <w:rPr>
+                <w:sz w:val="20"/>
+              </w:rPr>
+              <w:t>Typical speed error during a fault, m/s</w:t>
+            </w:r>
+          </w:p>
+        </w:tc>
+        <w:tc>
+          <w:tcPr>
+            <w:tcW w:type="dxa" w:w="2412"/>
+          </w:tcPr>
+          <w:p>
+            <w:r/>
+            <w:r>
+              <w:rPr>
+                <w:sz w:val="20"/>
+              </w:rPr>
+              <w:t>0.79</w:t>
+            </w:r>
+          </w:p>
+        </w:tc>
+        <w:tc>
+          <w:tcPr>
+            <w:tcW w:type="dxa" w:w="2412"/>
+          </w:tcPr>
+          <w:p>
+            <w:r/>
+            <w:r>
+              <w:rPr>
+                <w:sz w:val="20"/>
+              </w:rPr>
+              <w:t>0.25</w:t>
+            </w:r>
+          </w:p>
+        </w:tc>
+        <w:tc>
+          <w:tcPr>
+            <w:tcW w:type="dxa" w:w="2412"/>
+          </w:tcPr>
+          <w:p>
+            <w:r/>
+            <w:r>
+              <w:rPr>
+                <w:sz w:val="20"/>
+              </w:rPr>
+              <w:t>0.20</w:t>
+            </w:r>
+          </w:p>
+        </w:tc>
+      </w:tr>
+      <w:tr>
+        <w:tc>
+          <w:tcPr>
+            <w:tcW w:type="dxa" w:w="2412"/>
+          </w:tcPr>
+          <w:p>
+            <w:r/>
+            <w:r>
+              <w:rPr>
+                <w:sz w:val="20"/>
+              </w:rPr>
+              <w:t>Control steps finished late</w:t>
+            </w:r>
+          </w:p>
+        </w:tc>
+        <w:tc>
+          <w:tcPr>
+            <w:tcW w:type="dxa" w:w="2412"/>
+          </w:tcPr>
+          <w:p>
+            <w:r/>
+            <w:r>
+              <w:rPr>
+                <w:sz w:val="20"/>
+              </w:rPr>
+              <w:t>0</w:t>
+            </w:r>
+          </w:p>
+        </w:tc>
+        <w:tc>
+          <w:tcPr>
+            <w:tcW w:type="dxa" w:w="2412"/>
+          </w:tcPr>
+          <w:p>
+            <w:r/>
+            <w:r>
+              <w:rPr>
+                <w:sz w:val="20"/>
+              </w:rPr>
+              <w:t>0</w:t>
+            </w:r>
+          </w:p>
+        </w:tc>
+        <w:tc>
+          <w:tcPr>
+            <w:tcW w:type="dxa" w:w="2412"/>
+          </w:tcPr>
+          <w:p>
+            <w:r/>
+            <w:r>
+              <w:rPr>
+                <w:sz w:val="20"/>
+              </w:rPr>
+              <w:t>0</w:t>
+            </w:r>
+          </w:p>
+        </w:tc>
+      </w:tr>
+      <w:tr>
+        <w:tc>
+          <w:tcPr>
+            <w:tcW w:type="dxa" w:w="2412"/>
+          </w:tcPr>
+          <w:p>
+            <w:r/>
+            <w:r>
+              <w:rPr>
+                <w:sz w:val="20"/>
+              </w:rPr>
+              <w:t>Longest control calculation, millionths of a second</w:t>
+            </w:r>
+          </w:p>
+        </w:tc>
+        <w:tc>
+          <w:tcPr>
+            <w:tcW w:type="dxa" w:w="2412"/>
+          </w:tcPr>
+          <w:p>
+            <w:r/>
+            <w:r>
+              <w:rPr>
+                <w:sz w:val="20"/>
+              </w:rPr>
+              <w:t>72</w:t>
+            </w:r>
+          </w:p>
+        </w:tc>
+        <w:tc>
+          <w:tcPr>
+            <w:tcW w:type="dxa" w:w="2412"/>
+          </w:tcPr>
+          <w:p>
+            <w:r/>
+            <w:r>
+              <w:rPr>
+                <w:sz w:val="20"/>
+              </w:rPr>
+              <w:t>74</w:t>
+            </w:r>
+          </w:p>
+        </w:tc>
+        <w:tc>
+          <w:tcPr>
+            <w:tcW w:type="dxa" w:w="2412"/>
+          </w:tcPr>
+          <w:p>
+            <w:r/>
+            <w:r>
+              <w:rPr>
+                <w:sz w:val="20"/>
+              </w:rPr>
+              <w:t>78</w:t>
+            </w:r>
+          </w:p>
+        </w:tc>
+      </w:tr>
+    </w:tbl>
+    <w:p>
+      <w:pPr>
+        <w:spacing w:after="40"/>
+      </w:pPr>
+    </w:p>
+    <w:p>
+      <w:pPr>
+        <w:spacing w:after="160"/>
+      </w:pPr>
+      <w:r>
+        <w:rPr>
+          <w:i/>
+          <w:color w:val="595959"/>
+          <w:sz w:val="18"/>
+        </w:rPr>
+        <w:t>Table. Injected speed-sensor faults on the board. One run per case, each on the firmware its column names, confirmed from the chip's own report. MEASURED on the board.</w:t>
+      </w:r>
+    </w:p>
+    <w:p>
+      <w:pPr>
+        <w:spacing w:after="160"/>
+      </w:pPr>
+      <w:r>
+        <w:rPr>
+          <w:i w:val="0"/>
+          <w:sz w:val="24"/>
+        </w:rPr>
+        <w:t>The new checker caught all 40 faults, the slowest in 0.32 seconds, and raised no false alarm. The first checker caught 33 and raised 162 false alarms on one clean drive with a drifting acceleration signal. That is the failure the simulation predicted, now seen on the chip.</w:t>
+      </w:r>
+    </w:p>
+    <w:p>
+      <w:pPr>
+        <w:spacing w:after="160"/>
+      </w:pPr>
+      <w:r>
+        <w:rPr>
+          <w:i w:val="0"/>
+          <w:sz w:val="24"/>
+        </w:rPr>
+        <w:t>The cost is small. The new checker's longest control calculation was 74 millionths of a second against 72 for the first, out of the 10,000 available, and no control step finished late in any run.</w:t>
+      </w:r>
+    </w:p>
+    <w:p>
+      <w:pPr>
+        <w:spacing w:after="160"/>
+      </w:pPr>
+      <w:r>
+        <w:rPr>
+          <w:i w:val="0"/>
+          <w:sz w:val="24"/>
+        </w:rPr>
+        <w:t>The rule helper in the last column is explained in the next section. On the board it made a small difference in the direction the simulation gave. With 40 runs per version, that difference is not established.</w:t>
+      </w:r>
+    </w:p>
+    <w:p>
+      <w:pPr>
+        <w:pStyle w:val="Heading2"/>
+      </w:pPr>
+      <w:r>
+        <w:t>What this does not cover</w:t>
+      </w:r>
+    </w:p>
+    <w:p>
+      <w:pPr>
+        <w:pStyle w:val="ListBullet"/>
+        <w:spacing w:after="80"/>
+      </w:pPr>
+      <w:r>
+        <w:t>A real acceleration sensor. The drift on the board was simulated from what the logged trips showed.</w:t>
+      </w:r>
+    </w:p>
+    <w:p>
+      <w:pPr>
+        <w:pStyle w:val="ListBullet"/>
+        <w:spacing w:after="80"/>
+      </w:pPr>
+      <w:r>
+        <w:t>Repeats. Each case was run once, with one draw of noise.</w:t>
+      </w:r>
+    </w:p>
+    <w:p>
+      <w:pPr>
+        <w:pStyle w:val="ListBullet"/>
+        <w:spacing w:after="80"/>
+      </w:pPr>
+      <w:r>
+        <w:t>The new checker has not passed every limit set in advance. In simulation it is still late on a few small errors under heavy noise. On the board those cases were caught in 0.22 to 0.32 seconds.</w:t>
+      </w:r>
+    </w:p>
+    <w:p>
+      <w:pPr>
+        <w:pStyle w:val="Heading1"/>
+      </w:pPr>
+      <w:r>
+        <w:t>31. AI helpers around the fault checker</w:t>
+      </w:r>
+    </w:p>
+    <w:p>
+      <w:pPr>
+        <w:spacing w:after="160"/>
+      </w:pPr>
+      <w:r>
+        <w:rPr>
+          <w:i w:val="0"/>
+          <w:sz w:val="24"/>
+        </w:rPr>
+        <w:t>The fault checker makes fast decisions, one every hundredth of a second. The plan proposed a second, slower layer: a helper that looks back over the last tenth of a second and advises the checker. The helper may only do four things: keep an alarm raised, release it, choose which backup speed to use, or make the checker more watchful. It never commands the motor.</w:t>
+      </w:r>
+    </w:p>
+    <w:p>
+      <w:pPr>
+        <w:spacing w:after="160"/>
+      </w:pPr>
+      <w:r>
+        <w:rPr>
+          <w:i w:val="0"/>
+          <w:sz w:val="24"/>
+        </w:rPr>
+        <w:t>The plan intended this seat for Jev, a paid online AI model. Jev has not been purchased, so no result in this report is a Jev result. To test the idea itself, three other helpers were put in the same seat: a helper made of hand-written rules, and two small neural networks of 1,508 and 550 numbers, small enough for the chip.</w:t>
+      </w:r>
+    </w:p>
+    <w:p>
+      <w:pPr>
+        <w:pStyle w:val="Heading2"/>
+      </w:pPr>
+      <w:r>
+        <w:t>As judges, the AI helpers were better</w:t>
+      </w:r>
+    </w:p>
+    <w:p>
+      <w:pPr>
+        <w:spacing w:after="160"/>
+      </w:pPr>
+      <w:r>
+        <w:rPr>
+          <w:i w:val="0"/>
+          <w:sz w:val="24"/>
+        </w:rPr>
+        <w:t>Each helper was first scored on its diagnosis alone, without letting it change anything. While an alarm was raised, the rule helper recognised a real fault 94% of the time and the larger neural network 99%. With no alarm raised, the rule helper recognised 1% of faults and the network 88%. SIMULATED, 540,960 tenth-of-a-second blocks from the highway cycle.</w:t>
+      </w:r>
+    </w:p>
+    <w:p>
+      <w:pPr>
+        <w:pStyle w:val="Heading2"/>
+      </w:pPr>
+      <w:r>
+        <w:t>In control of the car, they were worse</w:t>
+      </w:r>
+    </w:p>
+    <w:tbl>
+      <w:tblPr>
+        <w:tblStyle w:val="LightGrid-Accent1"/>
+        <w:tblW w:type="auto" w:w="0"/>
+        <w:jc w:val="center"/>
+        <w:tblLook w:firstColumn="1" w:firstRow="1" w:lastColumn="0" w:lastRow="0" w:noHBand="0" w:noVBand="1" w:val="04A0"/>
+      </w:tblPr>
+      <w:tblGrid>
+        <w:gridCol w:w="1930"/>
+        <w:gridCol w:w="1930"/>
+        <w:gridCol w:w="1930"/>
+        <w:gridCol w:w="1930"/>
+        <w:gridCol w:w="1930"/>
+      </w:tblGrid>
+      <w:tr>
+        <w:tc>
+          <w:tcPr>
+            <w:tcW w:type="dxa" w:w="1930"/>
+          </w:tcPr>
+          <w:p>
+            <w:r/>
+            <w:r>
+              <w:rPr>
+                <w:b/>
+                <w:sz w:val="20"/>
+              </w:rPr>
+            </w:r>
+          </w:p>
+        </w:tc>
+        <w:tc>
+          <w:tcPr>
+            <w:tcW w:type="dxa" w:w="1930"/>
+          </w:tcPr>
+          <w:p>
+            <w:r/>
+            <w:r>
+              <w:rPr>
+                <w:b/>
+                <w:sz w:val="20"/>
+              </w:rPr>
+              <w:t>Largest speed error, highway, m/s</w:t>
+            </w:r>
+          </w:p>
+        </w:tc>
+        <w:tc>
+          <w:tcPr>
+            <w:tcW w:type="dxa" w:w="1930"/>
+          </w:tcPr>
+          <w:p>
+            <w:r/>
+            <w:r>
+              <w:rPr>
+                <w:b/>
+                <w:sz w:val="20"/>
+              </w:rPr>
+              <w:t>Largest speed error, aggressive, m/s</w:t>
+            </w:r>
+          </w:p>
+        </w:tc>
+        <w:tc>
+          <w:tcPr>
+            <w:tcW w:type="dxa" w:w="1930"/>
+          </w:tcPr>
+          <w:p>
+            <w:r/>
+            <w:r>
+              <w:rPr>
+                <w:b/>
+                <w:sz w:val="20"/>
+              </w:rPr>
+              <w:t>False alarms, highway</w:t>
+            </w:r>
+          </w:p>
+        </w:tc>
+        <w:tc>
+          <w:tcPr>
+            <w:tcW w:type="dxa" w:w="1930"/>
+          </w:tcPr>
+          <w:p>
+            <w:r/>
+            <w:r>
+              <w:rPr>
+                <w:b/>
+                <w:sz w:val="20"/>
+              </w:rPr>
+              <w:t>False alarms, aggressive</w:t>
+            </w:r>
+          </w:p>
+        </w:tc>
+      </w:tr>
+      <w:tr>
+        <w:tc>
+          <w:tcPr>
+            <w:tcW w:type="dxa" w:w="1930"/>
+          </w:tcPr>
+          <w:p>
+            <w:r/>
+            <w:r>
+              <w:rPr>
+                <w:sz w:val="20"/>
+              </w:rPr>
+              <w:t>New checker alone</w:t>
+            </w:r>
+          </w:p>
+        </w:tc>
+        <w:tc>
+          <w:tcPr>
+            <w:tcW w:type="dxa" w:w="1930"/>
+          </w:tcPr>
+          <w:p>
+            <w:r/>
+            <w:r>
+              <w:rPr>
+                <w:sz w:val="20"/>
+              </w:rPr>
+              <w:t>3.7</w:t>
+            </w:r>
+          </w:p>
+        </w:tc>
+        <w:tc>
+          <w:tcPr>
+            <w:tcW w:type="dxa" w:w="1930"/>
+          </w:tcPr>
+          <w:p>
+            <w:r/>
+            <w:r>
+              <w:rPr>
+                <w:sz w:val="20"/>
+              </w:rPr>
+              <w:t>5.1</w:t>
+            </w:r>
+          </w:p>
+        </w:tc>
+        <w:tc>
+          <w:tcPr>
+            <w:tcW w:type="dxa" w:w="1930"/>
+          </w:tcPr>
+          <w:p>
+            <w:r/>
+            <w:r>
+              <w:rPr>
+                <w:sz w:val="20"/>
+              </w:rPr>
+              <w:t>0</w:t>
+            </w:r>
+          </w:p>
+        </w:tc>
+        <w:tc>
+          <w:tcPr>
+            <w:tcW w:type="dxa" w:w="1930"/>
+          </w:tcPr>
+          <w:p>
+            <w:r/>
+            <w:r>
+              <w:rPr>
+                <w:sz w:val="20"/>
+              </w:rPr>
+              <w:t>0</w:t>
+            </w:r>
+          </w:p>
+        </w:tc>
+      </w:tr>
+      <w:tr>
+        <w:tc>
+          <w:tcPr>
+            <w:tcW w:type="dxa" w:w="1930"/>
+          </w:tcPr>
+          <w:p>
+            <w:r/>
+            <w:r>
+              <w:rPr>
+                <w:sz w:val="20"/>
+              </w:rPr>
+              <w:t>With the rule helper</w:t>
+            </w:r>
+          </w:p>
+        </w:tc>
+        <w:tc>
+          <w:tcPr>
+            <w:tcW w:type="dxa" w:w="1930"/>
+          </w:tcPr>
+          <w:p>
+            <w:r/>
+            <w:r>
+              <w:rPr>
+                <w:sz w:val="20"/>
+              </w:rPr>
+              <w:t>1.2</w:t>
+            </w:r>
+          </w:p>
+        </w:tc>
+        <w:tc>
+          <w:tcPr>
+            <w:tcW w:type="dxa" w:w="1930"/>
+          </w:tcPr>
+          <w:p>
+            <w:r/>
+            <w:r>
+              <w:rPr>
+                <w:sz w:val="20"/>
+              </w:rPr>
+              <w:t>1.4</w:t>
+            </w:r>
+          </w:p>
+        </w:tc>
+        <w:tc>
+          <w:tcPr>
+            <w:tcW w:type="dxa" w:w="1930"/>
+          </w:tcPr>
+          <w:p>
+            <w:r/>
+            <w:r>
+              <w:rPr>
+                <w:sz w:val="20"/>
+              </w:rPr>
+              <w:t>0</w:t>
+            </w:r>
+          </w:p>
+        </w:tc>
+        <w:tc>
+          <w:tcPr>
+            <w:tcW w:type="dxa" w:w="1930"/>
+          </w:tcPr>
+          <w:p>
+            <w:r/>
+            <w:r>
+              <w:rPr>
+                <w:sz w:val="20"/>
+              </w:rPr>
+              <w:t>0</w:t>
+            </w:r>
+          </w:p>
+        </w:tc>
+      </w:tr>
+      <w:tr>
+        <w:tc>
+          <w:tcPr>
+            <w:tcW w:type="dxa" w:w="1930"/>
+          </w:tcPr>
+          <w:p>
+            <w:r/>
+            <w:r>
+              <w:rPr>
+                <w:sz w:val="20"/>
+              </w:rPr>
+              <w:t>With the larger neural network</w:t>
+            </w:r>
+          </w:p>
+        </w:tc>
+        <w:tc>
+          <w:tcPr>
+            <w:tcW w:type="dxa" w:w="1930"/>
+          </w:tcPr>
+          <w:p>
+            <w:r/>
+            <w:r>
+              <w:rPr>
+                <w:sz w:val="20"/>
+              </w:rPr>
+              <w:t>9.7</w:t>
+            </w:r>
+          </w:p>
+        </w:tc>
+        <w:tc>
+          <w:tcPr>
+            <w:tcW w:type="dxa" w:w="1930"/>
+          </w:tcPr>
+          <w:p>
+            <w:r/>
+            <w:r>
+              <w:rPr>
+                <w:sz w:val="20"/>
+              </w:rPr>
+              <w:t>10.8</w:t>
+            </w:r>
+          </w:p>
+        </w:tc>
+        <w:tc>
+          <w:tcPr>
+            <w:tcW w:type="dxa" w:w="1930"/>
+          </w:tcPr>
+          <w:p>
+            <w:r/>
+            <w:r>
+              <w:rPr>
+                <w:sz w:val="20"/>
+              </w:rPr>
+              <w:t>4</w:t>
+            </w:r>
+          </w:p>
+        </w:tc>
+        <w:tc>
+          <w:tcPr>
+            <w:tcW w:type="dxa" w:w="1930"/>
+          </w:tcPr>
+          <w:p>
+            <w:r/>
+            <w:r>
+              <w:rPr>
+                <w:sz w:val="20"/>
+              </w:rPr>
+              <w:t>3</w:t>
+            </w:r>
+          </w:p>
+        </w:tc>
+      </w:tr>
+      <w:tr>
+        <w:tc>
+          <w:tcPr>
+            <w:tcW w:type="dxa" w:w="1930"/>
+          </w:tcPr>
+          <w:p>
+            <w:r/>
+            <w:r>
+              <w:rPr>
+                <w:sz w:val="20"/>
+              </w:rPr>
+              <w:t>With the smaller neural network</w:t>
+            </w:r>
+          </w:p>
+        </w:tc>
+        <w:tc>
+          <w:tcPr>
+            <w:tcW w:type="dxa" w:w="1930"/>
+          </w:tcPr>
+          <w:p>
+            <w:r/>
+            <w:r>
+              <w:rPr>
+                <w:sz w:val="20"/>
+              </w:rPr>
+              <w:t>3.0</w:t>
+            </w:r>
+          </w:p>
+        </w:tc>
+        <w:tc>
+          <w:tcPr>
+            <w:tcW w:type="dxa" w:w="1930"/>
+          </w:tcPr>
+          <w:p>
+            <w:r/>
+            <w:r>
+              <w:rPr>
+                <w:sz w:val="20"/>
+              </w:rPr>
+              <w:t>12.8</w:t>
+            </w:r>
+          </w:p>
+        </w:tc>
+        <w:tc>
+          <w:tcPr>
+            <w:tcW w:type="dxa" w:w="1930"/>
+          </w:tcPr>
+          <w:p>
+            <w:r/>
+            <w:r>
+              <w:rPr>
+                <w:sz w:val="20"/>
+              </w:rPr>
+              <w:t>2</w:t>
+            </w:r>
+          </w:p>
+        </w:tc>
+        <w:tc>
+          <w:tcPr>
+            <w:tcW w:type="dxa" w:w="1930"/>
+          </w:tcPr>
+          <w:p>
+            <w:r/>
+            <w:r>
+              <w:rPr>
+                <w:sz w:val="20"/>
+              </w:rPr>
+              <w:t>5</w:t>
+            </w:r>
+          </w:p>
+        </w:tc>
+      </w:tr>
+    </w:tbl>
+    <w:p>
+      <w:pPr>
+        <w:spacing w:after="40"/>
+      </w:pPr>
+    </w:p>
+    <w:p>
+      <w:pPr>
+        <w:spacing w:after="160"/>
+      </w:pPr>
+      <w:r>
+        <w:rPr>
+          <w:i/>
+          <w:color w:val="595959"/>
+          <w:sz w:val="18"/>
+        </w:rPr>
+        <w:t>Table. Each helper on the chip, with no delay. Largest speed error through any of 560 faults; false alarms on the clean drives. SIMULATED on the laptop.</w:t>
+      </w:r>
+    </w:p>
+    <w:p>
+      <w:pPr>
+        <w:spacing w:after="160"/>
+      </w:pPr>
+      <w:r>
+        <w:rPr>
+          <w:i w:val="0"/>
+          <w:sz w:val="24"/>
+        </w:rPr>
+        <w:t>The rule helper cut the largest speed error from 3.7 to 1.2 metres per second on the highway cycle, with no false alarm. The neural networks, which judged faults better, drove the car worse: up to 13 metres per second off on the aggressive cycle, and they added false alarms.</w:t>
+      </w:r>
+    </w:p>
+    <w:p>
+      <w:pPr>
+        <w:spacing w:after="160"/>
+      </w:pPr>
+      <w:r>
+        <w:rPr>
+          <w:i w:val="0"/>
+          <w:sz w:val="24"/>
+        </w:rPr>
+        <w:t>The cause was traced on the highway cycle. The networks were right that the sensor was faulty, so they kept the alarm raised. While the alarm is raised the controller works out its speed from a backup, and both backups drift. For a small sensor error, five seconds on a drifting backup did more harm than trusting the slightly wrong sensor would have. A better judge does not fix a drifting backup.</w:t>
+      </w:r>
+    </w:p>
+    <w:p>
+      <w:pPr>
+        <w:pStyle w:val="Heading2"/>
+      </w:pPr>
+      <w:r>
+        <w:t>Delay, and what it means for an online helper</w:t>
+      </w:r>
+    </w:p>
+    <w:p>
+      <w:pPr>
+        <w:spacing w:after="160"/>
+      </w:pPr>
+      <w:r>
+        <w:rPr>
+          <w:i w:val="0"/>
+          <w:sz w:val="24"/>
+        </w:rPr>
+        <w:t>An online helper answers late. The rule helper was tested with its answers delayed. Up to half a second it worked about as well as with no delay. At one second its advice arrived too late to be used, and the result was the checker alone. A lost connection during a fault also left the checker working alone, which is the designed behaviour.</w:t>
+      </w:r>
+    </w:p>
+    <w:p>
+      <w:pPr>
+        <w:pStyle w:val="Heading2"/>
+      </w:pPr>
+      <w:r>
+        <w:t>Mixing the two backup speeds did not help</w:t>
+      </w:r>
+    </w:p>
+    <w:p>
+      <w:pPr>
+        <w:spacing w:after="160"/>
+      </w:pPr>
+      <w:r>
+        <w:rPr>
+          <w:i w:val="0"/>
+          <w:sz w:val="24"/>
+        </w:rPr>
+        <w:t>One further idea was tried: instead of choosing one backup speed, use a mix of the two, with the mix set by a fixed number or by a helper. No mix beat the rule helper's simple choice. A fixed half-and-half mix gave a largest error of 8.0 metres per second on the aggressive cycle. SIMULATED.</w:t>
+      </w:r>
+    </w:p>
+    <w:p>
+      <w:pPr>
+        <w:pStyle w:val="Heading2"/>
+      </w:pPr>
+      <w:r>
+        <w:t>What this means for buying Jev</w:t>
+      </w:r>
+    </w:p>
+    <w:p>
+      <w:pPr>
+        <w:pStyle w:val="ListBullet"/>
+        <w:spacing w:after="80"/>
+      </w:pPr>
+      <w:r>
+        <w:t>For the sensor-fault task, the evidence is against it. The simple rules did the job, and the limit was the drifting backup speed, which no helper can fix by judging better.</w:t>
+      </w:r>
+    </w:p>
+    <w:p>
+      <w:pPr>
+        <w:pStyle w:val="ListBullet"/>
+        <w:spacing w:after="80"/>
+      </w:pPr>
+      <w:r>
+        <w:t>A hosted helper would need to answer within about half a second and bring information the car does not already have.</w:t>
+      </w:r>
+    </w:p>
+    <w:p>
+      <w:pPr>
+        <w:pStyle w:val="ListBullet"/>
+        <w:spacing w:after="80"/>
+      </w:pPr>
+      <w:r>
+        <w:t>Nothing here tests Jev itself. Its seat in the software is ready if it is bought later.</w:t>
+      </w:r>
+    </w:p>
+    <w:p>
+      <w:pPr>
+        <w:pStyle w:val="Heading1"/>
+      </w:pPr>
+      <w:r>
+        <w:t>32. Planning the speed to save energy</w:t>
+      </w:r>
+    </w:p>
+    <w:p>
+      <w:pPr>
+        <w:spacing w:after="160"/>
+      </w:pPr>
+      <w:r>
+        <w:rPr>
+          <w:i w:val="0"/>
+          <w:sz w:val="24"/>
+        </w:rPr>
+        <w:t>Everything before this section followed a speed trace that was handed to the controller. This section asks a different question: if the car may choose its own speed, how much energy can it save? This is a new task. It does not change any energy figure earlier in the report.</w:t>
+      </w:r>
+    </w:p>
+    <w:p>
+      <w:pPr>
+        <w:spacing w:after="160"/>
+      </w:pPr>
+      <w:r>
+        <w:rPr>
+          <w:i w:val="0"/>
+          <w:sz w:val="24"/>
+        </w:rPr>
+        <w:t>The rules were fixed before any planner was run. A route is a standard drive with the driver taken out. The planner must cover the same distance, make every stop and wait the same time at each, stay under the fastest speed the drive reached nearby, accelerate and brake no harder than the drive did, and arrive at the same time within 1%.</w:t>
+      </w:r>
+    </w:p>
+    <w:p>
+      <w:pPr>
+        <w:spacing w:after="160"/>
+      </w:pPr>
+      <w:r>
+        <w:rPr>
+          <w:i w:val="0"/>
+          <w:sz w:val="24"/>
+        </w:rPr>
+        <w:t>One thing is missing from this task, and it limits what the numbers mean: other traffic. Where the recorded drive slowed for a car ahead, the planner is free not to. The savings below are for an empty road. They are the most that planning could give, not what it would give in traffic.</w:t>
+      </w:r>
+    </w:p>
+    <w:tbl>
+      <w:tblPr>
+        <w:tblStyle w:val="LightGrid-Accent1"/>
+        <w:tblW w:type="auto" w:w="0"/>
+        <w:jc w:val="center"/>
+        <w:tblLook w:firstColumn="1" w:firstRow="1" w:lastColumn="0" w:lastRow="0" w:noHBand="0" w:noVBand="1" w:val="04A0"/>
+      </w:tblPr>
+      <w:tblGrid>
+        <w:gridCol w:w="1930"/>
+        <w:gridCol w:w="1930"/>
+        <w:gridCol w:w="1930"/>
+        <w:gridCol w:w="1930"/>
+        <w:gridCol w:w="1930"/>
+      </w:tblGrid>
+      <w:tr>
+        <w:tc>
+          <w:tcPr>
+            <w:tcW w:type="dxa" w:w="1930"/>
+          </w:tcPr>
+          <w:p>
+            <w:r/>
+            <w:r>
+              <w:rPr>
+                <w:b/>
+                <w:sz w:val="20"/>
+              </w:rPr>
+            </w:r>
+          </w:p>
+        </w:tc>
+        <w:tc>
+          <w:tcPr>
+            <w:tcW w:type="dxa" w:w="1930"/>
+          </w:tcPr>
+          <w:p>
+            <w:r/>
+            <w:r>
+              <w:rPr>
+                <w:b/>
+                <w:sz w:val="20"/>
+              </w:rPr>
+              <w:t>Aggressive route, Wh/km</w:t>
+            </w:r>
+          </w:p>
+        </w:tc>
+        <w:tc>
+          <w:tcPr>
+            <w:tcW w:type="dxa" w:w="1930"/>
+          </w:tcPr>
+          <w:p>
+            <w:r/>
+            <w:r>
+              <w:rPr>
+                <w:b/>
+                <w:sz w:val="20"/>
+              </w:rPr>
+              <w:t>Saving</w:t>
+            </w:r>
+          </w:p>
+        </w:tc>
+        <w:tc>
+          <w:tcPr>
+            <w:tcW w:type="dxa" w:w="1930"/>
+          </w:tcPr>
+          <w:p>
+            <w:r/>
+            <w:r>
+              <w:rPr>
+                <w:b/>
+                <w:sz w:val="20"/>
+              </w:rPr>
+              <w:t>Highway route, Wh/km</w:t>
+            </w:r>
+          </w:p>
+        </w:tc>
+        <w:tc>
+          <w:tcPr>
+            <w:tcW w:type="dxa" w:w="1930"/>
+          </w:tcPr>
+          <w:p>
+            <w:r/>
+            <w:r>
+              <w:rPr>
+                <w:b/>
+                <w:sz w:val="20"/>
+              </w:rPr>
+              <w:t>Saving</w:t>
+            </w:r>
+          </w:p>
+        </w:tc>
+      </w:tr>
+      <w:tr>
+        <w:tc>
+          <w:tcPr>
+            <w:tcW w:type="dxa" w:w="1930"/>
+          </w:tcPr>
+          <w:p>
+            <w:r/>
+            <w:r>
+              <w:rPr>
+                <w:sz w:val="20"/>
+              </w:rPr>
+              <w:t>The drive as recorded</w:t>
+            </w:r>
+          </w:p>
+        </w:tc>
+        <w:tc>
+          <w:tcPr>
+            <w:tcW w:type="dxa" w:w="1930"/>
+          </w:tcPr>
+          <w:p>
+            <w:r/>
+            <w:r>
+              <w:rPr>
+                <w:sz w:val="20"/>
+              </w:rPr>
+              <w:t>190.5</w:t>
+            </w:r>
+          </w:p>
+        </w:tc>
+        <w:tc>
+          <w:tcPr>
+            <w:tcW w:type="dxa" w:w="1930"/>
+          </w:tcPr>
+          <w:p>
+            <w:r/>
+            <w:r>
+              <w:rPr>
+                <w:sz w:val="20"/>
+              </w:rPr>
+              <w:t>0.0%</w:t>
+            </w:r>
+          </w:p>
+        </w:tc>
+        <w:tc>
+          <w:tcPr>
+            <w:tcW w:type="dxa" w:w="1930"/>
+          </w:tcPr>
+          <w:p>
+            <w:r/>
+            <w:r>
+              <w:rPr>
+                <w:sz w:val="20"/>
+              </w:rPr>
+              <w:t>153.9</w:t>
+            </w:r>
+          </w:p>
+        </w:tc>
+        <w:tc>
+          <w:tcPr>
+            <w:tcW w:type="dxa" w:w="1930"/>
+          </w:tcPr>
+          <w:p>
+            <w:r/>
+            <w:r>
+              <w:rPr>
+                <w:sz w:val="20"/>
+              </w:rPr>
+              <w:t>0.0%</w:t>
+            </w:r>
+          </w:p>
+        </w:tc>
+      </w:tr>
+      <w:tr>
+        <w:tc>
+          <w:tcPr>
+            <w:tcW w:type="dxa" w:w="1930"/>
+          </w:tcPr>
+          <w:p>
+            <w:r/>
+            <w:r>
+              <w:rPr>
+                <w:sz w:val="20"/>
+              </w:rPr>
+              <w:t>Planner that sees the whole route</w:t>
+            </w:r>
+          </w:p>
+        </w:tc>
+        <w:tc>
+          <w:tcPr>
+            <w:tcW w:type="dxa" w:w="1930"/>
+          </w:tcPr>
+          <w:p>
+            <w:r/>
+            <w:r>
+              <w:rPr>
+                <w:sz w:val="20"/>
+              </w:rPr>
+              <w:t>170.6</w:t>
+            </w:r>
+          </w:p>
+        </w:tc>
+        <w:tc>
+          <w:tcPr>
+            <w:tcW w:type="dxa" w:w="1930"/>
+          </w:tcPr>
+          <w:p>
+            <w:r/>
+            <w:r>
+              <w:rPr>
+                <w:sz w:val="20"/>
+              </w:rPr>
+              <w:t>10.4%</w:t>
+            </w:r>
+          </w:p>
+        </w:tc>
+        <w:tc>
+          <w:tcPr>
+            <w:tcW w:type="dxa" w:w="1930"/>
+          </w:tcPr>
+          <w:p>
+            <w:r/>
+            <w:r>
+              <w:rPr>
+                <w:sz w:val="20"/>
+              </w:rPr>
+              <w:t>152.1</w:t>
+            </w:r>
+          </w:p>
+        </w:tc>
+        <w:tc>
+          <w:tcPr>
+            <w:tcW w:type="dxa" w:w="1930"/>
+          </w:tcPr>
+          <w:p>
+            <w:r/>
+            <w:r>
+              <w:rPr>
+                <w:sz w:val="20"/>
+              </w:rPr>
+              <w:t>1.2%</w:t>
+            </w:r>
+          </w:p>
+        </w:tc>
+      </w:tr>
+      <w:tr>
+        <w:tc>
+          <w:tcPr>
+            <w:tcW w:type="dxa" w:w="1930"/>
+          </w:tcPr>
+          <w:p>
+            <w:r/>
+            <w:r>
+              <w:rPr>
+                <w:sz w:val="20"/>
+              </w:rPr>
+              <w:t>Planner that sees 300 m ahead</w:t>
+            </w:r>
+          </w:p>
+        </w:tc>
+        <w:tc>
+          <w:tcPr>
+            <w:tcW w:type="dxa" w:w="1930"/>
+          </w:tcPr>
+          <w:p>
+            <w:r/>
+            <w:r>
+              <w:rPr>
+                <w:sz w:val="20"/>
+              </w:rPr>
+              <w:t>172.4</w:t>
+            </w:r>
+          </w:p>
+        </w:tc>
+        <w:tc>
+          <w:tcPr>
+            <w:tcW w:type="dxa" w:w="1930"/>
+          </w:tcPr>
+          <w:p>
+            <w:r/>
+            <w:r>
+              <w:rPr>
+                <w:sz w:val="20"/>
+              </w:rPr>
+              <w:t>9.5%</w:t>
+            </w:r>
+          </w:p>
+        </w:tc>
+        <w:tc>
+          <w:tcPr>
+            <w:tcW w:type="dxa" w:w="1930"/>
+          </w:tcPr>
+          <w:p>
+            <w:r/>
+            <w:r>
+              <w:rPr>
+                <w:sz w:val="20"/>
+              </w:rPr>
+              <w:t>152.7</w:t>
+            </w:r>
+          </w:p>
+        </w:tc>
+        <w:tc>
+          <w:tcPr>
+            <w:tcW w:type="dxa" w:w="1930"/>
+          </w:tcPr>
+          <w:p>
+            <w:r/>
+            <w:r>
+              <w:rPr>
+                <w:sz w:val="20"/>
+              </w:rPr>
+              <w:t>0.8%</w:t>
+            </w:r>
+          </w:p>
+        </w:tc>
+      </w:tr>
+      <w:tr>
+        <w:tc>
+          <w:tcPr>
+            <w:tcW w:type="dxa" w:w="1930"/>
+          </w:tcPr>
+          <w:p>
+            <w:r/>
+            <w:r>
+              <w:rPr>
+                <w:sz w:val="20"/>
+              </w:rPr>
+              <w:t>300 m ahead, with a learned estimate of the rest</w:t>
+            </w:r>
+          </w:p>
+        </w:tc>
+        <w:tc>
+          <w:tcPr>
+            <w:tcW w:type="dxa" w:w="1930"/>
+          </w:tcPr>
+          <w:p>
+            <w:r/>
+            <w:r>
+              <w:rPr>
+                <w:sz w:val="20"/>
+              </w:rPr>
+              <w:t>170.6</w:t>
+            </w:r>
+          </w:p>
+        </w:tc>
+        <w:tc>
+          <w:tcPr>
+            <w:tcW w:type="dxa" w:w="1930"/>
+          </w:tcPr>
+          <w:p>
+            <w:r/>
+            <w:r>
+              <w:rPr>
+                <w:sz w:val="20"/>
+              </w:rPr>
+              <w:t>10.4%</w:t>
+            </w:r>
+          </w:p>
+        </w:tc>
+        <w:tc>
+          <w:tcPr>
+            <w:tcW w:type="dxa" w:w="1930"/>
+          </w:tcPr>
+          <w:p>
+            <w:r/>
+            <w:r>
+              <w:rPr>
+                <w:sz w:val="20"/>
+              </w:rPr>
+              <w:t>152.3</w:t>
+            </w:r>
+          </w:p>
+        </w:tc>
+        <w:tc>
+          <w:tcPr>
+            <w:tcW w:type="dxa" w:w="1930"/>
+          </w:tcPr>
+          <w:p>
+            <w:r/>
+            <w:r>
+              <w:rPr>
+                <w:sz w:val="20"/>
+              </w:rPr>
+              <w:t>1.1%</w:t>
+            </w:r>
+          </w:p>
+        </w:tc>
+      </w:tr>
+      <w:tr>
+        <w:tc>
+          <w:tcPr>
+            <w:tcW w:type="dxa" w:w="1930"/>
+          </w:tcPr>
+          <w:p>
+            <w:r/>
+            <w:r>
+              <w:rPr>
+                <w:sz w:val="20"/>
+              </w:rPr>
+              <w:t>Neural network that picks the speed directly</w:t>
+            </w:r>
+          </w:p>
+        </w:tc>
+        <w:tc>
+          <w:tcPr>
+            <w:tcW w:type="dxa" w:w="1930"/>
+          </w:tcPr>
+          <w:p>
+            <w:r/>
+            <w:r>
+              <w:rPr>
+                <w:sz w:val="20"/>
+              </w:rPr>
+              <w:t>190.4</w:t>
+            </w:r>
+          </w:p>
+        </w:tc>
+        <w:tc>
+          <w:tcPr>
+            <w:tcW w:type="dxa" w:w="1930"/>
+          </w:tcPr>
+          <w:p>
+            <w:r/>
+            <w:r>
+              <w:rPr>
+                <w:sz w:val="20"/>
+              </w:rPr>
+              <w:t>0.0%</w:t>
+            </w:r>
+          </w:p>
+        </w:tc>
+        <w:tc>
+          <w:tcPr>
+            <w:tcW w:type="dxa" w:w="1930"/>
+          </w:tcPr>
+          <w:p>
+            <w:r/>
+            <w:r>
+              <w:rPr>
+                <w:sz w:val="20"/>
+              </w:rPr>
+              <w:t>153.4</w:t>
+            </w:r>
+          </w:p>
+        </w:tc>
+        <w:tc>
+          <w:tcPr>
+            <w:tcW w:type="dxa" w:w="1930"/>
+          </w:tcPr>
+          <w:p>
+            <w:r/>
+            <w:r>
+              <w:rPr>
+                <w:sz w:val="20"/>
+              </w:rPr>
+              <w:t>0.3%</w:t>
+            </w:r>
+          </w:p>
+        </w:tc>
+      </w:tr>
+    </w:tbl>
+    <w:p>
+      <w:pPr>
+        <w:spacing w:after="40"/>
+      </w:pPr>
+    </w:p>
+    <w:p>
+      <w:pPr>
+        <w:spacing w:after="160"/>
+      </w:pPr>
+      <w:r>
+        <w:rPr>
+          <w:i/>
+          <w:color w:val="595959"/>
+          <w:sz w:val="18"/>
+        </w:rPr>
+        <w:t>Table. Energy on the comparable scale, each speed plan driven through the full vehicle model with the speed controller and the rule energy manager. No other traffic. One run, reported as it came out. SIMULATED on the laptop.</w:t>
+      </w:r>
+    </w:p>
+    <w:p>
+      <w:pPr>
+        <w:spacing w:after="160"/>
+      </w:pPr>
+      <w:r>
+        <w:rPr>
+          <w:i w:val="0"/>
+          <w:sz w:val="24"/>
+        </w:rPr>
+        <w:t>On the aggressive route the planner used 10.4% less energy than the recorded drive, with the same stops and the same arrival time. On the steady highway route it saved 1.2%: that drive had little to smooth out.</w:t>
+      </w:r>
+    </w:p>
+    <w:p>
+      <w:pPr>
+        <w:spacing w:after="160"/>
+      </w:pPr>
+      <w:r>
+        <w:rPr>
+          <w:i w:val="0"/>
+          <w:sz w:val="24"/>
+        </w:rPr>
+        <w:t>A planner that sees only 300 metres ahead saved 9.5%. Giving it a small neural network that estimates the cost of the rest of the route brought it back to 10.4%. This is the one place in the project where a learned part clearly earned its keep.</w:t>
+      </w:r>
+    </w:p>
+    <w:p>
+      <w:pPr>
+        <w:spacing w:after="160"/>
+      </w:pPr>
+      <w:r>
+        <w:rPr>
+          <w:i w:val="0"/>
+          <w:sz w:val="24"/>
+        </w:rPr>
+        <w:t>A neural network asked to pick the speed directly, with no planning behind it, saved 0.0% on the aggressive route. It kept every rule, because a simple arithmetic check forces it to, but it drove no better than the recorded driver.</w:t>
+      </w:r>
+    </w:p>
+    <w:p>
+      <w:pPr>
+        <w:spacing w:after="160"/>
+      </w:pPr>
+      <w:r>
+        <w:rPr>
+          <w:i w:val="0"/>
+          <w:sz w:val="24"/>
+        </w:rPr>
+        <w:t>The planners draw a higher peak battery current than the recorded drive, 319 to 340 amperes against 257 on the aggressive route. Energy fell and peak current rose. The task set no current limit, and the cause was not examined.</w:t>
+      </w:r>
+    </w:p>
+    <w:p>
+      <w:pPr>
+        <w:pStyle w:val="Heading2"/>
+      </w:pPr>
+      <w:r>
+        <w:t>What this does not cover</w:t>
+      </w:r>
+    </w:p>
+    <w:p>
+      <w:pPr>
+        <w:pStyle w:val="ListBullet"/>
+        <w:spacing w:after="80"/>
+      </w:pPr>
+      <w:r>
+        <w:t>Other traffic, traffic lights, hills.</w:t>
+      </w:r>
+    </w:p>
+    <w:p>
+      <w:pPr>
+        <w:pStyle w:val="ListBullet"/>
+        <w:spacing w:after="80"/>
+      </w:pPr>
+      <w:r>
+        <w:t>The board. No planner was run on the chip.</w:t>
+      </w:r>
+    </w:p>
+    <w:p>
+      <w:pPr>
+        <w:pStyle w:val="ListBullet"/>
+        <w:spacing w:after="80"/>
+      </w:pPr>
+      <w:r>
+        <w:t>Repeats. One training run, one test route.</w:t>
+      </w:r>
+    </w:p>
+    <w:p>
+      <w:pPr>
+        <w:pStyle w:val="ListBullet"/>
+        <w:spacing w:after="80"/>
+      </w:pPr>
+      <w:r>
+        <w:t>Sending plans from a remote computer. It was considered and not run: the local planner already recovers the full saving, so a remote one would add a link without adding a result.</w:t>
+      </w:r>
+    </w:p>
+    <w:p>
+      <w:pPr>
+        <w:pStyle w:val="Heading1"/>
+      </w:pPr>
+      <w:r>
+        <w:t>33. Results that went against expectation</w:t>
+      </w:r>
+    </w:p>
+    <w:p>
+      <w:pPr>
+        <w:spacing w:after="160"/>
+      </w:pPr>
+      <w:r>
+        <w:rPr>
+          <w:i w:val="0"/>
+          <w:sz w:val="24"/>
+        </w:rPr>
+        <w:t>Each one is reported because each one changes what the paper may claim, and a supervisor reading the work will find them more convincing than the successes.</w:t>
+      </w:r>
+    </w:p>
+    <w:p>
+      <w:pPr>
+        <w:pStyle w:val="Heading2"/>
+      </w:pPr>
+      <w:r>
+        <w:t>The learned controller loses to two thresholds</w:t>
+      </w:r>
+    </w:p>
+    <w:p>
+      <w:pPr>
+        <w:spacing w:after="160"/>
+      </w:pPr>
+      <w:r>
+        <w:rPr>
+          <w:i w:val="0"/>
+          <w:sz w:val="24"/>
+        </w:rPr>
+        <w:t>Five independent training runs, and every one of them finishes worse than a controller that is two thresholds and a taper, once the cabin heating they switched off is charged back. The offline optimum predicted it and the training measured it, and the two do not depend on each other. Section 21.</w:t>
+      </w:r>
+    </w:p>
+    <w:p>
+      <w:pPr>
+        <w:pStyle w:val="Heading2"/>
+      </w:pPr>
+      <w:r>
+        <w:t>The forecast makes no difference to the controller</w:t>
+      </w:r>
+    </w:p>
+    <w:p>
+      <w:pPr>
+        <w:spacing w:after="160"/>
+      </w:pPr>
+      <w:r>
+        <w:rPr>
+          <w:i w:val="0"/>
+          <w:sz w:val="24"/>
+        </w:rPr>
+        <w:t>Removing it changes the result by an amount whose confidence interval contains zero, and whose sign is not consistent across the five runs. This was accepted as publishable in the design document before it was run, and week 7 gave it a reason rather than leaving it a possibility.</w:t>
+      </w:r>
+    </w:p>
+    <w:p>
+      <w:pPr>
+        <w:pStyle w:val="Heading2"/>
+      </w:pPr>
+      <w:r>
+        <w:t>A parity test was passing without testing anything</w:t>
+      </w:r>
+    </w:p>
+    <w:p>
+      <w:pPr>
+        <w:spacing w:after="160"/>
+      </w:pPr>
+      <w:r>
+        <w:rPr>
+          <w:i w:val="0"/>
+          <w:sz w:val="24"/>
+        </w:rPr>
+        <w:t>The test that compares the controller written in C against the same controller in Python was, for a while, compiling one set of weights and comparing them against another network's expected answers. The cause is a C rule: an include written with quotes is resolved against the including file's own directory before any search path, so the file under test kept finding the deployed weights whatever the test asked for. It passed honestly for exactly as long as nothing had been deployed. Two fixes: the include now searches the path only, and the weights carry a checksum that the inference code itself reports, because two policies of the same shape are indistinguishable without one.</w:t>
+      </w:r>
+    </w:p>
+    <w:p>
+      <w:pPr>
+        <w:pStyle w:val="Heading2"/>
+      </w:pPr>
+      <w:r>
+        <w:t>A model 27 times bigger is not better</w:t>
+      </w:r>
+    </w:p>
+    <w:p>
+      <w:pPr>
+        <w:spacing w:after="160"/>
+      </w:pPr>
+      <w:r>
+        <w:rPr>
+          <w:i w:val="0"/>
+          <w:sz w:val="24"/>
+        </w:rPr>
+        <w:t>The last piece of the 8-bit experiment trained a deliberately oversized model to teach the small one. The teaching changed nothing measurable, and the reason is that the big model was not better than the small one to begin with: 27 times the parameters, and slightly worse. Every model tried falls within 0.89% of the others, which is less than what converting to 8-bit costs. Section 14.</w:t>
+      </w:r>
+    </w:p>
+    <w:p>
+      <w:pPr>
+        <w:pStyle w:val="Heading2"/>
+      </w:pPr>
+      <w:r>
+        <w:t>The energy-management problem has almost no room in it</w:t>
+      </w:r>
+    </w:p>
+    <w:p>
+      <w:pPr>
+        <w:spacing w:after="160"/>
+      </w:pPr>
+      <w:r>
+        <w:rPr>
+          <w:i w:val="0"/>
+          <w:sz w:val="24"/>
+        </w:rPr>
+        <w:t>The theoretically optimal strategy is a constant instruction, and two thresholds get within a sixth of a percent of it. This is the largest of these findings and it is the subject of section 16, including the three routes open and the fact that choosing between them is the supervisor's decision rather than one taken here.</w:t>
+      </w:r>
+    </w:p>
+    <w:p>
+      <w:pPr>
+        <w:pStyle w:val="Heading2"/>
+      </w:pPr>
+      <w:r>
+        <w:t>The fitted rolling resistance is not a rolling resistance</w:t>
+      </w:r>
+    </w:p>
+    <w:p>
+      <w:pPr>
+        <w:spacing w:after="160"/>
+      </w:pPr>
+      <w:r>
+        <w:rPr>
+          <w:i w:val="0"/>
+          <w:sz w:val="24"/>
+        </w:rPr>
+        <w:t>It is 2.2 times larger than an independent measurement on a comparable car. It is a lumped loss term named after the physics it stands in for rather than the physics it contains. The parameter file now says so and an automated test fails if that statement is removed.</w:t>
+      </w:r>
+    </w:p>
+    <w:p>
+      <w:pPr>
+        <w:pStyle w:val="Heading2"/>
+      </w:pPr>
+      <w:r>
+        <w:t>Gate G4 was already passed before the models existed</w:t>
+      </w:r>
+    </w:p>
+    <w:p>
+      <w:pPr>
+        <w:spacing w:after="160"/>
+      </w:pPr>
+      <w:r>
+        <w:rPr>
+          <w:i w:val="0"/>
+          <w:sz w:val="24"/>
+        </w:rPr>
+        <w:t>A linear regression beat the naive baseline by 14.5% against a required 10%. The gate as written could not distinguish a Transformer from a matrix calculation, so every model is now reported against the regression too.</w:t>
+      </w:r>
+    </w:p>
+    <w:p>
+      <w:pPr>
+        <w:pStyle w:val="Heading2"/>
+      </w:pPr>
+      <w:r>
+        <w:t>Physics-informing does not improve accuracy</w:t>
+      </w:r>
+    </w:p>
+    <w:p>
+      <w:pPr>
+        <w:spacing w:after="160"/>
+      </w:pPr>
+      <w:r>
+        <w:rPr>
+          <w:i w:val="0"/>
+          <w:sz w:val="24"/>
+        </w:rPr>
+        <w:t>Five watts of difference on eleven kilowatts at matched parameter count. It improves physical consistency by a factor of ten instead, which is a different and still useful claim.</w:t>
+      </w:r>
+    </w:p>
+    <w:p>
+      <w:pPr>
+        <w:pStyle w:val="Heading2"/>
+      </w:pPr>
+      <w:r>
+        <w:t>The compute estimate was 64% too optimistic</w:t>
+      </w:r>
+    </w:p>
+    <w:p>
+      <w:pPr>
+        <w:spacing w:after="160"/>
+      </w:pPr>
+      <w:r>
+        <w:rPr>
+          <w:i w:val="0"/>
+          <w:sz w:val="24"/>
+        </w:rPr>
+        <w:t>Dividing a multiply count by a measured multiply rate gave 22.28 milliseconds for the Transformer. Timing the real graph on the chip gave 36.46. The LSTM is worse: 19.84 estimated against 35.07 measured. Both still fit inside the 40 milliseconds allowed, and the estimates remain useful for ranking models against each other, but they cannot be quoted as latencies now that measurements exist.</w:t>
+      </w:r>
+    </w:p>
+    <w:p>
+      <w:pPr>
+        <w:pStyle w:val="Heading2"/>
+      </w:pPr>
+      <w:r>
+        <w:t>Charge conservation cannot be tested at this horizon</w:t>
+      </w:r>
+    </w:p>
+    <w:p>
+      <w:pPr>
+        <w:spacing w:after="160"/>
+      </w:pPr>
+      <w:r>
+        <w:rPr>
+          <w:i w:val="0"/>
+          <w:sz w:val="24"/>
+        </w:rPr>
+        <w:t>The recorded charge channel does not move within a typical three-second window, so the equation has nothing to constrain. Enforcing it costs 4.4% accuracy and buys almost nothing. This was measured rather than argued.</w:t>
+      </w:r>
+    </w:p>
+    <w:p>
+      <w:pPr>
+        <w:pStyle w:val="Heading1"/>
+      </w:pPr>
+      <w:r>
+        <w:t>34. What changed from the original plan</w:t>
+      </w:r>
+    </w:p>
+    <w:p>
+      <w:pPr>
+        <w:spacing w:after="160"/>
+      </w:pPr>
+      <w:r>
+        <w:rPr>
+          <w:i w:val="0"/>
+          <w:sz w:val="24"/>
+        </w:rPr>
+        <w:t>Twenty-two changes, in two classes, and the distinction matters. Eleven were agreed in the design document before any code was written. Eleven more happened during the eight weeks, each one forced by something that had been measured.</w:t>
+      </w:r>
+    </w:p>
+    <w:p>
+      <w:pPr>
+        <w:pStyle w:val="Heading2"/>
+      </w:pPr>
+      <w:r>
+        <w:t>Agreed before implementation</w:t>
+      </w:r>
+    </w:p>
+    <w:p>
+      <w:pPr>
+        <w:spacing w:after="160"/>
+      </w:pPr>
+      <w:r>
+        <w:rPr>
+          <w:i w:val="0"/>
+          <w:sz w:val="24"/>
+        </w:rPr>
+        <w:t>It is Processor-in-the-Loop, not Hardware-in-the-Loop. The original used HIL throughout. HIL means real electrical hardware in the loop, with motors, power electronics and sensors. There is none of that here, only a processor. Reviewers in embedded and control venues spot a misused HIL immediately, and the correct term costs nothing.</w:t>
+      </w:r>
+    </w:p>
+    <w:p>
+      <w:pPr>
+        <w:spacing w:after="160"/>
+      </w:pPr>
+      <w:r>
+        <w:rPr>
+          <w:i w:val="0"/>
+          <w:sz w:val="24"/>
+        </w:rPr>
+        <w:t>The embedded work moved from last to first, which is the largest single change. The original schedules the ESP32 for weeks 10 and 11, after all the modelling is finished. That is the one arrangement in which a failure has no recovery: if the model does not fit in week 10, there is no time left to build a smaller one. The compute-feasibility question is now gate G1 in week 1, and the plan already names the fallback. This inversion is why the project knew in week 4, rather than week 10, that XGBoost was never deployable.</w:t>
+      </w:r>
+    </w:p>
+    <w:p>
+      <w:pPr>
+        <w:spacing w:after="160"/>
+      </w:pPr>
+      <w:r>
+        <w:rPr>
+          <w:i w:val="0"/>
+          <w:sz w:val="24"/>
+        </w:rPr>
+        <w:t>Real logged trips replaced a physics-generated dataset. The original creates the training data by pushing drive cycles through the physics model, which makes the thing being predicted a closed-form function of the very inputs used to predict it. The model then appears to do brilliantly while having learned nothing about a real car. The predecessor work has exactly this defect. This project trains on 72 real logged trips at 10 Hz instead.</w:t>
+      </w:r>
+    </w:p>
+    <w:p>
+      <w:pPr>
+        <w:spacing w:after="160"/>
+      </w:pPr>
+      <w:r>
+        <w:rPr>
+          <w:i w:val="0"/>
+          <w:sz w:val="24"/>
+        </w:rPr>
+        <w:t>Data is split by trip and never by row. The predecessor split 2,000 rows at random, and because consecutive rows come from the same drive a fraction of a second apart, near-identical samples landed on both sides. The model was effectively tested on data it had trained on, which inflates every score. Here no sample from a trip ever appears on both sides, and the calibration data used for 8-bit quantisation is drawn from training trips only, which is a subtler version of the same leak.</w:t>
+      </w:r>
+    </w:p>
+    <w:p>
+      <w:pPr>
+        <w:spacing w:after="160"/>
+      </w:pPr>
+      <w:r>
+        <w:rPr>
+          <w:i w:val="0"/>
+          <w:sz w:val="24"/>
+        </w:rPr>
+        <w:t>The communication task runs at 10 ms rather than 50. This was arithmetic rather than judgement: the original specifies a 10 ms control loop and a 50 ms communication task, and a loop cannot close five times faster than the messages it depends on arrive.</w:t>
+      </w:r>
+    </w:p>
+    <w:p>
+      <w:pPr>
+        <w:spacing w:after="160"/>
+      </w:pPr>
+      <w:r>
+        <w:rPr>
+          <w:i w:val="0"/>
+          <w:sz w:val="24"/>
+        </w:rPr>
+        <w:t>Budget first, then model. The model size is not chosen and then checked, it is derived from what gate G1 measured. The Transformer is 32 sequence steps, 32 units wide and 2 layers deep because that is what fits in 40 milliseconds on this chip.</w:t>
+      </w:r>
+    </w:p>
+    <w:p>
+      <w:pPr>
+        <w:spacing w:after="160"/>
+      </w:pPr>
+      <w:r>
+        <w:rPr>
+          <w:i w:val="0"/>
+          <w:sz w:val="24"/>
+        </w:rPr>
+        <w:t>The model comparison was rebuilt. Linear regression, random forest and XGBoost became a mandatory naive baseline, one strong tabular model, an LSTM fed genuinely sequential data, and a Transformer, each in plain and physics-informed versions at matched size. Re-running the LSTM correctly is deliberate: the predecessor flattened its data first, which removes the time ordering the architecture exists to exploit, and then reported that recurrent models underperform.</w:t>
+      </w:r>
+    </w:p>
+    <w:p>
+      <w:pPr>
+        <w:spacing w:after="160"/>
+      </w:pPr>
+      <w:r>
+        <w:rPr>
+          <w:i w:val="0"/>
+          <w:sz w:val="24"/>
+        </w:rPr>
+        <w:t>Gates, ablations and explicit non-claims are entirely new. Five gates each with a written action on failure; four numbered ablations; a metrics table with actual metrics where the original listed headings and left them empty; and a list of things this work will explicitly not claim. Stating the non-claims in advance is what allows two null results to be reported as findings rather than as embarrassments.</w:t>
+      </w:r>
+    </w:p>
+    <w:p>
+      <w:pPr>
+        <w:spacing w:after="160"/>
+      </w:pPr>
+      <w:r>
+        <w:rPr>
+          <w:i w:val="0"/>
+          <w:sz w:val="24"/>
+        </w:rPr>
+        <w:t>Thirteen scenario variations became six axes, keeping full robustness coverage at roughly half the runs.</w:t>
+      </w:r>
+    </w:p>
+    <w:p>
+      <w:pPr>
+        <w:spacing w:after="160"/>
+      </w:pPr>
+      <w:r>
+        <w:rPr>
+          <w:i w:val="0"/>
+          <w:sz w:val="24"/>
+        </w:rPr>
+        <w:t>The ESP32-S3 is the primary platform rather than the C6. Two processor cores matter enormously here, because the hard real-time loop is pinned to core 0 where inference on core 1 cannot disturb it. The single-core C6 cannot make that separation at all.</w:t>
+      </w:r>
+    </w:p>
+    <w:p>
+      <w:pPr>
+        <w:spacing w:after="160"/>
+      </w:pPr>
+      <w:r>
+        <w:rPr>
+          <w:i w:val="0"/>
+          <w:sz w:val="24"/>
+        </w:rPr>
+        <w:t>A second, independent dataset was added, held purely as an out-of-distribution check. Building and testing on one car answers whether the model fits; the question a reviewer actually asks is whether it transfers, and nothing in the original plan could have answered it.</w:t>
+      </w:r>
+    </w:p>
+    <w:p>
+      <w:pPr>
+        <w:pStyle w:val="Heading2"/>
+      </w:pPr>
+      <w:r>
+        <w:t>Changed in flight, because something was measured</w:t>
+      </w:r>
+    </w:p>
+    <w:p>
+      <w:pPr>
+        <w:spacing w:after="160"/>
+      </w:pPr>
+      <w:r>
+        <w:rPr>
+          <w:i w:val="0"/>
+          <w:sz w:val="24"/>
+        </w:rPr>
+        <w:t>These are the ones to be most transparent about, because each represents the plan meeting reality. In every case the measurement came first and the change followed.</w:t>
+      </w:r>
+    </w:p>
+    <w:p>
+      <w:pPr>
+        <w:spacing w:after="160"/>
+      </w:pPr>
+      <w:r>
+        <w:rPr>
+          <w:i w:val="0"/>
+          <w:sz w:val="24"/>
+        </w:rPr>
+        <w:t>Gate G2 was split into three parts instead of one pooled number, and this was the one revision the design document permits. Neither threshold was loosened; what changed is which part of the model each threshold is applied to. Applied literally the original criterion failed all seven trips at a median error of 23.7 percent, because that single number pooled three independent models and could not say which was wrong. Driving the plant with the archive's own logged torque drops the error to a median of 7.0 percent, inside the original bound on every trip. The revision is now spent and nothing else may be adjusted without the same treatment.</w:t>
+      </w:r>
+    </w:p>
+    <w:p>
+      <w:pPr>
+        <w:spacing w:after="160"/>
+      </w:pPr>
+      <w:r>
+        <w:rPr>
+          <w:i w:val="0"/>
+          <w:sz w:val="24"/>
+        </w:rPr>
+        <w:t>The control loop became pipelined rather than synchronous. Originally the chip sent a request and then waited for the reply inside the same 10 millisecond slot, tying its deadline to the scheduling behaviour of a general-purpose laptop. It now requests the next state and acts on the most recent one it holds, so it no longer waits for the laptop inside its own time slot. This is a genuine trade rather than a free win, because the controller now acts on information one cycle old, and that cost is measured and reported.</w:t>
+      </w:r>
+    </w:p>
+    <w:p>
+      <w:pPr>
+        <w:spacing w:after="160"/>
+      </w:pPr>
+      <w:r>
+        <w:rPr>
+          <w:i w:val="0"/>
+          <w:sz w:val="24"/>
+        </w:rPr>
+        <w:t>The link runs over the chip's built-in USB rather than a separate adapter. The design deliberately left this open for gate G3 to settle on measured evidence, and the built-in peripheral carries the loop with zero corrupted and zero lost messages.</w:t>
+      </w:r>
+    </w:p>
+    <w:p>
+      <w:pPr>
+        <w:spacing w:after="160"/>
+      </w:pPr>
+      <w:r>
+        <w:rPr>
+          <w:i w:val="0"/>
+          <w:sz w:val="24"/>
+        </w:rPr>
+        <w:t>Three identified parameters were relabelled as lumped losses. The fitted rolling-resistance coefficient came out 2.2 times larger than an independent measurement on a comparable car, so it is not a tyre property. It is a coefficient occupying that place in the equation and absorbing every speed-dependent loss the model does not represent separately. The parameter file says so, and an automated test fails if that statement is removed.</w:t>
+      </w:r>
+    </w:p>
+    <w:p>
+      <w:pPr>
+        <w:spacing w:after="160"/>
+      </w:pPr>
+      <w:r>
+        <w:rPr>
+          <w:i w:val="0"/>
+          <w:sz w:val="24"/>
+        </w:rPr>
+        <w:t>One of the three physics constraints was switched off. Charge conservation has nothing to constrain over a three-second window, because the logged charge channel does not measurably move within one. Its weight is held at zero and the cost of switching it on is reported as its own arm rather than quietly omitted.</w:t>
+      </w:r>
+    </w:p>
+    <w:p>
+      <w:pPr>
+        <w:spacing w:after="160"/>
+      </w:pPr>
+      <w:r>
+        <w:rPr>
+          <w:i w:val="0"/>
+          <w:sz w:val="24"/>
+        </w:rPr>
+        <w:t>The message format grew to carry a real controller. The state message went from 8 numbers to 10 so that the laptop can send the target speed and its rate of change, the command message from 3 to 4, and the diagnostics message from 11 counters to 16. Gate G3 was then re-measured in full, because the loop the report describes has to be the loop that was measured.</w:t>
+      </w:r>
+    </w:p>
+    <w:p>
+      <w:pPr>
+        <w:spacing w:after="160"/>
+      </w:pPr>
+      <w:r>
+        <w:rPr>
+          <w:i w:val="0"/>
+          <w:sz w:val="24"/>
+        </w:rPr>
+        <w:t>The offline optimiser searches two dimensions rather than three. This is not a simplification for speed. With the speed trajectory fixed by the tracking constraint, the battery power limit can only ever remove power the speed controller needs, which the constraint forbids. It is a safety limiter and not an optimisation lever, and that applies to the learned controller in exactly the same way.</w:t>
+      </w:r>
+    </w:p>
+    <w:p>
+      <w:pPr>
+        <w:spacing w:after="160"/>
+      </w:pPr>
+      <w:r>
+        <w:rPr>
+          <w:i w:val="0"/>
+          <w:sz w:val="24"/>
+        </w:rPr>
+        <w:t>Controllers are now ranked with shed cabin heat charged back. Raw consumption is not comparable between controllers, because one that turns the heating down looks excellent without having managed any energy. Without this correction the week 8 table reads as the learned controller saving 1.3 percent; with it, the same controller is 0.66 percent worse, and the entire difference was 48 to 50 watt-hours of cabin heat per cycle.</w:t>
+      </w:r>
+    </w:p>
+    <w:p>
+      <w:pPr>
+        <w:spacing w:after="160"/>
+      </w:pPr>
+      <w:r>
+        <w:rPr>
+          <w:i w:val="0"/>
+          <w:sz w:val="24"/>
+        </w:rPr>
+        <w:t>The learned controller is 64 units wide rather than the library default of 256. The default would be 68,867 numbers and 269 kilobytes, which is 90 percent of the entire memory budget the forecaster also has to fit inside. At 64 wide it is 4,931 numbers and 19.3 kilobytes, and both figures were measured in a pilot run before the main campaign.</w:t>
+      </w:r>
+    </w:p>
+    <w:p>
+      <w:pPr>
+        <w:spacing w:after="160"/>
+      </w:pPr>
+      <w:r>
+        <w:rPr>
+          <w:i w:val="0"/>
+          <w:sz w:val="24"/>
+        </w:rPr>
+        <w:t>XGBoost and the LSTM ensemble were dropped as deployable options. XGBoost needs roughly 3.7 megabytes against a 300 kilobyte budget, over twelve times too large. The best-looking accuracy figure in the whole comparison was a five-model LSTM ensemble, which takes 99 milliseconds against a 40 millisecond budget. Both remain offline reference points, and the reported number is now always distinguished from the deployable one.</w:t>
+      </w:r>
+    </w:p>
+    <w:p>
+      <w:pPr>
+        <w:spacing w:after="160"/>
+      </w:pPr>
+      <w:r>
+        <w:rPr>
+          <w:i w:val="0"/>
+          <w:sz w:val="24"/>
+        </w:rPr>
+        <w:t>The watchdog was switched on and a fallback path built. Three different failures now get three different responses and three separate counters rather than one generic fault state, because collapsing them is how a controller ends up limping owing to a slow logging task. All three were then triggered deliberately on the board, plus a fourth test that hung the control task on purpose to confirm the watchdog resets the chip. A fallback path that has never been taken is a claim, not a result.</w:t>
+      </w:r>
+    </w:p>
+    <w:p>
+      <w:pPr>
+        <w:pStyle w:val="Heading1"/>
+      </w:pPr>
+      <w:r>
+        <w:t>35. What is left to do</w:t>
+      </w:r>
+    </w:p>
+    <w:p>
+      <w:pPr>
+        <w:spacing w:after="160"/>
+      </w:pPr>
+      <w:r>
+        <w:rPr>
+          <w:i w:val="0"/>
+          <w:sz w:val="24"/>
+        </w:rPr>
+        <w:t>Corrected-model campaign: complete. Corrected-model link-outage sweep: complete. The proposed speed-loop decision transformer was dropped. The classical filter and detector are in the firmware, switched off by default, and were measured on the board in section 29. Open from that section: the detector's threshold has to be redesigned before it can be relied on, and every fault and mismatch scenario remains simulated.</w:t>
+      </w:r>
+    </w:p>
+    <w:p>
+      <w:pPr>
+        <w:spacing w:after="160"/>
+      </w:pPr>
+      <w:r>
+        <w:rPr>
+          <w:i w:val="0"/>
+          <w:sz w:val="24"/>
+        </w:rPr>
+        <w:t>Week 13 closed that open item: the detector was replaced by a new fault checker, measured on the board with injected faults in section 30. Still open after week 13: a real acceleration sensor in place of the simulated drift; repeats of the board runs; a backup speed that does not drift while an alarm is raised; traffic in the speed-planning task of section 32; and a decision on Jev, which section 31 does not recommend for the sensor-fault task.</w:t>
+      </w:r>
+    </w:p>
+    <w:p>
+      <w:pPr>
+        <w:spacing w:after="160"/>
+      </w:pPr>
+      <w:r>
+        <w:rPr>
+          <w:i/>
+          <w:color w:val="595959"/>
+          <w:sz w:val="24"/>
+        </w:rPr>
+        <w:t>The following week-by-week plan records the earlier project schedule. Current correction status is stated above.</w:t>
+      </w:r>
+    </w:p>
+    <w:tbl>
+      <w:tblPr>
+        <w:tblStyle w:val="LightGrid-Accent1"/>
+        <w:tblW w:type="auto" w:w="0"/>
+        <w:jc w:val="center"/>
+        <w:tblLook w:firstColumn="1" w:firstRow="1" w:lastColumn="0" w:lastRow="0" w:noHBand="0" w:noVBand="1" w:val="04A0"/>
+      </w:tblPr>
+      <w:tblGrid>
+        <w:gridCol w:w="2412"/>
+        <w:gridCol w:w="2412"/>
+        <w:gridCol w:w="2412"/>
+        <w:gridCol w:w="2412"/>
+      </w:tblGrid>
+      <w:tr>
+        <w:tc>
+          <w:tcPr>
             <w:tcW w:type="dxa" w:w="720"/>
           </w:tcPr>
           <w:p>
@@ -27648,7 +29638,7 @@
         <w:pStyle w:val="Heading1"/>
       </w:pPr>
       <w:r>
-        <w:t>33. Reproducing everything in this report</w:t>
+        <w:t>36. Reproducing everything in this report</w:t>
       </w:r>
     </w:p>
     <w:p>
@@ -28622,7 +30612,7 @@
           <w:color w:val="595959"/>
           <w:sz w:val="22"/>
         </w:rPr>
-        <w:t>All Python commands need PYTHONPATH="src:." set. The reinforcement-learning ramp-up additionally needs stable-baselines3 and gymnasium. The test suite runs with python3 -m pytest and currently holds 553 tests, including ones that drive the controller and the learned policy in C and in Python through identical inputs and require them to agree, and ones that read the firmware's own compile-time switches back out of its headers so that the scripts describing them cannot drift from what is compiled.</w:t>
+        <w:t>All Python commands need PYTHONPATH="src:." set. The reinforcement-learning ramp-up additionally needs stable-baselines3 and gymnasium. The test suite runs with python3 -m pytest and currently holds 602 tests, including ones that drive the controller and the learned policy in C and in Python through identical inputs and require them to agree, and ones that read the firmware's own compile-time switches back out of its headers so that the scripts describing them cannot drift from what is compiled.</w:t>
       </w:r>
     </w:p>
     <w:sectPr>

</xml_diff>

<commit_message>
Report and supervisor note carry week 14; the rule helper's board advantage is corrected
Week 14 section and summary in the report, a block in the note, and the
week-13 sentence about the rule helper on the board now says the repeats
did not bear it out. Report 78 pages, note 3; exported through Word and
checked.

Co-Authored-By: Claude Opus 5.5 <noreply@anthropic.com>
</commit_message>
<xml_diff>
--- a/reports/EV-PIL-status-report.docx
+++ b/reports/EV-PIL-status-report.docx
@@ -661,6 +661,41 @@
       </w:pPr>
       <w:r>
         <w:t>Week 13, simulated, a new task: letting the car plan its own speed on an empty road saved 10.4% of energy on the aggressive route and 1.2% on the highway route. Section 32.</w:t>
+      </w:r>
+    </w:p>
+    <w:p>
+      <w:pPr>
+        <w:pStyle w:val="Heading2"/>
+      </w:pPr>
+      <w:r>
+        <w:t>Week 14 in brief</w:t>
+      </w:r>
+    </w:p>
+    <w:p>
+      <w:pPr>
+        <w:pStyle w:val="ListBullet"/>
+        <w:spacing w:after="80"/>
+      </w:pPr>
+      <w:r>
+        <w:t>Week 14, measured on the board: repeated with two more draws of noise, the new fault checker caught 120 of 120 injected faults with no false alarm in 1 clean hour. The rule helper's small advantage from the first run did not repeat. Section 33.</w:t>
+      </w:r>
+    </w:p>
+    <w:p>
+      <w:pPr>
+        <w:pStyle w:val="ListBullet"/>
+        <w:spacing w:after="80"/>
+      </w:pPr>
+      <w:r>
+        <w:t>Week 14, simulated: a backup speed that does not drift cut the largest speed error during a fault from 3.74 to 0.62 metres per second on the highway cycle. It fails for a car heavier than its model in aggressive driving.</w:t>
+      </w:r>
+    </w:p>
+    <w:p>
+      <w:pPr>
+        <w:pStyle w:val="ListBullet"/>
+        <w:spacing w:after="80"/>
+      </w:pPr>
+      <w:r>
+        <w:t>Week 14, simulated: with traffic, held within 25 metres of the recorded drive, speed planning still saves 5.1% on the aggressive route.</w:t>
       </w:r>
     </w:p>
     <w:p>
@@ -14605,7 +14640,7 @@
           <w:i w:val="0"/>
           <w:sz w:val="24"/>
         </w:rPr>
-        <w:t>The chain from a trained policy to a running one has four links, and each is checked against the one before it. Building that chain found a real fault: the test that compares the C controller against Python was, for a while, compiling the wrong weights and comparing them against themselves. It passed for exactly as long as no policy had been deployed. Section 33 records it.</w:t>
+        <w:t>The chain from a trained policy to a running one has four links, and each is checked against the one before it. Building that chain found a real fault: the test that compares the C controller against Python was, for a while, compiling the wrong weights and comparing them against themselves. It passed for exactly as long as no policy had been deployed. Section 34 records it.</w:t>
       </w:r>
     </w:p>
     <w:p>
@@ -27218,7 +27253,7 @@
           <w:i w:val="0"/>
           <w:sz w:val="24"/>
         </w:rPr>
-        <w:t>The rule helper in the last column is explained in the next section. On the board it made a small difference in the direction the simulation gave. With 40 runs per version, that difference is not established.</w:t>
+        <w:t>The rule helper in the last column is explained in the next section. In this single run it looked slightly better than the checker alone. The runs were repeated in week 14 with other draws of noise, and the difference did not hold: section 33.</w:t>
       </w:r>
     </w:p>
     <w:p>
@@ -28422,7 +28457,2027 @@
         <w:pStyle w:val="Heading1"/>
       </w:pPr>
       <w:r>
-        <w:t>33. Results that went against expectation</w:t>
+        <w:t>33. Week 14: board repeats, a steadier backup speed, and traffic</w:t>
+      </w:r>
+    </w:p>
+    <w:p>
+      <w:pPr>
+        <w:spacing w:after="160"/>
+      </w:pPr>
+      <w:r>
+        <w:rPr>
+          <w:i w:val="0"/>
+          <w:sz w:val="24"/>
+        </w:rPr>
+        <w:t>Week 14 followed up three things that sections 30 to 32 left open: each board case had been run only once; the backup speed used while an alarm is raised drifts; and the speed planner had an empty road.</w:t>
+      </w:r>
+    </w:p>
+    <w:p>
+      <w:pPr>
+        <w:pStyle w:val="Heading2"/>
+      </w:pPr>
+      <w:r>
+        <w:t>The board runs, repeated</w:t>
+      </w:r>
+    </w:p>
+    <w:p>
+      <w:pPr>
+        <w:spacing w:after="160"/>
+      </w:pPr>
+      <w:r>
+        <w:rPr>
+          <w:i w:val="0"/>
+          <w:sz w:val="24"/>
+        </w:rPr>
+        <w:t>The same 42 cases per version were run twice more on the board, each time with a different draw of sensor noise and of acceleration drift. With the first run that makes 120 injected faults and 1 hour of clean driving for each version.</w:t>
+      </w:r>
+    </w:p>
+    <w:tbl>
+      <w:tblPr>
+        <w:tblStyle w:val="LightGrid-Accent1"/>
+        <w:tblW w:type="auto" w:w="0"/>
+        <w:jc w:val="center"/>
+        <w:tblLook w:firstColumn="1" w:firstRow="1" w:lastColumn="0" w:lastRow="0" w:noHBand="0" w:noVBand="1" w:val="04A0"/>
+      </w:tblPr>
+      <w:tblGrid>
+        <w:gridCol w:w="3216"/>
+        <w:gridCol w:w="3216"/>
+        <w:gridCol w:w="3216"/>
+      </w:tblGrid>
+      <w:tr>
+        <w:tc>
+          <w:tcPr>
+            <w:tcW w:type="dxa" w:w="3216"/>
+          </w:tcPr>
+          <w:p>
+            <w:r/>
+            <w:r>
+              <w:rPr>
+                <w:b/>
+                <w:sz w:val="20"/>
+              </w:rPr>
+            </w:r>
+          </w:p>
+        </w:tc>
+        <w:tc>
+          <w:tcPr>
+            <w:tcW w:type="dxa" w:w="3216"/>
+          </w:tcPr>
+          <w:p>
+            <w:r/>
+            <w:r>
+              <w:rPr>
+                <w:b/>
+                <w:sz w:val="20"/>
+              </w:rPr>
+              <w:t>New checker</w:t>
+            </w:r>
+          </w:p>
+        </w:tc>
+        <w:tc>
+          <w:tcPr>
+            <w:tcW w:type="dxa" w:w="3216"/>
+          </w:tcPr>
+          <w:p>
+            <w:r/>
+            <w:r>
+              <w:rPr>
+                <w:b/>
+                <w:sz w:val="20"/>
+              </w:rPr>
+              <w:t>New checker with rule helper</w:t>
+            </w:r>
+          </w:p>
+        </w:tc>
+      </w:tr>
+      <w:tr>
+        <w:tc>
+          <w:tcPr>
+            <w:tcW w:type="dxa" w:w="3216"/>
+          </w:tcPr>
+          <w:p>
+            <w:r/>
+            <w:r>
+              <w:rPr>
+                <w:sz w:val="20"/>
+              </w:rPr>
+              <w:t>Faults caught within half a second</w:t>
+            </w:r>
+          </w:p>
+        </w:tc>
+        <w:tc>
+          <w:tcPr>
+            <w:tcW w:type="dxa" w:w="3216"/>
+          </w:tcPr>
+          <w:p>
+            <w:r/>
+            <w:r>
+              <w:rPr>
+                <w:sz w:val="20"/>
+              </w:rPr>
+              <w:t>120 of 120</w:t>
+            </w:r>
+          </w:p>
+        </w:tc>
+        <w:tc>
+          <w:tcPr>
+            <w:tcW w:type="dxa" w:w="3216"/>
+          </w:tcPr>
+          <w:p>
+            <w:r/>
+            <w:r>
+              <w:rPr>
+                <w:sz w:val="20"/>
+              </w:rPr>
+              <w:t>120 of 120</w:t>
+            </w:r>
+          </w:p>
+        </w:tc>
+      </w:tr>
+      <w:tr>
+        <w:tc>
+          <w:tcPr>
+            <w:tcW w:type="dxa" w:w="3216"/>
+          </w:tcPr>
+          <w:p>
+            <w:r/>
+            <w:r>
+              <w:rPr>
+                <w:sz w:val="20"/>
+              </w:rPr>
+              <w:t>Slowest catch, seconds</w:t>
+            </w:r>
+          </w:p>
+        </w:tc>
+        <w:tc>
+          <w:tcPr>
+            <w:tcW w:type="dxa" w:w="3216"/>
+          </w:tcPr>
+          <w:p>
+            <w:r/>
+            <w:r>
+              <w:rPr>
+                <w:sz w:val="20"/>
+              </w:rPr>
+              <w:t>0.32</w:t>
+            </w:r>
+          </w:p>
+        </w:tc>
+        <w:tc>
+          <w:tcPr>
+            <w:tcW w:type="dxa" w:w="3216"/>
+          </w:tcPr>
+          <w:p>
+            <w:r/>
+            <w:r>
+              <w:rPr>
+                <w:sz w:val="20"/>
+              </w:rPr>
+              <w:t>0.33</w:t>
+            </w:r>
+          </w:p>
+        </w:tc>
+      </w:tr>
+      <w:tr>
+        <w:tc>
+          <w:tcPr>
+            <w:tcW w:type="dxa" w:w="3216"/>
+          </w:tcPr>
+          <w:p>
+            <w:r/>
+            <w:r>
+              <w:rPr>
+                <w:sz w:val="20"/>
+              </w:rPr>
+              <w:t>False alarms in one clean hour</w:t>
+            </w:r>
+          </w:p>
+        </w:tc>
+        <w:tc>
+          <w:tcPr>
+            <w:tcW w:type="dxa" w:w="3216"/>
+          </w:tcPr>
+          <w:p>
+            <w:r/>
+            <w:r>
+              <w:rPr>
+                <w:sz w:val="20"/>
+              </w:rPr>
+              <w:t>0</w:t>
+            </w:r>
+          </w:p>
+        </w:tc>
+        <w:tc>
+          <w:tcPr>
+            <w:tcW w:type="dxa" w:w="3216"/>
+          </w:tcPr>
+          <w:p>
+            <w:r/>
+            <w:r>
+              <w:rPr>
+                <w:sz w:val="20"/>
+              </w:rPr>
+              <w:t>0</w:t>
+            </w:r>
+          </w:p>
+        </w:tc>
+      </w:tr>
+      <w:tr>
+        <w:tc>
+          <w:tcPr>
+            <w:tcW w:type="dxa" w:w="3216"/>
+          </w:tcPr>
+          <w:p>
+            <w:r/>
+            <w:r>
+              <w:rPr>
+                <w:sz w:val="20"/>
+              </w:rPr>
+              <w:t>Alarm dropped while the fault was still there</w:t>
+            </w:r>
+          </w:p>
+        </w:tc>
+        <w:tc>
+          <w:tcPr>
+            <w:tcW w:type="dxa" w:w="3216"/>
+          </w:tcPr>
+          <w:p>
+            <w:r/>
+            <w:r>
+              <w:rPr>
+                <w:sz w:val="20"/>
+              </w:rPr>
+              <w:t>47</w:t>
+            </w:r>
+          </w:p>
+        </w:tc>
+        <w:tc>
+          <w:tcPr>
+            <w:tcW w:type="dxa" w:w="3216"/>
+          </w:tcPr>
+          <w:p>
+            <w:r/>
+            <w:r>
+              <w:rPr>
+                <w:sz w:val="20"/>
+              </w:rPr>
+              <w:t>30</w:t>
+            </w:r>
+          </w:p>
+        </w:tc>
+      </w:tr>
+      <w:tr>
+        <w:tc>
+          <w:tcPr>
+            <w:tcW w:type="dxa" w:w="3216"/>
+          </w:tcPr>
+          <w:p>
+            <w:r/>
+            <w:r>
+              <w:rPr>
+                <w:sz w:val="20"/>
+              </w:rPr>
+              <w:t>Still raising the alarm when the run ended</w:t>
+            </w:r>
+          </w:p>
+        </w:tc>
+        <w:tc>
+          <w:tcPr>
+            <w:tcW w:type="dxa" w:w="3216"/>
+          </w:tcPr>
+          <w:p>
+            <w:r/>
+            <w:r>
+              <w:rPr>
+                <w:sz w:val="20"/>
+              </w:rPr>
+              <w:t>0</w:t>
+            </w:r>
+          </w:p>
+        </w:tc>
+        <w:tc>
+          <w:tcPr>
+            <w:tcW w:type="dxa" w:w="3216"/>
+          </w:tcPr>
+          <w:p>
+            <w:r/>
+            <w:r>
+              <w:rPr>
+                <w:sz w:val="20"/>
+              </w:rPr>
+              <w:t>3</w:t>
+            </w:r>
+          </w:p>
+        </w:tc>
+      </w:tr>
+      <w:tr>
+        <w:tc>
+          <w:tcPr>
+            <w:tcW w:type="dxa" w:w="3216"/>
+          </w:tcPr>
+          <w:p>
+            <w:r/>
+            <w:r>
+              <w:rPr>
+                <w:sz w:val="20"/>
+              </w:rPr>
+              <w:t>Largest speed error during a fault, m/s</w:t>
+            </w:r>
+          </w:p>
+        </w:tc>
+        <w:tc>
+          <w:tcPr>
+            <w:tcW w:type="dxa" w:w="3216"/>
+          </w:tcPr>
+          <w:p>
+            <w:r/>
+            <w:r>
+              <w:rPr>
+                <w:sz w:val="20"/>
+              </w:rPr>
+              <w:t>0.83</w:t>
+            </w:r>
+          </w:p>
+        </w:tc>
+        <w:tc>
+          <w:tcPr>
+            <w:tcW w:type="dxa" w:w="3216"/>
+          </w:tcPr>
+          <w:p>
+            <w:r/>
+            <w:r>
+              <w:rPr>
+                <w:sz w:val="20"/>
+              </w:rPr>
+              <w:t>1.32</w:t>
+            </w:r>
+          </w:p>
+        </w:tc>
+      </w:tr>
+      <w:tr>
+        <w:tc>
+          <w:tcPr>
+            <w:tcW w:type="dxa" w:w="3216"/>
+          </w:tcPr>
+          <w:p>
+            <w:r/>
+            <w:r>
+              <w:rPr>
+                <w:sz w:val="20"/>
+              </w:rPr>
+              <w:t>Typical speed error during a fault, m/s</w:t>
+            </w:r>
+          </w:p>
+        </w:tc>
+        <w:tc>
+          <w:tcPr>
+            <w:tcW w:type="dxa" w:w="3216"/>
+          </w:tcPr>
+          <w:p>
+            <w:r/>
+            <w:r>
+              <w:rPr>
+                <w:sz w:val="20"/>
+              </w:rPr>
+              <w:t>0.43</w:t>
+            </w:r>
+          </w:p>
+        </w:tc>
+        <w:tc>
+          <w:tcPr>
+            <w:tcW w:type="dxa" w:w="3216"/>
+          </w:tcPr>
+          <w:p>
+            <w:r/>
+            <w:r>
+              <w:rPr>
+                <w:sz w:val="20"/>
+              </w:rPr>
+              <w:t>0.40</w:t>
+            </w:r>
+          </w:p>
+        </w:tc>
+      </w:tr>
+      <w:tr>
+        <w:tc>
+          <w:tcPr>
+            <w:tcW w:type="dxa" w:w="3216"/>
+          </w:tcPr>
+          <w:p>
+            <w:r/>
+            <w:r>
+              <w:rPr>
+                <w:sz w:val="20"/>
+              </w:rPr>
+              <w:t>Control steps finished late</w:t>
+            </w:r>
+          </w:p>
+        </w:tc>
+        <w:tc>
+          <w:tcPr>
+            <w:tcW w:type="dxa" w:w="3216"/>
+          </w:tcPr>
+          <w:p>
+            <w:r/>
+            <w:r>
+              <w:rPr>
+                <w:sz w:val="20"/>
+              </w:rPr>
+              <w:t>0</w:t>
+            </w:r>
+          </w:p>
+        </w:tc>
+        <w:tc>
+          <w:tcPr>
+            <w:tcW w:type="dxa" w:w="3216"/>
+          </w:tcPr>
+          <w:p>
+            <w:r/>
+            <w:r>
+              <w:rPr>
+                <w:sz w:val="20"/>
+              </w:rPr>
+              <w:t>0</w:t>
+            </w:r>
+          </w:p>
+        </w:tc>
+      </w:tr>
+    </w:tbl>
+    <w:p>
+      <w:pPr>
+        <w:spacing w:after="40"/>
+      </w:pPr>
+    </w:p>
+    <w:p>
+      <w:pPr>
+        <w:spacing w:after="160"/>
+      </w:pPr>
+      <w:r>
+        <w:rPr>
+          <w:i/>
+          <w:color w:val="595959"/>
+          <w:sz w:val="18"/>
+        </w:rPr>
+        <w:t>Table. Injected speed-sensor faults on the board, three draws of noise pooled. Cases that lost more than 16 frames were set aside and run again. MEASURED on the board.</w:t>
+      </w:r>
+    </w:p>
+    <w:p>
+      <w:pPr>
+        <w:spacing w:after="160"/>
+      </w:pPr>
+      <w:r>
+        <w:rPr>
+          <w:i w:val="0"/>
+          <w:sz w:val="24"/>
+        </w:rPr>
+        <w:t>The new checker's result holds. All 120 faults were caught, the slowest in 0.32 seconds, with no false alarm and no late control step.</w:t>
+      </w:r>
+    </w:p>
+    <w:p>
+      <w:pPr>
+        <w:spacing w:after="160"/>
+      </w:pPr>
+      <w:r>
+        <w:rPr>
+          <w:i w:val="0"/>
+          <w:sz w:val="24"/>
+        </w:rPr>
+        <w:t>The rule helper's advantage on the board does not hold. In the first run its largest speed error was 0.61 metres per second, a little under the checker alone. Over three draws it is 1.32 against 0.83, and it left 3 alarms raised at the end of a run where the checker alone left none. It does drop the alarm early less often (30 against 47). The rule helper helps in simulation. On the chip it has not been shown to.</w:t>
+      </w:r>
+    </w:p>
+    <w:p>
+      <w:pPr>
+        <w:pStyle w:val="Heading2"/>
+      </w:pPr>
+      <w:r>
+        <w:t>A backup speed that does not drift</w:t>
+      </w:r>
+    </w:p>
+    <w:p>
+      <w:pPr>
+        <w:spacing w:after="160"/>
+      </w:pPr>
+      <w:r>
+        <w:rPr>
+          <w:i w:val="0"/>
+          <w:sz w:val="24"/>
+        </w:rPr>
+        <w:t>Section 31 found what limits every helper: while the sensor is distrusted the controller works from a backup speed, and both backups drift. One comes from the acceleration reading and drifts with that reading's error. The other is the vehicle model's prediction and drifts with whatever the model has wrong.</w:t>
+      </w:r>
+    </w:p>
+    <w:p>
+      <w:pPr>
+        <w:spacing w:after="160"/>
+      </w:pPr>
+      <w:r>
+        <w:rPr>
+          <w:i w:val="0"/>
+          <w:sz w:val="24"/>
+        </w:rPr>
+        <w:t>The fused backup speed is one calculation that keeps track of three things: the speed, the model's error and the acceleration reading's error. While the sensor is trusted it learns both errors. While the sensor is distrusted it carries on with what it learned. The checker itself is unchanged. Its three settings were chosen on the urban training cycle only.</w:t>
+      </w:r>
+    </w:p>
+    <w:tbl>
+      <w:tblPr>
+        <w:tblStyle w:val="LightGrid-Accent1"/>
+        <w:tblW w:type="auto" w:w="0"/>
+        <w:jc w:val="center"/>
+        <w:tblLook w:firstColumn="1" w:firstRow="1" w:lastColumn="0" w:lastRow="0" w:noHBand="0" w:noVBand="1" w:val="04A0"/>
+      </w:tblPr>
+      <w:tblGrid>
+        <w:gridCol w:w="1930"/>
+        <w:gridCol w:w="1930"/>
+        <w:gridCol w:w="1930"/>
+        <w:gridCol w:w="1930"/>
+        <w:gridCol w:w="1930"/>
+      </w:tblGrid>
+      <w:tr>
+        <w:tc>
+          <w:tcPr>
+            <w:tcW w:type="dxa" w:w="1930"/>
+          </w:tcPr>
+          <w:p>
+            <w:r/>
+            <w:r>
+              <w:rPr>
+                <w:b/>
+                <w:sz w:val="20"/>
+              </w:rPr>
+              <w:t>Highway cycle</w:t>
+            </w:r>
+          </w:p>
+        </w:tc>
+        <w:tc>
+          <w:tcPr>
+            <w:tcW w:type="dxa" w:w="1930"/>
+          </w:tcPr>
+          <w:p>
+            <w:r/>
+            <w:r>
+              <w:rPr>
+                <w:b/>
+                <w:sz w:val="20"/>
+              </w:rPr>
+              <w:t>Largest speed error, m/s</w:t>
+            </w:r>
+          </w:p>
+        </w:tc>
+        <w:tc>
+          <w:tcPr>
+            <w:tcW w:type="dxa" w:w="1930"/>
+          </w:tcPr>
+          <w:p>
+            <w:r/>
+            <w:r>
+              <w:rPr>
+                <w:b/>
+                <w:sz w:val="20"/>
+              </w:rPr>
+              <w:t>Typical speed error, m/s</w:t>
+            </w:r>
+          </w:p>
+        </w:tc>
+        <w:tc>
+          <w:tcPr>
+            <w:tcW w:type="dxa" w:w="1930"/>
+          </w:tcPr>
+          <w:p>
+            <w:r/>
+            <w:r>
+              <w:rPr>
+                <w:b/>
+                <w:sz w:val="20"/>
+              </w:rPr>
+              <w:t>Alarms stuck</w:t>
+            </w:r>
+          </w:p>
+        </w:tc>
+        <w:tc>
+          <w:tcPr>
+            <w:tcW w:type="dxa" w:w="1930"/>
+          </w:tcPr>
+          <w:p>
+            <w:r/>
+            <w:r>
+              <w:rPr>
+                <w:b/>
+                <w:sz w:val="20"/>
+              </w:rPr>
+              <w:t>Clean false alarms</w:t>
+            </w:r>
+          </w:p>
+        </w:tc>
+      </w:tr>
+      <w:tr>
+        <w:tc>
+          <w:tcPr>
+            <w:tcW w:type="dxa" w:w="1930"/>
+          </w:tcPr>
+          <w:p>
+            <w:r/>
+            <w:r>
+              <w:rPr>
+                <w:sz w:val="20"/>
+              </w:rPr>
+              <w:t>New checker alone</w:t>
+            </w:r>
+          </w:p>
+        </w:tc>
+        <w:tc>
+          <w:tcPr>
+            <w:tcW w:type="dxa" w:w="1930"/>
+          </w:tcPr>
+          <w:p>
+            <w:r/>
+            <w:r>
+              <w:rPr>
+                <w:sz w:val="20"/>
+              </w:rPr>
+              <w:t>3.74</w:t>
+            </w:r>
+          </w:p>
+        </w:tc>
+        <w:tc>
+          <w:tcPr>
+            <w:tcW w:type="dxa" w:w="1930"/>
+          </w:tcPr>
+          <w:p>
+            <w:r/>
+            <w:r>
+              <w:rPr>
+                <w:sz w:val="20"/>
+              </w:rPr>
+              <w:t>0.56</w:t>
+            </w:r>
+          </w:p>
+        </w:tc>
+        <w:tc>
+          <w:tcPr>
+            <w:tcW w:type="dxa" w:w="1930"/>
+          </w:tcPr>
+          <w:p>
+            <w:r/>
+            <w:r>
+              <w:rPr>
+                <w:sz w:val="20"/>
+              </w:rPr>
+              <w:t>14</w:t>
+            </w:r>
+          </w:p>
+        </w:tc>
+        <w:tc>
+          <w:tcPr>
+            <w:tcW w:type="dxa" w:w="1930"/>
+          </w:tcPr>
+          <w:p>
+            <w:r/>
+            <w:r>
+              <w:rPr>
+                <w:sz w:val="20"/>
+              </w:rPr>
+              <w:t>0</w:t>
+            </w:r>
+          </w:p>
+        </w:tc>
+      </w:tr>
+      <w:tr>
+        <w:tc>
+          <w:tcPr>
+            <w:tcW w:type="dxa" w:w="1930"/>
+          </w:tcPr>
+          <w:p>
+            <w:r/>
+            <w:r>
+              <w:rPr>
+                <w:sz w:val="20"/>
+              </w:rPr>
+              <w:t>New checker with the rule helper</w:t>
+            </w:r>
+          </w:p>
+        </w:tc>
+        <w:tc>
+          <w:tcPr>
+            <w:tcW w:type="dxa" w:w="1930"/>
+          </w:tcPr>
+          <w:p>
+            <w:r/>
+            <w:r>
+              <w:rPr>
+                <w:sz w:val="20"/>
+              </w:rPr>
+              <w:t>1.24</w:t>
+            </w:r>
+          </w:p>
+        </w:tc>
+        <w:tc>
+          <w:tcPr>
+            <w:tcW w:type="dxa" w:w="1930"/>
+          </w:tcPr>
+          <w:p>
+            <w:r/>
+            <w:r>
+              <w:rPr>
+                <w:sz w:val="20"/>
+              </w:rPr>
+              <w:t>0.24</w:t>
+            </w:r>
+          </w:p>
+        </w:tc>
+        <w:tc>
+          <w:tcPr>
+            <w:tcW w:type="dxa" w:w="1930"/>
+          </w:tcPr>
+          <w:p>
+            <w:r/>
+            <w:r>
+              <w:rPr>
+                <w:sz w:val="20"/>
+              </w:rPr>
+              <w:t>10</w:t>
+            </w:r>
+          </w:p>
+        </w:tc>
+        <w:tc>
+          <w:tcPr>
+            <w:tcW w:type="dxa" w:w="1930"/>
+          </w:tcPr>
+          <w:p>
+            <w:r/>
+            <w:r>
+              <w:rPr>
+                <w:sz w:val="20"/>
+              </w:rPr>
+              <w:t>0</w:t>
+            </w:r>
+          </w:p>
+        </w:tc>
+      </w:tr>
+      <w:tr>
+        <w:tc>
+          <w:tcPr>
+            <w:tcW w:type="dxa" w:w="1930"/>
+          </w:tcPr>
+          <w:p>
+            <w:r/>
+            <w:r>
+              <w:rPr>
+                <w:sz w:val="20"/>
+              </w:rPr>
+              <w:t>With the fused backup speed</w:t>
+            </w:r>
+          </w:p>
+        </w:tc>
+        <w:tc>
+          <w:tcPr>
+            <w:tcW w:type="dxa" w:w="1930"/>
+          </w:tcPr>
+          <w:p>
+            <w:r/>
+            <w:r>
+              <w:rPr>
+                <w:sz w:val="20"/>
+              </w:rPr>
+              <w:t>0.62</w:t>
+            </w:r>
+          </w:p>
+        </w:tc>
+        <w:tc>
+          <w:tcPr>
+            <w:tcW w:type="dxa" w:w="1930"/>
+          </w:tcPr>
+          <w:p>
+            <w:r/>
+            <w:r>
+              <w:rPr>
+                <w:sz w:val="20"/>
+              </w:rPr>
+              <w:t>0.08</w:t>
+            </w:r>
+          </w:p>
+        </w:tc>
+        <w:tc>
+          <w:tcPr>
+            <w:tcW w:type="dxa" w:w="1930"/>
+          </w:tcPr>
+          <w:p>
+            <w:r/>
+            <w:r>
+              <w:rPr>
+                <w:sz w:val="20"/>
+              </w:rPr>
+              <w:t>0</w:t>
+            </w:r>
+          </w:p>
+        </w:tc>
+        <w:tc>
+          <w:tcPr>
+            <w:tcW w:type="dxa" w:w="1930"/>
+          </w:tcPr>
+          <w:p>
+            <w:r/>
+            <w:r>
+              <w:rPr>
+                <w:sz w:val="20"/>
+              </w:rPr>
+              <w:t>0</w:t>
+            </w:r>
+          </w:p>
+        </w:tc>
+      </w:tr>
+      <w:tr>
+        <w:tc>
+          <w:tcPr>
+            <w:tcW w:type="dxa" w:w="1930"/>
+          </w:tcPr>
+          <w:p>
+            <w:r/>
+            <w:r>
+              <w:rPr>
+                <w:sz w:val="20"/>
+              </w:rPr>
+              <w:t>Fused backup speed and rule helper</w:t>
+            </w:r>
+          </w:p>
+        </w:tc>
+        <w:tc>
+          <w:tcPr>
+            <w:tcW w:type="dxa" w:w="1930"/>
+          </w:tcPr>
+          <w:p>
+            <w:r/>
+            <w:r>
+              <w:rPr>
+                <w:sz w:val="20"/>
+              </w:rPr>
+              <w:t>0.70</w:t>
+            </w:r>
+          </w:p>
+        </w:tc>
+        <w:tc>
+          <w:tcPr>
+            <w:tcW w:type="dxa" w:w="1930"/>
+          </w:tcPr>
+          <w:p>
+            <w:r/>
+            <w:r>
+              <w:rPr>
+                <w:sz w:val="20"/>
+              </w:rPr>
+              <w:t>0.09</w:t>
+            </w:r>
+          </w:p>
+        </w:tc>
+        <w:tc>
+          <w:tcPr>
+            <w:tcW w:type="dxa" w:w="1930"/>
+          </w:tcPr>
+          <w:p>
+            <w:r/>
+            <w:r>
+              <w:rPr>
+                <w:sz w:val="20"/>
+              </w:rPr>
+              <w:t>10</w:t>
+            </w:r>
+          </w:p>
+        </w:tc>
+        <w:tc>
+          <w:tcPr>
+            <w:tcW w:type="dxa" w:w="1930"/>
+          </w:tcPr>
+          <w:p>
+            <w:r/>
+            <w:r>
+              <w:rPr>
+                <w:sz w:val="20"/>
+              </w:rPr>
+              <w:t>0</w:t>
+            </w:r>
+          </w:p>
+        </w:tc>
+      </w:tr>
+    </w:tbl>
+    <w:p>
+      <w:pPr>
+        <w:spacing w:after="40"/>
+      </w:pPr>
+    </w:p>
+    <w:tbl>
+      <w:tblPr>
+        <w:tblStyle w:val="LightGrid-Accent1"/>
+        <w:tblW w:type="auto" w:w="0"/>
+        <w:jc w:val="center"/>
+        <w:tblLook w:firstColumn="1" w:firstRow="1" w:lastColumn="0" w:lastRow="0" w:noHBand="0" w:noVBand="1" w:val="04A0"/>
+      </w:tblPr>
+      <w:tblGrid>
+        <w:gridCol w:w="1930"/>
+        <w:gridCol w:w="1930"/>
+        <w:gridCol w:w="1930"/>
+        <w:gridCol w:w="1930"/>
+        <w:gridCol w:w="1930"/>
+      </w:tblGrid>
+      <w:tr>
+        <w:tc>
+          <w:tcPr>
+            <w:tcW w:type="dxa" w:w="1930"/>
+          </w:tcPr>
+          <w:p>
+            <w:r/>
+            <w:r>
+              <w:rPr>
+                <w:b/>
+                <w:sz w:val="20"/>
+              </w:rPr>
+              <w:t>Aggressive cycle</w:t>
+            </w:r>
+          </w:p>
+        </w:tc>
+        <w:tc>
+          <w:tcPr>
+            <w:tcW w:type="dxa" w:w="1930"/>
+          </w:tcPr>
+          <w:p>
+            <w:r/>
+            <w:r>
+              <w:rPr>
+                <w:b/>
+                <w:sz w:val="20"/>
+              </w:rPr>
+              <w:t>Largest speed error, m/s</w:t>
+            </w:r>
+          </w:p>
+        </w:tc>
+        <w:tc>
+          <w:tcPr>
+            <w:tcW w:type="dxa" w:w="1930"/>
+          </w:tcPr>
+          <w:p>
+            <w:r/>
+            <w:r>
+              <w:rPr>
+                <w:b/>
+                <w:sz w:val="20"/>
+              </w:rPr>
+              <w:t>Typical speed error, m/s</w:t>
+            </w:r>
+          </w:p>
+        </w:tc>
+        <w:tc>
+          <w:tcPr>
+            <w:tcW w:type="dxa" w:w="1930"/>
+          </w:tcPr>
+          <w:p>
+            <w:r/>
+            <w:r>
+              <w:rPr>
+                <w:b/>
+                <w:sz w:val="20"/>
+              </w:rPr>
+              <w:t>Alarms stuck</w:t>
+            </w:r>
+          </w:p>
+        </w:tc>
+        <w:tc>
+          <w:tcPr>
+            <w:tcW w:type="dxa" w:w="1930"/>
+          </w:tcPr>
+          <w:p>
+            <w:r/>
+            <w:r>
+              <w:rPr>
+                <w:b/>
+                <w:sz w:val="20"/>
+              </w:rPr>
+              <w:t>Clean false alarms</w:t>
+            </w:r>
+          </w:p>
+        </w:tc>
+      </w:tr>
+      <w:tr>
+        <w:tc>
+          <w:tcPr>
+            <w:tcW w:type="dxa" w:w="1930"/>
+          </w:tcPr>
+          <w:p>
+            <w:r/>
+            <w:r>
+              <w:rPr>
+                <w:sz w:val="20"/>
+              </w:rPr>
+              <w:t>New checker alone</w:t>
+            </w:r>
+          </w:p>
+        </w:tc>
+        <w:tc>
+          <w:tcPr>
+            <w:tcW w:type="dxa" w:w="1930"/>
+          </w:tcPr>
+          <w:p>
+            <w:r/>
+            <w:r>
+              <w:rPr>
+                <w:sz w:val="20"/>
+              </w:rPr>
+              <w:t>5.10</w:t>
+            </w:r>
+          </w:p>
+        </w:tc>
+        <w:tc>
+          <w:tcPr>
+            <w:tcW w:type="dxa" w:w="1930"/>
+          </w:tcPr>
+          <w:p>
+            <w:r/>
+            <w:r>
+              <w:rPr>
+                <w:sz w:val="20"/>
+              </w:rPr>
+              <w:t>0.58</w:t>
+            </w:r>
+          </w:p>
+        </w:tc>
+        <w:tc>
+          <w:tcPr>
+            <w:tcW w:type="dxa" w:w="1930"/>
+          </w:tcPr>
+          <w:p>
+            <w:r/>
+            <w:r>
+              <w:rPr>
+                <w:sz w:val="20"/>
+              </w:rPr>
+              <w:t>32</w:t>
+            </w:r>
+          </w:p>
+        </w:tc>
+        <w:tc>
+          <w:tcPr>
+            <w:tcW w:type="dxa" w:w="1930"/>
+          </w:tcPr>
+          <w:p>
+            <w:r/>
+            <w:r>
+              <w:rPr>
+                <w:sz w:val="20"/>
+              </w:rPr>
+              <w:t>0</w:t>
+            </w:r>
+          </w:p>
+        </w:tc>
+      </w:tr>
+      <w:tr>
+        <w:tc>
+          <w:tcPr>
+            <w:tcW w:type="dxa" w:w="1930"/>
+          </w:tcPr>
+          <w:p>
+            <w:r/>
+            <w:r>
+              <w:rPr>
+                <w:sz w:val="20"/>
+              </w:rPr>
+              <w:t>New checker with the rule helper</w:t>
+            </w:r>
+          </w:p>
+        </w:tc>
+        <w:tc>
+          <w:tcPr>
+            <w:tcW w:type="dxa" w:w="1930"/>
+          </w:tcPr>
+          <w:p>
+            <w:r/>
+            <w:r>
+              <w:rPr>
+                <w:sz w:val="20"/>
+              </w:rPr>
+              <w:t>1.41</w:t>
+            </w:r>
+          </w:p>
+        </w:tc>
+        <w:tc>
+          <w:tcPr>
+            <w:tcW w:type="dxa" w:w="1930"/>
+          </w:tcPr>
+          <w:p>
+            <w:r/>
+            <w:r>
+              <w:rPr>
+                <w:sz w:val="20"/>
+              </w:rPr>
+              <w:t>0.47</w:t>
+            </w:r>
+          </w:p>
+        </w:tc>
+        <w:tc>
+          <w:tcPr>
+            <w:tcW w:type="dxa" w:w="1930"/>
+          </w:tcPr>
+          <w:p>
+            <w:r/>
+            <w:r>
+              <w:rPr>
+                <w:sz w:val="20"/>
+              </w:rPr>
+              <w:t>5</w:t>
+            </w:r>
+          </w:p>
+        </w:tc>
+        <w:tc>
+          <w:tcPr>
+            <w:tcW w:type="dxa" w:w="1930"/>
+          </w:tcPr>
+          <w:p>
+            <w:r/>
+            <w:r>
+              <w:rPr>
+                <w:sz w:val="20"/>
+              </w:rPr>
+              <w:t>0</w:t>
+            </w:r>
+          </w:p>
+        </w:tc>
+      </w:tr>
+      <w:tr>
+        <w:tc>
+          <w:tcPr>
+            <w:tcW w:type="dxa" w:w="1930"/>
+          </w:tcPr>
+          <w:p>
+            <w:r/>
+            <w:r>
+              <w:rPr>
+                <w:sz w:val="20"/>
+              </w:rPr>
+              <w:t>With the fused backup speed</w:t>
+            </w:r>
+          </w:p>
+        </w:tc>
+        <w:tc>
+          <w:tcPr>
+            <w:tcW w:type="dxa" w:w="1930"/>
+          </w:tcPr>
+          <w:p>
+            <w:r/>
+            <w:r>
+              <w:rPr>
+                <w:sz w:val="20"/>
+              </w:rPr>
+              <w:t>2.59</w:t>
+            </w:r>
+          </w:p>
+        </w:tc>
+        <w:tc>
+          <w:tcPr>
+            <w:tcW w:type="dxa" w:w="1930"/>
+          </w:tcPr>
+          <w:p>
+            <w:r/>
+            <w:r>
+              <w:rPr>
+                <w:sz w:val="20"/>
+              </w:rPr>
+              <w:t>0.55</w:t>
+            </w:r>
+          </w:p>
+        </w:tc>
+        <w:tc>
+          <w:tcPr>
+            <w:tcW w:type="dxa" w:w="1930"/>
+          </w:tcPr>
+          <w:p>
+            <w:r/>
+            <w:r>
+              <w:rPr>
+                <w:sz w:val="20"/>
+              </w:rPr>
+              <w:t>2</w:t>
+            </w:r>
+          </w:p>
+        </w:tc>
+        <w:tc>
+          <w:tcPr>
+            <w:tcW w:type="dxa" w:w="1930"/>
+          </w:tcPr>
+          <w:p>
+            <w:r/>
+            <w:r>
+              <w:rPr>
+                <w:sz w:val="20"/>
+              </w:rPr>
+              <w:t>0</w:t>
+            </w:r>
+          </w:p>
+        </w:tc>
+      </w:tr>
+      <w:tr>
+        <w:tc>
+          <w:tcPr>
+            <w:tcW w:type="dxa" w:w="1930"/>
+          </w:tcPr>
+          <w:p>
+            <w:r/>
+            <w:r>
+              <w:rPr>
+                <w:sz w:val="20"/>
+              </w:rPr>
+              <w:t>Fused backup speed and rule helper</w:t>
+            </w:r>
+          </w:p>
+        </w:tc>
+        <w:tc>
+          <w:tcPr>
+            <w:tcW w:type="dxa" w:w="1930"/>
+          </w:tcPr>
+          <w:p>
+            <w:r/>
+            <w:r>
+              <w:rPr>
+                <w:sz w:val="20"/>
+              </w:rPr>
+              <w:t>1.29</w:t>
+            </w:r>
+          </w:p>
+        </w:tc>
+        <w:tc>
+          <w:tcPr>
+            <w:tcW w:type="dxa" w:w="1930"/>
+          </w:tcPr>
+          <w:p>
+            <w:r/>
+            <w:r>
+              <w:rPr>
+                <w:sz w:val="20"/>
+              </w:rPr>
+              <w:t>0.50</w:t>
+            </w:r>
+          </w:p>
+        </w:tc>
+        <w:tc>
+          <w:tcPr>
+            <w:tcW w:type="dxa" w:w="1930"/>
+          </w:tcPr>
+          <w:p>
+            <w:r/>
+            <w:r>
+              <w:rPr>
+                <w:sz w:val="20"/>
+              </w:rPr>
+              <w:t>4</w:t>
+            </w:r>
+          </w:p>
+        </w:tc>
+        <w:tc>
+          <w:tcPr>
+            <w:tcW w:type="dxa" w:w="1930"/>
+          </w:tcPr>
+          <w:p>
+            <w:r/>
+            <w:r>
+              <w:rPr>
+                <w:sz w:val="20"/>
+              </w:rPr>
+              <w:t>0</w:t>
+            </w:r>
+          </w:p>
+        </w:tc>
+      </w:tr>
+    </w:tbl>
+    <w:p>
+      <w:pPr>
+        <w:spacing w:after="40"/>
+      </w:pPr>
+    </w:p>
+    <w:p>
+      <w:pPr>
+        <w:spacing w:after="160"/>
+      </w:pPr>
+      <w:r>
+        <w:rPr>
+          <w:i/>
+          <w:color w:val="595959"/>
+          <w:sz w:val="18"/>
+        </w:rPr>
+        <w:t>Tables. Largest speed error through any of 560 faults, and the typical error in the hardest condition. SIMULATED on the laptop.</w:t>
+      </w:r>
+    </w:p>
+    <w:p>
+      <w:pPr>
+        <w:spacing w:after="160"/>
+      </w:pPr>
+      <w:r>
+        <w:rPr>
+          <w:i w:val="0"/>
+          <w:sz w:val="24"/>
+        </w:rPr>
+        <w:t>On the highway cycle the fused backup speed is the best result so far: largest error 0.62 metres per second against 3.74 for the checker alone and 1.24 with the rule helper, and no alarm left stuck.</w:t>
+      </w:r>
+    </w:p>
+    <w:p>
+      <w:pPr>
+        <w:spacing w:after="160"/>
+      </w:pPr>
+      <w:r>
+        <w:rPr>
+          <w:i w:val="0"/>
+          <w:sz w:val="24"/>
+        </w:rPr>
+        <w:t>On the aggressive cycle it is the best in 6 of the 7 conditions, with a largest error of 0.61 to 0.64. It is the worst in the remaining one: a car 10% heavier than the model, 2.59. That is where the model is most wrong and changes fastest. The settings were chosen on gentle urban driving, which is the likely cause; it was not tested.</w:t>
+      </w:r>
+    </w:p>
+    <w:p>
+      <w:pPr>
+        <w:pStyle w:val="Heading2"/>
+      </w:pPr>
+      <w:r>
+        <w:t>Speed planning with traffic</w:t>
+      </w:r>
+    </w:p>
+    <w:p>
+      <w:pPr>
+        <w:spacing w:after="160"/>
+      </w:pPr>
+      <w:r>
+        <w:rPr>
+          <w:i w:val="0"/>
+          <w:sz w:val="24"/>
+        </w:rPr>
+        <w:t>Section 32 let the planner drive an empty road. A real car is in traffic. Here the planner must stay within a set distance of the recorded drive at every second, ahead or behind. Distance covered and arrival time are the recorded drive's exactly.</w:t>
+      </w:r>
+    </w:p>
+    <w:tbl>
+      <w:tblPr>
+        <w:tblStyle w:val="LightGrid-Accent1"/>
+        <w:tblW w:type="auto" w:w="0"/>
+        <w:jc w:val="center"/>
+        <w:tblLook w:firstColumn="1" w:firstRow="1" w:lastColumn="0" w:lastRow="0" w:noHBand="0" w:noVBand="1" w:val="04A0"/>
+      </w:tblPr>
+      <w:tblGrid>
+        <w:gridCol w:w="1930"/>
+        <w:gridCol w:w="1930"/>
+        <w:gridCol w:w="1930"/>
+        <w:gridCol w:w="1930"/>
+        <w:gridCol w:w="1930"/>
+      </w:tblGrid>
+      <w:tr>
+        <w:tc>
+          <w:tcPr>
+            <w:tcW w:type="dxa" w:w="1930"/>
+          </w:tcPr>
+          <w:p>
+            <w:r/>
+            <w:r>
+              <w:rPr>
+                <w:b/>
+                <w:sz w:val="20"/>
+              </w:rPr>
+              <w:t>The car stays</w:t>
+            </w:r>
+          </w:p>
+        </w:tc>
+        <w:tc>
+          <w:tcPr>
+            <w:tcW w:type="dxa" w:w="1930"/>
+          </w:tcPr>
+          <w:p>
+            <w:r/>
+            <w:r>
+              <w:rPr>
+                <w:b/>
+                <w:sz w:val="20"/>
+              </w:rPr>
+              <w:t>Aggressive route, Wh/km</w:t>
+            </w:r>
+          </w:p>
+        </w:tc>
+        <w:tc>
+          <w:tcPr>
+            <w:tcW w:type="dxa" w:w="1930"/>
+          </w:tcPr>
+          <w:p>
+            <w:r/>
+            <w:r>
+              <w:rPr>
+                <w:b/>
+                <w:sz w:val="20"/>
+              </w:rPr>
+              <w:t>Saving</w:t>
+            </w:r>
+          </w:p>
+        </w:tc>
+        <w:tc>
+          <w:tcPr>
+            <w:tcW w:type="dxa" w:w="1930"/>
+          </w:tcPr>
+          <w:p>
+            <w:r/>
+            <w:r>
+              <w:rPr>
+                <w:b/>
+                <w:sz w:val="20"/>
+              </w:rPr>
+              <w:t>Highway route, Wh/km</w:t>
+            </w:r>
+          </w:p>
+        </w:tc>
+        <w:tc>
+          <w:tcPr>
+            <w:tcW w:type="dxa" w:w="1930"/>
+          </w:tcPr>
+          <w:p>
+            <w:r/>
+            <w:r>
+              <w:rPr>
+                <w:b/>
+                <w:sz w:val="20"/>
+              </w:rPr>
+              <w:t>Saving</w:t>
+            </w:r>
+          </w:p>
+        </w:tc>
+      </w:tr>
+      <w:tr>
+        <w:tc>
+          <w:tcPr>
+            <w:tcW w:type="dxa" w:w="1930"/>
+          </w:tcPr>
+          <w:p>
+            <w:r/>
+            <w:r>
+              <w:rPr>
+                <w:sz w:val="20"/>
+              </w:rPr>
+              <w:t>The recorded drive</w:t>
+            </w:r>
+          </w:p>
+        </w:tc>
+        <w:tc>
+          <w:tcPr>
+            <w:tcW w:type="dxa" w:w="1930"/>
+          </w:tcPr>
+          <w:p>
+            <w:r/>
+            <w:r>
+              <w:rPr>
+                <w:sz w:val="20"/>
+              </w:rPr>
+              <w:t>190.5</w:t>
+            </w:r>
+          </w:p>
+        </w:tc>
+        <w:tc>
+          <w:tcPr>
+            <w:tcW w:type="dxa" w:w="1930"/>
+          </w:tcPr>
+          <w:p>
+            <w:r/>
+            <w:r>
+              <w:rPr>
+                <w:sz w:val="20"/>
+              </w:rPr>
+            </w:r>
+          </w:p>
+        </w:tc>
+        <w:tc>
+          <w:tcPr>
+            <w:tcW w:type="dxa" w:w="1930"/>
+          </w:tcPr>
+          <w:p>
+            <w:r/>
+            <w:r>
+              <w:rPr>
+                <w:sz w:val="20"/>
+              </w:rPr>
+              <w:t>153.9</w:t>
+            </w:r>
+          </w:p>
+        </w:tc>
+        <w:tc>
+          <w:tcPr>
+            <w:tcW w:type="dxa" w:w="1930"/>
+          </w:tcPr>
+          <w:p>
+            <w:r/>
+            <w:r>
+              <w:rPr>
+                <w:sz w:val="20"/>
+              </w:rPr>
+            </w:r>
+          </w:p>
+        </w:tc>
+      </w:tr>
+      <w:tr>
+        <w:tc>
+          <w:tcPr>
+            <w:tcW w:type="dxa" w:w="1930"/>
+          </w:tcPr>
+          <w:p>
+            <w:r/>
+            <w:r>
+              <w:rPr>
+                <w:sz w:val="20"/>
+              </w:rPr>
+              <w:t>Within 5 m</w:t>
+            </w:r>
+          </w:p>
+        </w:tc>
+        <w:tc>
+          <w:tcPr>
+            <w:tcW w:type="dxa" w:w="1930"/>
+          </w:tcPr>
+          <w:p>
+            <w:r/>
+            <w:r>
+              <w:rPr>
+                <w:sz w:val="20"/>
+              </w:rPr>
+              <w:t>186.0</w:t>
+            </w:r>
+          </w:p>
+        </w:tc>
+        <w:tc>
+          <w:tcPr>
+            <w:tcW w:type="dxa" w:w="1930"/>
+          </w:tcPr>
+          <w:p>
+            <w:r/>
+            <w:r>
+              <w:rPr>
+                <w:sz w:val="20"/>
+              </w:rPr>
+              <w:t>2.3%</w:t>
+            </w:r>
+          </w:p>
+        </w:tc>
+        <w:tc>
+          <w:tcPr>
+            <w:tcW w:type="dxa" w:w="1930"/>
+          </w:tcPr>
+          <w:p>
+            <w:r/>
+            <w:r>
+              <w:rPr>
+                <w:sz w:val="20"/>
+              </w:rPr>
+              <w:t>154.0</w:t>
+            </w:r>
+          </w:p>
+        </w:tc>
+        <w:tc>
+          <w:tcPr>
+            <w:tcW w:type="dxa" w:w="1930"/>
+          </w:tcPr>
+          <w:p>
+            <w:r/>
+            <w:r>
+              <w:rPr>
+                <w:sz w:val="20"/>
+              </w:rPr>
+              <w:t>-0.1%</w:t>
+            </w:r>
+          </w:p>
+        </w:tc>
+      </w:tr>
+      <w:tr>
+        <w:tc>
+          <w:tcPr>
+            <w:tcW w:type="dxa" w:w="1930"/>
+          </w:tcPr>
+          <w:p>
+            <w:r/>
+            <w:r>
+              <w:rPr>
+                <w:sz w:val="20"/>
+              </w:rPr>
+              <w:t>Within 10 m</w:t>
+            </w:r>
+          </w:p>
+        </w:tc>
+        <w:tc>
+          <w:tcPr>
+            <w:tcW w:type="dxa" w:w="1930"/>
+          </w:tcPr>
+          <w:p>
+            <w:r/>
+            <w:r>
+              <w:rPr>
+                <w:sz w:val="20"/>
+              </w:rPr>
+              <w:t>184.0</w:t>
+            </w:r>
+          </w:p>
+        </w:tc>
+        <w:tc>
+          <w:tcPr>
+            <w:tcW w:type="dxa" w:w="1930"/>
+          </w:tcPr>
+          <w:p>
+            <w:r/>
+            <w:r>
+              <w:rPr>
+                <w:sz w:val="20"/>
+              </w:rPr>
+              <w:t>3.4%</w:t>
+            </w:r>
+          </w:p>
+        </w:tc>
+        <w:tc>
+          <w:tcPr>
+            <w:tcW w:type="dxa" w:w="1930"/>
+          </w:tcPr>
+          <w:p>
+            <w:r/>
+            <w:r>
+              <w:rPr>
+                <w:sz w:val="20"/>
+              </w:rPr>
+              <w:t>153.4</w:t>
+            </w:r>
+          </w:p>
+        </w:tc>
+        <w:tc>
+          <w:tcPr>
+            <w:tcW w:type="dxa" w:w="1930"/>
+          </w:tcPr>
+          <w:p>
+            <w:r/>
+            <w:r>
+              <w:rPr>
+                <w:sz w:val="20"/>
+              </w:rPr>
+              <w:t>0.3%</w:t>
+            </w:r>
+          </w:p>
+        </w:tc>
+      </w:tr>
+      <w:tr>
+        <w:tc>
+          <w:tcPr>
+            <w:tcW w:type="dxa" w:w="1930"/>
+          </w:tcPr>
+          <w:p>
+            <w:r/>
+            <w:r>
+              <w:rPr>
+                <w:sz w:val="20"/>
+              </w:rPr>
+              <w:t>Within 25 m</w:t>
+            </w:r>
+          </w:p>
+        </w:tc>
+        <w:tc>
+          <w:tcPr>
+            <w:tcW w:type="dxa" w:w="1930"/>
+          </w:tcPr>
+          <w:p>
+            <w:r/>
+            <w:r>
+              <w:rPr>
+                <w:sz w:val="20"/>
+              </w:rPr>
+              <w:t>180.7</w:t>
+            </w:r>
+          </w:p>
+        </w:tc>
+        <w:tc>
+          <w:tcPr>
+            <w:tcW w:type="dxa" w:w="1930"/>
+          </w:tcPr>
+          <w:p>
+            <w:r/>
+            <w:r>
+              <w:rPr>
+                <w:sz w:val="20"/>
+              </w:rPr>
+              <w:t>5.1%</w:t>
+            </w:r>
+          </w:p>
+        </w:tc>
+        <w:tc>
+          <w:tcPr>
+            <w:tcW w:type="dxa" w:w="1930"/>
+          </w:tcPr>
+          <w:p>
+            <w:r/>
+            <w:r>
+              <w:rPr>
+                <w:sz w:val="20"/>
+              </w:rPr>
+              <w:t>152.6</w:t>
+            </w:r>
+          </w:p>
+        </w:tc>
+        <w:tc>
+          <w:tcPr>
+            <w:tcW w:type="dxa" w:w="1930"/>
+          </w:tcPr>
+          <w:p>
+            <w:r/>
+            <w:r>
+              <w:rPr>
+                <w:sz w:val="20"/>
+              </w:rPr>
+              <w:t>0.8%</w:t>
+            </w:r>
+          </w:p>
+        </w:tc>
+      </w:tr>
+      <w:tr>
+        <w:tc>
+          <w:tcPr>
+            <w:tcW w:type="dxa" w:w="1930"/>
+          </w:tcPr>
+          <w:p>
+            <w:r/>
+            <w:r>
+              <w:rPr>
+                <w:sz w:val="20"/>
+              </w:rPr>
+              <w:t>Within 50 m</w:t>
+            </w:r>
+          </w:p>
+        </w:tc>
+        <w:tc>
+          <w:tcPr>
+            <w:tcW w:type="dxa" w:w="1930"/>
+          </w:tcPr>
+          <w:p>
+            <w:r/>
+            <w:r>
+              <w:rPr>
+                <w:sz w:val="20"/>
+              </w:rPr>
+              <w:t>176.7</w:t>
+            </w:r>
+          </w:p>
+        </w:tc>
+        <w:tc>
+          <w:tcPr>
+            <w:tcW w:type="dxa" w:w="1930"/>
+          </w:tcPr>
+          <w:p>
+            <w:r/>
+            <w:r>
+              <w:rPr>
+                <w:sz w:val="20"/>
+              </w:rPr>
+              <w:t>7.2%</w:t>
+            </w:r>
+          </w:p>
+        </w:tc>
+        <w:tc>
+          <w:tcPr>
+            <w:tcW w:type="dxa" w:w="1930"/>
+          </w:tcPr>
+          <w:p>
+            <w:r/>
+            <w:r>
+              <w:rPr>
+                <w:sz w:val="20"/>
+              </w:rPr>
+              <w:t>151.9</w:t>
+            </w:r>
+          </w:p>
+        </w:tc>
+        <w:tc>
+          <w:tcPr>
+            <w:tcW w:type="dxa" w:w="1930"/>
+          </w:tcPr>
+          <w:p>
+            <w:r/>
+            <w:r>
+              <w:rPr>
+                <w:sz w:val="20"/>
+              </w:rPr>
+              <w:t>1.3%</w:t>
+            </w:r>
+          </w:p>
+        </w:tc>
+      </w:tr>
+      <w:tr>
+        <w:tc>
+          <w:tcPr>
+            <w:tcW w:type="dxa" w:w="1930"/>
+          </w:tcPr>
+          <w:p>
+            <w:r/>
+            <w:r>
+              <w:rPr>
+                <w:sz w:val="20"/>
+              </w:rPr>
+              <w:t>Within 100 m</w:t>
+            </w:r>
+          </w:p>
+        </w:tc>
+        <w:tc>
+          <w:tcPr>
+            <w:tcW w:type="dxa" w:w="1930"/>
+          </w:tcPr>
+          <w:p>
+            <w:r/>
+            <w:r>
+              <w:rPr>
+                <w:sz w:val="20"/>
+              </w:rPr>
+              <w:t>172.0</w:t>
+            </w:r>
+          </w:p>
+        </w:tc>
+        <w:tc>
+          <w:tcPr>
+            <w:tcW w:type="dxa" w:w="1930"/>
+          </w:tcPr>
+          <w:p>
+            <w:r/>
+            <w:r>
+              <w:rPr>
+                <w:sz w:val="20"/>
+              </w:rPr>
+              <w:t>9.7%</w:t>
+            </w:r>
+          </w:p>
+        </w:tc>
+        <w:tc>
+          <w:tcPr>
+            <w:tcW w:type="dxa" w:w="1930"/>
+          </w:tcPr>
+          <w:p>
+            <w:r/>
+            <w:r>
+              <w:rPr>
+                <w:sz w:val="20"/>
+              </w:rPr>
+              <w:t>151.6</w:t>
+            </w:r>
+          </w:p>
+        </w:tc>
+        <w:tc>
+          <w:tcPr>
+            <w:tcW w:type="dxa" w:w="1930"/>
+          </w:tcPr>
+          <w:p>
+            <w:r/>
+            <w:r>
+              <w:rPr>
+                <w:sz w:val="20"/>
+              </w:rPr>
+              <w:t>1.5%</w:t>
+            </w:r>
+          </w:p>
+        </w:tc>
+      </w:tr>
+      <w:tr>
+        <w:tc>
+          <w:tcPr>
+            <w:tcW w:type="dxa" w:w="1930"/>
+          </w:tcPr>
+          <w:p>
+            <w:r/>
+            <w:r>
+              <w:rPr>
+                <w:sz w:val="20"/>
+              </w:rPr>
+              <w:t>Within 200 m</w:t>
+            </w:r>
+          </w:p>
+        </w:tc>
+        <w:tc>
+          <w:tcPr>
+            <w:tcW w:type="dxa" w:w="1930"/>
+          </w:tcPr>
+          <w:p>
+            <w:r/>
+            <w:r>
+              <w:rPr>
+                <w:sz w:val="20"/>
+              </w:rPr>
+              <w:t>166.6</w:t>
+            </w:r>
+          </w:p>
+        </w:tc>
+        <w:tc>
+          <w:tcPr>
+            <w:tcW w:type="dxa" w:w="1930"/>
+          </w:tcPr>
+          <w:p>
+            <w:r/>
+            <w:r>
+              <w:rPr>
+                <w:sz w:val="20"/>
+              </w:rPr>
+              <w:t>12.6%</w:t>
+            </w:r>
+          </w:p>
+        </w:tc>
+        <w:tc>
+          <w:tcPr>
+            <w:tcW w:type="dxa" w:w="1930"/>
+          </w:tcPr>
+          <w:p>
+            <w:r/>
+            <w:r>
+              <w:rPr>
+                <w:sz w:val="20"/>
+              </w:rPr>
+              <w:t>151.3</w:t>
+            </w:r>
+          </w:p>
+        </w:tc>
+        <w:tc>
+          <w:tcPr>
+            <w:tcW w:type="dxa" w:w="1930"/>
+          </w:tcPr>
+          <w:p>
+            <w:r/>
+            <w:r>
+              <w:rPr>
+                <w:sz w:val="20"/>
+              </w:rPr>
+              <w:t>1.7%</w:t>
+            </w:r>
+          </w:p>
+        </w:tc>
+      </w:tr>
+    </w:tbl>
+    <w:p>
+      <w:pPr>
+        <w:spacing w:after="40"/>
+      </w:pPr>
+    </w:p>
+    <w:p>
+      <w:pPr>
+        <w:spacing w:after="160"/>
+      </w:pPr>
+      <w:r>
+        <w:rPr>
+          <w:i/>
+          <w:color w:val="595959"/>
+          <w:sz w:val="18"/>
+        </w:rPr>
+        <w:t>Table. Energy on the comparable scale, each plan driven through the full vehicle model. One run per distance. SIMULATED on the laptop.</w:t>
+      </w:r>
+    </w:p>
+    <w:p>
+      <w:pPr>
+        <w:spacing w:after="160"/>
+      </w:pPr>
+      <w:r>
+        <w:rPr>
+          <w:i w:val="0"/>
+          <w:sz w:val="24"/>
+        </w:rPr>
+        <w:t>About half of the empty-road saving survives a tight limit. Held within 25 metres of the recorded drive the planner still saves 5.1% on the aggressive route, and within 100 metres 9.7%. On the steady highway route there is little to save at any distance.</w:t>
+      </w:r>
+    </w:p>
+    <w:p>
+      <w:pPr>
+        <w:pStyle w:val="Heading2"/>
+      </w:pPr>
+      <w:r>
+        <w:t>What this does not cover</w:t>
+      </w:r>
+    </w:p>
+    <w:p>
+      <w:pPr>
+        <w:pStyle w:val="ListBullet"/>
+        <w:spacing w:after="80"/>
+      </w:pPr>
+      <w:r>
+        <w:t>A real acceleration sensor. The drift on the board is still simulated.</w:t>
+      </w:r>
+    </w:p>
+    <w:p>
+      <w:pPr>
+        <w:pStyle w:val="ListBullet"/>
+        <w:spacing w:after="80"/>
+      </w:pPr>
+      <w:r>
+        <w:t>The fused backup speed on the board. It exists on the laptop only.</w:t>
+      </w:r>
+    </w:p>
+    <w:p>
+      <w:pPr>
+        <w:pStyle w:val="ListBullet"/>
+        <w:spacing w:after="80"/>
+      </w:pPr>
+      <w:r>
+        <w:t>A traffic model. The traffic here is one recorded drive.</w:t>
+      </w:r>
+    </w:p>
+    <w:p>
+      <w:pPr>
+        <w:pStyle w:val="ListBullet"/>
+        <w:spacing w:after="80"/>
+      </w:pPr>
+      <w:r>
+        <w:t>Jev. It was not purchased and is not tested.</w:t>
+      </w:r>
+    </w:p>
+    <w:p>
+      <w:pPr>
+        <w:pStyle w:val="Heading1"/>
+      </w:pPr>
+      <w:r>
+        <w:t>34. Results that went against expectation</w:t>
       </w:r>
     </w:p>
     <w:p>
@@ -28642,7 +30697,7 @@
         <w:pStyle w:val="Heading1"/>
       </w:pPr>
       <w:r>
-        <w:t>34. What changed from the original plan</w:t>
+        <w:t>35. What changed from the original plan</w:t>
       </w:r>
     </w:p>
     <w:p>
@@ -28954,7 +31009,7 @@
         <w:pStyle w:val="Heading1"/>
       </w:pPr>
       <w:r>
-        <w:t>35. What is left to do</w:t>
+        <w:t>36. What is left to do</w:t>
       </w:r>
     </w:p>
     <w:p>
@@ -28978,7 +31033,19 @@
           <w:i w:val="0"/>
           <w:sz w:val="24"/>
         </w:rPr>
-        <w:t>Week 13 closed that open item: the detector was replaced by a new fault checker, measured on the board with injected faults in section 30. Still open after week 13: a real acceleration sensor in place of the simulated drift; repeats of the board runs; a backup speed that does not drift while an alarm is raised; traffic in the speed-planning task of section 32; and a decision on Jev, which section 31 does not recommend for the sensor-fault task.</w:t>
+        <w:t>Week 13 closed that open item: the detector was replaced by a new fault checker, measured on the board with injected faults in section 30. Still open after week 13: a real acceleration sensor in place of the simulated drift; repeats of the board runs, done in week 14; a backup speed that does not drift while an alarm is raised; traffic in the speed-planning task of section 32; and a decision on Jev, which section 31 does not recommend for the sensor-fault task.</w:t>
+      </w:r>
+    </w:p>
+    <w:p>
+      <w:pPr>
+        <w:spacing w:after="160"/>
+      </w:pPr>
+      <w:r>
+        <w:rPr>
+          <w:i w:val="0"/>
+          <w:sz w:val="24"/>
+        </w:rPr>
+        <w:t>Week 14 repeated the board runs and tried a backup speed that does not drift and a traffic limit on the planner, all in section 33. Open after week 14: the backup speed's failure on a car heavier than its model, then a version for the chip and a board run; and still a real acceleration sensor.</w:t>
       </w:r>
     </w:p>
     <w:p>
@@ -29638,7 +31705,7 @@
         <w:pStyle w:val="Heading1"/>
       </w:pPr>
       <w:r>
-        <w:t>36. Reproducing everything in this report</w:t>
+        <w:t>37. Reproducing everything in this report</w:t>
       </w:r>
     </w:p>
     <w:p>
@@ -30612,7 +32679,7 @@
           <w:color w:val="595959"/>
           <w:sz w:val="22"/>
         </w:rPr>
-        <w:t>All Python commands need PYTHONPATH="src:." set. The reinforcement-learning ramp-up additionally needs stable-baselines3 and gymnasium. The test suite runs with python3 -m pytest and currently holds 602 tests, including ones that drive the controller and the learned policy in C and in Python through identical inputs and require them to agree, and ones that read the firmware's own compile-time switches back out of its headers so that the scripts describing them cannot drift from what is compiled.</w:t>
+        <w:t>All Python commands need PYTHONPATH="src:." set. The reinforcement-learning ramp-up additionally needs stable-baselines3 and gymnasium. The test suite runs with python3 -m pytest and currently holds 606 tests, including ones that drive the controller and the learned policy in C and in Python through identical inputs and require them to agree, and ones that read the firmware's own compile-time switches back out of its headers so that the scripts describing them cannot drift from what is compiled.</w:t>
       </w:r>
     </w:p>
     <w:sectPr>

</xml_diff>